<commit_message>
docs: add colors to style guide in memoria proyecto
</commit_message>
<xml_diff>
--- a/documentacion proyecto/Proyecto Final - Memoria proyecto Bsnessapp.docx
+++ b/documentacion proyecto/Proyecto Final - Memoria proyecto Bsnessapp.docx
@@ -10869,20 +10869,7 @@
           <w:lang w:val="en-US" w:eastAsia="es-ES"/>
           <w14:ligatures w14:val="none"/>
         </w:rPr>
-        <w:t>'Juan</w:t>
-      </w:r>
-      <w:proofErr w:type="gramStart"/>
-      <w:r>
-        <w:rPr>
-          <w:rFonts w:ascii="Consolas" w:eastAsia="Times New Roman" w:hAnsi="Consolas" w:cs="Times New Roman"/>
-          <w:color w:val="032F62"/>
-          <w:kern w:val="0"/>
-          <w:sz w:val="21"/>
-          <w:szCs w:val="21"/>
-          <w:lang w:val="en-US" w:eastAsia="es-ES"/>
-          <w14:ligatures w14:val="none"/>
-        </w:rPr>
-        <w:t>'</w:t>
+        <w:t>'Juan'</w:t>
       </w:r>
       <w:r>
         <w:rPr>
@@ -10896,7 +10883,6 @@
         </w:rPr>
         <w:t>;</w:t>
       </w:r>
-      <w:proofErr w:type="gramEnd"/>
     </w:p>
     <w:p>
       <w:pPr>
@@ -11180,22 +11166,8 @@
           <w:lang w:val="en-US" w:eastAsia="es-ES"/>
           <w14:ligatures w14:val="none"/>
         </w:rPr>
-        <w:t>)</w:t>
-      </w:r>
-      <w:proofErr w:type="gramStart"/>
-      <w:r>
-        <w:rPr>
-          <w:rFonts w:ascii="Consolas" w:eastAsia="Times New Roman" w:hAnsi="Consolas" w:cs="Times New Roman"/>
-          <w:color w:val="24292E"/>
-          <w:kern w:val="0"/>
-          <w:sz w:val="21"/>
-          <w:szCs w:val="21"/>
-          <w:lang w:val="en-US" w:eastAsia="es-ES"/>
-          <w14:ligatures w14:val="none"/>
-        </w:rPr>
-        <w:t>);</w:t>
-      </w:r>
-      <w:proofErr w:type="gramEnd"/>
+        <w:t>));</w:t>
+      </w:r>
     </w:p>
     <w:p>
       <w:pPr>
@@ -25244,7 +25216,6 @@
               <w:t>, variante suave</w:t>
             </w:r>
           </w:p>
-          <w:p/>
         </w:tc>
       </w:tr>
       <w:tr>
@@ -25657,10 +25628,7 @@
           </w:tcPr>
           <w:p>
             <w:r>
-              <w:t>Fondos suaves</w:t>
-            </w:r>
-            <w:r>
-              <w:t xml:space="preserve"> </w:t>
+              <w:t xml:space="preserve">Fondos suaves </w:t>
             </w:r>
           </w:p>
         </w:tc>
@@ -25811,10 +25779,7 @@
               <w:jc w:val="center"/>
             </w:pPr>
             <w:r>
-              <w:t>stone-</w:t>
-            </w:r>
-            <w:r>
-              <w:t>4</w:t>
+              <w:t>stone-4</w:t>
             </w:r>
             <w:r>
               <w:t>00</w:t>
@@ -25871,10 +25836,7 @@
               <w:jc w:val="center"/>
             </w:pPr>
             <w:r>
-              <w:t>stone-</w:t>
-            </w:r>
-            <w:r>
-              <w:t>5</w:t>
+              <w:t>stone-5</w:t>
             </w:r>
             <w:r>
               <w:t>00</w:t>
@@ -25931,10 +25893,7 @@
               <w:jc w:val="center"/>
             </w:pPr>
             <w:r>
-              <w:t>stone-</w:t>
-            </w:r>
-            <w:r>
-              <w:t>6</w:t>
+              <w:t>stone-6</w:t>
             </w:r>
             <w:r>
               <w:t>00</w:t>
@@ -25991,10 +25950,7 @@
               <w:jc w:val="center"/>
             </w:pPr>
             <w:r>
-              <w:t>stone-</w:t>
-            </w:r>
-            <w:r>
-              <w:t>8</w:t>
+              <w:t>stone-8</w:t>
             </w:r>
             <w:r>
               <w:t>00</w:t>
@@ -26051,10 +26007,7 @@
               <w:jc w:val="center"/>
             </w:pPr>
             <w:r>
-              <w:t>stone-</w:t>
-            </w:r>
-            <w:r>
-              <w:t>9</w:t>
+              <w:t>stone-9</w:t>
             </w:r>
             <w:r>
               <w:t>00</w:t>
@@ -26114,7 +26067,14 @@
         <w:t>5.2.3 Slate – Colores neutros y tema oscuro</w:t>
       </w:r>
     </w:p>
-    <w:p/>
+    <w:p>
+      <w:pPr>
+        <w:rPr>
+          <w:sz w:val="12"/>
+          <w:szCs w:val="12"/>
+        </w:rPr>
+      </w:pPr>
+    </w:p>
     <w:tbl>
       <w:tblPr>
         <w:tblStyle w:val="Tablaconcuadrcula"/>
@@ -26305,10 +26265,7 @@
               <w:jc w:val="center"/>
             </w:pPr>
             <w:r>
-              <w:t>slate-</w:t>
-            </w:r>
-            <w:r>
-              <w:t>200</w:t>
+              <w:t>slate-200</w:t>
             </w:r>
           </w:p>
         </w:tc>
@@ -26362,13 +26319,7 @@
               <w:jc w:val="center"/>
             </w:pPr>
             <w:r>
-              <w:t>slate-</w:t>
-            </w:r>
-            <w:r>
-              <w:t>40</w:t>
-            </w:r>
-            <w:r>
-              <w:t>0</w:t>
+              <w:t>slate-400</w:t>
             </w:r>
           </w:p>
         </w:tc>
@@ -26422,13 +26373,7 @@
               <w:jc w:val="center"/>
             </w:pPr>
             <w:r>
-              <w:t>slate-5</w:t>
-            </w:r>
-            <w:r>
-              <w:t>0</w:t>
-            </w:r>
-            <w:r>
-              <w:t>0</w:t>
+              <w:t>slate-500</w:t>
             </w:r>
           </w:p>
         </w:tc>
@@ -26482,13 +26427,7 @@
               <w:jc w:val="center"/>
             </w:pPr>
             <w:r>
-              <w:t>slate-</w:t>
-            </w:r>
-            <w:r>
-              <w:t>70</w:t>
-            </w:r>
-            <w:r>
-              <w:t>0</w:t>
+              <w:t>slate-700</w:t>
             </w:r>
           </w:p>
         </w:tc>
@@ -26542,13 +26481,7 @@
               <w:jc w:val="center"/>
             </w:pPr>
             <w:r>
-              <w:t>slate-</w:t>
-            </w:r>
-            <w:r>
-              <w:t>80</w:t>
-            </w:r>
-            <w:r>
-              <w:t>0</w:t>
+              <w:t>slate-800</w:t>
             </w:r>
           </w:p>
         </w:tc>
@@ -26602,13 +26535,7 @@
               <w:jc w:val="center"/>
             </w:pPr>
             <w:r>
-              <w:t>slate-</w:t>
-            </w:r>
-            <w:r>
-              <w:t>90</w:t>
-            </w:r>
-            <w:r>
-              <w:t>0</w:t>
+              <w:t>slate-900</w:t>
             </w:r>
           </w:p>
         </w:tc>
@@ -26662,13 +26589,7 @@
               <w:jc w:val="center"/>
             </w:pPr>
             <w:r>
-              <w:t>slate-</w:t>
-            </w:r>
-            <w:r>
-              <w:t>9</w:t>
-            </w:r>
-            <w:r>
-              <w:t>50</w:t>
+              <w:t>slate-950</w:t>
             </w:r>
           </w:p>
         </w:tc>
@@ -26705,14 +26626,772 @@
     <w:p/>
     <w:p>
       <w:pPr>
-        <w:rPr>
-          <w:rFonts w:asciiTheme="majorHAnsi" w:eastAsiaTheme="majorEastAsia" w:hAnsiTheme="majorHAnsi" w:cstheme="majorBidi"/>
-          <w:color w:val="0F4761" w:themeColor="accent1" w:themeShade="BF"/>
-          <w:sz w:val="32"/>
-          <w:szCs w:val="32"/>
-        </w:rPr>
+        <w:pStyle w:val="Ttulo3"/>
       </w:pPr>
       <w:bookmarkStart w:id="25" w:name="_Toc227824462"/>
+      <w:r>
+        <w:t>5.2.4 Cyan – Acciones primarias y tema oscuro</w:t>
+      </w:r>
+    </w:p>
+    <w:p>
+      <w:pPr>
+        <w:rPr>
+          <w:sz w:val="12"/>
+          <w:szCs w:val="12"/>
+        </w:rPr>
+      </w:pPr>
+    </w:p>
+    <w:tbl>
+      <w:tblPr>
+        <w:tblStyle w:val="Tablaconcuadrcula"/>
+        <w:tblW w:w="0" w:type="auto"/>
+        <w:tblLook w:val="04A0" w:firstRow="1" w:lastRow="0" w:firstColumn="1" w:lastColumn="0" w:noHBand="0" w:noVBand="1"/>
+      </w:tblPr>
+      <w:tblGrid>
+        <w:gridCol w:w="1199"/>
+        <w:gridCol w:w="1348"/>
+        <w:gridCol w:w="1701"/>
+        <w:gridCol w:w="4246"/>
+      </w:tblGrid>
+      <w:tr>
+        <w:trPr>
+          <w:trHeight w:val="247"/>
+        </w:trPr>
+        <w:tc>
+          <w:tcPr>
+            <w:tcW w:w="1199" w:type="dxa"/>
+            <w:shd w:val="clear" w:color="auto" w:fill="E97132" w:themeFill="accent2"/>
+          </w:tcPr>
+          <w:p>
+            <w:pPr>
+              <w:jc w:val="center"/>
+              <w:rPr>
+                <w:color w:val="FFFFFF" w:themeColor="background1"/>
+                <w:sz w:val="28"/>
+                <w:szCs w:val="28"/>
+              </w:rPr>
+            </w:pPr>
+            <w:r>
+              <w:rPr>
+                <w:color w:val="FFFFFF" w:themeColor="background1"/>
+                <w:sz w:val="28"/>
+                <w:szCs w:val="28"/>
+              </w:rPr>
+              <w:t>Muestra</w:t>
+            </w:r>
+          </w:p>
+        </w:tc>
+        <w:tc>
+          <w:tcPr>
+            <w:tcW w:w="1348" w:type="dxa"/>
+            <w:shd w:val="clear" w:color="auto" w:fill="E97132" w:themeFill="accent2"/>
+          </w:tcPr>
+          <w:p>
+            <w:pPr>
+              <w:jc w:val="center"/>
+              <w:rPr>
+                <w:color w:val="FFFFFF" w:themeColor="background1"/>
+                <w:sz w:val="28"/>
+                <w:szCs w:val="28"/>
+              </w:rPr>
+            </w:pPr>
+            <w:r>
+              <w:rPr>
+                <w:color w:val="FFFFFF" w:themeColor="background1"/>
+                <w:sz w:val="28"/>
+                <w:szCs w:val="28"/>
+              </w:rPr>
+              <w:t>Clase</w:t>
+            </w:r>
+          </w:p>
+        </w:tc>
+        <w:tc>
+          <w:tcPr>
+            <w:tcW w:w="1701" w:type="dxa"/>
+            <w:shd w:val="clear" w:color="auto" w:fill="E97132" w:themeFill="accent2"/>
+          </w:tcPr>
+          <w:p>
+            <w:pPr>
+              <w:jc w:val="center"/>
+              <w:rPr>
+                <w:color w:val="FFFFFF" w:themeColor="background1"/>
+                <w:sz w:val="28"/>
+                <w:szCs w:val="28"/>
+              </w:rPr>
+            </w:pPr>
+            <w:proofErr w:type="spellStart"/>
+            <w:r>
+              <w:rPr>
+                <w:color w:val="FFFFFF" w:themeColor="background1"/>
+                <w:sz w:val="28"/>
+                <w:szCs w:val="28"/>
+              </w:rPr>
+              <w:t>Hex</w:t>
+            </w:r>
+            <w:proofErr w:type="spellEnd"/>
+          </w:p>
+        </w:tc>
+        <w:tc>
+          <w:tcPr>
+            <w:tcW w:w="4246" w:type="dxa"/>
+            <w:shd w:val="clear" w:color="auto" w:fill="E97132" w:themeFill="accent2"/>
+          </w:tcPr>
+          <w:p>
+            <w:pPr>
+              <w:jc w:val="center"/>
+              <w:rPr>
+                <w:color w:val="FFFFFF" w:themeColor="background1"/>
+                <w:sz w:val="28"/>
+                <w:szCs w:val="28"/>
+              </w:rPr>
+            </w:pPr>
+            <w:r>
+              <w:rPr>
+                <w:color w:val="FFFFFF" w:themeColor="background1"/>
+                <w:sz w:val="28"/>
+                <w:szCs w:val="28"/>
+              </w:rPr>
+              <w:t>Uso</w:t>
+            </w:r>
+          </w:p>
+        </w:tc>
+      </w:tr>
+      <w:tr>
+        <w:trPr>
+          <w:trHeight w:val="567"/>
+        </w:trPr>
+        <w:tc>
+          <w:tcPr>
+            <w:tcW w:w="1199" w:type="dxa"/>
+            <w:shd w:val="clear" w:color="auto" w:fill="A5F3FC"/>
+          </w:tcPr>
+          <w:p/>
+        </w:tc>
+        <w:tc>
+          <w:tcPr>
+            <w:tcW w:w="1348" w:type="dxa"/>
+            <w:vAlign w:val="center"/>
+          </w:tcPr>
+          <w:p>
+            <w:pPr>
+              <w:jc w:val="center"/>
+            </w:pPr>
+            <w:r>
+              <w:t>cyan</w:t>
+            </w:r>
+            <w:r>
+              <w:t>-200</w:t>
+            </w:r>
+          </w:p>
+        </w:tc>
+        <w:tc>
+          <w:tcPr>
+            <w:tcW w:w="1701" w:type="dxa"/>
+            <w:vAlign w:val="center"/>
+          </w:tcPr>
+          <w:p>
+            <w:pPr>
+              <w:jc w:val="center"/>
+            </w:pPr>
+            <w:r>
+              <w:t>#</w:t>
+            </w:r>
+            <w:r>
+              <w:t>A5F3FC</w:t>
+            </w:r>
+          </w:p>
+        </w:tc>
+        <w:tc>
+          <w:tcPr>
+            <w:tcW w:w="4246" w:type="dxa"/>
+            <w:vAlign w:val="center"/>
+          </w:tcPr>
+          <w:p>
+            <w:r>
+              <w:t>Hover suave</w:t>
+            </w:r>
+          </w:p>
+        </w:tc>
+      </w:tr>
+      <w:tr>
+        <w:trPr>
+          <w:trHeight w:val="567"/>
+        </w:trPr>
+        <w:tc>
+          <w:tcPr>
+            <w:tcW w:w="1199" w:type="dxa"/>
+            <w:shd w:val="clear" w:color="auto" w:fill="22D3EE"/>
+          </w:tcPr>
+          <w:p/>
+        </w:tc>
+        <w:tc>
+          <w:tcPr>
+            <w:tcW w:w="1348" w:type="dxa"/>
+            <w:vAlign w:val="center"/>
+          </w:tcPr>
+          <w:p>
+            <w:pPr>
+              <w:jc w:val="center"/>
+            </w:pPr>
+            <w:r>
+              <w:t>cyan</w:t>
+            </w:r>
+            <w:r>
+              <w:t>-</w:t>
+            </w:r>
+            <w:r>
+              <w:t>4</w:t>
+            </w:r>
+            <w:r>
+              <w:t>00</w:t>
+            </w:r>
+          </w:p>
+        </w:tc>
+        <w:tc>
+          <w:tcPr>
+            <w:tcW w:w="1701" w:type="dxa"/>
+            <w:vAlign w:val="center"/>
+          </w:tcPr>
+          <w:p>
+            <w:pPr>
+              <w:jc w:val="center"/>
+            </w:pPr>
+            <w:r>
+              <w:t>#</w:t>
+            </w:r>
+            <w:r>
+              <w:t>22D3EE</w:t>
+            </w:r>
+          </w:p>
+        </w:tc>
+        <w:tc>
+          <w:tcPr>
+            <w:tcW w:w="4246" w:type="dxa"/>
+            <w:vAlign w:val="center"/>
+          </w:tcPr>
+          <w:p>
+            <w:r>
+              <w:t>Acentos</w:t>
+            </w:r>
+          </w:p>
+        </w:tc>
+      </w:tr>
+      <w:tr>
+        <w:trPr>
+          <w:trHeight w:val="567"/>
+        </w:trPr>
+        <w:tc>
+          <w:tcPr>
+            <w:tcW w:w="1199" w:type="dxa"/>
+            <w:shd w:val="clear" w:color="auto" w:fill="06B6D4"/>
+          </w:tcPr>
+          <w:p/>
+        </w:tc>
+        <w:tc>
+          <w:tcPr>
+            <w:tcW w:w="1348" w:type="dxa"/>
+            <w:vAlign w:val="center"/>
+          </w:tcPr>
+          <w:p>
+            <w:pPr>
+              <w:jc w:val="center"/>
+            </w:pPr>
+            <w:r>
+              <w:t>cyan</w:t>
+            </w:r>
+            <w:r>
+              <w:t>-</w:t>
+            </w:r>
+            <w:r>
+              <w:t>5</w:t>
+            </w:r>
+            <w:r>
+              <w:t>00</w:t>
+            </w:r>
+          </w:p>
+        </w:tc>
+        <w:tc>
+          <w:tcPr>
+            <w:tcW w:w="1701" w:type="dxa"/>
+            <w:vAlign w:val="center"/>
+          </w:tcPr>
+          <w:p>
+            <w:pPr>
+              <w:jc w:val="center"/>
+            </w:pPr>
+            <w:r>
+              <w:t>#</w:t>
+            </w:r>
+            <w:r>
+              <w:t>06B6D4</w:t>
+            </w:r>
+          </w:p>
+        </w:tc>
+        <w:tc>
+          <w:tcPr>
+            <w:tcW w:w="4246" w:type="dxa"/>
+            <w:vAlign w:val="center"/>
+          </w:tcPr>
+          <w:p>
+            <w:r>
+              <w:t>Acciones principales</w:t>
+            </w:r>
+          </w:p>
+        </w:tc>
+      </w:tr>
+      <w:tr>
+        <w:trPr>
+          <w:trHeight w:val="567"/>
+        </w:trPr>
+        <w:tc>
+          <w:tcPr>
+            <w:tcW w:w="1199" w:type="dxa"/>
+            <w:shd w:val="clear" w:color="auto" w:fill="0891B2"/>
+          </w:tcPr>
+          <w:p/>
+        </w:tc>
+        <w:tc>
+          <w:tcPr>
+            <w:tcW w:w="1348" w:type="dxa"/>
+            <w:vAlign w:val="center"/>
+          </w:tcPr>
+          <w:p>
+            <w:pPr>
+              <w:jc w:val="center"/>
+            </w:pPr>
+            <w:r>
+              <w:t>cyan</w:t>
+            </w:r>
+            <w:r>
+              <w:t>-</w:t>
+            </w:r>
+            <w:r>
+              <w:t>6</w:t>
+            </w:r>
+            <w:r>
+              <w:t>00</w:t>
+            </w:r>
+          </w:p>
+        </w:tc>
+        <w:tc>
+          <w:tcPr>
+            <w:tcW w:w="1701" w:type="dxa"/>
+            <w:vAlign w:val="center"/>
+          </w:tcPr>
+          <w:p>
+            <w:pPr>
+              <w:jc w:val="center"/>
+            </w:pPr>
+            <w:r>
+              <w:t>#</w:t>
+            </w:r>
+            <w:r>
+              <w:t>0891B2</w:t>
+            </w:r>
+          </w:p>
+        </w:tc>
+        <w:tc>
+          <w:tcPr>
+            <w:tcW w:w="4246" w:type="dxa"/>
+            <w:vAlign w:val="center"/>
+          </w:tcPr>
+          <w:p>
+            <w:r>
+              <w:t>Botones primarios</w:t>
+            </w:r>
+          </w:p>
+        </w:tc>
+      </w:tr>
+      <w:tr>
+        <w:trPr>
+          <w:trHeight w:val="567"/>
+        </w:trPr>
+        <w:tc>
+          <w:tcPr>
+            <w:tcW w:w="1199" w:type="dxa"/>
+            <w:shd w:val="clear" w:color="auto" w:fill="155E75"/>
+          </w:tcPr>
+          <w:p/>
+        </w:tc>
+        <w:tc>
+          <w:tcPr>
+            <w:tcW w:w="1348" w:type="dxa"/>
+            <w:vAlign w:val="center"/>
+          </w:tcPr>
+          <w:p>
+            <w:pPr>
+              <w:jc w:val="center"/>
+            </w:pPr>
+            <w:r>
+              <w:t>cyan</w:t>
+            </w:r>
+            <w:r>
+              <w:t>-</w:t>
+            </w:r>
+            <w:r>
+              <w:t>8</w:t>
+            </w:r>
+            <w:r>
+              <w:t>00</w:t>
+            </w:r>
+          </w:p>
+        </w:tc>
+        <w:tc>
+          <w:tcPr>
+            <w:tcW w:w="1701" w:type="dxa"/>
+            <w:vAlign w:val="center"/>
+          </w:tcPr>
+          <w:p>
+            <w:pPr>
+              <w:jc w:val="center"/>
+            </w:pPr>
+            <w:r>
+              <w:t>#</w:t>
+            </w:r>
+            <w:r>
+              <w:t>155E75</w:t>
+            </w:r>
+          </w:p>
+        </w:tc>
+        <w:tc>
+          <w:tcPr>
+            <w:tcW w:w="4246" w:type="dxa"/>
+            <w:vAlign w:val="center"/>
+          </w:tcPr>
+          <w:p>
+            <w:r>
+              <w:t>Contraste</w:t>
+            </w:r>
+          </w:p>
+        </w:tc>
+      </w:tr>
+    </w:tbl>
+    <w:p/>
+    <w:p>
+      <w:pPr>
+        <w:pStyle w:val="Ttulo3"/>
+      </w:pPr>
+      <w:r>
+        <w:t>5.2.5 Colores semánticos</w:t>
+      </w:r>
+    </w:p>
+    <w:p>
+      <w:pPr>
+        <w:rPr>
+          <w:sz w:val="12"/>
+          <w:szCs w:val="12"/>
+        </w:rPr>
+      </w:pPr>
+    </w:p>
+    <w:tbl>
+      <w:tblPr>
+        <w:tblStyle w:val="Tablaconcuadrcula"/>
+        <w:tblW w:w="0" w:type="auto"/>
+        <w:tblLook w:val="04A0" w:firstRow="1" w:lastRow="0" w:firstColumn="1" w:lastColumn="0" w:noHBand="0" w:noVBand="1"/>
+      </w:tblPr>
+      <w:tblGrid>
+        <w:gridCol w:w="1199"/>
+        <w:gridCol w:w="1348"/>
+        <w:gridCol w:w="1701"/>
+        <w:gridCol w:w="4246"/>
+      </w:tblGrid>
+      <w:tr>
+        <w:trPr>
+          <w:trHeight w:val="247"/>
+        </w:trPr>
+        <w:tc>
+          <w:tcPr>
+            <w:tcW w:w="1199" w:type="dxa"/>
+            <w:shd w:val="clear" w:color="auto" w:fill="E97132" w:themeFill="accent2"/>
+          </w:tcPr>
+          <w:p>
+            <w:pPr>
+              <w:jc w:val="center"/>
+              <w:rPr>
+                <w:color w:val="FFFFFF" w:themeColor="background1"/>
+                <w:sz w:val="28"/>
+                <w:szCs w:val="28"/>
+              </w:rPr>
+            </w:pPr>
+            <w:r>
+              <w:rPr>
+                <w:color w:val="FFFFFF" w:themeColor="background1"/>
+                <w:sz w:val="28"/>
+                <w:szCs w:val="28"/>
+              </w:rPr>
+              <w:t>Muestra</w:t>
+            </w:r>
+          </w:p>
+        </w:tc>
+        <w:tc>
+          <w:tcPr>
+            <w:tcW w:w="1348" w:type="dxa"/>
+            <w:shd w:val="clear" w:color="auto" w:fill="E97132" w:themeFill="accent2"/>
+          </w:tcPr>
+          <w:p>
+            <w:pPr>
+              <w:jc w:val="center"/>
+              <w:rPr>
+                <w:color w:val="FFFFFF" w:themeColor="background1"/>
+                <w:sz w:val="28"/>
+                <w:szCs w:val="28"/>
+              </w:rPr>
+            </w:pPr>
+            <w:r>
+              <w:rPr>
+                <w:color w:val="FFFFFF" w:themeColor="background1"/>
+                <w:sz w:val="28"/>
+                <w:szCs w:val="28"/>
+              </w:rPr>
+              <w:t>Clase</w:t>
+            </w:r>
+          </w:p>
+        </w:tc>
+        <w:tc>
+          <w:tcPr>
+            <w:tcW w:w="1701" w:type="dxa"/>
+            <w:shd w:val="clear" w:color="auto" w:fill="E97132" w:themeFill="accent2"/>
+          </w:tcPr>
+          <w:p>
+            <w:pPr>
+              <w:jc w:val="center"/>
+              <w:rPr>
+                <w:color w:val="FFFFFF" w:themeColor="background1"/>
+                <w:sz w:val="28"/>
+                <w:szCs w:val="28"/>
+              </w:rPr>
+            </w:pPr>
+            <w:proofErr w:type="spellStart"/>
+            <w:r>
+              <w:rPr>
+                <w:color w:val="FFFFFF" w:themeColor="background1"/>
+                <w:sz w:val="28"/>
+                <w:szCs w:val="28"/>
+              </w:rPr>
+              <w:t>Hex</w:t>
+            </w:r>
+            <w:proofErr w:type="spellEnd"/>
+          </w:p>
+        </w:tc>
+        <w:tc>
+          <w:tcPr>
+            <w:tcW w:w="4246" w:type="dxa"/>
+            <w:shd w:val="clear" w:color="auto" w:fill="E97132" w:themeFill="accent2"/>
+          </w:tcPr>
+          <w:p>
+            <w:pPr>
+              <w:jc w:val="center"/>
+              <w:rPr>
+                <w:color w:val="FFFFFF" w:themeColor="background1"/>
+                <w:sz w:val="28"/>
+                <w:szCs w:val="28"/>
+              </w:rPr>
+            </w:pPr>
+            <w:r>
+              <w:rPr>
+                <w:color w:val="FFFFFF" w:themeColor="background1"/>
+                <w:sz w:val="28"/>
+                <w:szCs w:val="28"/>
+              </w:rPr>
+              <w:t>Uso</w:t>
+            </w:r>
+          </w:p>
+        </w:tc>
+      </w:tr>
+      <w:tr>
+        <w:trPr>
+          <w:trHeight w:val="567"/>
+        </w:trPr>
+        <w:tc>
+          <w:tcPr>
+            <w:tcW w:w="1199" w:type="dxa"/>
+            <w:shd w:val="clear" w:color="auto" w:fill="EF4444"/>
+          </w:tcPr>
+          <w:p/>
+        </w:tc>
+        <w:tc>
+          <w:tcPr>
+            <w:tcW w:w="1348" w:type="dxa"/>
+            <w:vAlign w:val="center"/>
+          </w:tcPr>
+          <w:p>
+            <w:pPr>
+              <w:jc w:val="center"/>
+            </w:pPr>
+            <w:r>
+              <w:t>red</w:t>
+            </w:r>
+            <w:r>
+              <w:t>-</w:t>
+            </w:r>
+            <w:r>
+              <w:t>500</w:t>
+            </w:r>
+          </w:p>
+        </w:tc>
+        <w:tc>
+          <w:tcPr>
+            <w:tcW w:w="1701" w:type="dxa"/>
+            <w:vAlign w:val="center"/>
+          </w:tcPr>
+          <w:p>
+            <w:pPr>
+              <w:jc w:val="center"/>
+            </w:pPr>
+            <w:r>
+              <w:t>#</w:t>
+            </w:r>
+            <w:r>
+              <w:t>EF4444</w:t>
+            </w:r>
+          </w:p>
+        </w:tc>
+        <w:tc>
+          <w:tcPr>
+            <w:tcW w:w="4246" w:type="dxa"/>
+            <w:vAlign w:val="center"/>
+          </w:tcPr>
+          <w:p>
+            <w:r>
+              <w:t>Errores</w:t>
+            </w:r>
+          </w:p>
+        </w:tc>
+      </w:tr>
+      <w:tr>
+        <w:trPr>
+          <w:trHeight w:val="567"/>
+        </w:trPr>
+        <w:tc>
+          <w:tcPr>
+            <w:tcW w:w="1199" w:type="dxa"/>
+            <w:tcBorders>
+              <w:bottom w:val="single" w:sz="4" w:space="0" w:color="auto"/>
+            </w:tcBorders>
+            <w:shd w:val="clear" w:color="auto" w:fill="DC2626"/>
+          </w:tcPr>
+          <w:p/>
+        </w:tc>
+        <w:tc>
+          <w:tcPr>
+            <w:tcW w:w="1348" w:type="dxa"/>
+            <w:vAlign w:val="center"/>
+          </w:tcPr>
+          <w:p>
+            <w:pPr>
+              <w:jc w:val="center"/>
+            </w:pPr>
+            <w:r>
+              <w:t>red</w:t>
+            </w:r>
+            <w:r>
+              <w:t>-</w:t>
+            </w:r>
+            <w:r>
+              <w:t>600</w:t>
+            </w:r>
+          </w:p>
+        </w:tc>
+        <w:tc>
+          <w:tcPr>
+            <w:tcW w:w="1701" w:type="dxa"/>
+            <w:vAlign w:val="center"/>
+          </w:tcPr>
+          <w:p>
+            <w:pPr>
+              <w:jc w:val="center"/>
+            </w:pPr>
+            <w:r>
+              <w:t>#</w:t>
+            </w:r>
+            <w:r>
+              <w:t>DC</w:t>
+            </w:r>
+            <w:r>
+              <w:t>2626</w:t>
+            </w:r>
+          </w:p>
+        </w:tc>
+        <w:tc>
+          <w:tcPr>
+            <w:tcW w:w="4246" w:type="dxa"/>
+            <w:vAlign w:val="center"/>
+          </w:tcPr>
+          <w:p>
+            <w:r>
+              <w:t>Peligro, eliminar, cerrar</w:t>
+            </w:r>
+          </w:p>
+        </w:tc>
+      </w:tr>
+      <w:tr>
+        <w:trPr>
+          <w:trHeight w:val="567"/>
+        </w:trPr>
+        <w:tc>
+          <w:tcPr>
+            <w:tcW w:w="1199" w:type="dxa"/>
+            <w:tcBorders>
+              <w:bottom w:val="nil"/>
+            </w:tcBorders>
+            <w:shd w:val="clear" w:color="auto" w:fill="22C55E"/>
+          </w:tcPr>
+          <w:p/>
+        </w:tc>
+        <w:tc>
+          <w:tcPr>
+            <w:tcW w:w="1348" w:type="dxa"/>
+            <w:vAlign w:val="center"/>
+          </w:tcPr>
+          <w:p>
+            <w:pPr>
+              <w:jc w:val="center"/>
+            </w:pPr>
+            <w:r>
+              <w:t>green</w:t>
+            </w:r>
+            <w:r>
+              <w:t>-</w:t>
+            </w:r>
+            <w:r>
+              <w:t>5</w:t>
+            </w:r>
+            <w:r>
+              <w:t>00</w:t>
+            </w:r>
+          </w:p>
+        </w:tc>
+        <w:tc>
+          <w:tcPr>
+            <w:tcW w:w="1701" w:type="dxa"/>
+            <w:vAlign w:val="center"/>
+          </w:tcPr>
+          <w:p>
+            <w:pPr>
+              <w:jc w:val="center"/>
+            </w:pPr>
+            <w:r>
+              <w:t>#</w:t>
+            </w:r>
+            <w:r>
+              <w:t>22C55E</w:t>
+            </w:r>
+          </w:p>
+        </w:tc>
+        <w:tc>
+          <w:tcPr>
+            <w:tcW w:w="4246" w:type="dxa"/>
+            <w:vAlign w:val="center"/>
+          </w:tcPr>
+          <w:p>
+            <w:r>
+              <w:t>Éxito, confirmar</w:t>
+            </w:r>
+          </w:p>
+        </w:tc>
+      </w:tr>
+    </w:tbl>
+    <w:p>
       <w:r>
         <w:br w:type="page"/>
       </w:r>
@@ -34201,8 +34880,10 @@
     <w:rsid w:val="00406C8A"/>
     <w:rsid w:val="0055497D"/>
     <w:rsid w:val="006D6755"/>
+    <w:rsid w:val="0073319B"/>
     <w:rsid w:val="007E3F9C"/>
     <w:rsid w:val="007E6509"/>
+    <w:rsid w:val="00851509"/>
     <w:rsid w:val="00AA5E59"/>
     <w:rsid w:val="00C66654"/>
     <w:rsid w:val="00D04E45"/>

</xml_diff>

<commit_message>
docs: add fonts and text styles in project documentation
</commit_message>
<xml_diff>
--- a/documentacion proyecto/Proyecto Final - Memoria proyecto Bsnessapp.docx
+++ b/documentacion proyecto/Proyecto Final - Memoria proyecto Bsnessapp.docx
@@ -27402,6 +27402,1549 @@
       </w:pPr>
       <w:r>
         <w:lastRenderedPageBreak/>
+        <w:t>5.3 Tipografía</w:t>
+      </w:r>
+    </w:p>
+    <w:p>
+      <w:r>
+        <w:t xml:space="preserve">La fuente principal que hemos usado en el proyecto es la fuente </w:t>
+      </w:r>
+      <w:proofErr w:type="spellStart"/>
+      <w:r>
+        <w:t>Roboto</w:t>
+      </w:r>
+      <w:proofErr w:type="spellEnd"/>
+      <w:r>
+        <w:t xml:space="preserve"> de Google Fonts en diferentes variables:</w:t>
+      </w:r>
+    </w:p>
+    <w:tbl>
+      <w:tblPr>
+        <w:tblStyle w:val="Tablaconcuadrcula"/>
+        <w:tblW w:w="0" w:type="auto"/>
+        <w:tblLook w:val="04A0" w:firstRow="1" w:lastRow="0" w:firstColumn="1" w:lastColumn="0" w:noHBand="0" w:noVBand="1"/>
+      </w:tblPr>
+      <w:tblGrid>
+        <w:gridCol w:w="2123"/>
+        <w:gridCol w:w="2123"/>
+        <w:gridCol w:w="2124"/>
+        <w:gridCol w:w="2124"/>
+      </w:tblGrid>
+      <w:tr>
+        <w:tc>
+          <w:tcPr>
+            <w:tcW w:w="2123" w:type="dxa"/>
+            <w:shd w:val="clear" w:color="auto" w:fill="156082" w:themeFill="accent1"/>
+          </w:tcPr>
+          <w:p>
+            <w:pPr>
+              <w:jc w:val="center"/>
+              <w:rPr>
+                <w:color w:val="FFFFFF" w:themeColor="background1"/>
+              </w:rPr>
+            </w:pPr>
+            <w:r>
+              <w:rPr>
+                <w:color w:val="FFFFFF" w:themeColor="background1"/>
+              </w:rPr>
+              <w:t>Familia</w:t>
+            </w:r>
+          </w:p>
+        </w:tc>
+        <w:tc>
+          <w:tcPr>
+            <w:tcW w:w="2123" w:type="dxa"/>
+            <w:shd w:val="clear" w:color="auto" w:fill="156082" w:themeFill="accent1"/>
+          </w:tcPr>
+          <w:p>
+            <w:pPr>
+              <w:jc w:val="center"/>
+              <w:rPr>
+                <w:color w:val="FFFFFF" w:themeColor="background1"/>
+              </w:rPr>
+            </w:pPr>
+            <w:r>
+              <w:rPr>
+                <w:color w:val="FFFFFF" w:themeColor="background1"/>
+              </w:rPr>
+              <w:t>Pesos</w:t>
+            </w:r>
+          </w:p>
+        </w:tc>
+        <w:tc>
+          <w:tcPr>
+            <w:tcW w:w="2124" w:type="dxa"/>
+            <w:shd w:val="clear" w:color="auto" w:fill="156082" w:themeFill="accent1"/>
+          </w:tcPr>
+          <w:p>
+            <w:pPr>
+              <w:jc w:val="center"/>
+              <w:rPr>
+                <w:color w:val="FFFFFF" w:themeColor="background1"/>
+              </w:rPr>
+            </w:pPr>
+            <w:proofErr w:type="spellStart"/>
+            <w:r>
+              <w:rPr>
+                <w:color w:val="FFFFFF" w:themeColor="background1"/>
+              </w:rPr>
+              <w:t>Subset</w:t>
+            </w:r>
+            <w:proofErr w:type="spellEnd"/>
+          </w:p>
+        </w:tc>
+        <w:tc>
+          <w:tcPr>
+            <w:tcW w:w="2124" w:type="dxa"/>
+            <w:shd w:val="clear" w:color="auto" w:fill="156082" w:themeFill="accent1"/>
+          </w:tcPr>
+          <w:p>
+            <w:pPr>
+              <w:jc w:val="center"/>
+              <w:rPr>
+                <w:color w:val="FFFFFF" w:themeColor="background1"/>
+              </w:rPr>
+            </w:pPr>
+            <w:r>
+              <w:rPr>
+                <w:color w:val="FFFFFF" w:themeColor="background1"/>
+              </w:rPr>
+              <w:t>Uso</w:t>
+            </w:r>
+          </w:p>
+        </w:tc>
+      </w:tr>
+      <w:tr>
+        <w:tc>
+          <w:tcPr>
+            <w:tcW w:w="2123" w:type="dxa"/>
+            <w:vMerge w:val="restart"/>
+            <w:vAlign w:val="center"/>
+          </w:tcPr>
+          <w:p>
+            <w:pPr>
+              <w:jc w:val="center"/>
+            </w:pPr>
+            <w:proofErr w:type="spellStart"/>
+            <w:r>
+              <w:t>Roboto-sans</w:t>
+            </w:r>
+            <w:proofErr w:type="spellEnd"/>
+          </w:p>
+        </w:tc>
+        <w:tc>
+          <w:tcPr>
+            <w:tcW w:w="2123" w:type="dxa"/>
+          </w:tcPr>
+          <w:p>
+            <w:pPr>
+              <w:jc w:val="center"/>
+            </w:pPr>
+            <w:r>
+              <w:t>400</w:t>
+            </w:r>
+          </w:p>
+        </w:tc>
+        <w:tc>
+          <w:tcPr>
+            <w:tcW w:w="2124" w:type="dxa"/>
+          </w:tcPr>
+          <w:p>
+            <w:pPr>
+              <w:jc w:val="center"/>
+            </w:pPr>
+            <w:proofErr w:type="spellStart"/>
+            <w:r>
+              <w:t>latin</w:t>
+            </w:r>
+            <w:proofErr w:type="spellEnd"/>
+          </w:p>
+        </w:tc>
+        <w:tc>
+          <w:tcPr>
+            <w:tcW w:w="2124" w:type="dxa"/>
+            <w:vMerge w:val="restart"/>
+            <w:vAlign w:val="center"/>
+          </w:tcPr>
+          <w:p>
+            <w:r>
+              <w:t xml:space="preserve">Texto principal, títulos, </w:t>
+            </w:r>
+            <w:proofErr w:type="spellStart"/>
+            <w:r>
+              <w:t>body</w:t>
+            </w:r>
+            <w:proofErr w:type="spellEnd"/>
+            <w:r>
+              <w:t xml:space="preserve"> </w:t>
+            </w:r>
+          </w:p>
+        </w:tc>
+      </w:tr>
+      <w:tr>
+        <w:tc>
+          <w:tcPr>
+            <w:tcW w:w="2123" w:type="dxa"/>
+            <w:vMerge/>
+            <w:vAlign w:val="center"/>
+          </w:tcPr>
+          <w:p/>
+        </w:tc>
+        <w:tc>
+          <w:tcPr>
+            <w:tcW w:w="4247" w:type="dxa"/>
+            <w:gridSpan w:val="2"/>
+          </w:tcPr>
+          <w:p>
+            <w:pPr>
+              <w:rPr>
+                <w:rFonts w:ascii="Roboto" w:hAnsi="Roboto"/>
+              </w:rPr>
+            </w:pPr>
+            <w:r>
+              <w:rPr>
+                <w:rFonts w:ascii="Roboto" w:hAnsi="Roboto"/>
+              </w:rPr>
+              <w:t xml:space="preserve">Estos es </w:t>
+            </w:r>
+            <w:proofErr w:type="spellStart"/>
+            <w:r>
+              <w:rPr>
+                <w:rFonts w:ascii="Roboto" w:hAnsi="Roboto"/>
+              </w:rPr>
+              <w:t>Roboto</w:t>
+            </w:r>
+            <w:proofErr w:type="spellEnd"/>
+            <w:r>
+              <w:rPr>
+                <w:rFonts w:ascii="Roboto" w:hAnsi="Roboto"/>
+              </w:rPr>
+              <w:t xml:space="preserve"> en peso 400</w:t>
+            </w:r>
+          </w:p>
+        </w:tc>
+        <w:tc>
+          <w:tcPr>
+            <w:tcW w:w="2124" w:type="dxa"/>
+            <w:vMerge/>
+          </w:tcPr>
+          <w:p/>
+        </w:tc>
+      </w:tr>
+      <w:tr>
+        <w:tc>
+          <w:tcPr>
+            <w:tcW w:w="2123" w:type="dxa"/>
+            <w:vMerge/>
+          </w:tcPr>
+          <w:p/>
+        </w:tc>
+        <w:tc>
+          <w:tcPr>
+            <w:tcW w:w="2123" w:type="dxa"/>
+          </w:tcPr>
+          <w:p>
+            <w:pPr>
+              <w:jc w:val="center"/>
+            </w:pPr>
+            <w:r>
+              <w:t>700</w:t>
+            </w:r>
+          </w:p>
+        </w:tc>
+        <w:tc>
+          <w:tcPr>
+            <w:tcW w:w="2124" w:type="dxa"/>
+          </w:tcPr>
+          <w:p>
+            <w:pPr>
+              <w:jc w:val="center"/>
+            </w:pPr>
+            <w:proofErr w:type="spellStart"/>
+            <w:r>
+              <w:t>l</w:t>
+            </w:r>
+            <w:r>
+              <w:t>atin</w:t>
+            </w:r>
+            <w:proofErr w:type="spellEnd"/>
+          </w:p>
+        </w:tc>
+        <w:tc>
+          <w:tcPr>
+            <w:tcW w:w="2124" w:type="dxa"/>
+            <w:vMerge/>
+          </w:tcPr>
+          <w:p/>
+        </w:tc>
+      </w:tr>
+      <w:tr>
+        <w:tc>
+          <w:tcPr>
+            <w:tcW w:w="2123" w:type="dxa"/>
+            <w:vMerge/>
+          </w:tcPr>
+          <w:p/>
+        </w:tc>
+        <w:tc>
+          <w:tcPr>
+            <w:tcW w:w="4247" w:type="dxa"/>
+            <w:gridSpan w:val="2"/>
+          </w:tcPr>
+          <w:p>
+            <w:pPr>
+              <w:rPr>
+                <w:rFonts w:ascii="Roboto Bold" w:hAnsi="Roboto Bold"/>
+              </w:rPr>
+            </w:pPr>
+            <w:r>
+              <w:rPr>
+                <w:rFonts w:ascii="Roboto Bold" w:hAnsi="Roboto Bold"/>
+              </w:rPr>
+              <w:t xml:space="preserve">Esto es </w:t>
+            </w:r>
+            <w:proofErr w:type="spellStart"/>
+            <w:r>
+              <w:rPr>
+                <w:rFonts w:ascii="Roboto Bold" w:hAnsi="Roboto Bold"/>
+              </w:rPr>
+              <w:t>Robo</w:t>
+            </w:r>
+            <w:r>
+              <w:rPr>
+                <w:rFonts w:ascii="Roboto Bold" w:hAnsi="Roboto Bold"/>
+              </w:rPr>
+              <w:t>to</w:t>
+            </w:r>
+            <w:proofErr w:type="spellEnd"/>
+            <w:r>
+              <w:rPr>
+                <w:rFonts w:ascii="Roboto Bold" w:hAnsi="Roboto Bold"/>
+              </w:rPr>
+              <w:t xml:space="preserve"> en peso 700</w:t>
+            </w:r>
+          </w:p>
+        </w:tc>
+        <w:tc>
+          <w:tcPr>
+            <w:tcW w:w="2124" w:type="dxa"/>
+            <w:vMerge/>
+          </w:tcPr>
+          <w:p/>
+        </w:tc>
+      </w:tr>
+      <w:tr>
+        <w:tc>
+          <w:tcPr>
+            <w:tcW w:w="2123" w:type="dxa"/>
+            <w:vMerge w:val="restart"/>
+            <w:vAlign w:val="center"/>
+          </w:tcPr>
+          <w:p>
+            <w:pPr>
+              <w:jc w:val="center"/>
+            </w:pPr>
+            <w:r>
+              <w:t>Robot Flex</w:t>
+            </w:r>
+          </w:p>
+        </w:tc>
+        <w:tc>
+          <w:tcPr>
+            <w:tcW w:w="2123" w:type="dxa"/>
+          </w:tcPr>
+          <w:p>
+            <w:pPr>
+              <w:jc w:val="center"/>
+            </w:pPr>
+            <w:r>
+              <w:t>500</w:t>
+            </w:r>
+          </w:p>
+        </w:tc>
+        <w:tc>
+          <w:tcPr>
+            <w:tcW w:w="2124" w:type="dxa"/>
+          </w:tcPr>
+          <w:p>
+            <w:pPr>
+              <w:jc w:val="center"/>
+            </w:pPr>
+            <w:proofErr w:type="spellStart"/>
+            <w:r>
+              <w:t>latin</w:t>
+            </w:r>
+            <w:proofErr w:type="spellEnd"/>
+          </w:p>
+        </w:tc>
+        <w:tc>
+          <w:tcPr>
+            <w:tcW w:w="2124" w:type="dxa"/>
+            <w:vMerge w:val="restart"/>
+          </w:tcPr>
+          <w:p>
+            <w:r>
+              <w:t>Acentos, énfasis secundarios</w:t>
+            </w:r>
+          </w:p>
+        </w:tc>
+      </w:tr>
+      <w:tr>
+        <w:tc>
+          <w:tcPr>
+            <w:tcW w:w="2123" w:type="dxa"/>
+            <w:vMerge/>
+          </w:tcPr>
+          <w:p/>
+        </w:tc>
+        <w:tc>
+          <w:tcPr>
+            <w:tcW w:w="4247" w:type="dxa"/>
+            <w:gridSpan w:val="2"/>
+          </w:tcPr>
+          <w:p>
+            <w:pPr>
+              <w:rPr>
+                <w:rFonts w:ascii="Roboto Flex Medium" w:hAnsi="Roboto Flex Medium"/>
+              </w:rPr>
+            </w:pPr>
+            <w:r>
+              <w:rPr>
+                <w:rFonts w:ascii="Roboto Flex Medium" w:hAnsi="Roboto Flex Medium"/>
+              </w:rPr>
+              <w:t xml:space="preserve">Esto es </w:t>
+            </w:r>
+            <w:proofErr w:type="spellStart"/>
+            <w:r>
+              <w:rPr>
+                <w:rFonts w:ascii="Roboto Flex Medium" w:hAnsi="Roboto Flex Medium"/>
+              </w:rPr>
+              <w:t>Roboto</w:t>
+            </w:r>
+            <w:proofErr w:type="spellEnd"/>
+            <w:r>
+              <w:rPr>
+                <w:rFonts w:ascii="Roboto Flex Medium" w:hAnsi="Roboto Flex Medium"/>
+              </w:rPr>
+              <w:t xml:space="preserve"> Flex en peso 500</w:t>
+            </w:r>
+          </w:p>
+        </w:tc>
+        <w:tc>
+          <w:tcPr>
+            <w:tcW w:w="2124" w:type="dxa"/>
+            <w:vMerge/>
+          </w:tcPr>
+          <w:p/>
+        </w:tc>
+      </w:tr>
+    </w:tbl>
+    <w:p/>
+    <w:p>
+      <w:r>
+        <w:t>Estas fuentes se cargan desde Google Fonts vía Next.js en el archivo ‘</w:t>
+      </w:r>
+      <w:proofErr w:type="gramStart"/>
+      <w:r>
+        <w:t>app</w:t>
+      </w:r>
+      <w:proofErr w:type="gramEnd"/>
+      <w:r>
+        <w:t>/</w:t>
+      </w:r>
+      <w:proofErr w:type="spellStart"/>
+      <w:r>
+        <w:t>fonts.ts</w:t>
+      </w:r>
+      <w:proofErr w:type="spellEnd"/>
+      <w:r>
+        <w:t>’.</w:t>
+      </w:r>
+    </w:p>
+    <w:p>
+      <w:pPr>
+        <w:shd w:val="clear" w:color="auto" w:fill="F2F2F2" w:themeFill="background1" w:themeFillShade="F2"/>
+        <w:spacing w:after="0" w:line="285" w:lineRule="atLeast"/>
+        <w:rPr>
+          <w:rFonts w:ascii="Consolas" w:eastAsia="Times New Roman" w:hAnsi="Consolas" w:cs="Times New Roman"/>
+          <w:color w:val="0E2841" w:themeColor="text2"/>
+          <w:kern w:val="0"/>
+          <w:sz w:val="21"/>
+          <w:szCs w:val="21"/>
+          <w:lang w:val="en-US" w:eastAsia="es-ES"/>
+          <w14:ligatures w14:val="none"/>
+        </w:rPr>
+      </w:pPr>
+      <w:r>
+        <w:rPr>
+          <w:rFonts w:ascii="Consolas" w:eastAsia="Times New Roman" w:hAnsi="Consolas" w:cs="Times New Roman"/>
+          <w:i/>
+          <w:iCs/>
+          <w:color w:val="0E2841" w:themeColor="text2"/>
+          <w:kern w:val="0"/>
+          <w:sz w:val="21"/>
+          <w:szCs w:val="21"/>
+          <w:lang w:val="en-US" w:eastAsia="es-ES"/>
+          <w14:ligatures w14:val="none"/>
+        </w:rPr>
+        <w:t>// app/</w:t>
+      </w:r>
+      <w:proofErr w:type="spellStart"/>
+      <w:r>
+        <w:rPr>
+          <w:rFonts w:ascii="Consolas" w:eastAsia="Times New Roman" w:hAnsi="Consolas" w:cs="Times New Roman"/>
+          <w:i/>
+          <w:iCs/>
+          <w:color w:val="0E2841" w:themeColor="text2"/>
+          <w:kern w:val="0"/>
+          <w:sz w:val="21"/>
+          <w:szCs w:val="21"/>
+          <w:lang w:val="en-US" w:eastAsia="es-ES"/>
+          <w14:ligatures w14:val="none"/>
+        </w:rPr>
+        <w:t>fonts.ts</w:t>
+      </w:r>
+      <w:proofErr w:type="spellEnd"/>
+    </w:p>
+    <w:p>
+      <w:pPr>
+        <w:shd w:val="clear" w:color="auto" w:fill="F2F2F2" w:themeFill="background1" w:themeFillShade="F2"/>
+        <w:spacing w:after="0" w:line="285" w:lineRule="atLeast"/>
+        <w:rPr>
+          <w:rFonts w:ascii="Consolas" w:eastAsia="Times New Roman" w:hAnsi="Consolas" w:cs="Times New Roman"/>
+          <w:color w:val="E4E4E4"/>
+          <w:kern w:val="0"/>
+          <w:sz w:val="21"/>
+          <w:szCs w:val="21"/>
+          <w:lang w:val="en-US" w:eastAsia="es-ES"/>
+          <w14:ligatures w14:val="none"/>
+        </w:rPr>
+      </w:pPr>
+      <w:r>
+        <w:rPr>
+          <w:rFonts w:ascii="Consolas" w:eastAsia="Times New Roman" w:hAnsi="Consolas" w:cs="Times New Roman"/>
+          <w:color w:val="156082" w:themeColor="accent1"/>
+          <w:kern w:val="0"/>
+          <w:sz w:val="21"/>
+          <w:szCs w:val="21"/>
+          <w:lang w:val="en-US" w:eastAsia="es-ES"/>
+          <w14:ligatures w14:val="none"/>
+        </w:rPr>
+        <w:t xml:space="preserve">export const </w:t>
+      </w:r>
+      <w:proofErr w:type="spellStart"/>
+      <w:r>
+        <w:rPr>
+          <w:rFonts w:ascii="Consolas" w:eastAsia="Times New Roman" w:hAnsi="Consolas" w:cs="Times New Roman"/>
+          <w:color w:val="0F9ED5" w:themeColor="accent4"/>
+          <w:kern w:val="0"/>
+          <w:sz w:val="21"/>
+          <w:szCs w:val="21"/>
+          <w:lang w:val="en-US" w:eastAsia="es-ES"/>
+          <w14:ligatures w14:val="none"/>
+        </w:rPr>
+        <w:t>robotoSans</w:t>
+      </w:r>
+      <w:proofErr w:type="spellEnd"/>
+      <w:r>
+        <w:rPr>
+          <w:rFonts w:ascii="Consolas" w:eastAsia="Times New Roman" w:hAnsi="Consolas" w:cs="Times New Roman"/>
+          <w:color w:val="0F9ED5" w:themeColor="accent4"/>
+          <w:kern w:val="0"/>
+          <w:sz w:val="21"/>
+          <w:szCs w:val="21"/>
+          <w:lang w:val="en-US" w:eastAsia="es-ES"/>
+          <w14:ligatures w14:val="none"/>
+        </w:rPr>
+        <w:t xml:space="preserve"> </w:t>
+      </w:r>
+      <w:r>
+        <w:rPr>
+          <w:rFonts w:ascii="Consolas" w:eastAsia="Times New Roman" w:hAnsi="Consolas" w:cs="Times New Roman"/>
+          <w:color w:val="0E2841" w:themeColor="text2"/>
+          <w:kern w:val="0"/>
+          <w:sz w:val="21"/>
+          <w:szCs w:val="21"/>
+          <w:lang w:val="en-US" w:eastAsia="es-ES"/>
+          <w14:ligatures w14:val="none"/>
+        </w:rPr>
+        <w:t xml:space="preserve">= </w:t>
+      </w:r>
+      <w:proofErr w:type="gramStart"/>
+      <w:r>
+        <w:rPr>
+          <w:rFonts w:ascii="Consolas" w:eastAsia="Times New Roman" w:hAnsi="Consolas" w:cs="Times New Roman"/>
+          <w:color w:val="E97132" w:themeColor="accent2"/>
+          <w:kern w:val="0"/>
+          <w:sz w:val="21"/>
+          <w:szCs w:val="21"/>
+          <w:lang w:val="en-US" w:eastAsia="es-ES"/>
+          <w14:ligatures w14:val="none"/>
+        </w:rPr>
+        <w:t>Roboto</w:t>
+      </w:r>
+      <w:r>
+        <w:rPr>
+          <w:rFonts w:ascii="Consolas" w:eastAsia="Times New Roman" w:hAnsi="Consolas" w:cs="Times New Roman"/>
+          <w:color w:val="0E2841" w:themeColor="text2"/>
+          <w:kern w:val="0"/>
+          <w:sz w:val="21"/>
+          <w:szCs w:val="21"/>
+          <w:lang w:val="en-US" w:eastAsia="es-ES"/>
+          <w14:ligatures w14:val="none"/>
+        </w:rPr>
+        <w:t>({ subsets</w:t>
+      </w:r>
+      <w:proofErr w:type="gramEnd"/>
+      <w:r>
+        <w:rPr>
+          <w:rFonts w:ascii="Consolas" w:eastAsia="Times New Roman" w:hAnsi="Consolas" w:cs="Times New Roman"/>
+          <w:color w:val="0E2841" w:themeColor="text2"/>
+          <w:kern w:val="0"/>
+          <w:sz w:val="21"/>
+          <w:szCs w:val="21"/>
+          <w:lang w:val="en-US" w:eastAsia="es-ES"/>
+          <w14:ligatures w14:val="none"/>
+        </w:rPr>
+        <w:t>: [</w:t>
+      </w:r>
+      <w:r>
+        <w:rPr>
+          <w:rFonts w:ascii="Consolas" w:eastAsia="Times New Roman" w:hAnsi="Consolas" w:cs="Times New Roman"/>
+          <w:color w:val="A02B93" w:themeColor="accent5"/>
+          <w:kern w:val="0"/>
+          <w:sz w:val="21"/>
+          <w:szCs w:val="21"/>
+          <w:lang w:val="en-US" w:eastAsia="es-ES"/>
+          <w14:ligatures w14:val="none"/>
+        </w:rPr>
+        <w:t>"</w:t>
+      </w:r>
+      <w:proofErr w:type="spellStart"/>
+      <w:r>
+        <w:rPr>
+          <w:rFonts w:ascii="Consolas" w:eastAsia="Times New Roman" w:hAnsi="Consolas" w:cs="Times New Roman"/>
+          <w:color w:val="A02B93" w:themeColor="accent5"/>
+          <w:kern w:val="0"/>
+          <w:sz w:val="21"/>
+          <w:szCs w:val="21"/>
+          <w:lang w:val="en-US" w:eastAsia="es-ES"/>
+          <w14:ligatures w14:val="none"/>
+        </w:rPr>
+        <w:t>latin</w:t>
+      </w:r>
+      <w:proofErr w:type="spellEnd"/>
+      <w:r>
+        <w:rPr>
+          <w:rFonts w:ascii="Consolas" w:eastAsia="Times New Roman" w:hAnsi="Consolas" w:cs="Times New Roman"/>
+          <w:color w:val="A02B93" w:themeColor="accent5"/>
+          <w:kern w:val="0"/>
+          <w:sz w:val="21"/>
+          <w:szCs w:val="21"/>
+          <w:lang w:val="en-US" w:eastAsia="es-ES"/>
+          <w14:ligatures w14:val="none"/>
+        </w:rPr>
+        <w:t>"</w:t>
+      </w:r>
+      <w:r>
+        <w:rPr>
+          <w:rFonts w:ascii="Consolas" w:eastAsia="Times New Roman" w:hAnsi="Consolas" w:cs="Times New Roman"/>
+          <w:color w:val="0E2841" w:themeColor="text2"/>
+          <w:kern w:val="0"/>
+          <w:sz w:val="21"/>
+          <w:szCs w:val="21"/>
+          <w:lang w:val="en-US" w:eastAsia="es-ES"/>
+          <w14:ligatures w14:val="none"/>
+        </w:rPr>
+        <w:t>], weight: [</w:t>
+      </w:r>
+      <w:r>
+        <w:rPr>
+          <w:rFonts w:ascii="Consolas" w:eastAsia="Times New Roman" w:hAnsi="Consolas" w:cs="Times New Roman"/>
+          <w:color w:val="A02B93" w:themeColor="accent5"/>
+          <w:kern w:val="0"/>
+          <w:sz w:val="21"/>
+          <w:szCs w:val="21"/>
+          <w:lang w:val="en-US" w:eastAsia="es-ES"/>
+          <w14:ligatures w14:val="none"/>
+        </w:rPr>
+        <w:t>"400", "700"</w:t>
+      </w:r>
+      <w:proofErr w:type="gramStart"/>
+      <w:r>
+        <w:rPr>
+          <w:rFonts w:ascii="Consolas" w:eastAsia="Times New Roman" w:hAnsi="Consolas" w:cs="Times New Roman"/>
+          <w:color w:val="0E2841" w:themeColor="text2"/>
+          <w:kern w:val="0"/>
+          <w:sz w:val="21"/>
+          <w:szCs w:val="21"/>
+          <w:lang w:val="en-US" w:eastAsia="es-ES"/>
+          <w14:ligatures w14:val="none"/>
+        </w:rPr>
+        <w:t>] }</w:t>
+      </w:r>
+      <w:proofErr w:type="gramEnd"/>
+      <w:r>
+        <w:rPr>
+          <w:rFonts w:ascii="Consolas" w:eastAsia="Times New Roman" w:hAnsi="Consolas" w:cs="Times New Roman"/>
+          <w:color w:val="0E2841" w:themeColor="text2"/>
+          <w:kern w:val="0"/>
+          <w:sz w:val="21"/>
+          <w:szCs w:val="21"/>
+          <w:lang w:val="en-US" w:eastAsia="es-ES"/>
+          <w14:ligatures w14:val="none"/>
+        </w:rPr>
+        <w:t>);</w:t>
+      </w:r>
+    </w:p>
+    <w:p>
+      <w:pPr>
+        <w:shd w:val="clear" w:color="auto" w:fill="F2F2F2" w:themeFill="background1" w:themeFillShade="F2"/>
+        <w:spacing w:after="0" w:line="285" w:lineRule="atLeast"/>
+        <w:rPr>
+          <w:rFonts w:ascii="Consolas" w:eastAsia="Times New Roman" w:hAnsi="Consolas" w:cs="Times New Roman"/>
+          <w:color w:val="E4E4E4"/>
+          <w:kern w:val="0"/>
+          <w:sz w:val="21"/>
+          <w:szCs w:val="21"/>
+          <w:lang w:val="en-US" w:eastAsia="es-ES"/>
+          <w14:ligatures w14:val="none"/>
+        </w:rPr>
+      </w:pPr>
+      <w:r>
+        <w:rPr>
+          <w:rFonts w:ascii="Consolas" w:eastAsia="Times New Roman" w:hAnsi="Consolas" w:cs="Times New Roman"/>
+          <w:color w:val="156082" w:themeColor="accent1"/>
+          <w:kern w:val="0"/>
+          <w:sz w:val="21"/>
+          <w:szCs w:val="21"/>
+          <w:lang w:val="en-US" w:eastAsia="es-ES"/>
+          <w14:ligatures w14:val="none"/>
+        </w:rPr>
+        <w:t>export const</w:t>
+      </w:r>
+      <w:r>
+        <w:rPr>
+          <w:rFonts w:ascii="Consolas" w:eastAsia="Times New Roman" w:hAnsi="Consolas" w:cs="Times New Roman"/>
+          <w:color w:val="E4E4E4"/>
+          <w:kern w:val="0"/>
+          <w:sz w:val="21"/>
+          <w:szCs w:val="21"/>
+          <w:lang w:val="en-US" w:eastAsia="es-ES"/>
+          <w14:ligatures w14:val="none"/>
+        </w:rPr>
+        <w:t xml:space="preserve"> </w:t>
+      </w:r>
+      <w:proofErr w:type="spellStart"/>
+      <w:r>
+        <w:rPr>
+          <w:rFonts w:ascii="Consolas" w:eastAsia="Times New Roman" w:hAnsi="Consolas" w:cs="Times New Roman"/>
+          <w:color w:val="0F9ED5" w:themeColor="accent4"/>
+          <w:kern w:val="0"/>
+          <w:sz w:val="21"/>
+          <w:szCs w:val="21"/>
+          <w:lang w:val="en-US" w:eastAsia="es-ES"/>
+          <w14:ligatures w14:val="none"/>
+        </w:rPr>
+        <w:t>robotoFlex</w:t>
+      </w:r>
+      <w:proofErr w:type="spellEnd"/>
+      <w:r>
+        <w:rPr>
+          <w:rFonts w:ascii="Consolas" w:eastAsia="Times New Roman" w:hAnsi="Consolas" w:cs="Times New Roman"/>
+          <w:color w:val="0F9ED5" w:themeColor="accent4"/>
+          <w:kern w:val="0"/>
+          <w:sz w:val="21"/>
+          <w:szCs w:val="21"/>
+          <w:lang w:val="en-US" w:eastAsia="es-ES"/>
+          <w14:ligatures w14:val="none"/>
+        </w:rPr>
+        <w:t xml:space="preserve"> </w:t>
+      </w:r>
+      <w:r>
+        <w:rPr>
+          <w:rFonts w:ascii="Consolas" w:eastAsia="Times New Roman" w:hAnsi="Consolas" w:cs="Times New Roman"/>
+          <w:color w:val="0E2841" w:themeColor="text2"/>
+          <w:kern w:val="0"/>
+          <w:sz w:val="21"/>
+          <w:szCs w:val="21"/>
+          <w:lang w:val="en-US" w:eastAsia="es-ES"/>
+          <w14:ligatures w14:val="none"/>
+        </w:rPr>
+        <w:t xml:space="preserve">= </w:t>
+      </w:r>
+      <w:proofErr w:type="spellStart"/>
+      <w:r>
+        <w:rPr>
+          <w:rFonts w:ascii="Consolas" w:eastAsia="Times New Roman" w:hAnsi="Consolas" w:cs="Times New Roman"/>
+          <w:color w:val="E97132" w:themeColor="accent2"/>
+          <w:kern w:val="0"/>
+          <w:sz w:val="21"/>
+          <w:szCs w:val="21"/>
+          <w:lang w:val="en-US" w:eastAsia="es-ES"/>
+          <w14:ligatures w14:val="none"/>
+        </w:rPr>
+        <w:t>Roboto_</w:t>
+      </w:r>
+      <w:proofErr w:type="gramStart"/>
+      <w:r>
+        <w:rPr>
+          <w:rFonts w:ascii="Consolas" w:eastAsia="Times New Roman" w:hAnsi="Consolas" w:cs="Times New Roman"/>
+          <w:color w:val="E97132" w:themeColor="accent2"/>
+          <w:kern w:val="0"/>
+          <w:sz w:val="21"/>
+          <w:szCs w:val="21"/>
+          <w:lang w:val="en-US" w:eastAsia="es-ES"/>
+          <w14:ligatures w14:val="none"/>
+        </w:rPr>
+        <w:t>Flex</w:t>
+      </w:r>
+      <w:proofErr w:type="spellEnd"/>
+      <w:r>
+        <w:rPr>
+          <w:rFonts w:ascii="Consolas" w:eastAsia="Times New Roman" w:hAnsi="Consolas" w:cs="Times New Roman"/>
+          <w:color w:val="0E2841" w:themeColor="text2"/>
+          <w:kern w:val="0"/>
+          <w:sz w:val="21"/>
+          <w:szCs w:val="21"/>
+          <w:lang w:val="en-US" w:eastAsia="es-ES"/>
+          <w14:ligatures w14:val="none"/>
+        </w:rPr>
+        <w:t>({ weight</w:t>
+      </w:r>
+      <w:proofErr w:type="gramEnd"/>
+      <w:r>
+        <w:rPr>
+          <w:rFonts w:ascii="Consolas" w:eastAsia="Times New Roman" w:hAnsi="Consolas" w:cs="Times New Roman"/>
+          <w:color w:val="0E2841" w:themeColor="text2"/>
+          <w:kern w:val="0"/>
+          <w:sz w:val="21"/>
+          <w:szCs w:val="21"/>
+          <w:lang w:val="en-US" w:eastAsia="es-ES"/>
+          <w14:ligatures w14:val="none"/>
+        </w:rPr>
+        <w:t>: [</w:t>
+      </w:r>
+      <w:r>
+        <w:rPr>
+          <w:rFonts w:ascii="Consolas" w:eastAsia="Times New Roman" w:hAnsi="Consolas" w:cs="Times New Roman"/>
+          <w:color w:val="A02B93" w:themeColor="accent5"/>
+          <w:kern w:val="0"/>
+          <w:sz w:val="21"/>
+          <w:szCs w:val="21"/>
+          <w:lang w:val="en-US" w:eastAsia="es-ES"/>
+          <w14:ligatures w14:val="none"/>
+        </w:rPr>
+        <w:t>"500"</w:t>
+      </w:r>
+      <w:r>
+        <w:rPr>
+          <w:rFonts w:ascii="Consolas" w:eastAsia="Times New Roman" w:hAnsi="Consolas" w:cs="Times New Roman"/>
+          <w:color w:val="0E2841" w:themeColor="text2"/>
+          <w:kern w:val="0"/>
+          <w:sz w:val="21"/>
+          <w:szCs w:val="21"/>
+          <w:lang w:val="en-US" w:eastAsia="es-ES"/>
+          <w14:ligatures w14:val="none"/>
+        </w:rPr>
+        <w:t>], subsets: [</w:t>
+      </w:r>
+      <w:r>
+        <w:rPr>
+          <w:rFonts w:ascii="Consolas" w:eastAsia="Times New Roman" w:hAnsi="Consolas" w:cs="Times New Roman"/>
+          <w:color w:val="A02B93" w:themeColor="accent5"/>
+          <w:kern w:val="0"/>
+          <w:sz w:val="21"/>
+          <w:szCs w:val="21"/>
+          <w:lang w:val="en-US" w:eastAsia="es-ES"/>
+          <w14:ligatures w14:val="none"/>
+        </w:rPr>
+        <w:t>"</w:t>
+      </w:r>
+      <w:proofErr w:type="spellStart"/>
+      <w:r>
+        <w:rPr>
+          <w:rFonts w:ascii="Consolas" w:eastAsia="Times New Roman" w:hAnsi="Consolas" w:cs="Times New Roman"/>
+          <w:color w:val="A02B93" w:themeColor="accent5"/>
+          <w:kern w:val="0"/>
+          <w:sz w:val="21"/>
+          <w:szCs w:val="21"/>
+          <w:lang w:val="en-US" w:eastAsia="es-ES"/>
+          <w14:ligatures w14:val="none"/>
+        </w:rPr>
+        <w:t>latin</w:t>
+      </w:r>
+      <w:proofErr w:type="spellEnd"/>
+      <w:r>
+        <w:rPr>
+          <w:rFonts w:ascii="Consolas" w:eastAsia="Times New Roman" w:hAnsi="Consolas" w:cs="Times New Roman"/>
+          <w:color w:val="A02B93" w:themeColor="accent5"/>
+          <w:kern w:val="0"/>
+          <w:sz w:val="21"/>
+          <w:szCs w:val="21"/>
+          <w:lang w:val="en-US" w:eastAsia="es-ES"/>
+          <w14:ligatures w14:val="none"/>
+        </w:rPr>
+        <w:t>"</w:t>
+      </w:r>
+      <w:proofErr w:type="gramStart"/>
+      <w:r>
+        <w:rPr>
+          <w:rFonts w:ascii="Consolas" w:eastAsia="Times New Roman" w:hAnsi="Consolas" w:cs="Times New Roman"/>
+          <w:color w:val="0E2841" w:themeColor="text2"/>
+          <w:kern w:val="0"/>
+          <w:sz w:val="21"/>
+          <w:szCs w:val="21"/>
+          <w:lang w:val="en-US" w:eastAsia="es-ES"/>
+          <w14:ligatures w14:val="none"/>
+        </w:rPr>
+        <w:t>] }</w:t>
+      </w:r>
+      <w:proofErr w:type="gramEnd"/>
+      <w:r>
+        <w:rPr>
+          <w:rFonts w:ascii="Consolas" w:eastAsia="Times New Roman" w:hAnsi="Consolas" w:cs="Times New Roman"/>
+          <w:color w:val="0E2841" w:themeColor="text2"/>
+          <w:kern w:val="0"/>
+          <w:sz w:val="21"/>
+          <w:szCs w:val="21"/>
+          <w:lang w:val="en-US" w:eastAsia="es-ES"/>
+          <w14:ligatures w14:val="none"/>
+        </w:rPr>
+        <w:t>);</w:t>
+      </w:r>
+    </w:p>
+    <w:p>
+      <w:pPr>
+        <w:rPr>
+          <w:lang w:val="en-US"/>
+        </w:rPr>
+      </w:pPr>
+    </w:p>
+    <w:p>
+      <w:r>
+        <w:t>En cuanto al t</w:t>
+      </w:r>
+      <w:r>
+        <w:t>amaño de letra, por todo el proyecto hemos usado los siguientes tamaños:</w:t>
+      </w:r>
+    </w:p>
+    <w:tbl>
+      <w:tblPr>
+        <w:tblStyle w:val="Tablaconcuadrcula"/>
+        <w:tblW w:w="0" w:type="auto"/>
+        <w:tblLook w:val="04A0" w:firstRow="1" w:lastRow="0" w:firstColumn="1" w:lastColumn="0" w:noHBand="0" w:noVBand="1"/>
+      </w:tblPr>
+      <w:tblGrid>
+        <w:gridCol w:w="1242"/>
+        <w:gridCol w:w="1127"/>
+        <w:gridCol w:w="1534"/>
+        <w:gridCol w:w="2771"/>
+        <w:gridCol w:w="1820"/>
+      </w:tblGrid>
+      <w:tr>
+        <w:trPr>
+          <w:trHeight w:val="529"/>
+        </w:trPr>
+        <w:tc>
+          <w:tcPr>
+            <w:tcW w:w="1256" w:type="dxa"/>
+            <w:shd w:val="clear" w:color="auto" w:fill="156082" w:themeFill="accent1"/>
+            <w:vAlign w:val="center"/>
+          </w:tcPr>
+          <w:p>
+            <w:pPr>
+              <w:jc w:val="center"/>
+              <w:rPr>
+                <w:color w:val="FFFFFF" w:themeColor="background1"/>
+              </w:rPr>
+            </w:pPr>
+            <w:r>
+              <w:rPr>
+                <w:color w:val="FFFFFF" w:themeColor="background1"/>
+              </w:rPr>
+              <w:t>Etiqueta HTML</w:t>
+            </w:r>
+          </w:p>
+        </w:tc>
+        <w:tc>
+          <w:tcPr>
+            <w:tcW w:w="1149" w:type="dxa"/>
+            <w:shd w:val="clear" w:color="auto" w:fill="156082" w:themeFill="accent1"/>
+            <w:vAlign w:val="center"/>
+          </w:tcPr>
+          <w:p>
+            <w:pPr>
+              <w:jc w:val="center"/>
+              <w:rPr>
+                <w:color w:val="FFFFFF" w:themeColor="background1"/>
+              </w:rPr>
+            </w:pPr>
+            <w:r>
+              <w:rPr>
+                <w:color w:val="FFFFFF" w:themeColor="background1"/>
+              </w:rPr>
+              <w:t>Clase</w:t>
+            </w:r>
+          </w:p>
+        </w:tc>
+        <w:tc>
+          <w:tcPr>
+            <w:tcW w:w="1559" w:type="dxa"/>
+            <w:shd w:val="clear" w:color="auto" w:fill="156082" w:themeFill="accent1"/>
+            <w:vAlign w:val="center"/>
+          </w:tcPr>
+          <w:p>
+            <w:pPr>
+              <w:jc w:val="center"/>
+              <w:rPr>
+                <w:color w:val="FFFFFF" w:themeColor="background1"/>
+              </w:rPr>
+            </w:pPr>
+            <w:r>
+              <w:rPr>
+                <w:color w:val="FFFFFF" w:themeColor="background1"/>
+              </w:rPr>
+              <w:t>Tamaño</w:t>
+            </w:r>
+          </w:p>
+        </w:tc>
+        <w:tc>
+          <w:tcPr>
+            <w:tcW w:w="2694" w:type="dxa"/>
+            <w:shd w:val="clear" w:color="auto" w:fill="156082" w:themeFill="accent1"/>
+            <w:vAlign w:val="center"/>
+          </w:tcPr>
+          <w:p>
+            <w:pPr>
+              <w:jc w:val="center"/>
+              <w:rPr>
+                <w:color w:val="FFFFFF" w:themeColor="background1"/>
+              </w:rPr>
+            </w:pPr>
+            <w:r>
+              <w:rPr>
+                <w:color w:val="FFFFFF" w:themeColor="background1"/>
+              </w:rPr>
+              <w:t>Ejemplo</w:t>
+            </w:r>
+          </w:p>
+        </w:tc>
+        <w:tc>
+          <w:tcPr>
+            <w:tcW w:w="1836" w:type="dxa"/>
+            <w:shd w:val="clear" w:color="auto" w:fill="156082" w:themeFill="accent1"/>
+            <w:vAlign w:val="center"/>
+          </w:tcPr>
+          <w:p>
+            <w:pPr>
+              <w:jc w:val="center"/>
+              <w:rPr>
+                <w:color w:val="FFFFFF" w:themeColor="background1"/>
+              </w:rPr>
+            </w:pPr>
+            <w:r>
+              <w:rPr>
+                <w:color w:val="FFFFFF" w:themeColor="background1"/>
+              </w:rPr>
+              <w:t>Uso</w:t>
+            </w:r>
+          </w:p>
+        </w:tc>
+      </w:tr>
+      <w:tr>
+        <w:tc>
+          <w:tcPr>
+            <w:tcW w:w="1256" w:type="dxa"/>
+            <w:vAlign w:val="center"/>
+          </w:tcPr>
+          <w:p>
+            <w:pPr>
+              <w:jc w:val="center"/>
+            </w:pPr>
+            <w:r>
+              <w:t>H1</w:t>
+            </w:r>
+          </w:p>
+        </w:tc>
+        <w:tc>
+          <w:tcPr>
+            <w:tcW w:w="1149" w:type="dxa"/>
+            <w:vAlign w:val="center"/>
+          </w:tcPr>
+          <w:p>
+            <w:pPr>
+              <w:jc w:val="center"/>
+            </w:pPr>
+            <w:r>
+              <w:t>text-4xl</w:t>
+            </w:r>
+          </w:p>
+        </w:tc>
+        <w:tc>
+          <w:tcPr>
+            <w:tcW w:w="1559" w:type="dxa"/>
+            <w:vAlign w:val="center"/>
+          </w:tcPr>
+          <w:p>
+            <w:pPr>
+              <w:jc w:val="center"/>
+            </w:pPr>
+            <w:r>
+              <w:t>2.25rem</w:t>
+            </w:r>
+          </w:p>
+          <w:p>
+            <w:pPr>
+              <w:jc w:val="center"/>
+            </w:pPr>
+            <w:r>
+              <w:t>(36px)</w:t>
+            </w:r>
+          </w:p>
+        </w:tc>
+        <w:tc>
+          <w:tcPr>
+            <w:tcW w:w="2694" w:type="dxa"/>
+            <w:vAlign w:val="center"/>
+          </w:tcPr>
+          <w:p>
+            <w:pPr>
+              <w:rPr>
+                <w:sz w:val="72"/>
+                <w:szCs w:val="72"/>
+              </w:rPr>
+            </w:pPr>
+            <w:r>
+              <w:rPr>
+                <w:sz w:val="72"/>
+                <w:szCs w:val="72"/>
+              </w:rPr>
+              <w:t>Ejemplo</w:t>
+            </w:r>
+          </w:p>
+        </w:tc>
+        <w:tc>
+          <w:tcPr>
+            <w:tcW w:w="1836" w:type="dxa"/>
+            <w:vAlign w:val="center"/>
+          </w:tcPr>
+          <w:p>
+            <w:r>
+              <w:t>Títulos principales</w:t>
+            </w:r>
+          </w:p>
+        </w:tc>
+      </w:tr>
+      <w:tr>
+        <w:tc>
+          <w:tcPr>
+            <w:tcW w:w="1256" w:type="dxa"/>
+            <w:vAlign w:val="center"/>
+          </w:tcPr>
+          <w:p>
+            <w:pPr>
+              <w:jc w:val="center"/>
+            </w:pPr>
+            <w:r>
+              <w:t>H2</w:t>
+            </w:r>
+          </w:p>
+        </w:tc>
+        <w:tc>
+          <w:tcPr>
+            <w:tcW w:w="1149" w:type="dxa"/>
+            <w:vAlign w:val="center"/>
+          </w:tcPr>
+          <w:p>
+            <w:pPr>
+              <w:jc w:val="center"/>
+            </w:pPr>
+            <w:r>
+              <w:t>text-3xl</w:t>
+            </w:r>
+          </w:p>
+        </w:tc>
+        <w:tc>
+          <w:tcPr>
+            <w:tcW w:w="1559" w:type="dxa"/>
+            <w:vAlign w:val="center"/>
+          </w:tcPr>
+          <w:p>
+            <w:pPr>
+              <w:jc w:val="center"/>
+            </w:pPr>
+            <w:r>
+              <w:t>1.875rem (30px)</w:t>
+            </w:r>
+          </w:p>
+        </w:tc>
+        <w:tc>
+          <w:tcPr>
+            <w:tcW w:w="2694" w:type="dxa"/>
+            <w:vAlign w:val="center"/>
+          </w:tcPr>
+          <w:p>
+            <w:pPr>
+              <w:rPr>
+                <w:sz w:val="60"/>
+                <w:szCs w:val="60"/>
+              </w:rPr>
+            </w:pPr>
+            <w:r>
+              <w:rPr>
+                <w:sz w:val="60"/>
+                <w:szCs w:val="60"/>
+              </w:rPr>
+              <w:t>Ejemplo</w:t>
+            </w:r>
+          </w:p>
+        </w:tc>
+        <w:tc>
+          <w:tcPr>
+            <w:tcW w:w="1836" w:type="dxa"/>
+            <w:vAlign w:val="center"/>
+          </w:tcPr>
+          <w:p>
+            <w:r>
+              <w:t>Secciones</w:t>
+            </w:r>
+          </w:p>
+        </w:tc>
+      </w:tr>
+      <w:tr>
+        <w:tc>
+          <w:tcPr>
+            <w:tcW w:w="1256" w:type="dxa"/>
+            <w:vAlign w:val="center"/>
+          </w:tcPr>
+          <w:p>
+            <w:pPr>
+              <w:jc w:val="center"/>
+            </w:pPr>
+            <w:r>
+              <w:t>H3</w:t>
+            </w:r>
+          </w:p>
+        </w:tc>
+        <w:tc>
+          <w:tcPr>
+            <w:tcW w:w="1149" w:type="dxa"/>
+            <w:vAlign w:val="center"/>
+          </w:tcPr>
+          <w:p>
+            <w:pPr>
+              <w:jc w:val="center"/>
+            </w:pPr>
+            <w:r>
+              <w:t>text-2xl</w:t>
+            </w:r>
+          </w:p>
+        </w:tc>
+        <w:tc>
+          <w:tcPr>
+            <w:tcW w:w="1559" w:type="dxa"/>
+            <w:vAlign w:val="center"/>
+          </w:tcPr>
+          <w:p>
+            <w:pPr>
+              <w:jc w:val="center"/>
+            </w:pPr>
+            <w:r>
+              <w:t>1.5rem (24px)</w:t>
+            </w:r>
+          </w:p>
+        </w:tc>
+        <w:tc>
+          <w:tcPr>
+            <w:tcW w:w="2694" w:type="dxa"/>
+            <w:vAlign w:val="center"/>
+          </w:tcPr>
+          <w:p>
+            <w:pPr>
+              <w:rPr>
+                <w:sz w:val="48"/>
+                <w:szCs w:val="48"/>
+              </w:rPr>
+            </w:pPr>
+            <w:r>
+              <w:rPr>
+                <w:sz w:val="48"/>
+                <w:szCs w:val="48"/>
+              </w:rPr>
+              <w:t>Ejemplo</w:t>
+            </w:r>
+          </w:p>
+        </w:tc>
+        <w:tc>
+          <w:tcPr>
+            <w:tcW w:w="1836" w:type="dxa"/>
+            <w:vAlign w:val="center"/>
+          </w:tcPr>
+          <w:p>
+            <w:r>
+              <w:t>Subsecciones</w:t>
+            </w:r>
+          </w:p>
+        </w:tc>
+      </w:tr>
+      <w:tr>
+        <w:tc>
+          <w:tcPr>
+            <w:tcW w:w="1256" w:type="dxa"/>
+            <w:vAlign w:val="center"/>
+          </w:tcPr>
+          <w:p>
+            <w:pPr>
+              <w:jc w:val="center"/>
+            </w:pPr>
+            <w:r>
+              <w:t>H4</w:t>
+            </w:r>
+          </w:p>
+        </w:tc>
+        <w:tc>
+          <w:tcPr>
+            <w:tcW w:w="1149" w:type="dxa"/>
+            <w:vAlign w:val="center"/>
+          </w:tcPr>
+          <w:p>
+            <w:pPr>
+              <w:jc w:val="center"/>
+            </w:pPr>
+            <w:proofErr w:type="spellStart"/>
+            <w:r>
+              <w:t>text-xl</w:t>
+            </w:r>
+            <w:proofErr w:type="spellEnd"/>
+          </w:p>
+        </w:tc>
+        <w:tc>
+          <w:tcPr>
+            <w:tcW w:w="1559" w:type="dxa"/>
+            <w:vAlign w:val="center"/>
+          </w:tcPr>
+          <w:p>
+            <w:pPr>
+              <w:jc w:val="center"/>
+            </w:pPr>
+            <w:r>
+              <w:t>1.25rem (20px)</w:t>
+            </w:r>
+          </w:p>
+        </w:tc>
+        <w:tc>
+          <w:tcPr>
+            <w:tcW w:w="2694" w:type="dxa"/>
+            <w:vAlign w:val="center"/>
+          </w:tcPr>
+          <w:p>
+            <w:pPr>
+              <w:rPr>
+                <w:sz w:val="40"/>
+                <w:szCs w:val="40"/>
+              </w:rPr>
+            </w:pPr>
+            <w:r>
+              <w:rPr>
+                <w:sz w:val="40"/>
+                <w:szCs w:val="40"/>
+              </w:rPr>
+              <w:t>Ejemplo</w:t>
+            </w:r>
+          </w:p>
+        </w:tc>
+        <w:tc>
+          <w:tcPr>
+            <w:tcW w:w="1836" w:type="dxa"/>
+            <w:vAlign w:val="center"/>
+          </w:tcPr>
+          <w:p>
+            <w:r>
+              <w:t>Subtítulos</w:t>
+            </w:r>
+          </w:p>
+        </w:tc>
+      </w:tr>
+      <w:tr>
+        <w:tc>
+          <w:tcPr>
+            <w:tcW w:w="1256" w:type="dxa"/>
+            <w:vAlign w:val="center"/>
+          </w:tcPr>
+          <w:p>
+            <w:pPr>
+              <w:jc w:val="center"/>
+            </w:pPr>
+            <w:proofErr w:type="spellStart"/>
+            <w:r>
+              <w:t>body</w:t>
+            </w:r>
+            <w:proofErr w:type="spellEnd"/>
+          </w:p>
+        </w:tc>
+        <w:tc>
+          <w:tcPr>
+            <w:tcW w:w="1149" w:type="dxa"/>
+            <w:vAlign w:val="center"/>
+          </w:tcPr>
+          <w:p>
+            <w:pPr>
+              <w:jc w:val="center"/>
+            </w:pPr>
+            <w:proofErr w:type="spellStart"/>
+            <w:r>
+              <w:t>text</w:t>
+            </w:r>
+            <w:proofErr w:type="spellEnd"/>
+            <w:r>
+              <w:t>-base</w:t>
+            </w:r>
+          </w:p>
+        </w:tc>
+        <w:tc>
+          <w:tcPr>
+            <w:tcW w:w="1559" w:type="dxa"/>
+            <w:vAlign w:val="center"/>
+          </w:tcPr>
+          <w:p>
+            <w:pPr>
+              <w:jc w:val="center"/>
+            </w:pPr>
+            <w:r>
+              <w:t>1rem</w:t>
+            </w:r>
+          </w:p>
+          <w:p>
+            <w:pPr>
+              <w:jc w:val="center"/>
+            </w:pPr>
+            <w:r>
+              <w:t>(16px)</w:t>
+            </w:r>
+          </w:p>
+        </w:tc>
+        <w:tc>
+          <w:tcPr>
+            <w:tcW w:w="2694" w:type="dxa"/>
+            <w:vAlign w:val="center"/>
+          </w:tcPr>
+          <w:p>
+            <w:pPr>
+              <w:rPr>
+                <w:sz w:val="32"/>
+                <w:szCs w:val="32"/>
+              </w:rPr>
+            </w:pPr>
+            <w:r>
+              <w:rPr>
+                <w:sz w:val="32"/>
+                <w:szCs w:val="32"/>
+              </w:rPr>
+              <w:t>Ejemplo</w:t>
+            </w:r>
+          </w:p>
+        </w:tc>
+        <w:tc>
+          <w:tcPr>
+            <w:tcW w:w="1836" w:type="dxa"/>
+            <w:vAlign w:val="center"/>
+          </w:tcPr>
+          <w:p>
+            <w:r>
+              <w:t>Texto normal</w:t>
+            </w:r>
+          </w:p>
+        </w:tc>
+      </w:tr>
+      <w:tr>
+        <w:tc>
+          <w:tcPr>
+            <w:tcW w:w="1256" w:type="dxa"/>
+            <w:vAlign w:val="center"/>
+          </w:tcPr>
+          <w:p>
+            <w:pPr>
+              <w:jc w:val="center"/>
+            </w:pPr>
+            <w:proofErr w:type="spellStart"/>
+            <w:r>
+              <w:t>small</w:t>
+            </w:r>
+            <w:proofErr w:type="spellEnd"/>
+          </w:p>
+        </w:tc>
+        <w:tc>
+          <w:tcPr>
+            <w:tcW w:w="1149" w:type="dxa"/>
+            <w:vAlign w:val="center"/>
+          </w:tcPr>
+          <w:p>
+            <w:pPr>
+              <w:jc w:val="center"/>
+            </w:pPr>
+            <w:proofErr w:type="spellStart"/>
+            <w:r>
+              <w:t>text-sm</w:t>
+            </w:r>
+            <w:proofErr w:type="spellEnd"/>
+          </w:p>
+        </w:tc>
+        <w:tc>
+          <w:tcPr>
+            <w:tcW w:w="1559" w:type="dxa"/>
+            <w:vAlign w:val="center"/>
+          </w:tcPr>
+          <w:p>
+            <w:pPr>
+              <w:jc w:val="center"/>
+            </w:pPr>
+            <w:r>
+              <w:t>0.875rem (14px)</w:t>
+            </w:r>
+          </w:p>
+        </w:tc>
+        <w:tc>
+          <w:tcPr>
+            <w:tcW w:w="2694" w:type="dxa"/>
+            <w:vAlign w:val="center"/>
+          </w:tcPr>
+          <w:p>
+            <w:pPr>
+              <w:rPr>
+                <w:sz w:val="28"/>
+                <w:szCs w:val="28"/>
+              </w:rPr>
+            </w:pPr>
+            <w:r>
+              <w:rPr>
+                <w:sz w:val="28"/>
+                <w:szCs w:val="28"/>
+              </w:rPr>
+              <w:t>Ejemplo</w:t>
+            </w:r>
+          </w:p>
+        </w:tc>
+        <w:tc>
+          <w:tcPr>
+            <w:tcW w:w="1836" w:type="dxa"/>
+            <w:vAlign w:val="center"/>
+          </w:tcPr>
+          <w:p>
+            <w:r>
+              <w:t>Texto secundario, etiquetas</w:t>
+            </w:r>
+          </w:p>
+        </w:tc>
+      </w:tr>
+    </w:tbl>
+    <w:p/>
+    <w:p/>
+    <w:p>
+      <w:pPr>
+        <w:pStyle w:val="Ttulo2"/>
+      </w:pPr>
+      <w:r>
         <w:t>5.</w:t>
       </w:r>
       <w:r>
@@ -27436,6 +28979,7 @@
       </w:pPr>
       <w:bookmarkStart w:id="26" w:name="_Toc227824463"/>
       <w:r>
+        <w:lastRenderedPageBreak/>
         <w:t>5.</w:t>
       </w:r>
       <w:r>
@@ -34854,6 +36398,25 @@
     <w:pitch w:val="variable"/>
     <w:sig w:usb0="00000003" w:usb1="02000000" w:usb2="08000000" w:usb3="00000000" w:csb0="00000001" w:csb1="00000000"/>
   </w:font>
+  <w:font w:name="Roboto">
+    <w:charset w:val="00"/>
+    <w:family w:val="auto"/>
+    <w:pitch w:val="variable"/>
+    <w:sig w:usb0="E0000AFF" w:usb1="5000217F" w:usb2="00000021" w:usb3="00000000" w:csb0="0000019F" w:csb1="00000000"/>
+  </w:font>
+  <w:font w:name="Roboto Bold">
+    <w:panose1 w:val="00000000000000000000"/>
+    <w:charset w:val="00"/>
+    <w:family w:val="roman"/>
+    <w:notTrueType/>
+    <w:pitch w:val="default"/>
+  </w:font>
+  <w:font w:name="Roboto Flex Medium">
+    <w:charset w:val="00"/>
+    <w:family w:val="auto"/>
+    <w:pitch w:val="variable"/>
+    <w:sig w:usb0="A00002FF" w:usb1="5000006B" w:usb2="00000020" w:usb3="00000000" w:csb0="0000019F" w:csb1="00000000"/>
+  </w:font>
 </w:fonts>
 </file>
 
@@ -34883,7 +36446,7 @@
     <w:rsid w:val="0073319B"/>
     <w:rsid w:val="007E3F9C"/>
     <w:rsid w:val="007E6509"/>
-    <w:rsid w:val="00851509"/>
+    <w:rsid w:val="008C29E1"/>
     <w:rsid w:val="00AA5E59"/>
     <w:rsid w:val="00C66654"/>
     <w:rsid w:val="00D04E45"/>

</xml_diff>

<commit_message>
docs: style guide - icons
</commit_message>
<xml_diff>
--- a/documentacion proyecto/Proyecto Final - Memoria proyecto Bsnessapp.docx
+++ b/documentacion proyecto/Proyecto Final - Memoria proyecto Bsnessapp.docx
@@ -4103,7 +4103,7 @@
           <w:r>
             <w:fldChar w:fldCharType="separate"/>
           </w:r>
-          <w:hyperlink w:anchor="_Toc227824437" w:history="1">
+          <w:hyperlink w:anchor="_Toc227938733" w:history="1">
             <w:r>
               <w:rPr>
                 <w:rStyle w:val="Hipervnculo"/>
@@ -4130,7 +4130,7 @@
                 <w:noProof/>
                 <w:webHidden/>
               </w:rPr>
-              <w:instrText xml:space="preserve"> PAGEREF _Toc227824437 \h </w:instrText>
+              <w:instrText xml:space="preserve"> PAGEREF _Toc227938733 \h </w:instrText>
             </w:r>
             <w:r>
               <w:rPr>
@@ -4150,7 +4150,7 @@
                 <w:noProof/>
                 <w:webHidden/>
               </w:rPr>
-              <w:t>2</w:t>
+              <w:t>3</w:t>
             </w:r>
             <w:r>
               <w:rPr>
@@ -4175,7 +4175,7 @@
               <w:lang w:eastAsia="es-ES"/>
             </w:rPr>
           </w:pPr>
-          <w:hyperlink w:anchor="_Toc227824438" w:history="1">
+          <w:hyperlink w:anchor="_Toc227938734" w:history="1">
             <w:r>
               <w:rPr>
                 <w:rStyle w:val="Hipervnculo"/>
@@ -4202,7 +4202,7 @@
                 <w:noProof/>
                 <w:webHidden/>
               </w:rPr>
-              <w:instrText xml:space="preserve"> PAGEREF _Toc227824438 \h </w:instrText>
+              <w:instrText xml:space="preserve"> PAGEREF _Toc227938734 \h </w:instrText>
             </w:r>
             <w:r>
               <w:rPr>
@@ -4222,7 +4222,7 @@
                 <w:noProof/>
                 <w:webHidden/>
               </w:rPr>
-              <w:t>2</w:t>
+              <w:t>3</w:t>
             </w:r>
             <w:r>
               <w:rPr>
@@ -4247,7 +4247,7 @@
               <w:lang w:eastAsia="es-ES"/>
             </w:rPr>
           </w:pPr>
-          <w:hyperlink w:anchor="_Toc227824439" w:history="1">
+          <w:hyperlink w:anchor="_Toc227938735" w:history="1">
             <w:r>
               <w:rPr>
                 <w:rStyle w:val="Hipervnculo"/>
@@ -4274,7 +4274,7 @@
                 <w:noProof/>
                 <w:webHidden/>
               </w:rPr>
-              <w:instrText xml:space="preserve"> PAGEREF _Toc227824439 \h </w:instrText>
+              <w:instrText xml:space="preserve"> PAGEREF _Toc227938735 \h </w:instrText>
             </w:r>
             <w:r>
               <w:rPr>
@@ -4294,7 +4294,7 @@
                 <w:noProof/>
                 <w:webHidden/>
               </w:rPr>
-              <w:t>3</w:t>
+              <w:t>4</w:t>
             </w:r>
             <w:r>
               <w:rPr>
@@ -4319,7 +4319,7 @@
               <w:lang w:eastAsia="es-ES"/>
             </w:rPr>
           </w:pPr>
-          <w:hyperlink w:anchor="_Toc227824440" w:history="1">
+          <w:hyperlink w:anchor="_Toc227938736" w:history="1">
             <w:r>
               <w:rPr>
                 <w:rStyle w:val="Hipervnculo"/>
@@ -4346,7 +4346,7 @@
                 <w:noProof/>
                 <w:webHidden/>
               </w:rPr>
-              <w:instrText xml:space="preserve"> PAGEREF _Toc227824440 \h </w:instrText>
+              <w:instrText xml:space="preserve"> PAGEREF _Toc227938736 \h </w:instrText>
             </w:r>
             <w:r>
               <w:rPr>
@@ -4366,7 +4366,7 @@
                 <w:noProof/>
                 <w:webHidden/>
               </w:rPr>
-              <w:t>4</w:t>
+              <w:t>5</w:t>
             </w:r>
             <w:r>
               <w:rPr>
@@ -4391,7 +4391,7 @@
               <w:lang w:eastAsia="es-ES"/>
             </w:rPr>
           </w:pPr>
-          <w:hyperlink w:anchor="_Toc227824441" w:history="1">
+          <w:hyperlink w:anchor="_Toc227938737" w:history="1">
             <w:r>
               <w:rPr>
                 <w:rStyle w:val="Hipervnculo"/>
@@ -4418,7 +4418,7 @@
                 <w:noProof/>
                 <w:webHidden/>
               </w:rPr>
-              <w:instrText xml:space="preserve"> PAGEREF _Toc227824441 \h </w:instrText>
+              <w:instrText xml:space="preserve"> PAGEREF _Toc227938737 \h </w:instrText>
             </w:r>
             <w:r>
               <w:rPr>
@@ -4438,7 +4438,7 @@
                 <w:noProof/>
                 <w:webHidden/>
               </w:rPr>
-              <w:t>5</w:t>
+              <w:t>6</w:t>
             </w:r>
             <w:r>
               <w:rPr>
@@ -4463,7 +4463,7 @@
               <w:lang w:eastAsia="es-ES"/>
             </w:rPr>
           </w:pPr>
-          <w:hyperlink w:anchor="_Toc227824442" w:history="1">
+          <w:hyperlink w:anchor="_Toc227938738" w:history="1">
             <w:r>
               <w:rPr>
                 <w:rStyle w:val="Hipervnculo"/>
@@ -4490,7 +4490,7 @@
                 <w:noProof/>
                 <w:webHidden/>
               </w:rPr>
-              <w:instrText xml:space="preserve"> PAGEREF _Toc227824442 \h </w:instrText>
+              <w:instrText xml:space="preserve"> PAGEREF _Toc227938738 \h </w:instrText>
             </w:r>
             <w:r>
               <w:rPr>
@@ -4510,7 +4510,7 @@
                 <w:noProof/>
                 <w:webHidden/>
               </w:rPr>
-              <w:t>5</w:t>
+              <w:t>6</w:t>
             </w:r>
             <w:r>
               <w:rPr>
@@ -4535,7 +4535,7 @@
               <w:lang w:eastAsia="es-ES"/>
             </w:rPr>
           </w:pPr>
-          <w:hyperlink w:anchor="_Toc227824443" w:history="1">
+          <w:hyperlink w:anchor="_Toc227938739" w:history="1">
             <w:r>
               <w:rPr>
                 <w:rStyle w:val="Hipervnculo"/>
@@ -4564,7 +4564,7 @@
                 <w:noProof/>
                 <w:webHidden/>
               </w:rPr>
-              <w:instrText xml:space="preserve"> PAGEREF _Toc227824443 \h </w:instrText>
+              <w:instrText xml:space="preserve"> PAGEREF _Toc227938739 \h </w:instrText>
             </w:r>
             <w:r>
               <w:rPr>
@@ -4584,7 +4584,7 @@
                 <w:noProof/>
                 <w:webHidden/>
               </w:rPr>
-              <w:t>7</w:t>
+              <w:t>8</w:t>
             </w:r>
             <w:r>
               <w:rPr>
@@ -4609,7 +4609,7 @@
               <w:lang w:eastAsia="es-ES"/>
             </w:rPr>
           </w:pPr>
-          <w:hyperlink w:anchor="_Toc227824444" w:history="1">
+          <w:hyperlink w:anchor="_Toc227938740" w:history="1">
             <w:r>
               <w:rPr>
                 <w:rStyle w:val="Hipervnculo"/>
@@ -4636,7 +4636,7 @@
                 <w:noProof/>
                 <w:webHidden/>
               </w:rPr>
-              <w:instrText xml:space="preserve"> PAGEREF _Toc227824444 \h </w:instrText>
+              <w:instrText xml:space="preserve"> PAGEREF _Toc227938740 \h </w:instrText>
             </w:r>
             <w:r>
               <w:rPr>
@@ -4656,7 +4656,7 @@
                 <w:noProof/>
                 <w:webHidden/>
               </w:rPr>
-              <w:t>7</w:t>
+              <w:t>8</w:t>
             </w:r>
             <w:r>
               <w:rPr>
@@ -4681,7 +4681,7 @@
               <w:lang w:eastAsia="es-ES"/>
             </w:rPr>
           </w:pPr>
-          <w:hyperlink w:anchor="_Toc227824445" w:history="1">
+          <w:hyperlink w:anchor="_Toc227938741" w:history="1">
             <w:r>
               <w:rPr>
                 <w:rStyle w:val="Hipervnculo"/>
@@ -4708,7 +4708,7 @@
                 <w:noProof/>
                 <w:webHidden/>
               </w:rPr>
-              <w:instrText xml:space="preserve"> PAGEREF _Toc227824445 \h </w:instrText>
+              <w:instrText xml:space="preserve"> PAGEREF _Toc227938741 \h </w:instrText>
             </w:r>
             <w:r>
               <w:rPr>
@@ -4728,7 +4728,7 @@
                 <w:noProof/>
                 <w:webHidden/>
               </w:rPr>
-              <w:t>7</w:t>
+              <w:t>8</w:t>
             </w:r>
             <w:r>
               <w:rPr>
@@ -4753,7 +4753,7 @@
               <w:lang w:eastAsia="es-ES"/>
             </w:rPr>
           </w:pPr>
-          <w:hyperlink w:anchor="_Toc227824446" w:history="1">
+          <w:hyperlink w:anchor="_Toc227938742" w:history="1">
             <w:r>
               <w:rPr>
                 <w:rStyle w:val="Hipervnculo"/>
@@ -4780,7 +4780,7 @@
                 <w:noProof/>
                 <w:webHidden/>
               </w:rPr>
-              <w:instrText xml:space="preserve"> PAGEREF _Toc227824446 \h </w:instrText>
+              <w:instrText xml:space="preserve"> PAGEREF _Toc227938742 \h </w:instrText>
             </w:r>
             <w:r>
               <w:rPr>
@@ -4800,7 +4800,7 @@
                 <w:noProof/>
                 <w:webHidden/>
               </w:rPr>
-              <w:t>8</w:t>
+              <w:t>9</w:t>
             </w:r>
             <w:r>
               <w:rPr>
@@ -4825,7 +4825,7 @@
               <w:lang w:eastAsia="es-ES"/>
             </w:rPr>
           </w:pPr>
-          <w:hyperlink w:anchor="_Toc227824447" w:history="1">
+          <w:hyperlink w:anchor="_Toc227938743" w:history="1">
             <w:r>
               <w:rPr>
                 <w:rStyle w:val="Hipervnculo"/>
@@ -4852,7 +4852,7 @@
                 <w:noProof/>
                 <w:webHidden/>
               </w:rPr>
-              <w:instrText xml:space="preserve"> PAGEREF _Toc227824447 \h </w:instrText>
+              <w:instrText xml:space="preserve"> PAGEREF _Toc227938743 \h </w:instrText>
             </w:r>
             <w:r>
               <w:rPr>
@@ -4872,7 +4872,7 @@
                 <w:noProof/>
                 <w:webHidden/>
               </w:rPr>
-              <w:t>8</w:t>
+              <w:t>9</w:t>
             </w:r>
             <w:r>
               <w:rPr>
@@ -4897,7 +4897,7 @@
               <w:lang w:eastAsia="es-ES"/>
             </w:rPr>
           </w:pPr>
-          <w:hyperlink w:anchor="_Toc227824448" w:history="1">
+          <w:hyperlink w:anchor="_Toc227938744" w:history="1">
             <w:r>
               <w:rPr>
                 <w:rStyle w:val="Hipervnculo"/>
@@ -4924,7 +4924,7 @@
                 <w:noProof/>
                 <w:webHidden/>
               </w:rPr>
-              <w:instrText xml:space="preserve"> PAGEREF _Toc227824448 \h </w:instrText>
+              <w:instrText xml:space="preserve"> PAGEREF _Toc227938744 \h </w:instrText>
             </w:r>
             <w:r>
               <w:rPr>
@@ -4944,7 +4944,7 @@
                 <w:noProof/>
                 <w:webHidden/>
               </w:rPr>
-              <w:t>9</w:t>
+              <w:t>10</w:t>
             </w:r>
             <w:r>
               <w:rPr>
@@ -4969,7 +4969,7 @@
               <w:lang w:eastAsia="es-ES"/>
             </w:rPr>
           </w:pPr>
-          <w:hyperlink w:anchor="_Toc227824449" w:history="1">
+          <w:hyperlink w:anchor="_Toc227938745" w:history="1">
             <w:r>
               <w:rPr>
                 <w:rStyle w:val="Hipervnculo"/>
@@ -4996,7 +4996,7 @@
                 <w:noProof/>
                 <w:webHidden/>
               </w:rPr>
-              <w:instrText xml:space="preserve"> PAGEREF _Toc227824449 \h </w:instrText>
+              <w:instrText xml:space="preserve"> PAGEREF _Toc227938745 \h </w:instrText>
             </w:r>
             <w:r>
               <w:rPr>
@@ -5016,7 +5016,7 @@
                 <w:noProof/>
                 <w:webHidden/>
               </w:rPr>
-              <w:t>9</w:t>
+              <w:t>10</w:t>
             </w:r>
             <w:r>
               <w:rPr>
@@ -5041,7 +5041,7 @@
               <w:lang w:eastAsia="es-ES"/>
             </w:rPr>
           </w:pPr>
-          <w:hyperlink w:anchor="_Toc227824450" w:history="1">
+          <w:hyperlink w:anchor="_Toc227938746" w:history="1">
             <w:r>
               <w:rPr>
                 <w:rStyle w:val="Hipervnculo"/>
@@ -5068,7 +5068,7 @@
                 <w:noProof/>
                 <w:webHidden/>
               </w:rPr>
-              <w:instrText xml:space="preserve"> PAGEREF _Toc227824450 \h </w:instrText>
+              <w:instrText xml:space="preserve"> PAGEREF _Toc227938746 \h </w:instrText>
             </w:r>
             <w:r>
               <w:rPr>
@@ -5088,7 +5088,7 @@
                 <w:noProof/>
                 <w:webHidden/>
               </w:rPr>
-              <w:t>9</w:t>
+              <w:t>10</w:t>
             </w:r>
             <w:r>
               <w:rPr>
@@ -5113,7 +5113,7 @@
               <w:lang w:eastAsia="es-ES"/>
             </w:rPr>
           </w:pPr>
-          <w:hyperlink w:anchor="_Toc227824451" w:history="1">
+          <w:hyperlink w:anchor="_Toc227938747" w:history="1">
             <w:r>
               <w:rPr>
                 <w:rStyle w:val="Hipervnculo"/>
@@ -5140,7 +5140,7 @@
                 <w:noProof/>
                 <w:webHidden/>
               </w:rPr>
-              <w:instrText xml:space="preserve"> PAGEREF _Toc227824451 \h </w:instrText>
+              <w:instrText xml:space="preserve"> PAGEREF _Toc227938747 \h </w:instrText>
             </w:r>
             <w:r>
               <w:rPr>
@@ -5160,7 +5160,7 @@
                 <w:noProof/>
                 <w:webHidden/>
               </w:rPr>
-              <w:t>9</w:t>
+              <w:t>10</w:t>
             </w:r>
             <w:r>
               <w:rPr>
@@ -5185,7 +5185,7 @@
               <w:lang w:eastAsia="es-ES"/>
             </w:rPr>
           </w:pPr>
-          <w:hyperlink w:anchor="_Toc227824452" w:history="1">
+          <w:hyperlink w:anchor="_Toc227938748" w:history="1">
             <w:r>
               <w:rPr>
                 <w:rStyle w:val="Hipervnculo"/>
@@ -5212,7 +5212,7 @@
                 <w:noProof/>
                 <w:webHidden/>
               </w:rPr>
-              <w:instrText xml:space="preserve"> PAGEREF _Toc227824452 \h </w:instrText>
+              <w:instrText xml:space="preserve"> PAGEREF _Toc227938748 \h </w:instrText>
             </w:r>
             <w:r>
               <w:rPr>
@@ -5232,7 +5232,7 @@
                 <w:noProof/>
                 <w:webHidden/>
               </w:rPr>
-              <w:t>10</w:t>
+              <w:t>11</w:t>
             </w:r>
             <w:r>
               <w:rPr>
@@ -5257,7 +5257,7 @@
               <w:lang w:eastAsia="es-ES"/>
             </w:rPr>
           </w:pPr>
-          <w:hyperlink w:anchor="_Toc227824453" w:history="1">
+          <w:hyperlink w:anchor="_Toc227938749" w:history="1">
             <w:r>
               <w:rPr>
                 <w:rStyle w:val="Hipervnculo"/>
@@ -5284,7 +5284,7 @@
                 <w:noProof/>
                 <w:webHidden/>
               </w:rPr>
-              <w:instrText xml:space="preserve"> PAGEREF _Toc227824453 \h </w:instrText>
+              <w:instrText xml:space="preserve"> PAGEREF _Toc227938749 \h </w:instrText>
             </w:r>
             <w:r>
               <w:rPr>
@@ -5304,7 +5304,7 @@
                 <w:noProof/>
                 <w:webHidden/>
               </w:rPr>
-              <w:t>10</w:t>
+              <w:t>11</w:t>
             </w:r>
             <w:r>
               <w:rPr>
@@ -5329,7 +5329,7 @@
               <w:lang w:eastAsia="es-ES"/>
             </w:rPr>
           </w:pPr>
-          <w:hyperlink w:anchor="_Toc227824454" w:history="1">
+          <w:hyperlink w:anchor="_Toc227938750" w:history="1">
             <w:r>
               <w:rPr>
                 <w:rStyle w:val="Hipervnculo"/>
@@ -5356,7 +5356,7 @@
                 <w:noProof/>
                 <w:webHidden/>
               </w:rPr>
-              <w:instrText xml:space="preserve"> PAGEREF _Toc227824454 \h </w:instrText>
+              <w:instrText xml:space="preserve"> PAGEREF _Toc227938750 \h </w:instrText>
             </w:r>
             <w:r>
               <w:rPr>
@@ -5376,7 +5376,7 @@
                 <w:noProof/>
                 <w:webHidden/>
               </w:rPr>
-              <w:t>11</w:t>
+              <w:t>12</w:t>
             </w:r>
             <w:r>
               <w:rPr>
@@ -5401,7 +5401,7 @@
               <w:lang w:eastAsia="es-ES"/>
             </w:rPr>
           </w:pPr>
-          <w:hyperlink w:anchor="_Toc227824455" w:history="1">
+          <w:hyperlink w:anchor="_Toc227938751" w:history="1">
             <w:r>
               <w:rPr>
                 <w:rStyle w:val="Hipervnculo"/>
@@ -5428,7 +5428,7 @@
                 <w:noProof/>
                 <w:webHidden/>
               </w:rPr>
-              <w:instrText xml:space="preserve"> PAGEREF _Toc227824455 \h </w:instrText>
+              <w:instrText xml:space="preserve"> PAGEREF _Toc227938751 \h </w:instrText>
             </w:r>
             <w:r>
               <w:rPr>
@@ -5448,7 +5448,7 @@
                 <w:noProof/>
                 <w:webHidden/>
               </w:rPr>
-              <w:t>11</w:t>
+              <w:t>12</w:t>
             </w:r>
             <w:r>
               <w:rPr>
@@ -5473,7 +5473,7 @@
               <w:lang w:eastAsia="es-ES"/>
             </w:rPr>
           </w:pPr>
-          <w:hyperlink w:anchor="_Toc227824456" w:history="1">
+          <w:hyperlink w:anchor="_Toc227938752" w:history="1">
             <w:r>
               <w:rPr>
                 <w:rStyle w:val="Hipervnculo"/>
@@ -5500,7 +5500,7 @@
                 <w:noProof/>
                 <w:webHidden/>
               </w:rPr>
-              <w:instrText xml:space="preserve"> PAGEREF _Toc227824456 \h </w:instrText>
+              <w:instrText xml:space="preserve"> PAGEREF _Toc227938752 \h </w:instrText>
             </w:r>
             <w:r>
               <w:rPr>
@@ -5520,7 +5520,7 @@
                 <w:noProof/>
                 <w:webHidden/>
               </w:rPr>
-              <w:t>12</w:t>
+              <w:t>13</w:t>
             </w:r>
             <w:r>
               <w:rPr>
@@ -5545,7 +5545,7 @@
               <w:lang w:eastAsia="es-ES"/>
             </w:rPr>
           </w:pPr>
-          <w:hyperlink w:anchor="_Toc227824457" w:history="1">
+          <w:hyperlink w:anchor="_Toc227938753" w:history="1">
             <w:r>
               <w:rPr>
                 <w:rStyle w:val="Hipervnculo"/>
@@ -5572,7 +5572,7 @@
                 <w:noProof/>
                 <w:webHidden/>
               </w:rPr>
-              <w:instrText xml:space="preserve"> PAGEREF _Toc227824457 \h </w:instrText>
+              <w:instrText xml:space="preserve"> PAGEREF _Toc227938753 \h </w:instrText>
             </w:r>
             <w:r>
               <w:rPr>
@@ -5592,7 +5592,7 @@
                 <w:noProof/>
                 <w:webHidden/>
               </w:rPr>
-              <w:t>12</w:t>
+              <w:t>13</w:t>
             </w:r>
             <w:r>
               <w:rPr>
@@ -5617,7 +5617,7 @@
               <w:lang w:eastAsia="es-ES"/>
             </w:rPr>
           </w:pPr>
-          <w:hyperlink w:anchor="_Toc227824458" w:history="1">
+          <w:hyperlink w:anchor="_Toc227938754" w:history="1">
             <w:r>
               <w:rPr>
                 <w:rStyle w:val="Hipervnculo"/>
@@ -5644,7 +5644,7 @@
                 <w:noProof/>
                 <w:webHidden/>
               </w:rPr>
-              <w:instrText xml:space="preserve"> PAGEREF _Toc227824458 \h </w:instrText>
+              <w:instrText xml:space="preserve"> PAGEREF _Toc227938754 \h </w:instrText>
             </w:r>
             <w:r>
               <w:rPr>
@@ -5664,7 +5664,7 @@
                 <w:noProof/>
                 <w:webHidden/>
               </w:rPr>
-              <w:t>12</w:t>
+              <w:t>13</w:t>
             </w:r>
             <w:r>
               <w:rPr>
@@ -5689,7 +5689,7 @@
               <w:lang w:eastAsia="es-ES"/>
             </w:rPr>
           </w:pPr>
-          <w:hyperlink w:anchor="_Toc227824459" w:history="1">
+          <w:hyperlink w:anchor="_Toc227938755" w:history="1">
             <w:r>
               <w:rPr>
                 <w:rStyle w:val="Hipervnculo"/>
@@ -5716,7 +5716,7 @@
                 <w:noProof/>
                 <w:webHidden/>
               </w:rPr>
-              <w:instrText xml:space="preserve"> PAGEREF _Toc227824459 \h </w:instrText>
+              <w:instrText xml:space="preserve"> PAGEREF _Toc227938755 \h </w:instrText>
             </w:r>
             <w:r>
               <w:rPr>
@@ -5736,7 +5736,7 @@
                 <w:noProof/>
                 <w:webHidden/>
               </w:rPr>
-              <w:t>12</w:t>
+              <w:t>13</w:t>
             </w:r>
             <w:r>
               <w:rPr>
@@ -5761,7 +5761,7 @@
               <w:lang w:eastAsia="es-ES"/>
             </w:rPr>
           </w:pPr>
-          <w:hyperlink w:anchor="_Toc227824460" w:history="1">
+          <w:hyperlink w:anchor="_Toc227938756" w:history="1">
             <w:r>
               <w:rPr>
                 <w:rStyle w:val="Hipervnculo"/>
@@ -5788,7 +5788,7 @@
                 <w:noProof/>
                 <w:webHidden/>
               </w:rPr>
-              <w:instrText xml:space="preserve"> PAGEREF _Toc227824460 \h </w:instrText>
+              <w:instrText xml:space="preserve"> PAGEREF _Toc227938756 \h </w:instrText>
             </w:r>
             <w:r>
               <w:rPr>
@@ -5808,7 +5808,7 @@
                 <w:noProof/>
                 <w:webHidden/>
               </w:rPr>
-              <w:t>13</w:t>
+              <w:t>14</w:t>
             </w:r>
             <w:r>
               <w:rPr>
@@ -5833,7 +5833,7 @@
               <w:lang w:eastAsia="es-ES"/>
             </w:rPr>
           </w:pPr>
-          <w:hyperlink w:anchor="_Toc227824461" w:history="1">
+          <w:hyperlink w:anchor="_Toc227938757" w:history="1">
             <w:r>
               <w:rPr>
                 <w:rStyle w:val="Hipervnculo"/>
@@ -5860,7 +5860,7 @@
                 <w:noProof/>
                 <w:webHidden/>
               </w:rPr>
-              <w:instrText xml:space="preserve"> PAGEREF _Toc227824461 \h </w:instrText>
+              <w:instrText xml:space="preserve"> PAGEREF _Toc227938757 \h </w:instrText>
             </w:r>
             <w:r>
               <w:rPr>
@@ -5880,7 +5880,223 @@
                 <w:noProof/>
                 <w:webHidden/>
               </w:rPr>
-              <w:t>13</w:t>
+              <w:t>14</w:t>
+            </w:r>
+            <w:r>
+              <w:rPr>
+                <w:noProof/>
+                <w:webHidden/>
+              </w:rPr>
+              <w:fldChar w:fldCharType="end"/>
+            </w:r>
+          </w:hyperlink>
+        </w:p>
+        <w:p>
+          <w:pPr>
+            <w:pStyle w:val="TDC3"/>
+            <w:tabs>
+              <w:tab w:val="right" w:leader="dot" w:pos="8494"/>
+            </w:tabs>
+            <w:rPr>
+              <w:rFonts w:eastAsiaTheme="minorEastAsia"/>
+              <w:noProof/>
+              <w:sz w:val="24"/>
+              <w:szCs w:val="24"/>
+              <w:lang w:eastAsia="es-ES"/>
+            </w:rPr>
+          </w:pPr>
+          <w:hyperlink w:anchor="_Toc227938758" w:history="1">
+            <w:r>
+              <w:rPr>
+                <w:rStyle w:val="Hipervnculo"/>
+                <w:noProof/>
+              </w:rPr>
+              <w:t>5.2.3 Slate – Colores neutros y tema oscuro</w:t>
+            </w:r>
+            <w:r>
+              <w:rPr>
+                <w:noProof/>
+                <w:webHidden/>
+              </w:rPr>
+              <w:tab/>
+            </w:r>
+            <w:r>
+              <w:rPr>
+                <w:noProof/>
+                <w:webHidden/>
+              </w:rPr>
+              <w:fldChar w:fldCharType="begin"/>
+            </w:r>
+            <w:r>
+              <w:rPr>
+                <w:noProof/>
+                <w:webHidden/>
+              </w:rPr>
+              <w:instrText xml:space="preserve"> PAGEREF _Toc227938758 \h </w:instrText>
+            </w:r>
+            <w:r>
+              <w:rPr>
+                <w:noProof/>
+                <w:webHidden/>
+              </w:rPr>
+            </w:r>
+            <w:r>
+              <w:rPr>
+                <w:noProof/>
+                <w:webHidden/>
+              </w:rPr>
+              <w:fldChar w:fldCharType="separate"/>
+            </w:r>
+            <w:r>
+              <w:rPr>
+                <w:noProof/>
+                <w:webHidden/>
+              </w:rPr>
+              <w:t>15</w:t>
+            </w:r>
+            <w:r>
+              <w:rPr>
+                <w:noProof/>
+                <w:webHidden/>
+              </w:rPr>
+              <w:fldChar w:fldCharType="end"/>
+            </w:r>
+          </w:hyperlink>
+        </w:p>
+        <w:p>
+          <w:pPr>
+            <w:pStyle w:val="TDC3"/>
+            <w:tabs>
+              <w:tab w:val="right" w:leader="dot" w:pos="8494"/>
+            </w:tabs>
+            <w:rPr>
+              <w:rFonts w:eastAsiaTheme="minorEastAsia"/>
+              <w:noProof/>
+              <w:sz w:val="24"/>
+              <w:szCs w:val="24"/>
+              <w:lang w:eastAsia="es-ES"/>
+            </w:rPr>
+          </w:pPr>
+          <w:hyperlink w:anchor="_Toc227938759" w:history="1">
+            <w:r>
+              <w:rPr>
+                <w:rStyle w:val="Hipervnculo"/>
+                <w:noProof/>
+              </w:rPr>
+              <w:t>5.2.4 Cyan – Acciones primarias y tema oscuro</w:t>
+            </w:r>
+            <w:r>
+              <w:rPr>
+                <w:noProof/>
+                <w:webHidden/>
+              </w:rPr>
+              <w:tab/>
+            </w:r>
+            <w:r>
+              <w:rPr>
+                <w:noProof/>
+                <w:webHidden/>
+              </w:rPr>
+              <w:fldChar w:fldCharType="begin"/>
+            </w:r>
+            <w:r>
+              <w:rPr>
+                <w:noProof/>
+                <w:webHidden/>
+              </w:rPr>
+              <w:instrText xml:space="preserve"> PAGEREF _Toc227938759 \h </w:instrText>
+            </w:r>
+            <w:r>
+              <w:rPr>
+                <w:noProof/>
+                <w:webHidden/>
+              </w:rPr>
+            </w:r>
+            <w:r>
+              <w:rPr>
+                <w:noProof/>
+                <w:webHidden/>
+              </w:rPr>
+              <w:fldChar w:fldCharType="separate"/>
+            </w:r>
+            <w:r>
+              <w:rPr>
+                <w:noProof/>
+                <w:webHidden/>
+              </w:rPr>
+              <w:t>15</w:t>
+            </w:r>
+            <w:r>
+              <w:rPr>
+                <w:noProof/>
+                <w:webHidden/>
+              </w:rPr>
+              <w:fldChar w:fldCharType="end"/>
+            </w:r>
+          </w:hyperlink>
+        </w:p>
+        <w:p>
+          <w:pPr>
+            <w:pStyle w:val="TDC3"/>
+            <w:tabs>
+              <w:tab w:val="right" w:leader="dot" w:pos="8494"/>
+            </w:tabs>
+            <w:rPr>
+              <w:rFonts w:eastAsiaTheme="minorEastAsia"/>
+              <w:noProof/>
+              <w:sz w:val="24"/>
+              <w:szCs w:val="24"/>
+              <w:lang w:eastAsia="es-ES"/>
+            </w:rPr>
+          </w:pPr>
+          <w:hyperlink w:anchor="_Toc227938760" w:history="1">
+            <w:r>
+              <w:rPr>
+                <w:rStyle w:val="Hipervnculo"/>
+                <w:noProof/>
+              </w:rPr>
+              <w:t>5.2.5 Colores semánticos</w:t>
+            </w:r>
+            <w:r>
+              <w:rPr>
+                <w:noProof/>
+                <w:webHidden/>
+              </w:rPr>
+              <w:tab/>
+            </w:r>
+            <w:r>
+              <w:rPr>
+                <w:noProof/>
+                <w:webHidden/>
+              </w:rPr>
+              <w:fldChar w:fldCharType="begin"/>
+            </w:r>
+            <w:r>
+              <w:rPr>
+                <w:noProof/>
+                <w:webHidden/>
+              </w:rPr>
+              <w:instrText xml:space="preserve"> PAGEREF _Toc227938760 \h </w:instrText>
+            </w:r>
+            <w:r>
+              <w:rPr>
+                <w:noProof/>
+                <w:webHidden/>
+              </w:rPr>
+            </w:r>
+            <w:r>
+              <w:rPr>
+                <w:noProof/>
+                <w:webHidden/>
+              </w:rPr>
+              <w:fldChar w:fldCharType="separate"/>
+            </w:r>
+            <w:r>
+              <w:rPr>
+                <w:noProof/>
+                <w:webHidden/>
+              </w:rPr>
+              <w:t>15</w:t>
             </w:r>
             <w:r>
               <w:rPr>
@@ -5905,14 +6121,13 @@
               <w:lang w:eastAsia="es-ES"/>
             </w:rPr>
           </w:pPr>
-          <w:hyperlink w:anchor="_Toc227824462" w:history="1">
+          <w:hyperlink w:anchor="_Toc227938761" w:history="1">
             <w:r>
               <w:rPr>
                 <w:rStyle w:val="Hipervnculo"/>
                 <w:noProof/>
-                <w:lang w:val="en-US"/>
-              </w:rPr>
-              <w:t>5.4 Wireframes</w:t>
+              </w:rPr>
+              <w:t>5.3 Tipografía</w:t>
             </w:r>
             <w:r>
               <w:rPr>
@@ -5933,7 +6148,7 @@
                 <w:noProof/>
                 <w:webHidden/>
               </w:rPr>
-              <w:instrText xml:space="preserve"> PAGEREF _Toc227824462 \h </w:instrText>
+              <w:instrText xml:space="preserve"> PAGEREF _Toc227938761 \h </w:instrText>
             </w:r>
             <w:r>
               <w:rPr>
@@ -5953,7 +6168,79 @@
                 <w:noProof/>
                 <w:webHidden/>
               </w:rPr>
-              <w:t>13</w:t>
+              <w:t>16</w:t>
+            </w:r>
+            <w:r>
+              <w:rPr>
+                <w:noProof/>
+                <w:webHidden/>
+              </w:rPr>
+              <w:fldChar w:fldCharType="end"/>
+            </w:r>
+          </w:hyperlink>
+        </w:p>
+        <w:p>
+          <w:pPr>
+            <w:pStyle w:val="TDC2"/>
+            <w:tabs>
+              <w:tab w:val="right" w:leader="dot" w:pos="8494"/>
+            </w:tabs>
+            <w:rPr>
+              <w:rFonts w:eastAsiaTheme="minorEastAsia"/>
+              <w:noProof/>
+              <w:sz w:val="24"/>
+              <w:szCs w:val="24"/>
+              <w:lang w:eastAsia="es-ES"/>
+            </w:rPr>
+          </w:pPr>
+          <w:hyperlink w:anchor="_Toc227938762" w:history="1">
+            <w:r>
+              <w:rPr>
+                <w:rStyle w:val="Hipervnculo"/>
+                <w:noProof/>
+              </w:rPr>
+              <w:t>5.4 Wireframes</w:t>
+            </w:r>
+            <w:r>
+              <w:rPr>
+                <w:noProof/>
+                <w:webHidden/>
+              </w:rPr>
+              <w:tab/>
+            </w:r>
+            <w:r>
+              <w:rPr>
+                <w:noProof/>
+                <w:webHidden/>
+              </w:rPr>
+              <w:fldChar w:fldCharType="begin"/>
+            </w:r>
+            <w:r>
+              <w:rPr>
+                <w:noProof/>
+                <w:webHidden/>
+              </w:rPr>
+              <w:instrText xml:space="preserve"> PAGEREF _Toc227938762 \h </w:instrText>
+            </w:r>
+            <w:r>
+              <w:rPr>
+                <w:noProof/>
+                <w:webHidden/>
+              </w:rPr>
+            </w:r>
+            <w:r>
+              <w:rPr>
+                <w:noProof/>
+                <w:webHidden/>
+              </w:rPr>
+              <w:fldChar w:fldCharType="separate"/>
+            </w:r>
+            <w:r>
+              <w:rPr>
+                <w:noProof/>
+                <w:webHidden/>
+              </w:rPr>
+              <w:t>16</w:t>
             </w:r>
             <w:r>
               <w:rPr>
@@ -5978,7 +6265,7 @@
               <w:lang w:eastAsia="es-ES"/>
             </w:rPr>
           </w:pPr>
-          <w:hyperlink w:anchor="_Toc227824463" w:history="1">
+          <w:hyperlink w:anchor="_Toc227938763" w:history="1">
             <w:r>
               <w:rPr>
                 <w:rStyle w:val="Hipervnculo"/>
@@ -6005,7 +6292,7 @@
                 <w:noProof/>
                 <w:webHidden/>
               </w:rPr>
-              <w:instrText xml:space="preserve"> PAGEREF _Toc227824463 \h </w:instrText>
+              <w:instrText xml:space="preserve"> PAGEREF _Toc227938763 \h </w:instrText>
             </w:r>
             <w:r>
               <w:rPr>
@@ -6025,7 +6312,7 @@
                 <w:noProof/>
                 <w:webHidden/>
               </w:rPr>
-              <w:t>14</w:t>
+              <w:t>17</w:t>
             </w:r>
             <w:r>
               <w:rPr>
@@ -6050,7 +6337,7 @@
               <w:lang w:eastAsia="es-ES"/>
             </w:rPr>
           </w:pPr>
-          <w:hyperlink w:anchor="_Toc227824464" w:history="1">
+          <w:hyperlink w:anchor="_Toc227938764" w:history="1">
             <w:r>
               <w:rPr>
                 <w:rStyle w:val="Hipervnculo"/>
@@ -6077,7 +6364,7 @@
                 <w:noProof/>
                 <w:webHidden/>
               </w:rPr>
-              <w:instrText xml:space="preserve"> PAGEREF _Toc227824464 \h </w:instrText>
+              <w:instrText xml:space="preserve"> PAGEREF _Toc227938764 \h </w:instrText>
             </w:r>
             <w:r>
               <w:rPr>
@@ -6097,7 +6384,7 @@
                 <w:noProof/>
                 <w:webHidden/>
               </w:rPr>
-              <w:t>15</w:t>
+              <w:t>18</w:t>
             </w:r>
             <w:r>
               <w:rPr>
@@ -6122,7 +6409,7 @@
               <w:lang w:eastAsia="es-ES"/>
             </w:rPr>
           </w:pPr>
-          <w:hyperlink w:anchor="_Toc227824465" w:history="1">
+          <w:hyperlink w:anchor="_Toc227938765" w:history="1">
             <w:r>
               <w:rPr>
                 <w:rStyle w:val="Hipervnculo"/>
@@ -6149,7 +6436,7 @@
                 <w:noProof/>
                 <w:webHidden/>
               </w:rPr>
-              <w:instrText xml:space="preserve"> PAGEREF _Toc227824465 \h </w:instrText>
+              <w:instrText xml:space="preserve"> PAGEREF _Toc227938765 \h </w:instrText>
             </w:r>
             <w:r>
               <w:rPr>
@@ -6169,7 +6456,93 @@
                 <w:noProof/>
                 <w:webHidden/>
               </w:rPr>
-              <w:t>15</w:t>
+              <w:t>19</w:t>
+            </w:r>
+            <w:r>
+              <w:rPr>
+                <w:noProof/>
+                <w:webHidden/>
+              </w:rPr>
+              <w:fldChar w:fldCharType="end"/>
+            </w:r>
+          </w:hyperlink>
+        </w:p>
+        <w:p>
+          <w:pPr>
+            <w:pStyle w:val="TDC1"/>
+            <w:tabs>
+              <w:tab w:val="right" w:leader="dot" w:pos="8494"/>
+            </w:tabs>
+            <w:rPr>
+              <w:rFonts w:eastAsiaTheme="minorEastAsia"/>
+              <w:noProof/>
+              <w:sz w:val="24"/>
+              <w:szCs w:val="24"/>
+              <w:lang w:eastAsia="es-ES"/>
+            </w:rPr>
+          </w:pPr>
+          <w:hyperlink w:anchor="_Toc227938766" w:history="1">
+            <w:r>
+              <w:rPr>
+                <w:rStyle w:val="Hipervnculo"/>
+                <w:noProof/>
+              </w:rPr>
+              <w:t>7. Bibl</w:t>
+            </w:r>
+            <w:r>
+              <w:rPr>
+                <w:rStyle w:val="Hipervnculo"/>
+                <w:noProof/>
+              </w:rPr>
+              <w:t>i</w:t>
+            </w:r>
+            <w:r>
+              <w:rPr>
+                <w:rStyle w:val="Hipervnculo"/>
+                <w:noProof/>
+              </w:rPr>
+              <w:t>ografía</w:t>
+            </w:r>
+            <w:r>
+              <w:rPr>
+                <w:noProof/>
+                <w:webHidden/>
+              </w:rPr>
+              <w:tab/>
+            </w:r>
+            <w:r>
+              <w:rPr>
+                <w:noProof/>
+                <w:webHidden/>
+              </w:rPr>
+              <w:fldChar w:fldCharType="begin"/>
+            </w:r>
+            <w:r>
+              <w:rPr>
+                <w:noProof/>
+                <w:webHidden/>
+              </w:rPr>
+              <w:instrText xml:space="preserve"> PAGEREF _Toc227938766 \h </w:instrText>
+            </w:r>
+            <w:r>
+              <w:rPr>
+                <w:noProof/>
+                <w:webHidden/>
+              </w:rPr>
+            </w:r>
+            <w:r>
+              <w:rPr>
+                <w:noProof/>
+                <w:webHidden/>
+              </w:rPr>
+              <w:fldChar w:fldCharType="separate"/>
+            </w:r>
+            <w:r>
+              <w:rPr>
+                <w:noProof/>
+                <w:webHidden/>
+              </w:rPr>
+              <w:t>19</w:t>
             </w:r>
             <w:r>
               <w:rPr>
@@ -6201,6 +6574,7 @@
         </w:rPr>
       </w:pPr>
       <w:r>
+        <w:lastRenderedPageBreak/>
         <w:br w:type="page"/>
       </w:r>
     </w:p>
@@ -6208,7 +6582,7 @@
       <w:pPr>
         <w:pStyle w:val="Ttulo1"/>
       </w:pPr>
-      <w:bookmarkStart w:id="0" w:name="_Toc227824437"/>
+      <w:bookmarkStart w:id="0" w:name="_Toc227938733"/>
       <w:r>
         <w:lastRenderedPageBreak/>
         <w:t>1. Introducción</w:t>
@@ -6411,7 +6785,7 @@
       <w:pPr>
         <w:pStyle w:val="Ttulo2"/>
       </w:pPr>
-      <w:bookmarkStart w:id="1" w:name="_Toc227824438"/>
+      <w:bookmarkStart w:id="1" w:name="_Toc227938734"/>
       <w:r>
         <w:t>1.</w:t>
       </w:r>
@@ -6605,7 +6979,7 @@
       <w:pPr>
         <w:pStyle w:val="Ttulo1"/>
       </w:pPr>
-      <w:bookmarkStart w:id="2" w:name="_Toc227824439"/>
+      <w:bookmarkStart w:id="2" w:name="_Toc227938735"/>
       <w:r>
         <w:t>2. Estructura del proyecto</w:t>
       </w:r>
@@ -8113,7 +8487,7 @@
       <w:pPr>
         <w:pStyle w:val="Ttulo1"/>
       </w:pPr>
-      <w:bookmarkStart w:id="3" w:name="_Toc227824440"/>
+      <w:bookmarkStart w:id="3" w:name="_Toc227938736"/>
       <w:r>
         <w:t>3</w:t>
       </w:r>
@@ -8561,7 +8935,7 @@
       <w:pPr>
         <w:pStyle w:val="Ttulo2"/>
       </w:pPr>
-      <w:bookmarkStart w:id="4" w:name="_Toc227824441"/>
+      <w:bookmarkStart w:id="4" w:name="_Toc227938737"/>
       <w:r>
         <w:t>3.1 Despliegue de la aplicación</w:t>
       </w:r>
@@ -8830,7 +9204,7 @@
       <w:pPr>
         <w:pStyle w:val="Ttulo2"/>
       </w:pPr>
-      <w:bookmarkStart w:id="5" w:name="_Toc227824442"/>
+      <w:bookmarkStart w:id="5" w:name="_Toc227938738"/>
       <w:r>
         <w:t>3.</w:t>
       </w:r>
@@ -10562,7 +10936,7 @@
           <w:lang w:eastAsia="es-ES"/>
         </w:rPr>
       </w:pPr>
-      <w:bookmarkStart w:id="6" w:name="_Toc227824443"/>
+      <w:bookmarkStart w:id="6" w:name="_Toc227938739"/>
       <w:r>
         <w:rPr>
           <w:rFonts w:eastAsia="Times New Roman"/>
@@ -11287,7 +11661,7 @@
       <w:pPr>
         <w:pStyle w:val="Ttulo2"/>
       </w:pPr>
-      <w:bookmarkStart w:id="7" w:name="_Toc227824444"/>
+      <w:bookmarkStart w:id="7" w:name="_Toc227938740"/>
       <w:r>
         <w:t>4.1 Descripción de las tablas</w:t>
       </w:r>
@@ -11453,7 +11827,7 @@
       <w:pPr>
         <w:pStyle w:val="Ttulo3"/>
       </w:pPr>
-      <w:bookmarkStart w:id="8" w:name="_Toc227824445"/>
+      <w:bookmarkStart w:id="8" w:name="_Toc227938741"/>
       <w:r>
         <w:t xml:space="preserve">Tabla: </w:t>
       </w:r>
@@ -13048,7 +13422,7 @@
       <w:pPr>
         <w:pStyle w:val="Ttulo3"/>
       </w:pPr>
-      <w:bookmarkStart w:id="9" w:name="_Toc227824446"/>
+      <w:bookmarkStart w:id="9" w:name="_Toc227938742"/>
       <w:r>
         <w:t xml:space="preserve">Tabla: </w:t>
       </w:r>
@@ -13557,7 +13931,7 @@
       <w:pPr>
         <w:pStyle w:val="Ttulo3"/>
       </w:pPr>
-      <w:bookmarkStart w:id="10" w:name="_Toc227824447"/>
+      <w:bookmarkStart w:id="10" w:name="_Toc227938743"/>
       <w:r>
         <w:t xml:space="preserve">Tabla: </w:t>
       </w:r>
@@ -14071,7 +14445,7 @@
       <w:pPr>
         <w:pStyle w:val="Ttulo3"/>
       </w:pPr>
-      <w:bookmarkStart w:id="11" w:name="_Toc227824448"/>
+      <w:bookmarkStart w:id="11" w:name="_Toc227938744"/>
       <w:r>
         <w:lastRenderedPageBreak/>
         <w:t xml:space="preserve">Tabla: </w:t>
@@ -15404,7 +15778,7 @@
       <w:pPr>
         <w:pStyle w:val="Ttulo3"/>
       </w:pPr>
-      <w:bookmarkStart w:id="12" w:name="_Toc227824449"/>
+      <w:bookmarkStart w:id="12" w:name="_Toc227938745"/>
       <w:r>
         <w:t xml:space="preserve">Tabla: </w:t>
       </w:r>
@@ -16156,7 +16530,7 @@
       <w:pPr>
         <w:pStyle w:val="Ttulo3"/>
       </w:pPr>
-      <w:bookmarkStart w:id="13" w:name="_Toc227824450"/>
+      <w:bookmarkStart w:id="13" w:name="_Toc227938746"/>
       <w:r>
         <w:t xml:space="preserve">Tabla: </w:t>
       </w:r>
@@ -16598,7 +16972,7 @@
       <w:pPr>
         <w:pStyle w:val="Ttulo3"/>
       </w:pPr>
-      <w:bookmarkStart w:id="14" w:name="_Toc227824451"/>
+      <w:bookmarkStart w:id="14" w:name="_Toc227938747"/>
       <w:r>
         <w:t xml:space="preserve">Tabla: </w:t>
       </w:r>
@@ -18643,7 +19017,7 @@
       <w:pPr>
         <w:pStyle w:val="Ttulo3"/>
       </w:pPr>
-      <w:bookmarkStart w:id="15" w:name="_Toc227824452"/>
+      <w:bookmarkStart w:id="15" w:name="_Toc227938748"/>
       <w:r>
         <w:t xml:space="preserve">Tabla: </w:t>
       </w:r>
@@ -20548,7 +20922,7 @@
       <w:pPr>
         <w:pStyle w:val="Ttulo3"/>
       </w:pPr>
-      <w:bookmarkStart w:id="16" w:name="_Toc227824453"/>
+      <w:bookmarkStart w:id="16" w:name="_Toc227938749"/>
       <w:r>
         <w:t xml:space="preserve">Tabla: </w:t>
       </w:r>
@@ -21967,7 +22341,7 @@
       <w:pPr>
         <w:pStyle w:val="Ttulo3"/>
       </w:pPr>
-      <w:bookmarkStart w:id="17" w:name="_Toc227824454"/>
+      <w:bookmarkStart w:id="17" w:name="_Toc227938750"/>
       <w:r>
         <w:t xml:space="preserve">Vista: </w:t>
       </w:r>
@@ -22845,7 +23219,7 @@
       <w:pPr>
         <w:pStyle w:val="Ttulo3"/>
       </w:pPr>
-      <w:bookmarkStart w:id="18" w:name="_Toc227824455"/>
+      <w:bookmarkStart w:id="18" w:name="_Toc227938751"/>
       <w:r>
         <w:t xml:space="preserve">Vista: </w:t>
       </w:r>
@@ -23927,7 +24301,7 @@
       <w:pPr>
         <w:pStyle w:val="Ttulo1"/>
       </w:pPr>
-      <w:bookmarkStart w:id="19" w:name="_Toc227824456"/>
+      <w:bookmarkStart w:id="19" w:name="_Toc227938752"/>
       <w:r>
         <w:lastRenderedPageBreak/>
         <w:t>5. Guía de estilo</w:t>
@@ -23938,7 +24312,7 @@
       <w:pPr>
         <w:pStyle w:val="Ttulo2"/>
       </w:pPr>
-      <w:bookmarkStart w:id="20" w:name="_Toc227824457"/>
+      <w:bookmarkStart w:id="20" w:name="_Toc227938753"/>
       <w:r>
         <w:t>5.1 Introducción</w:t>
       </w:r>
@@ -24712,7 +25086,7 @@
       <w:pPr>
         <w:pStyle w:val="Ttulo3"/>
       </w:pPr>
-      <w:bookmarkStart w:id="21" w:name="_Toc227824458"/>
+      <w:bookmarkStart w:id="21" w:name="_Toc227938754"/>
       <w:r>
         <w:t>Stack técnico</w:t>
       </w:r>
@@ -24978,7 +25352,7 @@
       <w:pPr>
         <w:pStyle w:val="Ttulo2"/>
       </w:pPr>
-      <w:bookmarkStart w:id="22" w:name="_Toc227824459"/>
+      <w:bookmarkStart w:id="22" w:name="_Toc227938755"/>
       <w:r>
         <w:t>5.2 Color y uso tipográfico del color</w:t>
       </w:r>
@@ -25002,11 +25376,9 @@
       <w:r>
         <w:t xml:space="preserve"> A </w:t>
       </w:r>
-      <w:proofErr w:type="gramStart"/>
-      <w:r>
-        <w:t>continuación</w:t>
-      </w:r>
-      <w:proofErr w:type="gramEnd"/>
+      <w:r>
+        <w:t>continuación,</w:t>
+      </w:r>
       <w:r>
         <w:t xml:space="preserve"> mostraremos los colores utilizados en nuestro proyecto con una muestra de color, nombre de la clase de </w:t>
       </w:r>
@@ -25036,7 +25408,7 @@
       <w:pPr>
         <w:pStyle w:val="Ttulo3"/>
       </w:pPr>
-      <w:bookmarkStart w:id="23" w:name="_Toc227824460"/>
+      <w:bookmarkStart w:id="23" w:name="_Toc227938756"/>
       <w:r>
         <w:lastRenderedPageBreak/>
         <w:t>5.2.1 Blue – Acciones primarias y tema claro</w:t>
@@ -25457,7 +25829,7 @@
       <w:pPr>
         <w:pStyle w:val="Ttulo3"/>
       </w:pPr>
-      <w:bookmarkStart w:id="24" w:name="_Toc227824461"/>
+      <w:bookmarkStart w:id="24" w:name="_Toc227938757"/>
       <w:r>
         <w:t xml:space="preserve">5.2.2 Stone – Colores neutros y tema </w:t>
       </w:r>
@@ -26062,10 +26434,12 @@
       <w:pPr>
         <w:pStyle w:val="Ttulo3"/>
       </w:pPr>
+      <w:bookmarkStart w:id="25" w:name="_Toc227938758"/>
       <w:r>
         <w:lastRenderedPageBreak/>
         <w:t>5.2.3 Slate – Colores neutros y tema oscuro</w:t>
       </w:r>
+      <w:bookmarkEnd w:id="25"/>
     </w:p>
     <w:p>
       <w:pPr>
@@ -26628,10 +27002,11 @@
       <w:pPr>
         <w:pStyle w:val="Ttulo3"/>
       </w:pPr>
-      <w:bookmarkStart w:id="25" w:name="_Toc227824462"/>
+      <w:bookmarkStart w:id="26" w:name="_Toc227938759"/>
       <w:r>
         <w:t>5.2.4 Cyan – Acciones primarias y tema oscuro</w:t>
       </w:r>
+      <w:bookmarkEnd w:id="26"/>
     </w:p>
     <w:p>
       <w:pPr>
@@ -27071,9 +27446,11 @@
       <w:pPr>
         <w:pStyle w:val="Ttulo3"/>
       </w:pPr>
+      <w:bookmarkStart w:id="27" w:name="_Toc227938760"/>
       <w:r>
         <w:t>5.2.5 Colores semánticos</w:t>
       </w:r>
+      <w:bookmarkEnd w:id="27"/>
     </w:p>
     <w:p>
       <w:pPr>
@@ -27400,10 +27777,12 @@
       <w:pPr>
         <w:pStyle w:val="Ttulo2"/>
       </w:pPr>
+      <w:bookmarkStart w:id="28" w:name="_Toc227938761"/>
       <w:r>
         <w:lastRenderedPageBreak/>
         <w:t>5.3 Tipografía</w:t>
       </w:r>
+      <w:bookmarkEnd w:id="28"/>
     </w:p>
     <w:p>
       <w:r>
@@ -28336,11 +28715,11 @@
         <w:tblLook w:val="04A0" w:firstRow="1" w:lastRow="0" w:firstColumn="1" w:lastColumn="0" w:noHBand="0" w:noVBand="1"/>
       </w:tblPr>
       <w:tblGrid>
-        <w:gridCol w:w="1242"/>
-        <w:gridCol w:w="1127"/>
-        <w:gridCol w:w="1534"/>
-        <w:gridCol w:w="2771"/>
-        <w:gridCol w:w="1820"/>
+        <w:gridCol w:w="1129"/>
+        <w:gridCol w:w="1240"/>
+        <w:gridCol w:w="1170"/>
+        <w:gridCol w:w="2977"/>
+        <w:gridCol w:w="1978"/>
       </w:tblGrid>
       <w:tr>
         <w:trPr>
@@ -28348,7 +28727,7 @@
         </w:trPr>
         <w:tc>
           <w:tcPr>
-            <w:tcW w:w="1256" w:type="dxa"/>
+            <w:tcW w:w="1129" w:type="dxa"/>
             <w:shd w:val="clear" w:color="auto" w:fill="156082" w:themeFill="accent1"/>
             <w:vAlign w:val="center"/>
           </w:tcPr>
@@ -28369,7 +28748,7 @@
         </w:tc>
         <w:tc>
           <w:tcPr>
-            <w:tcW w:w="1149" w:type="dxa"/>
+            <w:tcW w:w="1240" w:type="dxa"/>
             <w:shd w:val="clear" w:color="auto" w:fill="156082" w:themeFill="accent1"/>
             <w:vAlign w:val="center"/>
           </w:tcPr>
@@ -28385,6 +28764,1643 @@
                 <w:color w:val="FFFFFF" w:themeColor="background1"/>
               </w:rPr>
               <w:t>Clase</w:t>
+            </w:r>
+          </w:p>
+        </w:tc>
+        <w:tc>
+          <w:tcPr>
+            <w:tcW w:w="1170" w:type="dxa"/>
+            <w:shd w:val="clear" w:color="auto" w:fill="156082" w:themeFill="accent1"/>
+            <w:vAlign w:val="center"/>
+          </w:tcPr>
+          <w:p>
+            <w:pPr>
+              <w:jc w:val="center"/>
+              <w:rPr>
+                <w:color w:val="FFFFFF" w:themeColor="background1"/>
+              </w:rPr>
+            </w:pPr>
+            <w:r>
+              <w:rPr>
+                <w:color w:val="FFFFFF" w:themeColor="background1"/>
+              </w:rPr>
+              <w:t>Tamaño</w:t>
+            </w:r>
+          </w:p>
+        </w:tc>
+        <w:tc>
+          <w:tcPr>
+            <w:tcW w:w="2977" w:type="dxa"/>
+            <w:shd w:val="clear" w:color="auto" w:fill="156082" w:themeFill="accent1"/>
+            <w:vAlign w:val="center"/>
+          </w:tcPr>
+          <w:p>
+            <w:pPr>
+              <w:jc w:val="center"/>
+              <w:rPr>
+                <w:color w:val="FFFFFF" w:themeColor="background1"/>
+              </w:rPr>
+            </w:pPr>
+            <w:r>
+              <w:rPr>
+                <w:color w:val="FFFFFF" w:themeColor="background1"/>
+              </w:rPr>
+              <w:t>Ejemplo</w:t>
+            </w:r>
+          </w:p>
+        </w:tc>
+        <w:tc>
+          <w:tcPr>
+            <w:tcW w:w="1978" w:type="dxa"/>
+            <w:shd w:val="clear" w:color="auto" w:fill="156082" w:themeFill="accent1"/>
+            <w:vAlign w:val="center"/>
+          </w:tcPr>
+          <w:p>
+            <w:pPr>
+              <w:jc w:val="center"/>
+              <w:rPr>
+                <w:color w:val="FFFFFF" w:themeColor="background1"/>
+              </w:rPr>
+            </w:pPr>
+            <w:r>
+              <w:rPr>
+                <w:color w:val="FFFFFF" w:themeColor="background1"/>
+              </w:rPr>
+              <w:t>Uso</w:t>
+            </w:r>
+          </w:p>
+        </w:tc>
+      </w:tr>
+      <w:tr>
+        <w:tc>
+          <w:tcPr>
+            <w:tcW w:w="1129" w:type="dxa"/>
+            <w:vAlign w:val="center"/>
+          </w:tcPr>
+          <w:p>
+            <w:pPr>
+              <w:jc w:val="center"/>
+            </w:pPr>
+            <w:r>
+              <w:t>H1</w:t>
+            </w:r>
+          </w:p>
+        </w:tc>
+        <w:tc>
+          <w:tcPr>
+            <w:tcW w:w="1240" w:type="dxa"/>
+            <w:vAlign w:val="center"/>
+          </w:tcPr>
+          <w:p>
+            <w:pPr>
+              <w:jc w:val="center"/>
+            </w:pPr>
+            <w:r>
+              <w:t>text-4xl</w:t>
+            </w:r>
+          </w:p>
+        </w:tc>
+        <w:tc>
+          <w:tcPr>
+            <w:tcW w:w="1170" w:type="dxa"/>
+            <w:vAlign w:val="center"/>
+          </w:tcPr>
+          <w:p>
+            <w:pPr>
+              <w:jc w:val="center"/>
+            </w:pPr>
+            <w:r>
+              <w:t>2.25rem</w:t>
+            </w:r>
+          </w:p>
+          <w:p>
+            <w:pPr>
+              <w:jc w:val="center"/>
+            </w:pPr>
+            <w:r>
+              <w:t>(36px)</w:t>
+            </w:r>
+          </w:p>
+        </w:tc>
+        <w:tc>
+          <w:tcPr>
+            <w:tcW w:w="2977" w:type="dxa"/>
+            <w:vAlign w:val="center"/>
+          </w:tcPr>
+          <w:p>
+            <w:pPr>
+              <w:rPr>
+                <w:sz w:val="72"/>
+                <w:szCs w:val="72"/>
+              </w:rPr>
+            </w:pPr>
+            <w:r>
+              <w:rPr>
+                <w:sz w:val="72"/>
+                <w:szCs w:val="72"/>
+              </w:rPr>
+              <w:t>Ejemplo</w:t>
+            </w:r>
+          </w:p>
+        </w:tc>
+        <w:tc>
+          <w:tcPr>
+            <w:tcW w:w="1978" w:type="dxa"/>
+            <w:vAlign w:val="center"/>
+          </w:tcPr>
+          <w:p>
+            <w:r>
+              <w:t>Títulos principales</w:t>
+            </w:r>
+          </w:p>
+        </w:tc>
+      </w:tr>
+      <w:tr>
+        <w:tc>
+          <w:tcPr>
+            <w:tcW w:w="1129" w:type="dxa"/>
+            <w:vAlign w:val="center"/>
+          </w:tcPr>
+          <w:p>
+            <w:pPr>
+              <w:jc w:val="center"/>
+            </w:pPr>
+            <w:r>
+              <w:t>H2</w:t>
+            </w:r>
+          </w:p>
+        </w:tc>
+        <w:tc>
+          <w:tcPr>
+            <w:tcW w:w="1240" w:type="dxa"/>
+            <w:vAlign w:val="center"/>
+          </w:tcPr>
+          <w:p>
+            <w:pPr>
+              <w:jc w:val="center"/>
+            </w:pPr>
+            <w:r>
+              <w:t>text-3xl</w:t>
+            </w:r>
+          </w:p>
+        </w:tc>
+        <w:tc>
+          <w:tcPr>
+            <w:tcW w:w="1170" w:type="dxa"/>
+            <w:vAlign w:val="center"/>
+          </w:tcPr>
+          <w:p>
+            <w:pPr>
+              <w:jc w:val="center"/>
+            </w:pPr>
+            <w:r>
+              <w:t>1.875rem (30px)</w:t>
+            </w:r>
+          </w:p>
+        </w:tc>
+        <w:tc>
+          <w:tcPr>
+            <w:tcW w:w="2977" w:type="dxa"/>
+            <w:vAlign w:val="center"/>
+          </w:tcPr>
+          <w:p>
+            <w:pPr>
+              <w:rPr>
+                <w:sz w:val="60"/>
+                <w:szCs w:val="60"/>
+              </w:rPr>
+            </w:pPr>
+            <w:r>
+              <w:rPr>
+                <w:sz w:val="60"/>
+                <w:szCs w:val="60"/>
+              </w:rPr>
+              <w:t>Ejemplo</w:t>
+            </w:r>
+          </w:p>
+        </w:tc>
+        <w:tc>
+          <w:tcPr>
+            <w:tcW w:w="1978" w:type="dxa"/>
+            <w:vAlign w:val="center"/>
+          </w:tcPr>
+          <w:p>
+            <w:r>
+              <w:t>Secciones</w:t>
+            </w:r>
+          </w:p>
+        </w:tc>
+      </w:tr>
+      <w:tr>
+        <w:tc>
+          <w:tcPr>
+            <w:tcW w:w="1129" w:type="dxa"/>
+            <w:vAlign w:val="center"/>
+          </w:tcPr>
+          <w:p>
+            <w:pPr>
+              <w:jc w:val="center"/>
+            </w:pPr>
+            <w:r>
+              <w:t>H3</w:t>
+            </w:r>
+          </w:p>
+        </w:tc>
+        <w:tc>
+          <w:tcPr>
+            <w:tcW w:w="1240" w:type="dxa"/>
+            <w:vAlign w:val="center"/>
+          </w:tcPr>
+          <w:p>
+            <w:pPr>
+              <w:jc w:val="center"/>
+            </w:pPr>
+            <w:r>
+              <w:t>text-2xl</w:t>
+            </w:r>
+          </w:p>
+        </w:tc>
+        <w:tc>
+          <w:tcPr>
+            <w:tcW w:w="1170" w:type="dxa"/>
+            <w:vAlign w:val="center"/>
+          </w:tcPr>
+          <w:p>
+            <w:pPr>
+              <w:jc w:val="center"/>
+            </w:pPr>
+            <w:r>
+              <w:t>1.5rem (24px)</w:t>
+            </w:r>
+          </w:p>
+        </w:tc>
+        <w:tc>
+          <w:tcPr>
+            <w:tcW w:w="2977" w:type="dxa"/>
+            <w:vAlign w:val="center"/>
+          </w:tcPr>
+          <w:p>
+            <w:pPr>
+              <w:rPr>
+                <w:sz w:val="48"/>
+                <w:szCs w:val="48"/>
+              </w:rPr>
+            </w:pPr>
+            <w:r>
+              <w:rPr>
+                <w:sz w:val="48"/>
+                <w:szCs w:val="48"/>
+              </w:rPr>
+              <w:t>Ejemplo</w:t>
+            </w:r>
+          </w:p>
+        </w:tc>
+        <w:tc>
+          <w:tcPr>
+            <w:tcW w:w="1978" w:type="dxa"/>
+            <w:vAlign w:val="center"/>
+          </w:tcPr>
+          <w:p>
+            <w:r>
+              <w:t>Subsecciones</w:t>
+            </w:r>
+          </w:p>
+        </w:tc>
+      </w:tr>
+      <w:tr>
+        <w:tc>
+          <w:tcPr>
+            <w:tcW w:w="1129" w:type="dxa"/>
+            <w:vAlign w:val="center"/>
+          </w:tcPr>
+          <w:p>
+            <w:pPr>
+              <w:jc w:val="center"/>
+            </w:pPr>
+            <w:r>
+              <w:t>H4</w:t>
+            </w:r>
+          </w:p>
+        </w:tc>
+        <w:tc>
+          <w:tcPr>
+            <w:tcW w:w="1240" w:type="dxa"/>
+            <w:vAlign w:val="center"/>
+          </w:tcPr>
+          <w:p>
+            <w:pPr>
+              <w:jc w:val="center"/>
+            </w:pPr>
+            <w:proofErr w:type="spellStart"/>
+            <w:r>
+              <w:t>text-xl</w:t>
+            </w:r>
+            <w:proofErr w:type="spellEnd"/>
+          </w:p>
+        </w:tc>
+        <w:tc>
+          <w:tcPr>
+            <w:tcW w:w="1170" w:type="dxa"/>
+            <w:vAlign w:val="center"/>
+          </w:tcPr>
+          <w:p>
+            <w:pPr>
+              <w:jc w:val="center"/>
+            </w:pPr>
+            <w:r>
+              <w:t>1.25rem (20px)</w:t>
+            </w:r>
+          </w:p>
+        </w:tc>
+        <w:tc>
+          <w:tcPr>
+            <w:tcW w:w="2977" w:type="dxa"/>
+            <w:vAlign w:val="center"/>
+          </w:tcPr>
+          <w:p>
+            <w:pPr>
+              <w:rPr>
+                <w:sz w:val="40"/>
+                <w:szCs w:val="40"/>
+              </w:rPr>
+            </w:pPr>
+            <w:r>
+              <w:rPr>
+                <w:sz w:val="40"/>
+                <w:szCs w:val="40"/>
+              </w:rPr>
+              <w:t>Ejemplo</w:t>
+            </w:r>
+          </w:p>
+        </w:tc>
+        <w:tc>
+          <w:tcPr>
+            <w:tcW w:w="1978" w:type="dxa"/>
+            <w:vAlign w:val="center"/>
+          </w:tcPr>
+          <w:p>
+            <w:r>
+              <w:t>Subtítulos</w:t>
+            </w:r>
+          </w:p>
+        </w:tc>
+      </w:tr>
+      <w:tr>
+        <w:tc>
+          <w:tcPr>
+            <w:tcW w:w="1129" w:type="dxa"/>
+            <w:vAlign w:val="center"/>
+          </w:tcPr>
+          <w:p>
+            <w:pPr>
+              <w:jc w:val="center"/>
+            </w:pPr>
+            <w:proofErr w:type="spellStart"/>
+            <w:r>
+              <w:t>body</w:t>
+            </w:r>
+            <w:proofErr w:type="spellEnd"/>
+          </w:p>
+        </w:tc>
+        <w:tc>
+          <w:tcPr>
+            <w:tcW w:w="1240" w:type="dxa"/>
+            <w:vAlign w:val="center"/>
+          </w:tcPr>
+          <w:p>
+            <w:pPr>
+              <w:jc w:val="center"/>
+            </w:pPr>
+            <w:proofErr w:type="spellStart"/>
+            <w:r>
+              <w:t>text</w:t>
+            </w:r>
+            <w:proofErr w:type="spellEnd"/>
+            <w:r>
+              <w:t>-base</w:t>
+            </w:r>
+          </w:p>
+        </w:tc>
+        <w:tc>
+          <w:tcPr>
+            <w:tcW w:w="1170" w:type="dxa"/>
+            <w:vAlign w:val="center"/>
+          </w:tcPr>
+          <w:p>
+            <w:pPr>
+              <w:jc w:val="center"/>
+            </w:pPr>
+            <w:r>
+              <w:t>1rem</w:t>
+            </w:r>
+          </w:p>
+          <w:p>
+            <w:pPr>
+              <w:jc w:val="center"/>
+            </w:pPr>
+            <w:r>
+              <w:t>(16px)</w:t>
+            </w:r>
+          </w:p>
+        </w:tc>
+        <w:tc>
+          <w:tcPr>
+            <w:tcW w:w="2977" w:type="dxa"/>
+            <w:vAlign w:val="center"/>
+          </w:tcPr>
+          <w:p>
+            <w:pPr>
+              <w:rPr>
+                <w:sz w:val="32"/>
+                <w:szCs w:val="32"/>
+              </w:rPr>
+            </w:pPr>
+            <w:r>
+              <w:rPr>
+                <w:sz w:val="32"/>
+                <w:szCs w:val="32"/>
+              </w:rPr>
+              <w:t>Ejemplo</w:t>
+            </w:r>
+          </w:p>
+        </w:tc>
+        <w:tc>
+          <w:tcPr>
+            <w:tcW w:w="1978" w:type="dxa"/>
+            <w:vAlign w:val="center"/>
+          </w:tcPr>
+          <w:p>
+            <w:r>
+              <w:t>Texto normal</w:t>
+            </w:r>
+          </w:p>
+        </w:tc>
+      </w:tr>
+      <w:tr>
+        <w:tc>
+          <w:tcPr>
+            <w:tcW w:w="1129" w:type="dxa"/>
+            <w:vAlign w:val="center"/>
+          </w:tcPr>
+          <w:p>
+            <w:pPr>
+              <w:jc w:val="center"/>
+            </w:pPr>
+            <w:proofErr w:type="spellStart"/>
+            <w:r>
+              <w:t>small</w:t>
+            </w:r>
+            <w:proofErr w:type="spellEnd"/>
+          </w:p>
+        </w:tc>
+        <w:tc>
+          <w:tcPr>
+            <w:tcW w:w="1240" w:type="dxa"/>
+            <w:vAlign w:val="center"/>
+          </w:tcPr>
+          <w:p>
+            <w:pPr>
+              <w:jc w:val="center"/>
+            </w:pPr>
+            <w:proofErr w:type="spellStart"/>
+            <w:r>
+              <w:t>text-sm</w:t>
+            </w:r>
+            <w:proofErr w:type="spellEnd"/>
+          </w:p>
+        </w:tc>
+        <w:tc>
+          <w:tcPr>
+            <w:tcW w:w="1170" w:type="dxa"/>
+            <w:vAlign w:val="center"/>
+          </w:tcPr>
+          <w:p>
+            <w:pPr>
+              <w:jc w:val="center"/>
+            </w:pPr>
+            <w:r>
+              <w:t>0.875rem (14px)</w:t>
+            </w:r>
+          </w:p>
+        </w:tc>
+        <w:tc>
+          <w:tcPr>
+            <w:tcW w:w="2977" w:type="dxa"/>
+            <w:vAlign w:val="center"/>
+          </w:tcPr>
+          <w:p>
+            <w:pPr>
+              <w:rPr>
+                <w:sz w:val="28"/>
+                <w:szCs w:val="28"/>
+              </w:rPr>
+            </w:pPr>
+            <w:r>
+              <w:rPr>
+                <w:sz w:val="28"/>
+                <w:szCs w:val="28"/>
+              </w:rPr>
+              <w:t>Ejemplo</w:t>
+            </w:r>
+          </w:p>
+        </w:tc>
+        <w:tc>
+          <w:tcPr>
+            <w:tcW w:w="1978" w:type="dxa"/>
+            <w:vAlign w:val="center"/>
+          </w:tcPr>
+          <w:p>
+            <w:r>
+              <w:t>Texto secundario, etiquetas</w:t>
+            </w:r>
+          </w:p>
+        </w:tc>
+      </w:tr>
+    </w:tbl>
+    <w:p/>
+    <w:p>
+      <w:pPr>
+        <w:pStyle w:val="Ttulo2"/>
+      </w:pPr>
+      <w:r>
+        <w:t>5.4. Iconografía</w:t>
+      </w:r>
+    </w:p>
+    <w:p>
+      <w:pPr>
+        <w:jc w:val="both"/>
+      </w:pPr>
+      <w:bookmarkStart w:id="29" w:name="_Toc227938762"/>
+      <w:r>
+        <w:t xml:space="preserve">Para nuestra Iconografía hemos usado la librería Font Awesome </w:t>
+      </w:r>
+      <w:proofErr w:type="spellStart"/>
+      <w:r>
+        <w:t>Icons</w:t>
+      </w:r>
+      <w:proofErr w:type="spellEnd"/>
+      <w:r>
+        <w:t xml:space="preserve">. Usamos esta librería porque dispone de una gran colección de iconos de uso gratuito que nos permite usar en nuestra aplicación comercial sin regalías ni cánones. Además, tiene una gran integración y optimización con nuestro </w:t>
+      </w:r>
+      <w:proofErr w:type="spellStart"/>
+      <w:r>
+        <w:t>stack</w:t>
+      </w:r>
+      <w:proofErr w:type="spellEnd"/>
+      <w:r>
+        <w:t xml:space="preserve"> tecnológico.</w:t>
+      </w:r>
+    </w:p>
+    <w:p>
+      <w:pPr>
+        <w:jc w:val="both"/>
+      </w:pPr>
+      <w:r>
+        <w:t>Los paquetes que usamos en nuestro proyecto son:</w:t>
+      </w:r>
+    </w:p>
+    <w:p>
+      <w:pPr>
+        <w:rPr>
+          <w:rFonts w:ascii="Courier New" w:eastAsia="Times New Roman" w:hAnsi="Courier New" w:cs="Courier New"/>
+          <w:kern w:val="0"/>
+          <w:sz w:val="20"/>
+          <w:szCs w:val="20"/>
+          <w:lang w:eastAsia="es-ES"/>
+          <w14:ligatures w14:val="none"/>
+        </w:rPr>
+      </w:pPr>
+      <w:r>
+        <w:rPr>
+          <w:rFonts w:ascii="Courier New" w:eastAsia="Times New Roman" w:hAnsi="Courier New" w:cs="Courier New"/>
+          <w:kern w:val="0"/>
+          <w:sz w:val="20"/>
+          <w:szCs w:val="20"/>
+          <w:lang w:eastAsia="es-ES"/>
+          <w14:ligatures w14:val="none"/>
+        </w:rPr>
+        <w:br w:type="page"/>
+      </w:r>
+    </w:p>
+    <w:p>
+      <w:pPr>
+        <w:shd w:val="clear" w:color="auto" w:fill="F2F2F2" w:themeFill="background1" w:themeFillShade="F2"/>
+        <w:tabs>
+          <w:tab w:val="left" w:pos="916"/>
+          <w:tab w:val="left" w:pos="1832"/>
+          <w:tab w:val="left" w:pos="2748"/>
+          <w:tab w:val="left" w:pos="3664"/>
+          <w:tab w:val="left" w:pos="4580"/>
+          <w:tab w:val="left" w:pos="5496"/>
+          <w:tab w:val="left" w:pos="6412"/>
+          <w:tab w:val="left" w:pos="7328"/>
+          <w:tab w:val="left" w:pos="8244"/>
+          <w:tab w:val="left" w:pos="9160"/>
+          <w:tab w:val="left" w:pos="10076"/>
+          <w:tab w:val="left" w:pos="10992"/>
+          <w:tab w:val="left" w:pos="11908"/>
+          <w:tab w:val="left" w:pos="12824"/>
+          <w:tab w:val="left" w:pos="13740"/>
+          <w:tab w:val="left" w:pos="14656"/>
+        </w:tabs>
+        <w:spacing w:after="0" w:line="240" w:lineRule="auto"/>
+        <w:rPr>
+          <w:rFonts w:ascii="Courier New" w:eastAsia="Times New Roman" w:hAnsi="Courier New" w:cs="Courier New"/>
+          <w:kern w:val="0"/>
+          <w:sz w:val="20"/>
+          <w:szCs w:val="20"/>
+          <w:lang w:eastAsia="es-ES"/>
+          <w14:ligatures w14:val="none"/>
+        </w:rPr>
+      </w:pPr>
+      <w:r>
+        <w:rPr>
+          <w:rFonts w:ascii="Courier New" w:eastAsia="Times New Roman" w:hAnsi="Courier New" w:cs="Courier New"/>
+          <w:kern w:val="0"/>
+          <w:sz w:val="20"/>
+          <w:szCs w:val="20"/>
+          <w:lang w:eastAsia="es-ES"/>
+          <w14:ligatures w14:val="none"/>
+        </w:rPr>
+        <w:lastRenderedPageBreak/>
+        <w:t>"@</w:t>
+      </w:r>
+      <w:proofErr w:type="spellStart"/>
+      <w:r>
+        <w:rPr>
+          <w:rFonts w:ascii="Courier New" w:eastAsia="Times New Roman" w:hAnsi="Courier New" w:cs="Courier New"/>
+          <w:kern w:val="0"/>
+          <w:sz w:val="20"/>
+          <w:szCs w:val="20"/>
+          <w:lang w:eastAsia="es-ES"/>
+          <w14:ligatures w14:val="none"/>
+        </w:rPr>
+        <w:t>fortawesome</w:t>
+      </w:r>
+      <w:proofErr w:type="spellEnd"/>
+      <w:r>
+        <w:rPr>
+          <w:rFonts w:ascii="Courier New" w:eastAsia="Times New Roman" w:hAnsi="Courier New" w:cs="Courier New"/>
+          <w:kern w:val="0"/>
+          <w:sz w:val="20"/>
+          <w:szCs w:val="20"/>
+          <w:lang w:eastAsia="es-ES"/>
+          <w14:ligatures w14:val="none"/>
+        </w:rPr>
+        <w:t>/</w:t>
+      </w:r>
+      <w:proofErr w:type="spellStart"/>
+      <w:r>
+        <w:rPr>
+          <w:rFonts w:ascii="Courier New" w:eastAsia="Times New Roman" w:hAnsi="Courier New" w:cs="Courier New"/>
+          <w:kern w:val="0"/>
+          <w:sz w:val="20"/>
+          <w:szCs w:val="20"/>
+          <w:lang w:eastAsia="es-ES"/>
+          <w14:ligatures w14:val="none"/>
+        </w:rPr>
+        <w:t>fontawesome-svg-core</w:t>
+      </w:r>
+      <w:proofErr w:type="spellEnd"/>
+      <w:r>
+        <w:rPr>
+          <w:rFonts w:ascii="Courier New" w:eastAsia="Times New Roman" w:hAnsi="Courier New" w:cs="Courier New"/>
+          <w:kern w:val="0"/>
+          <w:sz w:val="20"/>
+          <w:szCs w:val="20"/>
+          <w:lang w:eastAsia="es-ES"/>
+          <w14:ligatures w14:val="none"/>
+        </w:rPr>
+        <w:t>": "^7.1.0",</w:t>
+      </w:r>
+    </w:p>
+    <w:p>
+      <w:pPr>
+        <w:shd w:val="clear" w:color="auto" w:fill="F2F2F2" w:themeFill="background1" w:themeFillShade="F2"/>
+        <w:tabs>
+          <w:tab w:val="left" w:pos="916"/>
+          <w:tab w:val="left" w:pos="1832"/>
+          <w:tab w:val="left" w:pos="2748"/>
+          <w:tab w:val="left" w:pos="3664"/>
+          <w:tab w:val="left" w:pos="4580"/>
+          <w:tab w:val="left" w:pos="5496"/>
+          <w:tab w:val="left" w:pos="6412"/>
+          <w:tab w:val="left" w:pos="7328"/>
+          <w:tab w:val="left" w:pos="8244"/>
+          <w:tab w:val="left" w:pos="9160"/>
+          <w:tab w:val="left" w:pos="10076"/>
+          <w:tab w:val="left" w:pos="10992"/>
+          <w:tab w:val="left" w:pos="11908"/>
+          <w:tab w:val="left" w:pos="12824"/>
+          <w:tab w:val="left" w:pos="13740"/>
+          <w:tab w:val="left" w:pos="14656"/>
+        </w:tabs>
+        <w:spacing w:after="0" w:line="240" w:lineRule="auto"/>
+        <w:rPr>
+          <w:rFonts w:ascii="Courier New" w:eastAsia="Times New Roman" w:hAnsi="Courier New" w:cs="Courier New"/>
+          <w:kern w:val="0"/>
+          <w:sz w:val="20"/>
+          <w:szCs w:val="20"/>
+          <w:lang w:eastAsia="es-ES"/>
+          <w14:ligatures w14:val="none"/>
+        </w:rPr>
+      </w:pPr>
+      <w:r>
+        <w:rPr>
+          <w:rFonts w:ascii="Courier New" w:eastAsia="Times New Roman" w:hAnsi="Courier New" w:cs="Courier New"/>
+          <w:kern w:val="0"/>
+          <w:sz w:val="20"/>
+          <w:szCs w:val="20"/>
+          <w:lang w:eastAsia="es-ES"/>
+          <w14:ligatures w14:val="none"/>
+        </w:rPr>
+        <w:t>"@</w:t>
+      </w:r>
+      <w:proofErr w:type="spellStart"/>
+      <w:r>
+        <w:rPr>
+          <w:rFonts w:ascii="Courier New" w:eastAsia="Times New Roman" w:hAnsi="Courier New" w:cs="Courier New"/>
+          <w:kern w:val="0"/>
+          <w:sz w:val="20"/>
+          <w:szCs w:val="20"/>
+          <w:lang w:eastAsia="es-ES"/>
+          <w14:ligatures w14:val="none"/>
+        </w:rPr>
+        <w:t>fortawesome</w:t>
+      </w:r>
+      <w:proofErr w:type="spellEnd"/>
+      <w:r>
+        <w:rPr>
+          <w:rFonts w:ascii="Courier New" w:eastAsia="Times New Roman" w:hAnsi="Courier New" w:cs="Courier New"/>
+          <w:kern w:val="0"/>
+          <w:sz w:val="20"/>
+          <w:szCs w:val="20"/>
+          <w:lang w:eastAsia="es-ES"/>
+          <w14:ligatures w14:val="none"/>
+        </w:rPr>
+        <w:t>/</w:t>
+      </w:r>
+      <w:proofErr w:type="spellStart"/>
+      <w:r>
+        <w:rPr>
+          <w:rFonts w:ascii="Courier New" w:eastAsia="Times New Roman" w:hAnsi="Courier New" w:cs="Courier New"/>
+          <w:kern w:val="0"/>
+          <w:sz w:val="20"/>
+          <w:szCs w:val="20"/>
+          <w:lang w:eastAsia="es-ES"/>
+          <w14:ligatures w14:val="none"/>
+        </w:rPr>
+        <w:t>react-fontawesome</w:t>
+      </w:r>
+      <w:proofErr w:type="spellEnd"/>
+      <w:r>
+        <w:rPr>
+          <w:rFonts w:ascii="Courier New" w:eastAsia="Times New Roman" w:hAnsi="Courier New" w:cs="Courier New"/>
+          <w:kern w:val="0"/>
+          <w:sz w:val="20"/>
+          <w:szCs w:val="20"/>
+          <w:lang w:eastAsia="es-ES"/>
+          <w14:ligatures w14:val="none"/>
+        </w:rPr>
+        <w:t>": "^3.1.1",</w:t>
+      </w:r>
+    </w:p>
+    <w:p>
+      <w:pPr>
+        <w:shd w:val="clear" w:color="auto" w:fill="F2F2F2" w:themeFill="background1" w:themeFillShade="F2"/>
+        <w:tabs>
+          <w:tab w:val="left" w:pos="916"/>
+          <w:tab w:val="left" w:pos="1832"/>
+          <w:tab w:val="left" w:pos="2748"/>
+          <w:tab w:val="left" w:pos="3664"/>
+          <w:tab w:val="left" w:pos="4580"/>
+          <w:tab w:val="left" w:pos="5496"/>
+          <w:tab w:val="left" w:pos="6412"/>
+          <w:tab w:val="left" w:pos="7328"/>
+          <w:tab w:val="left" w:pos="8244"/>
+          <w:tab w:val="left" w:pos="9160"/>
+          <w:tab w:val="left" w:pos="10076"/>
+          <w:tab w:val="left" w:pos="10992"/>
+          <w:tab w:val="left" w:pos="11908"/>
+          <w:tab w:val="left" w:pos="12824"/>
+          <w:tab w:val="left" w:pos="13740"/>
+          <w:tab w:val="left" w:pos="14656"/>
+        </w:tabs>
+        <w:spacing w:after="0" w:line="240" w:lineRule="auto"/>
+        <w:rPr>
+          <w:rFonts w:ascii="Courier New" w:eastAsia="Times New Roman" w:hAnsi="Courier New" w:cs="Courier New"/>
+          <w:kern w:val="0"/>
+          <w:sz w:val="20"/>
+          <w:szCs w:val="20"/>
+          <w:lang w:eastAsia="es-ES"/>
+          <w14:ligatures w14:val="none"/>
+        </w:rPr>
+      </w:pPr>
+      <w:r>
+        <w:rPr>
+          <w:rFonts w:ascii="Courier New" w:eastAsia="Times New Roman" w:hAnsi="Courier New" w:cs="Courier New"/>
+          <w:kern w:val="0"/>
+          <w:sz w:val="20"/>
+          <w:szCs w:val="20"/>
+          <w:lang w:eastAsia="es-ES"/>
+          <w14:ligatures w14:val="none"/>
+        </w:rPr>
+        <w:t>"@</w:t>
+      </w:r>
+      <w:proofErr w:type="spellStart"/>
+      <w:r>
+        <w:rPr>
+          <w:rFonts w:ascii="Courier New" w:eastAsia="Times New Roman" w:hAnsi="Courier New" w:cs="Courier New"/>
+          <w:kern w:val="0"/>
+          <w:sz w:val="20"/>
+          <w:szCs w:val="20"/>
+          <w:lang w:eastAsia="es-ES"/>
+          <w14:ligatures w14:val="none"/>
+        </w:rPr>
+        <w:t>fortawesome</w:t>
+      </w:r>
+      <w:proofErr w:type="spellEnd"/>
+      <w:r>
+        <w:rPr>
+          <w:rFonts w:ascii="Courier New" w:eastAsia="Times New Roman" w:hAnsi="Courier New" w:cs="Courier New"/>
+          <w:kern w:val="0"/>
+          <w:sz w:val="20"/>
+          <w:szCs w:val="20"/>
+          <w:lang w:eastAsia="es-ES"/>
+          <w14:ligatures w14:val="none"/>
+        </w:rPr>
+        <w:t>/free-</w:t>
+      </w:r>
+      <w:proofErr w:type="spellStart"/>
+      <w:r>
+        <w:rPr>
+          <w:rFonts w:ascii="Courier New" w:eastAsia="Times New Roman" w:hAnsi="Courier New" w:cs="Courier New"/>
+          <w:kern w:val="0"/>
+          <w:sz w:val="20"/>
+          <w:szCs w:val="20"/>
+          <w:lang w:eastAsia="es-ES"/>
+          <w14:ligatures w14:val="none"/>
+        </w:rPr>
+        <w:t>solid</w:t>
+      </w:r>
+      <w:proofErr w:type="spellEnd"/>
+      <w:r>
+        <w:rPr>
+          <w:rFonts w:ascii="Courier New" w:eastAsia="Times New Roman" w:hAnsi="Courier New" w:cs="Courier New"/>
+          <w:kern w:val="0"/>
+          <w:sz w:val="20"/>
+          <w:szCs w:val="20"/>
+          <w:lang w:eastAsia="es-ES"/>
+          <w14:ligatures w14:val="none"/>
+        </w:rPr>
+        <w:t>-</w:t>
+      </w:r>
+      <w:proofErr w:type="spellStart"/>
+      <w:r>
+        <w:rPr>
+          <w:rFonts w:ascii="Courier New" w:eastAsia="Times New Roman" w:hAnsi="Courier New" w:cs="Courier New"/>
+          <w:kern w:val="0"/>
+          <w:sz w:val="20"/>
+          <w:szCs w:val="20"/>
+          <w:lang w:eastAsia="es-ES"/>
+          <w14:ligatures w14:val="none"/>
+        </w:rPr>
+        <w:t>svg-icons</w:t>
+      </w:r>
+      <w:proofErr w:type="spellEnd"/>
+      <w:r>
+        <w:rPr>
+          <w:rFonts w:ascii="Courier New" w:eastAsia="Times New Roman" w:hAnsi="Courier New" w:cs="Courier New"/>
+          <w:kern w:val="0"/>
+          <w:sz w:val="20"/>
+          <w:szCs w:val="20"/>
+          <w:lang w:eastAsia="es-ES"/>
+          <w14:ligatures w14:val="none"/>
+        </w:rPr>
+        <w:t>": "^7.1.0",</w:t>
+      </w:r>
+    </w:p>
+    <w:p>
+      <w:pPr>
+        <w:shd w:val="clear" w:color="auto" w:fill="F2F2F2" w:themeFill="background1" w:themeFillShade="F2"/>
+        <w:tabs>
+          <w:tab w:val="left" w:pos="916"/>
+          <w:tab w:val="left" w:pos="1832"/>
+          <w:tab w:val="left" w:pos="2748"/>
+          <w:tab w:val="left" w:pos="3664"/>
+          <w:tab w:val="left" w:pos="4580"/>
+          <w:tab w:val="left" w:pos="5496"/>
+          <w:tab w:val="left" w:pos="6412"/>
+          <w:tab w:val="left" w:pos="7328"/>
+          <w:tab w:val="left" w:pos="8244"/>
+          <w:tab w:val="left" w:pos="9160"/>
+          <w:tab w:val="left" w:pos="10076"/>
+          <w:tab w:val="left" w:pos="10992"/>
+          <w:tab w:val="left" w:pos="11908"/>
+          <w:tab w:val="left" w:pos="12824"/>
+          <w:tab w:val="left" w:pos="13740"/>
+          <w:tab w:val="left" w:pos="14656"/>
+        </w:tabs>
+        <w:spacing w:after="0" w:line="240" w:lineRule="auto"/>
+        <w:rPr>
+          <w:rFonts w:ascii="Courier New" w:eastAsia="Times New Roman" w:hAnsi="Courier New" w:cs="Courier New"/>
+          <w:kern w:val="0"/>
+          <w:sz w:val="20"/>
+          <w:szCs w:val="20"/>
+          <w:lang w:eastAsia="es-ES"/>
+          <w14:ligatures w14:val="none"/>
+        </w:rPr>
+      </w:pPr>
+      <w:r>
+        <w:rPr>
+          <w:rFonts w:ascii="Courier New" w:eastAsia="Times New Roman" w:hAnsi="Courier New" w:cs="Courier New"/>
+          <w:kern w:val="0"/>
+          <w:sz w:val="20"/>
+          <w:szCs w:val="20"/>
+          <w:lang w:eastAsia="es-ES"/>
+          <w14:ligatures w14:val="none"/>
+        </w:rPr>
+        <w:t>"@</w:t>
+      </w:r>
+      <w:proofErr w:type="spellStart"/>
+      <w:r>
+        <w:rPr>
+          <w:rFonts w:ascii="Courier New" w:eastAsia="Times New Roman" w:hAnsi="Courier New" w:cs="Courier New"/>
+          <w:kern w:val="0"/>
+          <w:sz w:val="20"/>
+          <w:szCs w:val="20"/>
+          <w:lang w:eastAsia="es-ES"/>
+          <w14:ligatures w14:val="none"/>
+        </w:rPr>
+        <w:t>fortawesome</w:t>
+      </w:r>
+      <w:proofErr w:type="spellEnd"/>
+      <w:r>
+        <w:rPr>
+          <w:rFonts w:ascii="Courier New" w:eastAsia="Times New Roman" w:hAnsi="Courier New" w:cs="Courier New"/>
+          <w:kern w:val="0"/>
+          <w:sz w:val="20"/>
+          <w:szCs w:val="20"/>
+          <w:lang w:eastAsia="es-ES"/>
+          <w14:ligatures w14:val="none"/>
+        </w:rPr>
+        <w:t>/free-</w:t>
+      </w:r>
+      <w:proofErr w:type="spellStart"/>
+      <w:r>
+        <w:rPr>
+          <w:rFonts w:ascii="Courier New" w:eastAsia="Times New Roman" w:hAnsi="Courier New" w:cs="Courier New"/>
+          <w:kern w:val="0"/>
+          <w:sz w:val="20"/>
+          <w:szCs w:val="20"/>
+          <w:lang w:eastAsia="es-ES"/>
+          <w14:ligatures w14:val="none"/>
+        </w:rPr>
+        <w:t>brands</w:t>
+      </w:r>
+      <w:proofErr w:type="spellEnd"/>
+      <w:r>
+        <w:rPr>
+          <w:rFonts w:ascii="Courier New" w:eastAsia="Times New Roman" w:hAnsi="Courier New" w:cs="Courier New"/>
+          <w:kern w:val="0"/>
+          <w:sz w:val="20"/>
+          <w:szCs w:val="20"/>
+          <w:lang w:eastAsia="es-ES"/>
+          <w14:ligatures w14:val="none"/>
+        </w:rPr>
+        <w:t>-</w:t>
+      </w:r>
+      <w:proofErr w:type="spellStart"/>
+      <w:r>
+        <w:rPr>
+          <w:rFonts w:ascii="Courier New" w:eastAsia="Times New Roman" w:hAnsi="Courier New" w:cs="Courier New"/>
+          <w:kern w:val="0"/>
+          <w:sz w:val="20"/>
+          <w:szCs w:val="20"/>
+          <w:lang w:eastAsia="es-ES"/>
+          <w14:ligatures w14:val="none"/>
+        </w:rPr>
+        <w:t>svg-icons</w:t>
+      </w:r>
+      <w:proofErr w:type="spellEnd"/>
+      <w:r>
+        <w:rPr>
+          <w:rFonts w:ascii="Courier New" w:eastAsia="Times New Roman" w:hAnsi="Courier New" w:cs="Courier New"/>
+          <w:kern w:val="0"/>
+          <w:sz w:val="20"/>
+          <w:szCs w:val="20"/>
+          <w:lang w:eastAsia="es-ES"/>
+          <w14:ligatures w14:val="none"/>
+        </w:rPr>
+        <w:t>": "^7.1.0",</w:t>
+      </w:r>
+    </w:p>
+    <w:p>
+      <w:pPr>
+        <w:shd w:val="clear" w:color="auto" w:fill="F2F2F2" w:themeFill="background1" w:themeFillShade="F2"/>
+        <w:tabs>
+          <w:tab w:val="left" w:pos="916"/>
+          <w:tab w:val="left" w:pos="1832"/>
+          <w:tab w:val="left" w:pos="2748"/>
+          <w:tab w:val="left" w:pos="3664"/>
+          <w:tab w:val="left" w:pos="4580"/>
+          <w:tab w:val="left" w:pos="5496"/>
+          <w:tab w:val="left" w:pos="6412"/>
+          <w:tab w:val="left" w:pos="7328"/>
+          <w:tab w:val="left" w:pos="8244"/>
+          <w:tab w:val="left" w:pos="9160"/>
+          <w:tab w:val="left" w:pos="10076"/>
+          <w:tab w:val="left" w:pos="10992"/>
+          <w:tab w:val="left" w:pos="11908"/>
+          <w:tab w:val="left" w:pos="12824"/>
+          <w:tab w:val="left" w:pos="13740"/>
+          <w:tab w:val="left" w:pos="14656"/>
+        </w:tabs>
+        <w:spacing w:after="0" w:line="240" w:lineRule="auto"/>
+        <w:rPr>
+          <w:rFonts w:ascii="Courier New" w:eastAsia="Times New Roman" w:hAnsi="Courier New" w:cs="Courier New"/>
+          <w:kern w:val="0"/>
+          <w:sz w:val="20"/>
+          <w:szCs w:val="20"/>
+          <w:lang w:eastAsia="es-ES"/>
+          <w14:ligatures w14:val="none"/>
+        </w:rPr>
+      </w:pPr>
+      <w:r>
+        <w:rPr>
+          <w:rFonts w:ascii="Courier New" w:eastAsia="Times New Roman" w:hAnsi="Courier New" w:cs="Courier New"/>
+          <w:kern w:val="0"/>
+          <w:sz w:val="20"/>
+          <w:szCs w:val="20"/>
+          <w:lang w:eastAsia="es-ES"/>
+          <w14:ligatures w14:val="none"/>
+        </w:rPr>
+        <w:t>"@</w:t>
+      </w:r>
+      <w:proofErr w:type="spellStart"/>
+      <w:r>
+        <w:rPr>
+          <w:rFonts w:ascii="Courier New" w:eastAsia="Times New Roman" w:hAnsi="Courier New" w:cs="Courier New"/>
+          <w:kern w:val="0"/>
+          <w:sz w:val="20"/>
+          <w:szCs w:val="20"/>
+          <w:lang w:eastAsia="es-ES"/>
+          <w14:ligatures w14:val="none"/>
+        </w:rPr>
+        <w:t>fortawesome</w:t>
+      </w:r>
+      <w:proofErr w:type="spellEnd"/>
+      <w:r>
+        <w:rPr>
+          <w:rFonts w:ascii="Courier New" w:eastAsia="Times New Roman" w:hAnsi="Courier New" w:cs="Courier New"/>
+          <w:kern w:val="0"/>
+          <w:sz w:val="20"/>
+          <w:szCs w:val="20"/>
+          <w:lang w:eastAsia="es-ES"/>
+          <w14:ligatures w14:val="none"/>
+        </w:rPr>
+        <w:t>/free-regular-</w:t>
+      </w:r>
+      <w:proofErr w:type="spellStart"/>
+      <w:r>
+        <w:rPr>
+          <w:rFonts w:ascii="Courier New" w:eastAsia="Times New Roman" w:hAnsi="Courier New" w:cs="Courier New"/>
+          <w:kern w:val="0"/>
+          <w:sz w:val="20"/>
+          <w:szCs w:val="20"/>
+          <w:lang w:eastAsia="es-ES"/>
+          <w14:ligatures w14:val="none"/>
+        </w:rPr>
+        <w:t>svg</w:t>
+      </w:r>
+      <w:proofErr w:type="spellEnd"/>
+      <w:r>
+        <w:rPr>
+          <w:rFonts w:ascii="Courier New" w:eastAsia="Times New Roman" w:hAnsi="Courier New" w:cs="Courier New"/>
+          <w:kern w:val="0"/>
+          <w:sz w:val="20"/>
+          <w:szCs w:val="20"/>
+          <w:lang w:eastAsia="es-ES"/>
+          <w14:ligatures w14:val="none"/>
+        </w:rPr>
+        <w:t>-</w:t>
+      </w:r>
+      <w:proofErr w:type="spellStart"/>
+      <w:r>
+        <w:rPr>
+          <w:rFonts w:ascii="Courier New" w:eastAsia="Times New Roman" w:hAnsi="Courier New" w:cs="Courier New"/>
+          <w:kern w:val="0"/>
+          <w:sz w:val="20"/>
+          <w:szCs w:val="20"/>
+          <w:lang w:eastAsia="es-ES"/>
+          <w14:ligatures w14:val="none"/>
+        </w:rPr>
+        <w:t>icons</w:t>
+      </w:r>
+      <w:proofErr w:type="spellEnd"/>
+      <w:r>
+        <w:rPr>
+          <w:rFonts w:ascii="Courier New" w:eastAsia="Times New Roman" w:hAnsi="Courier New" w:cs="Courier New"/>
+          <w:kern w:val="0"/>
+          <w:sz w:val="20"/>
+          <w:szCs w:val="20"/>
+          <w:lang w:eastAsia="es-ES"/>
+          <w14:ligatures w14:val="none"/>
+        </w:rPr>
+        <w:t>": "^7.1.0"</w:t>
+      </w:r>
+    </w:p>
+    <w:p>
+      <w:pPr>
+        <w:jc w:val="both"/>
+        <w:rPr>
+          <w:rFonts w:asciiTheme="majorHAnsi" w:eastAsiaTheme="majorEastAsia" w:hAnsiTheme="majorHAnsi" w:cstheme="majorBidi"/>
+          <w:color w:val="0F4761" w:themeColor="accent1" w:themeShade="BF"/>
+          <w:sz w:val="32"/>
+          <w:szCs w:val="32"/>
+        </w:rPr>
+      </w:pPr>
+    </w:p>
+    <w:p>
+      <w:pPr>
+        <w:pStyle w:val="Ttulo3"/>
+      </w:pPr>
+      <w:r>
+        <w:t>Configuración</w:t>
+      </w:r>
+    </w:p>
+    <w:p>
+      <w:r>
+        <w:t xml:space="preserve">Para poder usar los iconos debemos añadir en nuestro </w:t>
+      </w:r>
+      <w:proofErr w:type="spellStart"/>
+      <w:r>
+        <w:t>root</w:t>
+      </w:r>
+      <w:proofErr w:type="spellEnd"/>
+      <w:r>
+        <w:t xml:space="preserve"> </w:t>
+      </w:r>
+      <w:proofErr w:type="spellStart"/>
+      <w:r>
+        <w:t>layout.tsx</w:t>
+      </w:r>
+      <w:proofErr w:type="spellEnd"/>
+      <w:r>
+        <w:t xml:space="preserve"> la siguiente dependencia:</w:t>
+      </w:r>
+      <w:r>
+        <w:br/>
+      </w:r>
+    </w:p>
+    <w:p>
+      <w:pPr>
+        <w:shd w:val="clear" w:color="auto" w:fill="F2F2F2" w:themeFill="background1" w:themeFillShade="F2"/>
+        <w:spacing w:after="0" w:line="285" w:lineRule="atLeast"/>
+        <w:rPr>
+          <w:rFonts w:ascii="Consolas" w:eastAsia="Times New Roman" w:hAnsi="Consolas" w:cs="Times New Roman"/>
+          <w:color w:val="4EA72E" w:themeColor="accent6"/>
+          <w:kern w:val="0"/>
+          <w:sz w:val="21"/>
+          <w:szCs w:val="21"/>
+          <w:lang w:val="en-US" w:eastAsia="es-ES"/>
+          <w14:ligatures w14:val="none"/>
+        </w:rPr>
+      </w:pPr>
+      <w:r>
+        <w:rPr>
+          <w:rFonts w:ascii="Consolas" w:eastAsia="Times New Roman" w:hAnsi="Consolas" w:cs="Times New Roman"/>
+          <w:color w:val="156082" w:themeColor="accent1"/>
+          <w:kern w:val="0"/>
+          <w:sz w:val="21"/>
+          <w:szCs w:val="21"/>
+          <w:lang w:val="en-US" w:eastAsia="es-ES"/>
+          <w14:ligatures w14:val="none"/>
+        </w:rPr>
+        <w:t>import</w:t>
+      </w:r>
+      <w:r>
+        <w:rPr>
+          <w:rFonts w:ascii="Consolas" w:eastAsia="Times New Roman" w:hAnsi="Consolas" w:cs="Times New Roman"/>
+          <w:color w:val="E4E4E4"/>
+          <w:kern w:val="0"/>
+          <w:sz w:val="21"/>
+          <w:szCs w:val="21"/>
+          <w:lang w:val="en-US" w:eastAsia="es-ES"/>
+          <w14:ligatures w14:val="none"/>
+        </w:rPr>
+        <w:t xml:space="preserve"> </w:t>
+      </w:r>
+      <w:proofErr w:type="gramStart"/>
+      <w:r>
+        <w:rPr>
+          <w:rFonts w:ascii="Consolas" w:eastAsia="Times New Roman" w:hAnsi="Consolas" w:cs="Times New Roman"/>
+          <w:color w:val="E97132" w:themeColor="accent2"/>
+          <w:kern w:val="0"/>
+          <w:sz w:val="21"/>
+          <w:szCs w:val="21"/>
+          <w:lang w:val="en-US" w:eastAsia="es-ES"/>
+          <w14:ligatures w14:val="none"/>
+        </w:rPr>
+        <w:t>{</w:t>
+      </w:r>
+      <w:r>
+        <w:rPr>
+          <w:rFonts w:ascii="Consolas" w:eastAsia="Times New Roman" w:hAnsi="Consolas" w:cs="Times New Roman"/>
+          <w:color w:val="E4E4E4"/>
+          <w:kern w:val="0"/>
+          <w:sz w:val="21"/>
+          <w:szCs w:val="21"/>
+          <w:lang w:val="en-US" w:eastAsia="es-ES"/>
+          <w14:ligatures w14:val="none"/>
+        </w:rPr>
+        <w:t xml:space="preserve"> </w:t>
+      </w:r>
+      <w:r>
+        <w:rPr>
+          <w:rFonts w:ascii="Consolas" w:eastAsia="Times New Roman" w:hAnsi="Consolas" w:cs="Times New Roman"/>
+          <w:color w:val="A02B93" w:themeColor="accent5"/>
+          <w:kern w:val="0"/>
+          <w:sz w:val="21"/>
+          <w:szCs w:val="21"/>
+          <w:lang w:val="en-US" w:eastAsia="es-ES"/>
+          <w14:ligatures w14:val="none"/>
+        </w:rPr>
+        <w:t>config</w:t>
+      </w:r>
+      <w:proofErr w:type="gramEnd"/>
+      <w:r>
+        <w:rPr>
+          <w:rFonts w:ascii="Consolas" w:eastAsia="Times New Roman" w:hAnsi="Consolas" w:cs="Times New Roman"/>
+          <w:color w:val="A02B93" w:themeColor="accent5"/>
+          <w:kern w:val="0"/>
+          <w:sz w:val="21"/>
+          <w:szCs w:val="21"/>
+          <w:lang w:val="en-US" w:eastAsia="es-ES"/>
+          <w14:ligatures w14:val="none"/>
+        </w:rPr>
+        <w:t xml:space="preserve"> </w:t>
+      </w:r>
+      <w:r>
+        <w:rPr>
+          <w:rFonts w:ascii="Consolas" w:eastAsia="Times New Roman" w:hAnsi="Consolas" w:cs="Times New Roman"/>
+          <w:color w:val="E97132" w:themeColor="accent2"/>
+          <w:kern w:val="0"/>
+          <w:sz w:val="21"/>
+          <w:szCs w:val="21"/>
+          <w:lang w:val="en-US" w:eastAsia="es-ES"/>
+          <w14:ligatures w14:val="none"/>
+        </w:rPr>
+        <w:t>}</w:t>
+      </w:r>
+      <w:r>
+        <w:rPr>
+          <w:rFonts w:ascii="Consolas" w:eastAsia="Times New Roman" w:hAnsi="Consolas" w:cs="Times New Roman"/>
+          <w:color w:val="E4E4E4"/>
+          <w:kern w:val="0"/>
+          <w:sz w:val="21"/>
+          <w:szCs w:val="21"/>
+          <w:lang w:val="en-US" w:eastAsia="es-ES"/>
+          <w14:ligatures w14:val="none"/>
+        </w:rPr>
+        <w:t xml:space="preserve"> </w:t>
+      </w:r>
+      <w:r>
+        <w:rPr>
+          <w:rFonts w:ascii="Consolas" w:eastAsia="Times New Roman" w:hAnsi="Consolas" w:cs="Times New Roman"/>
+          <w:color w:val="156082" w:themeColor="accent1"/>
+          <w:kern w:val="0"/>
+          <w:sz w:val="21"/>
+          <w:szCs w:val="21"/>
+          <w:lang w:val="en-US" w:eastAsia="es-ES"/>
+          <w14:ligatures w14:val="none"/>
+        </w:rPr>
+        <w:t xml:space="preserve">from </w:t>
+      </w:r>
+      <w:r>
+        <w:rPr>
+          <w:rFonts w:ascii="Consolas" w:eastAsia="Times New Roman" w:hAnsi="Consolas" w:cs="Times New Roman"/>
+          <w:color w:val="4EA72E" w:themeColor="accent6"/>
+          <w:kern w:val="0"/>
+          <w:sz w:val="21"/>
+          <w:szCs w:val="21"/>
+          <w:lang w:val="en-US" w:eastAsia="es-ES"/>
+          <w14:ligatures w14:val="none"/>
+        </w:rPr>
+        <w:t>"@</w:t>
+      </w:r>
+      <w:proofErr w:type="spellStart"/>
+      <w:r>
+        <w:rPr>
+          <w:rFonts w:ascii="Consolas" w:eastAsia="Times New Roman" w:hAnsi="Consolas" w:cs="Times New Roman"/>
+          <w:color w:val="4EA72E" w:themeColor="accent6"/>
+          <w:kern w:val="0"/>
+          <w:sz w:val="21"/>
+          <w:szCs w:val="21"/>
+          <w:lang w:val="en-US" w:eastAsia="es-ES"/>
+          <w14:ligatures w14:val="none"/>
+        </w:rPr>
+        <w:t>fortawesome</w:t>
+      </w:r>
+      <w:proofErr w:type="spellEnd"/>
+      <w:r>
+        <w:rPr>
+          <w:rFonts w:ascii="Consolas" w:eastAsia="Times New Roman" w:hAnsi="Consolas" w:cs="Times New Roman"/>
+          <w:color w:val="4EA72E" w:themeColor="accent6"/>
+          <w:kern w:val="0"/>
+          <w:sz w:val="21"/>
+          <w:szCs w:val="21"/>
+          <w:lang w:val="en-US" w:eastAsia="es-ES"/>
+          <w14:ligatures w14:val="none"/>
+        </w:rPr>
+        <w:t>/</w:t>
+      </w:r>
+      <w:proofErr w:type="spellStart"/>
+      <w:r>
+        <w:rPr>
+          <w:rFonts w:ascii="Consolas" w:eastAsia="Times New Roman" w:hAnsi="Consolas" w:cs="Times New Roman"/>
+          <w:color w:val="4EA72E" w:themeColor="accent6"/>
+          <w:kern w:val="0"/>
+          <w:sz w:val="21"/>
+          <w:szCs w:val="21"/>
+          <w:lang w:val="en-US" w:eastAsia="es-ES"/>
+          <w14:ligatures w14:val="none"/>
+        </w:rPr>
+        <w:t>fontawesome</w:t>
+      </w:r>
+      <w:proofErr w:type="spellEnd"/>
+      <w:r>
+        <w:rPr>
+          <w:rFonts w:ascii="Consolas" w:eastAsia="Times New Roman" w:hAnsi="Consolas" w:cs="Times New Roman"/>
+          <w:color w:val="4EA72E" w:themeColor="accent6"/>
+          <w:kern w:val="0"/>
+          <w:sz w:val="21"/>
+          <w:szCs w:val="21"/>
+          <w:lang w:val="en-US" w:eastAsia="es-ES"/>
+          <w14:ligatures w14:val="none"/>
+        </w:rPr>
+        <w:t>-</w:t>
+      </w:r>
+      <w:proofErr w:type="spellStart"/>
+      <w:r>
+        <w:rPr>
+          <w:rFonts w:ascii="Consolas" w:eastAsia="Times New Roman" w:hAnsi="Consolas" w:cs="Times New Roman"/>
+          <w:color w:val="4EA72E" w:themeColor="accent6"/>
+          <w:kern w:val="0"/>
+          <w:sz w:val="21"/>
+          <w:szCs w:val="21"/>
+          <w:lang w:val="en-US" w:eastAsia="es-ES"/>
+          <w14:ligatures w14:val="none"/>
+        </w:rPr>
+        <w:t>svg</w:t>
+      </w:r>
+      <w:proofErr w:type="spellEnd"/>
+      <w:r>
+        <w:rPr>
+          <w:rFonts w:ascii="Consolas" w:eastAsia="Times New Roman" w:hAnsi="Consolas" w:cs="Times New Roman"/>
+          <w:color w:val="4EA72E" w:themeColor="accent6"/>
+          <w:kern w:val="0"/>
+          <w:sz w:val="21"/>
+          <w:szCs w:val="21"/>
+          <w:lang w:val="en-US" w:eastAsia="es-ES"/>
+          <w14:ligatures w14:val="none"/>
+        </w:rPr>
+        <w:t>-core";</w:t>
+      </w:r>
+    </w:p>
+    <w:p>
+      <w:pPr>
+        <w:shd w:val="clear" w:color="auto" w:fill="F2F2F2" w:themeFill="background1" w:themeFillShade="F2"/>
+        <w:spacing w:after="0" w:line="285" w:lineRule="atLeast"/>
+        <w:rPr>
+          <w:rFonts w:ascii="Consolas" w:eastAsia="Times New Roman" w:hAnsi="Consolas" w:cs="Times New Roman"/>
+          <w:color w:val="4EA72E" w:themeColor="accent6"/>
+          <w:kern w:val="0"/>
+          <w:sz w:val="21"/>
+          <w:szCs w:val="21"/>
+          <w:lang w:eastAsia="es-ES"/>
+          <w14:ligatures w14:val="none"/>
+        </w:rPr>
+      </w:pPr>
+      <w:proofErr w:type="spellStart"/>
+      <w:r>
+        <w:rPr>
+          <w:rFonts w:ascii="Consolas" w:eastAsia="Times New Roman" w:hAnsi="Consolas" w:cs="Times New Roman"/>
+          <w:color w:val="156082" w:themeColor="accent1"/>
+          <w:kern w:val="0"/>
+          <w:sz w:val="21"/>
+          <w:szCs w:val="21"/>
+          <w:lang w:eastAsia="es-ES"/>
+          <w14:ligatures w14:val="none"/>
+        </w:rPr>
+        <w:t>import</w:t>
+      </w:r>
+      <w:proofErr w:type="spellEnd"/>
+      <w:r>
+        <w:rPr>
+          <w:rFonts w:ascii="Consolas" w:eastAsia="Times New Roman" w:hAnsi="Consolas" w:cs="Times New Roman"/>
+          <w:color w:val="156082" w:themeColor="accent1"/>
+          <w:kern w:val="0"/>
+          <w:sz w:val="21"/>
+          <w:szCs w:val="21"/>
+          <w:lang w:eastAsia="es-ES"/>
+          <w14:ligatures w14:val="none"/>
+        </w:rPr>
+        <w:t xml:space="preserve"> </w:t>
+      </w:r>
+      <w:r>
+        <w:rPr>
+          <w:rFonts w:ascii="Consolas" w:eastAsia="Times New Roman" w:hAnsi="Consolas" w:cs="Times New Roman"/>
+          <w:color w:val="4EA72E" w:themeColor="accent6"/>
+          <w:kern w:val="0"/>
+          <w:sz w:val="21"/>
+          <w:szCs w:val="21"/>
+          <w:lang w:eastAsia="es-ES"/>
+          <w14:ligatures w14:val="none"/>
+        </w:rPr>
+        <w:t>"@</w:t>
+      </w:r>
+      <w:proofErr w:type="spellStart"/>
+      <w:r>
+        <w:rPr>
+          <w:rFonts w:ascii="Consolas" w:eastAsia="Times New Roman" w:hAnsi="Consolas" w:cs="Times New Roman"/>
+          <w:color w:val="4EA72E" w:themeColor="accent6"/>
+          <w:kern w:val="0"/>
+          <w:sz w:val="21"/>
+          <w:szCs w:val="21"/>
+          <w:lang w:eastAsia="es-ES"/>
+          <w14:ligatures w14:val="none"/>
+        </w:rPr>
+        <w:t>fortawesome</w:t>
+      </w:r>
+      <w:proofErr w:type="spellEnd"/>
+      <w:r>
+        <w:rPr>
+          <w:rFonts w:ascii="Consolas" w:eastAsia="Times New Roman" w:hAnsi="Consolas" w:cs="Times New Roman"/>
+          <w:color w:val="4EA72E" w:themeColor="accent6"/>
+          <w:kern w:val="0"/>
+          <w:sz w:val="21"/>
+          <w:szCs w:val="21"/>
+          <w:lang w:eastAsia="es-ES"/>
+          <w14:ligatures w14:val="none"/>
+        </w:rPr>
+        <w:t>/</w:t>
+      </w:r>
+      <w:proofErr w:type="spellStart"/>
+      <w:r>
+        <w:rPr>
+          <w:rFonts w:ascii="Consolas" w:eastAsia="Times New Roman" w:hAnsi="Consolas" w:cs="Times New Roman"/>
+          <w:color w:val="4EA72E" w:themeColor="accent6"/>
+          <w:kern w:val="0"/>
+          <w:sz w:val="21"/>
+          <w:szCs w:val="21"/>
+          <w:lang w:eastAsia="es-ES"/>
+          <w14:ligatures w14:val="none"/>
+        </w:rPr>
+        <w:t>fontawesome-svg-core</w:t>
+      </w:r>
+      <w:proofErr w:type="spellEnd"/>
+      <w:r>
+        <w:rPr>
+          <w:rFonts w:ascii="Consolas" w:eastAsia="Times New Roman" w:hAnsi="Consolas" w:cs="Times New Roman"/>
+          <w:color w:val="4EA72E" w:themeColor="accent6"/>
+          <w:kern w:val="0"/>
+          <w:sz w:val="21"/>
+          <w:szCs w:val="21"/>
+          <w:lang w:eastAsia="es-ES"/>
+          <w14:ligatures w14:val="none"/>
+        </w:rPr>
+        <w:t>/styles.css";</w:t>
+      </w:r>
+    </w:p>
+    <w:p>
+      <w:pPr>
+        <w:shd w:val="clear" w:color="auto" w:fill="F2F2F2" w:themeFill="background1" w:themeFillShade="F2"/>
+        <w:spacing w:after="0" w:line="285" w:lineRule="atLeast"/>
+        <w:rPr>
+          <w:rFonts w:ascii="Consolas" w:eastAsia="Times New Roman" w:hAnsi="Consolas" w:cs="Times New Roman"/>
+          <w:color w:val="E4E4E4"/>
+          <w:kern w:val="0"/>
+          <w:sz w:val="21"/>
+          <w:szCs w:val="21"/>
+          <w:lang w:eastAsia="es-ES"/>
+          <w14:ligatures w14:val="none"/>
+        </w:rPr>
+      </w:pPr>
+    </w:p>
+    <w:p>
+      <w:pPr>
+        <w:shd w:val="clear" w:color="auto" w:fill="F2F2F2" w:themeFill="background1" w:themeFillShade="F2"/>
+        <w:spacing w:after="0" w:line="285" w:lineRule="atLeast"/>
+        <w:rPr>
+          <w:rFonts w:ascii="Consolas" w:eastAsia="Times New Roman" w:hAnsi="Consolas" w:cs="Times New Roman"/>
+          <w:color w:val="E4E4E4"/>
+          <w:kern w:val="0"/>
+          <w:sz w:val="21"/>
+          <w:szCs w:val="21"/>
+          <w:lang w:eastAsia="es-ES"/>
+          <w14:ligatures w14:val="none"/>
+        </w:rPr>
+      </w:pPr>
+      <w:proofErr w:type="spellStart"/>
+      <w:proofErr w:type="gramStart"/>
+      <w:r>
+        <w:rPr>
+          <w:rFonts w:ascii="Consolas" w:eastAsia="Times New Roman" w:hAnsi="Consolas" w:cs="Times New Roman"/>
+          <w:color w:val="A02B93" w:themeColor="accent5"/>
+          <w:kern w:val="0"/>
+          <w:sz w:val="21"/>
+          <w:szCs w:val="21"/>
+          <w:lang w:eastAsia="es-ES"/>
+          <w14:ligatures w14:val="none"/>
+        </w:rPr>
+        <w:t>config.autoAddCss</w:t>
+      </w:r>
+      <w:proofErr w:type="spellEnd"/>
+      <w:proofErr w:type="gramEnd"/>
+      <w:r>
+        <w:rPr>
+          <w:rFonts w:ascii="Consolas" w:eastAsia="Times New Roman" w:hAnsi="Consolas" w:cs="Times New Roman"/>
+          <w:color w:val="A02B93" w:themeColor="accent5"/>
+          <w:kern w:val="0"/>
+          <w:sz w:val="21"/>
+          <w:szCs w:val="21"/>
+          <w:lang w:eastAsia="es-ES"/>
+          <w14:ligatures w14:val="none"/>
+        </w:rPr>
+        <w:t xml:space="preserve"> </w:t>
+      </w:r>
+      <w:r>
+        <w:rPr>
+          <w:rFonts w:ascii="Consolas" w:eastAsia="Times New Roman" w:hAnsi="Consolas" w:cs="Times New Roman"/>
+          <w:color w:val="E97132" w:themeColor="accent2"/>
+          <w:kern w:val="0"/>
+          <w:sz w:val="21"/>
+          <w:szCs w:val="21"/>
+          <w:lang w:eastAsia="es-ES"/>
+          <w14:ligatures w14:val="none"/>
+        </w:rPr>
+        <w:t>= false;</w:t>
+      </w:r>
+    </w:p>
+    <w:p>
+      <w:pPr>
+        <w:shd w:val="clear" w:color="auto" w:fill="F2F2F2" w:themeFill="background1" w:themeFillShade="F2"/>
+        <w:spacing w:after="0" w:line="285" w:lineRule="atLeast"/>
+        <w:rPr>
+          <w:rFonts w:ascii="Consolas" w:eastAsia="Times New Roman" w:hAnsi="Consolas" w:cs="Times New Roman"/>
+          <w:color w:val="E4E4E4"/>
+          <w:kern w:val="0"/>
+          <w:sz w:val="21"/>
+          <w:szCs w:val="21"/>
+          <w:lang w:eastAsia="es-ES"/>
+          <w14:ligatures w14:val="none"/>
+        </w:rPr>
+      </w:pPr>
+    </w:p>
+    <w:p>
+      <w:r>
+        <w:t xml:space="preserve"> </w:t>
+      </w:r>
+    </w:p>
+    <w:p>
+      <w:pPr>
+        <w:pStyle w:val="Ttulo3"/>
+      </w:pPr>
+      <w:r>
+        <w:t>Listado de iconos usados</w:t>
+      </w:r>
+    </w:p>
+    <w:tbl>
+      <w:tblPr>
+        <w:tblStyle w:val="Tablaconcuadrcula"/>
+        <w:tblW w:w="0" w:type="auto"/>
+        <w:tblLook w:val="04A0" w:firstRow="1" w:lastRow="0" w:firstColumn="1" w:lastColumn="0" w:noHBand="0" w:noVBand="1"/>
+      </w:tblPr>
+      <w:tblGrid>
+        <w:gridCol w:w="2831"/>
+        <w:gridCol w:w="1559"/>
+        <w:gridCol w:w="4104"/>
+      </w:tblGrid>
+      <w:tr>
+        <w:tc>
+          <w:tcPr>
+            <w:tcW w:w="2831" w:type="dxa"/>
+            <w:shd w:val="clear" w:color="auto" w:fill="156082" w:themeFill="accent1"/>
+            <w:vAlign w:val="center"/>
+          </w:tcPr>
+          <w:p>
+            <w:pPr>
+              <w:jc w:val="center"/>
+              <w:rPr>
+                <w:color w:val="FFFFFF" w:themeColor="background1"/>
+              </w:rPr>
+            </w:pPr>
+            <w:r>
+              <w:rPr>
+                <w:color w:val="FFFFFF" w:themeColor="background1"/>
+              </w:rPr>
+              <w:t>Icono</w:t>
             </w:r>
           </w:p>
         </w:tc>
@@ -28405,13 +30421,13 @@
               <w:rPr>
                 <w:color w:val="FFFFFF" w:themeColor="background1"/>
               </w:rPr>
-              <w:t>Tamaño</w:t>
-            </w:r>
-          </w:p>
-        </w:tc>
-        <w:tc>
-          <w:tcPr>
-            <w:tcW w:w="2694" w:type="dxa"/>
+              <w:t>Muestra</w:t>
+            </w:r>
+          </w:p>
+        </w:tc>
+        <w:tc>
+          <w:tcPr>
+            <w:tcW w:w="4104" w:type="dxa"/>
             <w:shd w:val="clear" w:color="auto" w:fill="156082" w:themeFill="accent1"/>
             <w:vAlign w:val="center"/>
           </w:tcPr>
@@ -28426,27 +30442,6 @@
               <w:rPr>
                 <w:color w:val="FFFFFF" w:themeColor="background1"/>
               </w:rPr>
-              <w:t>Ejemplo</w:t>
-            </w:r>
-          </w:p>
-        </w:tc>
-        <w:tc>
-          <w:tcPr>
-            <w:tcW w:w="1836" w:type="dxa"/>
-            <w:shd w:val="clear" w:color="auto" w:fill="156082" w:themeFill="accent1"/>
-            <w:vAlign w:val="center"/>
-          </w:tcPr>
-          <w:p>
-            <w:pPr>
-              <w:jc w:val="center"/>
-              <w:rPr>
-                <w:color w:val="FFFFFF" w:themeColor="background1"/>
-              </w:rPr>
-            </w:pPr>
-            <w:r>
-              <w:rPr>
-                <w:color w:val="FFFFFF" w:themeColor="background1"/>
-              </w:rPr>
               <w:t>Uso</w:t>
             </w:r>
           </w:p>
@@ -28455,30 +30450,18 @@
       <w:tr>
         <w:tc>
           <w:tcPr>
-            <w:tcW w:w="1256" w:type="dxa"/>
+            <w:tcW w:w="2831" w:type="dxa"/>
             <w:vAlign w:val="center"/>
           </w:tcPr>
           <w:p>
             <w:pPr>
               <w:jc w:val="center"/>
             </w:pPr>
-            <w:r>
-              <w:t>H1</w:t>
-            </w:r>
-          </w:p>
-        </w:tc>
-        <w:tc>
-          <w:tcPr>
-            <w:tcW w:w="1149" w:type="dxa"/>
-            <w:vAlign w:val="center"/>
-          </w:tcPr>
-          <w:p>
-            <w:pPr>
-              <w:jc w:val="center"/>
-            </w:pPr>
-            <w:r>
-              <w:t>text-4xl</w:t>
-            </w:r>
+            <w:proofErr w:type="spellStart"/>
+            <w:r>
+              <w:t>faUser</w:t>
+            </w:r>
+            <w:proofErr w:type="spellEnd"/>
           </w:p>
         </w:tc>
         <w:tc>
@@ -28491,78 +30474,66 @@
               <w:jc w:val="center"/>
             </w:pPr>
             <w:r>
-              <w:t>2.25rem</w:t>
-            </w:r>
-          </w:p>
-          <w:p>
-            <w:pPr>
-              <w:jc w:val="center"/>
-            </w:pPr>
-            <w:r>
-              <w:t>(36px)</w:t>
-            </w:r>
-          </w:p>
-        </w:tc>
-        <w:tc>
-          <w:tcPr>
-            <w:tcW w:w="2694" w:type="dxa"/>
-            <w:vAlign w:val="center"/>
-          </w:tcPr>
-          <w:p>
-            <w:pPr>
-              <w:rPr>
-                <w:sz w:val="72"/>
-                <w:szCs w:val="72"/>
-              </w:rPr>
-            </w:pPr>
-            <w:r>
-              <w:rPr>
-                <w:sz w:val="72"/>
-                <w:szCs w:val="72"/>
-              </w:rPr>
-              <w:t>Ejemplo</w:t>
-            </w:r>
-          </w:p>
-        </w:tc>
-        <w:tc>
-          <w:tcPr>
-            <w:tcW w:w="1836" w:type="dxa"/>
-            <w:vAlign w:val="center"/>
-          </w:tcPr>
-          <w:p>
-            <w:r>
-              <w:t>Títulos principales</w:t>
-            </w:r>
-          </w:p>
+              <w:drawing>
+                <wp:inline distT="0" distB="0" distL="0" distR="0" wp14:anchorId="2E8B4BA2" wp14:editId="22F3CDC7">
+                  <wp:extent cx="378121" cy="320040"/>
+                  <wp:effectExtent l="0" t="0" r="3175" b="3810"/>
+                  <wp:docPr id="1060535831" name="Imagen 1"/>
+                  <wp:cNvGraphicFramePr>
+                    <a:graphicFrameLocks xmlns:a="http://schemas.openxmlformats.org/drawingml/2006/main" noChangeAspect="1"/>
+                  </wp:cNvGraphicFramePr>
+                  <a:graphic xmlns:a="http://schemas.openxmlformats.org/drawingml/2006/main">
+                    <a:graphicData uri="http://schemas.openxmlformats.org/drawingml/2006/picture">
+                      <pic:pic xmlns:pic="http://schemas.openxmlformats.org/drawingml/2006/picture">
+                        <pic:nvPicPr>
+                          <pic:cNvPr id="1060535831" name=""/>
+                          <pic:cNvPicPr/>
+                        </pic:nvPicPr>
+                        <pic:blipFill>
+                          <a:blip r:embed="rId24"/>
+                          <a:stretch>
+                            <a:fillRect/>
+                          </a:stretch>
+                        </pic:blipFill>
+                        <pic:spPr>
+                          <a:xfrm>
+                            <a:off x="0" y="0"/>
+                            <a:ext cx="387498" cy="327977"/>
+                          </a:xfrm>
+                          <a:prstGeom prst="rect">
+                            <a:avLst/>
+                          </a:prstGeom>
+                        </pic:spPr>
+                      </pic:pic>
+                    </a:graphicData>
+                  </a:graphic>
+                </wp:inline>
+              </w:drawing>
+            </w:r>
+          </w:p>
+        </w:tc>
+        <w:tc>
+          <w:tcPr>
+            <w:tcW w:w="4104" w:type="dxa"/>
+          </w:tcPr>
+          <w:p/>
         </w:tc>
       </w:tr>
       <w:tr>
         <w:tc>
           <w:tcPr>
-            <w:tcW w:w="1256" w:type="dxa"/>
+            <w:tcW w:w="2831" w:type="dxa"/>
             <w:vAlign w:val="center"/>
           </w:tcPr>
           <w:p>
             <w:pPr>
               <w:jc w:val="center"/>
             </w:pPr>
-            <w:r>
-              <w:t>H2</w:t>
-            </w:r>
-          </w:p>
-        </w:tc>
-        <w:tc>
-          <w:tcPr>
-            <w:tcW w:w="1149" w:type="dxa"/>
-            <w:vAlign w:val="center"/>
-          </w:tcPr>
-          <w:p>
-            <w:pPr>
-              <w:jc w:val="center"/>
-            </w:pPr>
-            <w:r>
-              <w:t>text-3xl</w:t>
-            </w:r>
+            <w:proofErr w:type="spellStart"/>
+            <w:r>
+              <w:t>faLock</w:t>
+            </w:r>
+            <w:proofErr w:type="spellEnd"/>
           </w:p>
         </w:tc>
         <w:tc>
@@ -28575,70 +30546,66 @@
               <w:jc w:val="center"/>
             </w:pPr>
             <w:r>
-              <w:t>1.875rem (30px)</w:t>
-            </w:r>
-          </w:p>
-        </w:tc>
-        <w:tc>
-          <w:tcPr>
-            <w:tcW w:w="2694" w:type="dxa"/>
-            <w:vAlign w:val="center"/>
-          </w:tcPr>
-          <w:p>
-            <w:pPr>
-              <w:rPr>
-                <w:sz w:val="60"/>
-                <w:szCs w:val="60"/>
-              </w:rPr>
-            </w:pPr>
-            <w:r>
-              <w:rPr>
-                <w:sz w:val="60"/>
-                <w:szCs w:val="60"/>
-              </w:rPr>
-              <w:t>Ejemplo</w:t>
-            </w:r>
-          </w:p>
-        </w:tc>
-        <w:tc>
-          <w:tcPr>
-            <w:tcW w:w="1836" w:type="dxa"/>
-            <w:vAlign w:val="center"/>
-          </w:tcPr>
-          <w:p>
-            <w:r>
-              <w:t>Secciones</w:t>
-            </w:r>
-          </w:p>
+              <w:drawing>
+                <wp:inline distT="0" distB="0" distL="0" distR="0" wp14:anchorId="6B560F80" wp14:editId="7F81B740">
+                  <wp:extent cx="408305" cy="378462"/>
+                  <wp:effectExtent l="0" t="0" r="0" b="2540"/>
+                  <wp:docPr id="1773114196" name="Imagen 1"/>
+                  <wp:cNvGraphicFramePr>
+                    <a:graphicFrameLocks xmlns:a="http://schemas.openxmlformats.org/drawingml/2006/main" noChangeAspect="1"/>
+                  </wp:cNvGraphicFramePr>
+                  <a:graphic xmlns:a="http://schemas.openxmlformats.org/drawingml/2006/main">
+                    <a:graphicData uri="http://schemas.openxmlformats.org/drawingml/2006/picture">
+                      <pic:pic xmlns:pic="http://schemas.openxmlformats.org/drawingml/2006/picture">
+                        <pic:nvPicPr>
+                          <pic:cNvPr id="1773114196" name=""/>
+                          <pic:cNvPicPr/>
+                        </pic:nvPicPr>
+                        <pic:blipFill>
+                          <a:blip r:embed="rId25"/>
+                          <a:stretch>
+                            <a:fillRect/>
+                          </a:stretch>
+                        </pic:blipFill>
+                        <pic:spPr>
+                          <a:xfrm>
+                            <a:off x="0" y="0"/>
+                            <a:ext cx="422655" cy="391763"/>
+                          </a:xfrm>
+                          <a:prstGeom prst="rect">
+                            <a:avLst/>
+                          </a:prstGeom>
+                        </pic:spPr>
+                      </pic:pic>
+                    </a:graphicData>
+                  </a:graphic>
+                </wp:inline>
+              </w:drawing>
+            </w:r>
+          </w:p>
+        </w:tc>
+        <w:tc>
+          <w:tcPr>
+            <w:tcW w:w="4104" w:type="dxa"/>
+          </w:tcPr>
+          <w:p/>
         </w:tc>
       </w:tr>
       <w:tr>
         <w:tc>
           <w:tcPr>
-            <w:tcW w:w="1256" w:type="dxa"/>
+            <w:tcW w:w="2831" w:type="dxa"/>
             <w:vAlign w:val="center"/>
           </w:tcPr>
           <w:p>
             <w:pPr>
               <w:jc w:val="center"/>
             </w:pPr>
-            <w:r>
-              <w:t>H3</w:t>
-            </w:r>
-          </w:p>
-        </w:tc>
-        <w:tc>
-          <w:tcPr>
-            <w:tcW w:w="1149" w:type="dxa"/>
-            <w:vAlign w:val="center"/>
-          </w:tcPr>
-          <w:p>
-            <w:pPr>
-              <w:jc w:val="center"/>
-            </w:pPr>
-            <w:r>
-              <w:t>text-2xl</w:t>
-            </w:r>
+            <w:proofErr w:type="spellStart"/>
+            <w:r>
+              <w:t>faChartLine</w:t>
+            </w:r>
+            <w:proofErr w:type="spellEnd"/>
           </w:p>
         </w:tc>
         <w:tc>
@@ -28651,70 +30618,64 @@
               <w:jc w:val="center"/>
             </w:pPr>
             <w:r>
-              <w:t>1.5rem (24px)</w:t>
-            </w:r>
-          </w:p>
-        </w:tc>
-        <w:tc>
-          <w:tcPr>
-            <w:tcW w:w="2694" w:type="dxa"/>
-            <w:vAlign w:val="center"/>
-          </w:tcPr>
-          <w:p>
-            <w:pPr>
-              <w:rPr>
-                <w:sz w:val="48"/>
-                <w:szCs w:val="48"/>
-              </w:rPr>
-            </w:pPr>
-            <w:r>
-              <w:rPr>
-                <w:sz w:val="48"/>
-                <w:szCs w:val="48"/>
-              </w:rPr>
-              <w:t>Ejemplo</w:t>
-            </w:r>
-          </w:p>
-        </w:tc>
-        <w:tc>
-          <w:tcPr>
-            <w:tcW w:w="1836" w:type="dxa"/>
-            <w:vAlign w:val="center"/>
-          </w:tcPr>
-          <w:p>
-            <w:r>
-              <w:t>Subsecciones</w:t>
-            </w:r>
-          </w:p>
+              <w:drawing>
+                <wp:inline distT="0" distB="0" distL="0" distR="0" wp14:anchorId="57B2EC0F" wp14:editId="1561C452">
+                  <wp:extent cx="327660" cy="304831"/>
+                  <wp:effectExtent l="0" t="0" r="0" b="0"/>
+                  <wp:docPr id="116592644" name="Imagen 1"/>
+                  <wp:cNvGraphicFramePr>
+                    <a:graphicFrameLocks xmlns:a="http://schemas.openxmlformats.org/drawingml/2006/main" noChangeAspect="1"/>
+                  </wp:cNvGraphicFramePr>
+                  <a:graphic xmlns:a="http://schemas.openxmlformats.org/drawingml/2006/main">
+                    <a:graphicData uri="http://schemas.openxmlformats.org/drawingml/2006/picture">
+                      <pic:pic xmlns:pic="http://schemas.openxmlformats.org/drawingml/2006/picture">
+                        <pic:nvPicPr>
+                          <pic:cNvPr id="116592644" name=""/>
+                          <pic:cNvPicPr/>
+                        </pic:nvPicPr>
+                        <pic:blipFill>
+                          <a:blip r:embed="rId26"/>
+                          <a:stretch>
+                            <a:fillRect/>
+                          </a:stretch>
+                        </pic:blipFill>
+                        <pic:spPr>
+                          <a:xfrm>
+                            <a:off x="0" y="0"/>
+                            <a:ext cx="330432" cy="307410"/>
+                          </a:xfrm>
+                          <a:prstGeom prst="rect">
+                            <a:avLst/>
+                          </a:prstGeom>
+                        </pic:spPr>
+                      </pic:pic>
+                    </a:graphicData>
+                  </a:graphic>
+                </wp:inline>
+              </w:drawing>
+            </w:r>
+          </w:p>
+        </w:tc>
+        <w:tc>
+          <w:tcPr>
+            <w:tcW w:w="4104" w:type="dxa"/>
+          </w:tcPr>
+          <w:p/>
         </w:tc>
       </w:tr>
       <w:tr>
         <w:tc>
           <w:tcPr>
-            <w:tcW w:w="1256" w:type="dxa"/>
+            <w:tcW w:w="2831" w:type="dxa"/>
             <w:vAlign w:val="center"/>
           </w:tcPr>
           <w:p>
             <w:pPr>
               <w:jc w:val="center"/>
             </w:pPr>
-            <w:r>
-              <w:t>H4</w:t>
-            </w:r>
-          </w:p>
-        </w:tc>
-        <w:tc>
-          <w:tcPr>
-            <w:tcW w:w="1149" w:type="dxa"/>
-            <w:vAlign w:val="center"/>
-          </w:tcPr>
-          <w:p>
-            <w:pPr>
-              <w:jc w:val="center"/>
-            </w:pPr>
             <w:proofErr w:type="spellStart"/>
             <w:r>
-              <w:t>text-xl</w:t>
+              <w:t>faTicket</w:t>
             </w:r>
             <w:proofErr w:type="spellEnd"/>
           </w:p>
@@ -28729,47 +30690,55 @@
               <w:jc w:val="center"/>
             </w:pPr>
             <w:r>
-              <w:t>1.25rem (20px)</w:t>
-            </w:r>
-          </w:p>
-        </w:tc>
-        <w:tc>
-          <w:tcPr>
-            <w:tcW w:w="2694" w:type="dxa"/>
-            <w:vAlign w:val="center"/>
-          </w:tcPr>
-          <w:p>
-            <w:pPr>
-              <w:rPr>
-                <w:sz w:val="40"/>
-                <w:szCs w:val="40"/>
-              </w:rPr>
-            </w:pPr>
-            <w:r>
-              <w:rPr>
-                <w:sz w:val="40"/>
-                <w:szCs w:val="40"/>
-              </w:rPr>
-              <w:t>Ejemplo</w:t>
-            </w:r>
-          </w:p>
-        </w:tc>
-        <w:tc>
-          <w:tcPr>
-            <w:tcW w:w="1836" w:type="dxa"/>
-            <w:vAlign w:val="center"/>
-          </w:tcPr>
-          <w:p>
-            <w:r>
-              <w:t>Subtítulos</w:t>
-            </w:r>
-          </w:p>
+              <w:drawing>
+                <wp:inline distT="0" distB="0" distL="0" distR="0" wp14:anchorId="76C75960" wp14:editId="4AF59EB4">
+                  <wp:extent cx="434340" cy="303890"/>
+                  <wp:effectExtent l="0" t="0" r="3810" b="1270"/>
+                  <wp:docPr id="481178603" name="Imagen 1"/>
+                  <wp:cNvGraphicFramePr>
+                    <a:graphicFrameLocks xmlns:a="http://schemas.openxmlformats.org/drawingml/2006/main" noChangeAspect="1"/>
+                  </wp:cNvGraphicFramePr>
+                  <a:graphic xmlns:a="http://schemas.openxmlformats.org/drawingml/2006/main">
+                    <a:graphicData uri="http://schemas.openxmlformats.org/drawingml/2006/picture">
+                      <pic:pic xmlns:pic="http://schemas.openxmlformats.org/drawingml/2006/picture">
+                        <pic:nvPicPr>
+                          <pic:cNvPr id="481178603" name=""/>
+                          <pic:cNvPicPr/>
+                        </pic:nvPicPr>
+                        <pic:blipFill>
+                          <a:blip r:embed="rId27"/>
+                          <a:stretch>
+                            <a:fillRect/>
+                          </a:stretch>
+                        </pic:blipFill>
+                        <pic:spPr>
+                          <a:xfrm flipV="1">
+                            <a:off x="0" y="0"/>
+                            <a:ext cx="443630" cy="310390"/>
+                          </a:xfrm>
+                          <a:prstGeom prst="rect">
+                            <a:avLst/>
+                          </a:prstGeom>
+                        </pic:spPr>
+                      </pic:pic>
+                    </a:graphicData>
+                  </a:graphic>
+                </wp:inline>
+              </w:drawing>
+            </w:r>
+          </w:p>
+        </w:tc>
+        <w:tc>
+          <w:tcPr>
+            <w:tcW w:w="4104" w:type="dxa"/>
+          </w:tcPr>
+          <w:p/>
         </w:tc>
       </w:tr>
       <w:tr>
         <w:tc>
           <w:tcPr>
-            <w:tcW w:w="1256" w:type="dxa"/>
+            <w:tcW w:w="2831" w:type="dxa"/>
             <w:vAlign w:val="center"/>
           </w:tcPr>
           <w:p>
@@ -28778,28 +30747,9 @@
             </w:pPr>
             <w:proofErr w:type="spellStart"/>
             <w:r>
-              <w:t>body</w:t>
+              <w:t>faCoins</w:t>
             </w:r>
             <w:proofErr w:type="spellEnd"/>
-          </w:p>
-        </w:tc>
-        <w:tc>
-          <w:tcPr>
-            <w:tcW w:w="1149" w:type="dxa"/>
-            <w:vAlign w:val="center"/>
-          </w:tcPr>
-          <w:p>
-            <w:pPr>
-              <w:jc w:val="center"/>
-            </w:pPr>
-            <w:proofErr w:type="spellStart"/>
-            <w:r>
-              <w:t>text</w:t>
-            </w:r>
-            <w:proofErr w:type="spellEnd"/>
-            <w:r>
-              <w:t>-base</w:t>
-            </w:r>
           </w:p>
         </w:tc>
         <w:tc>
@@ -28812,55 +30762,55 @@
               <w:jc w:val="center"/>
             </w:pPr>
             <w:r>
-              <w:t>1rem</w:t>
-            </w:r>
-          </w:p>
-          <w:p>
-            <w:pPr>
-              <w:jc w:val="center"/>
-            </w:pPr>
-            <w:r>
-              <w:t>(16px)</w:t>
-            </w:r>
-          </w:p>
-        </w:tc>
-        <w:tc>
-          <w:tcPr>
-            <w:tcW w:w="2694" w:type="dxa"/>
-            <w:vAlign w:val="center"/>
-          </w:tcPr>
-          <w:p>
-            <w:pPr>
-              <w:rPr>
-                <w:sz w:val="32"/>
-                <w:szCs w:val="32"/>
-              </w:rPr>
-            </w:pPr>
-            <w:r>
-              <w:rPr>
-                <w:sz w:val="32"/>
-                <w:szCs w:val="32"/>
-              </w:rPr>
-              <w:t>Ejemplo</w:t>
-            </w:r>
-          </w:p>
-        </w:tc>
-        <w:tc>
-          <w:tcPr>
-            <w:tcW w:w="1836" w:type="dxa"/>
-            <w:vAlign w:val="center"/>
-          </w:tcPr>
-          <w:p>
-            <w:r>
-              <w:t>Texto normal</w:t>
-            </w:r>
-          </w:p>
+              <w:drawing>
+                <wp:inline distT="0" distB="0" distL="0" distR="0" wp14:anchorId="44E0C378" wp14:editId="44DB5B07">
+                  <wp:extent cx="441960" cy="368752"/>
+                  <wp:effectExtent l="0" t="0" r="0" b="0"/>
+                  <wp:docPr id="1559785470" name="Imagen 1"/>
+                  <wp:cNvGraphicFramePr>
+                    <a:graphicFrameLocks xmlns:a="http://schemas.openxmlformats.org/drawingml/2006/main" noChangeAspect="1"/>
+                  </wp:cNvGraphicFramePr>
+                  <a:graphic xmlns:a="http://schemas.openxmlformats.org/drawingml/2006/main">
+                    <a:graphicData uri="http://schemas.openxmlformats.org/drawingml/2006/picture">
+                      <pic:pic xmlns:pic="http://schemas.openxmlformats.org/drawingml/2006/picture">
+                        <pic:nvPicPr>
+                          <pic:cNvPr id="1559785470" name=""/>
+                          <pic:cNvPicPr/>
+                        </pic:nvPicPr>
+                        <pic:blipFill>
+                          <a:blip r:embed="rId28"/>
+                          <a:stretch>
+                            <a:fillRect/>
+                          </a:stretch>
+                        </pic:blipFill>
+                        <pic:spPr>
+                          <a:xfrm>
+                            <a:off x="0" y="0"/>
+                            <a:ext cx="451350" cy="376587"/>
+                          </a:xfrm>
+                          <a:prstGeom prst="rect">
+                            <a:avLst/>
+                          </a:prstGeom>
+                        </pic:spPr>
+                      </pic:pic>
+                    </a:graphicData>
+                  </a:graphic>
+                </wp:inline>
+              </w:drawing>
+            </w:r>
+          </w:p>
+        </w:tc>
+        <w:tc>
+          <w:tcPr>
+            <w:tcW w:w="4104" w:type="dxa"/>
+          </w:tcPr>
+          <w:p/>
         </w:tc>
       </w:tr>
       <w:tr>
         <w:tc>
           <w:tcPr>
-            <w:tcW w:w="1256" w:type="dxa"/>
+            <w:tcW w:w="2831" w:type="dxa"/>
             <w:vAlign w:val="center"/>
           </w:tcPr>
           <w:p>
@@ -28869,23 +30819,7 @@
             </w:pPr>
             <w:proofErr w:type="spellStart"/>
             <w:r>
-              <w:t>small</w:t>
-            </w:r>
-            <w:proofErr w:type="spellEnd"/>
-          </w:p>
-        </w:tc>
-        <w:tc>
-          <w:tcPr>
-            <w:tcW w:w="1149" w:type="dxa"/>
-            <w:vAlign w:val="center"/>
-          </w:tcPr>
-          <w:p>
-            <w:pPr>
-              <w:jc w:val="center"/>
-            </w:pPr>
-            <w:proofErr w:type="spellStart"/>
-            <w:r>
-              <w:t>text-sm</w:t>
+              <w:t>faReceipt</w:t>
             </w:r>
             <w:proofErr w:type="spellEnd"/>
           </w:p>
@@ -28900,46 +30834,302 @@
               <w:jc w:val="center"/>
             </w:pPr>
             <w:r>
-              <w:t>0.875rem (14px)</w:t>
-            </w:r>
-          </w:p>
-        </w:tc>
-        <w:tc>
-          <w:tcPr>
-            <w:tcW w:w="2694" w:type="dxa"/>
+              <w:drawing>
+                <wp:inline distT="0" distB="0" distL="0" distR="0" wp14:anchorId="405AEBEA" wp14:editId="71E43413">
+                  <wp:extent cx="339725" cy="363564"/>
+                  <wp:effectExtent l="0" t="0" r="3175" b="0"/>
+                  <wp:docPr id="148910023" name="Imagen 1"/>
+                  <wp:cNvGraphicFramePr>
+                    <a:graphicFrameLocks xmlns:a="http://schemas.openxmlformats.org/drawingml/2006/main" noChangeAspect="1"/>
+                  </wp:cNvGraphicFramePr>
+                  <a:graphic xmlns:a="http://schemas.openxmlformats.org/drawingml/2006/main">
+                    <a:graphicData uri="http://schemas.openxmlformats.org/drawingml/2006/picture">
+                      <pic:pic xmlns:pic="http://schemas.openxmlformats.org/drawingml/2006/picture">
+                        <pic:nvPicPr>
+                          <pic:cNvPr id="148910023" name=""/>
+                          <pic:cNvPicPr/>
+                        </pic:nvPicPr>
+                        <pic:blipFill>
+                          <a:blip r:embed="rId29"/>
+                          <a:stretch>
+                            <a:fillRect/>
+                          </a:stretch>
+                        </pic:blipFill>
+                        <pic:spPr>
+                          <a:xfrm flipV="1">
+                            <a:off x="0" y="0"/>
+                            <a:ext cx="348580" cy="373040"/>
+                          </a:xfrm>
+                          <a:prstGeom prst="rect">
+                            <a:avLst/>
+                          </a:prstGeom>
+                        </pic:spPr>
+                      </pic:pic>
+                    </a:graphicData>
+                  </a:graphic>
+                </wp:inline>
+              </w:drawing>
+            </w:r>
+          </w:p>
+        </w:tc>
+        <w:tc>
+          <w:tcPr>
+            <w:tcW w:w="4104" w:type="dxa"/>
+          </w:tcPr>
+          <w:p/>
+        </w:tc>
+      </w:tr>
+      <w:tr>
+        <w:tc>
+          <w:tcPr>
+            <w:tcW w:w="2831" w:type="dxa"/>
             <w:vAlign w:val="center"/>
           </w:tcPr>
           <w:p>
             <w:pPr>
-              <w:rPr>
-                <w:sz w:val="28"/>
-                <w:szCs w:val="28"/>
-              </w:rPr>
-            </w:pPr>
-            <w:r>
-              <w:rPr>
-                <w:sz w:val="28"/>
-                <w:szCs w:val="28"/>
-              </w:rPr>
-              <w:t>Ejemplo</w:t>
-            </w:r>
-          </w:p>
-        </w:tc>
-        <w:tc>
-          <w:tcPr>
-            <w:tcW w:w="1836" w:type="dxa"/>
+              <w:jc w:val="center"/>
+            </w:pPr>
+            <w:proofErr w:type="spellStart"/>
+            <w:r>
+              <w:t>faEye</w:t>
+            </w:r>
+            <w:proofErr w:type="spellEnd"/>
+          </w:p>
+        </w:tc>
+        <w:tc>
+          <w:tcPr>
+            <w:tcW w:w="1559" w:type="dxa"/>
             <w:vAlign w:val="center"/>
           </w:tcPr>
           <w:p>
-            <w:r>
-              <w:t>Texto secundario, etiquetas</w:t>
-            </w:r>
-          </w:p>
+            <w:pPr>
+              <w:jc w:val="center"/>
+            </w:pPr>
+            <w:r>
+              <w:drawing>
+                <wp:inline distT="0" distB="0" distL="0" distR="0" wp14:anchorId="56094F42" wp14:editId="4A0EC8D7">
+                  <wp:extent cx="448885" cy="346075"/>
+                  <wp:effectExtent l="0" t="0" r="8890" b="0"/>
+                  <wp:docPr id="2097274462" name="Imagen 1"/>
+                  <wp:cNvGraphicFramePr>
+                    <a:graphicFrameLocks xmlns:a="http://schemas.openxmlformats.org/drawingml/2006/main" noChangeAspect="1"/>
+                  </wp:cNvGraphicFramePr>
+                  <a:graphic xmlns:a="http://schemas.openxmlformats.org/drawingml/2006/main">
+                    <a:graphicData uri="http://schemas.openxmlformats.org/drawingml/2006/picture">
+                      <pic:pic xmlns:pic="http://schemas.openxmlformats.org/drawingml/2006/picture">
+                        <pic:nvPicPr>
+                          <pic:cNvPr id="2097274462" name=""/>
+                          <pic:cNvPicPr/>
+                        </pic:nvPicPr>
+                        <pic:blipFill>
+                          <a:blip r:embed="rId30"/>
+                          <a:stretch>
+                            <a:fillRect/>
+                          </a:stretch>
+                        </pic:blipFill>
+                        <pic:spPr>
+                          <a:xfrm>
+                            <a:off x="0" y="0"/>
+                            <a:ext cx="458215" cy="353268"/>
+                          </a:xfrm>
+                          <a:prstGeom prst="rect">
+                            <a:avLst/>
+                          </a:prstGeom>
+                        </pic:spPr>
+                      </pic:pic>
+                    </a:graphicData>
+                  </a:graphic>
+                </wp:inline>
+              </w:drawing>
+            </w:r>
+          </w:p>
+        </w:tc>
+        <w:tc>
+          <w:tcPr>
+            <w:tcW w:w="4104" w:type="dxa"/>
+          </w:tcPr>
+          <w:p/>
+        </w:tc>
+      </w:tr>
+      <w:tr>
+        <w:tc>
+          <w:tcPr>
+            <w:tcW w:w="2831" w:type="dxa"/>
+            <w:vAlign w:val="center"/>
+          </w:tcPr>
+          <w:p>
+            <w:pPr>
+              <w:jc w:val="center"/>
+            </w:pPr>
+            <w:proofErr w:type="spellStart"/>
+            <w:r>
+              <w:t>faPencil</w:t>
+            </w:r>
+            <w:proofErr w:type="spellEnd"/>
+          </w:p>
+        </w:tc>
+        <w:tc>
+          <w:tcPr>
+            <w:tcW w:w="1559" w:type="dxa"/>
+            <w:vAlign w:val="center"/>
+          </w:tcPr>
+          <w:p>
+            <w:pPr>
+              <w:jc w:val="center"/>
+            </w:pPr>
+            <w:r>
+              <w:drawing>
+                <wp:inline distT="0" distB="0" distL="0" distR="0" wp14:anchorId="576CE32F" wp14:editId="2A786C5C">
+                  <wp:extent cx="396240" cy="354741"/>
+                  <wp:effectExtent l="0" t="0" r="3810" b="7620"/>
+                  <wp:docPr id="2036588847" name="Imagen 1"/>
+                  <wp:cNvGraphicFramePr>
+                    <a:graphicFrameLocks xmlns:a="http://schemas.openxmlformats.org/drawingml/2006/main" noChangeAspect="1"/>
+                  </wp:cNvGraphicFramePr>
+                  <a:graphic xmlns:a="http://schemas.openxmlformats.org/drawingml/2006/main">
+                    <a:graphicData uri="http://schemas.openxmlformats.org/drawingml/2006/picture">
+                      <pic:pic xmlns:pic="http://schemas.openxmlformats.org/drawingml/2006/picture">
+                        <pic:nvPicPr>
+                          <pic:cNvPr id="2036588847" name=""/>
+                          <pic:cNvPicPr/>
+                        </pic:nvPicPr>
+                        <pic:blipFill>
+                          <a:blip r:embed="rId31"/>
+                          <a:stretch>
+                            <a:fillRect/>
+                          </a:stretch>
+                        </pic:blipFill>
+                        <pic:spPr>
+                          <a:xfrm>
+                            <a:off x="0" y="0"/>
+                            <a:ext cx="403882" cy="361583"/>
+                          </a:xfrm>
+                          <a:prstGeom prst="rect">
+                            <a:avLst/>
+                          </a:prstGeom>
+                        </pic:spPr>
+                      </pic:pic>
+                    </a:graphicData>
+                  </a:graphic>
+                </wp:inline>
+              </w:drawing>
+            </w:r>
+          </w:p>
+        </w:tc>
+        <w:tc>
+          <w:tcPr>
+            <w:tcW w:w="4104" w:type="dxa"/>
+          </w:tcPr>
+          <w:p/>
+        </w:tc>
+      </w:tr>
+      <w:tr>
+        <w:tc>
+          <w:tcPr>
+            <w:tcW w:w="2831" w:type="dxa"/>
+            <w:vAlign w:val="center"/>
+          </w:tcPr>
+          <w:p>
+            <w:pPr>
+              <w:jc w:val="center"/>
+            </w:pPr>
+            <w:proofErr w:type="spellStart"/>
+            <w:r>
+              <w:t>faTrash</w:t>
+            </w:r>
+            <w:proofErr w:type="spellEnd"/>
+          </w:p>
+        </w:tc>
+        <w:tc>
+          <w:tcPr>
+            <w:tcW w:w="1559" w:type="dxa"/>
+            <w:vAlign w:val="center"/>
+          </w:tcPr>
+          <w:p>
+            <w:pPr>
+              <w:jc w:val="center"/>
+            </w:pPr>
+          </w:p>
+        </w:tc>
+        <w:tc>
+          <w:tcPr>
+            <w:tcW w:w="4104" w:type="dxa"/>
+          </w:tcPr>
+          <w:p/>
+        </w:tc>
+      </w:tr>
+      <w:tr>
+        <w:tc>
+          <w:tcPr>
+            <w:tcW w:w="2831" w:type="dxa"/>
+            <w:vAlign w:val="center"/>
+          </w:tcPr>
+          <w:p>
+            <w:pPr>
+              <w:jc w:val="center"/>
+            </w:pPr>
+            <w:proofErr w:type="spellStart"/>
+            <w:r>
+              <w:t>faSun</w:t>
+            </w:r>
+            <w:proofErr w:type="spellEnd"/>
+          </w:p>
+        </w:tc>
+        <w:tc>
+          <w:tcPr>
+            <w:tcW w:w="1559" w:type="dxa"/>
+            <w:vAlign w:val="center"/>
+          </w:tcPr>
+          <w:p>
+            <w:pPr>
+              <w:jc w:val="center"/>
+            </w:pPr>
+          </w:p>
+        </w:tc>
+        <w:tc>
+          <w:tcPr>
+            <w:tcW w:w="4104" w:type="dxa"/>
+          </w:tcPr>
+          <w:p/>
+        </w:tc>
+      </w:tr>
+      <w:tr>
+        <w:tc>
+          <w:tcPr>
+            <w:tcW w:w="2831" w:type="dxa"/>
+            <w:vAlign w:val="center"/>
+          </w:tcPr>
+          <w:p>
+            <w:pPr>
+              <w:jc w:val="center"/>
+            </w:pPr>
+            <w:proofErr w:type="spellStart"/>
+            <w:r>
+              <w:t>faMoon</w:t>
+            </w:r>
+            <w:proofErr w:type="spellEnd"/>
+          </w:p>
+        </w:tc>
+        <w:tc>
+          <w:tcPr>
+            <w:tcW w:w="1559" w:type="dxa"/>
+            <w:vAlign w:val="center"/>
+          </w:tcPr>
+          <w:p>
+            <w:pPr>
+              <w:jc w:val="center"/>
+            </w:pPr>
+          </w:p>
+        </w:tc>
+        <w:tc>
+          <w:tcPr>
+            <w:tcW w:w="4104" w:type="dxa"/>
+          </w:tcPr>
+          <w:p/>
         </w:tc>
       </w:tr>
     </w:tbl>
     <w:p/>
-    <w:p/>
     <w:p>
       <w:pPr>
         <w:pStyle w:val="Ttulo2"/>
@@ -28957,7 +31147,7 @@
       <w:r>
         <w:t>Wireframes</w:t>
       </w:r>
-      <w:bookmarkEnd w:id="25"/>
+      <w:bookmarkEnd w:id="29"/>
       <w:proofErr w:type="spellEnd"/>
     </w:p>
     <w:p>
@@ -28977,7 +31167,7 @@
       <w:pPr>
         <w:pStyle w:val="Ttulo3"/>
       </w:pPr>
-      <w:bookmarkStart w:id="26" w:name="_Toc227824463"/>
+      <w:bookmarkStart w:id="30" w:name="_Toc227938763"/>
       <w:r>
         <w:lastRenderedPageBreak/>
         <w:t>5.</w:t>
@@ -28992,7 +31182,7 @@
       <w:r>
         <w:t>Dashboard</w:t>
       </w:r>
-      <w:bookmarkEnd w:id="26"/>
+      <w:bookmarkEnd w:id="30"/>
       <w:proofErr w:type="spellEnd"/>
     </w:p>
     <w:p>
@@ -29019,7 +31209,7 @@
                     <pic:cNvPicPr/>
                   </pic:nvPicPr>
                   <pic:blipFill>
-                    <a:blip r:embed="rId24" cstate="print">
+                    <a:blip r:embed="rId32" cstate="print">
                       <a:extLst>
                         <a:ext uri="{28A0092B-C50C-407E-A947-70E740481C1C}">
                           <a14:useLocalDpi xmlns:a14="http://schemas.microsoft.com/office/drawing/2010/main" val="0"/>
@@ -29131,7 +31321,7 @@
                     <pic:cNvPicPr/>
                   </pic:nvPicPr>
                   <pic:blipFill>
-                    <a:blip r:embed="rId25"/>
+                    <a:blip r:embed="rId33"/>
                     <a:stretch>
                       <a:fillRect/>
                     </a:stretch>
@@ -29196,7 +31386,7 @@
       <w:pPr>
         <w:pStyle w:val="Ttulo3"/>
       </w:pPr>
-      <w:bookmarkStart w:id="27" w:name="_Toc227824464"/>
+      <w:bookmarkStart w:id="31" w:name="_Toc227938764"/>
       <w:r>
         <w:lastRenderedPageBreak/>
         <w:t>5.</w:t>
@@ -29211,7 +31401,7 @@
       <w:r>
         <w:t>Pos</w:t>
       </w:r>
-      <w:bookmarkEnd w:id="27"/>
+      <w:bookmarkEnd w:id="31"/>
       <w:proofErr w:type="spellEnd"/>
     </w:p>
     <w:p>
@@ -29238,7 +31428,7 @@
                     <pic:cNvPicPr/>
                   </pic:nvPicPr>
                   <pic:blipFill>
-                    <a:blip r:embed="rId26" cstate="print">
+                    <a:blip r:embed="rId34" cstate="print">
                       <a:extLst>
                         <a:ext uri="{28A0092B-C50C-407E-A947-70E740481C1C}">
                           <a14:useLocalDpi xmlns:a14="http://schemas.microsoft.com/office/drawing/2010/main" val="0"/>
@@ -29350,7 +31540,7 @@
                     <pic:cNvPicPr/>
                   </pic:nvPicPr>
                   <pic:blipFill>
-                    <a:blip r:embed="rId27"/>
+                    <a:blip r:embed="rId35"/>
                     <a:stretch>
                       <a:fillRect/>
                     </a:stretch>
@@ -29427,7 +31617,6 @@
           <w:szCs w:val="40"/>
         </w:rPr>
       </w:pPr>
-      <w:bookmarkStart w:id="28" w:name="_Toc227824465"/>
       <w:r>
         <w:br w:type="page"/>
       </w:r>
@@ -29436,11 +31625,12 @@
       <w:pPr>
         <w:pStyle w:val="Ttulo1"/>
       </w:pPr>
+      <w:bookmarkStart w:id="32" w:name="_Toc227938765"/>
       <w:r>
         <w:lastRenderedPageBreak/>
         <w:t>6. Caso de uso</w:t>
       </w:r>
-      <w:bookmarkEnd w:id="28"/>
+      <w:bookmarkEnd w:id="32"/>
     </w:p>
     <w:p>
       <w:pPr>
@@ -29537,9 +31727,11 @@
       <w:pPr>
         <w:pStyle w:val="Ttulo1"/>
       </w:pPr>
+      <w:bookmarkStart w:id="33" w:name="_Toc227938766"/>
       <w:r>
         <w:t>7. Bibliografía</w:t>
       </w:r>
+      <w:bookmarkEnd w:id="33"/>
     </w:p>
     <w:p>
       <w:pPr>
@@ -29595,7 +31787,7 @@
         <w:pStyle w:val="Prrafodelista"/>
         <w:ind w:left="1416"/>
       </w:pPr>
-      <w:hyperlink r:id="rId28" w:history="1">
+      <w:hyperlink r:id="rId36" w:history="1">
         <w:r>
           <w:rPr>
             <w:rStyle w:val="Hipervnculo"/>
@@ -29645,7 +31837,7 @@
         <w:pStyle w:val="Prrafodelista"/>
         <w:ind w:firstLine="696"/>
       </w:pPr>
-      <w:hyperlink r:id="rId29" w:history="1">
+      <w:hyperlink r:id="rId37" w:history="1">
         <w:r>
           <w:rPr>
             <w:rStyle w:val="Hipervnculo"/>
@@ -29676,7 +31868,7 @@
         <w:pStyle w:val="Prrafodelista"/>
         <w:ind w:left="708" w:firstLine="708"/>
       </w:pPr>
-      <w:hyperlink r:id="rId30" w:history="1">
+      <w:hyperlink r:id="rId38" w:history="1">
         <w:r>
           <w:rPr>
             <w:rStyle w:val="Hipervnculo"/>
@@ -29710,7 +31902,7 @@
         <w:pStyle w:val="Prrafodelista"/>
         <w:ind w:firstLine="696"/>
       </w:pPr>
-      <w:hyperlink r:id="rId31" w:history="1">
+      <w:hyperlink r:id="rId39" w:history="1">
         <w:r>
           <w:rPr>
             <w:rStyle w:val="Hipervnculo"/>
@@ -29749,7 +31941,7 @@
         <w:pStyle w:val="Prrafodelista"/>
         <w:ind w:firstLine="696"/>
       </w:pPr>
-      <w:hyperlink r:id="rId32" w:history="1">
+      <w:hyperlink r:id="rId40" w:history="1">
         <w:r>
           <w:rPr>
             <w:rStyle w:val="Hipervnculo"/>
@@ -29803,7 +31995,7 @@
         <w:pStyle w:val="Prrafodelista"/>
         <w:ind w:left="1440"/>
       </w:pPr>
-      <w:hyperlink r:id="rId33" w:history="1">
+      <w:hyperlink r:id="rId41" w:history="1">
         <w:r>
           <w:rPr>
             <w:rStyle w:val="Hipervnculo"/>
@@ -29829,7 +32021,7 @@
         <w:pStyle w:val="Prrafodelista"/>
         <w:ind w:left="1440"/>
       </w:pPr>
-      <w:hyperlink r:id="rId34" w:history="1">
+      <w:hyperlink r:id="rId42" w:history="1">
         <w:r>
           <w:rPr>
             <w:rStyle w:val="Hipervnculo"/>
@@ -29866,7 +32058,7 @@
           <w:numId w:val="38"/>
         </w:numPr>
       </w:pPr>
-      <w:hyperlink r:id="rId35" w:history="1">
+      <w:hyperlink r:id="rId43" w:history="1">
         <w:r>
           <w:rPr>
             <w:rStyle w:val="Hipervnculo"/>
@@ -29883,7 +32075,7 @@
           <w:numId w:val="38"/>
         </w:numPr>
       </w:pPr>
-      <w:hyperlink r:id="rId36" w:history="1">
+      <w:hyperlink r:id="rId44" w:history="1">
         <w:r>
           <w:rPr>
             <w:rStyle w:val="Hipervnculo"/>
@@ -29936,7 +32128,7 @@
           <w:numId w:val="38"/>
         </w:numPr>
       </w:pPr>
-      <w:hyperlink r:id="rId37" w:history="1">
+      <w:hyperlink r:id="rId45" w:history="1">
         <w:r>
           <w:rPr>
             <w:rStyle w:val="Hipervnculo"/>
@@ -29998,7 +32190,7 @@
         <w:pStyle w:val="Prrafodelista"/>
         <w:ind w:left="1440"/>
       </w:pPr>
-      <w:hyperlink r:id="rId38" w:history="1">
+      <w:hyperlink r:id="rId46" w:history="1">
         <w:r>
           <w:rPr>
             <w:rStyle w:val="Hipervnculo"/>
@@ -30051,7 +32243,7 @@
           <w:numId w:val="38"/>
         </w:numPr>
       </w:pPr>
-      <w:hyperlink r:id="rId39" w:history="1">
+      <w:hyperlink r:id="rId47" w:history="1">
         <w:r>
           <w:rPr>
             <w:rStyle w:val="Hipervnculo"/>
@@ -30074,7 +32266,7 @@
       <w:r>
         <w:br/>
       </w:r>
-      <w:hyperlink r:id="rId40" w:history="1">
+      <w:hyperlink r:id="rId48" w:history="1">
         <w:r>
           <w:rPr>
             <w:rStyle w:val="Hipervnculo"/>
@@ -30105,7 +32297,7 @@
         <w:pStyle w:val="Prrafodelista"/>
         <w:ind w:left="1440"/>
       </w:pPr>
-      <w:hyperlink r:id="rId41" w:history="1">
+      <w:hyperlink r:id="rId49" w:history="1">
         <w:r>
           <w:rPr>
             <w:rStyle w:val="Hipervnculo"/>
@@ -30159,7 +32351,7 @@
           <w:numId w:val="38"/>
         </w:numPr>
       </w:pPr>
-      <w:hyperlink r:id="rId42" w:history="1">
+      <w:hyperlink r:id="rId50" w:history="1">
         <w:r>
           <w:rPr>
             <w:rStyle w:val="Hipervnculo"/>
@@ -30176,7 +32368,7 @@
           <w:numId w:val="38"/>
         </w:numPr>
       </w:pPr>
-      <w:hyperlink r:id="rId43" w:history="1">
+      <w:hyperlink r:id="rId51" w:history="1">
         <w:r>
           <w:rPr>
             <w:rStyle w:val="Hipervnculo"/>
@@ -30193,7 +32385,7 @@
           <w:numId w:val="38"/>
         </w:numPr>
       </w:pPr>
-      <w:hyperlink r:id="rId44" w:history="1">
+      <w:hyperlink r:id="rId52" w:history="1">
         <w:r>
           <w:rPr>
             <w:rStyle w:val="Hipervnculo"/>
@@ -30210,7 +32402,7 @@
           <w:numId w:val="38"/>
         </w:numPr>
       </w:pPr>
-      <w:hyperlink r:id="rId45" w:history="1">
+      <w:hyperlink r:id="rId53" w:history="1">
         <w:r>
           <w:rPr>
             <w:rStyle w:val="Hipervnculo"/>
@@ -30221,7 +32413,7 @@
     </w:p>
     <w:p/>
     <w:sectPr>
-      <w:footerReference w:type="default" r:id="rId46"/>
+      <w:footerReference w:type="default" r:id="rId54"/>
       <w:pgSz w:w="11906" w:h="16838"/>
       <w:pgMar w:top="1417" w:right="1701" w:bottom="1417" w:left="1701" w:header="708" w:footer="708" w:gutter="0"/>
       <w:pgNumType w:start="0"/>
@@ -36399,6 +38591,7 @@
     <w:sig w:usb0="00000003" w:usb1="02000000" w:usb2="08000000" w:usb3="00000000" w:csb0="00000001" w:csb1="00000000"/>
   </w:font>
   <w:font w:name="Roboto">
+    <w:panose1 w:val="02000000000000000000"/>
     <w:charset w:val="00"/>
     <w:family w:val="auto"/>
     <w:pitch w:val="variable"/>
@@ -36412,6 +38605,7 @@
     <w:pitch w:val="default"/>
   </w:font>
   <w:font w:name="Roboto Flex Medium">
+    <w:panose1 w:val="02000000000000000000"/>
     <w:charset w:val="00"/>
     <w:family w:val="auto"/>
     <w:pitch w:val="variable"/>
@@ -36444,10 +38638,12 @@
     <w:rsid w:val="0055497D"/>
     <w:rsid w:val="006D6755"/>
     <w:rsid w:val="0073319B"/>
+    <w:rsid w:val="00742029"/>
     <w:rsid w:val="007E3F9C"/>
     <w:rsid w:val="007E6509"/>
     <w:rsid w:val="008C29E1"/>
     <w:rsid w:val="00AA5E59"/>
+    <w:rsid w:val="00B867A6"/>
     <w:rsid w:val="00C66654"/>
     <w:rsid w:val="00D04E45"/>
     <w:rsid w:val="00E4042E"/>

</xml_diff>

<commit_message>
docs: style guide - icons section done
</commit_message>
<xml_diff>
--- a/documentacion proyecto/Proyecto Final - Memoria proyecto Bsnessapp.docx
+++ b/documentacion proyecto/Proyecto Final - Memoria proyecto Bsnessapp.docx
@@ -4103,7 +4103,7 @@
           <w:r>
             <w:fldChar w:fldCharType="separate"/>
           </w:r>
-          <w:hyperlink w:anchor="_Toc227938733" w:history="1">
+          <w:hyperlink w:anchor="_Toc227942651" w:history="1">
             <w:r>
               <w:rPr>
                 <w:rStyle w:val="Hipervnculo"/>
@@ -4130,7 +4130,7 @@
                 <w:noProof/>
                 <w:webHidden/>
               </w:rPr>
-              <w:instrText xml:space="preserve"> PAGEREF _Toc227938733 \h </w:instrText>
+              <w:instrText xml:space="preserve"> PAGEREF _Toc227942651 \h </w:instrText>
             </w:r>
             <w:r>
               <w:rPr>
@@ -4175,7 +4175,7 @@
               <w:lang w:eastAsia="es-ES"/>
             </w:rPr>
           </w:pPr>
-          <w:hyperlink w:anchor="_Toc227938734" w:history="1">
+          <w:hyperlink w:anchor="_Toc227942652" w:history="1">
             <w:r>
               <w:rPr>
                 <w:rStyle w:val="Hipervnculo"/>
@@ -4202,7 +4202,7 @@
                 <w:noProof/>
                 <w:webHidden/>
               </w:rPr>
-              <w:instrText xml:space="preserve"> PAGEREF _Toc227938734 \h </w:instrText>
+              <w:instrText xml:space="preserve"> PAGEREF _Toc227942652 \h </w:instrText>
             </w:r>
             <w:r>
               <w:rPr>
@@ -4247,7 +4247,7 @@
               <w:lang w:eastAsia="es-ES"/>
             </w:rPr>
           </w:pPr>
-          <w:hyperlink w:anchor="_Toc227938735" w:history="1">
+          <w:hyperlink w:anchor="_Toc227942653" w:history="1">
             <w:r>
               <w:rPr>
                 <w:rStyle w:val="Hipervnculo"/>
@@ -4274,7 +4274,7 @@
                 <w:noProof/>
                 <w:webHidden/>
               </w:rPr>
-              <w:instrText xml:space="preserve"> PAGEREF _Toc227938735 \h </w:instrText>
+              <w:instrText xml:space="preserve"> PAGEREF _Toc227942653 \h </w:instrText>
             </w:r>
             <w:r>
               <w:rPr>
@@ -4319,7 +4319,7 @@
               <w:lang w:eastAsia="es-ES"/>
             </w:rPr>
           </w:pPr>
-          <w:hyperlink w:anchor="_Toc227938736" w:history="1">
+          <w:hyperlink w:anchor="_Toc227942654" w:history="1">
             <w:r>
               <w:rPr>
                 <w:rStyle w:val="Hipervnculo"/>
@@ -4346,7 +4346,7 @@
                 <w:noProof/>
                 <w:webHidden/>
               </w:rPr>
-              <w:instrText xml:space="preserve"> PAGEREF _Toc227938736 \h </w:instrText>
+              <w:instrText xml:space="preserve"> PAGEREF _Toc227942654 \h </w:instrText>
             </w:r>
             <w:r>
               <w:rPr>
@@ -4391,7 +4391,7 @@
               <w:lang w:eastAsia="es-ES"/>
             </w:rPr>
           </w:pPr>
-          <w:hyperlink w:anchor="_Toc227938737" w:history="1">
+          <w:hyperlink w:anchor="_Toc227942655" w:history="1">
             <w:r>
               <w:rPr>
                 <w:rStyle w:val="Hipervnculo"/>
@@ -4418,7 +4418,7 @@
                 <w:noProof/>
                 <w:webHidden/>
               </w:rPr>
-              <w:instrText xml:space="preserve"> PAGEREF _Toc227938737 \h </w:instrText>
+              <w:instrText xml:space="preserve"> PAGEREF _Toc227942655 \h </w:instrText>
             </w:r>
             <w:r>
               <w:rPr>
@@ -4463,7 +4463,7 @@
               <w:lang w:eastAsia="es-ES"/>
             </w:rPr>
           </w:pPr>
-          <w:hyperlink w:anchor="_Toc227938738" w:history="1">
+          <w:hyperlink w:anchor="_Toc227942656" w:history="1">
             <w:r>
               <w:rPr>
                 <w:rStyle w:val="Hipervnculo"/>
@@ -4490,7 +4490,7 @@
                 <w:noProof/>
                 <w:webHidden/>
               </w:rPr>
-              <w:instrText xml:space="preserve"> PAGEREF _Toc227938738 \h </w:instrText>
+              <w:instrText xml:space="preserve"> PAGEREF _Toc227942656 \h </w:instrText>
             </w:r>
             <w:r>
               <w:rPr>
@@ -4535,7 +4535,7 @@
               <w:lang w:eastAsia="es-ES"/>
             </w:rPr>
           </w:pPr>
-          <w:hyperlink w:anchor="_Toc227938739" w:history="1">
+          <w:hyperlink w:anchor="_Toc227942657" w:history="1">
             <w:r>
               <w:rPr>
                 <w:rStyle w:val="Hipervnculo"/>
@@ -4564,7 +4564,7 @@
                 <w:noProof/>
                 <w:webHidden/>
               </w:rPr>
-              <w:instrText xml:space="preserve"> PAGEREF _Toc227938739 \h </w:instrText>
+              <w:instrText xml:space="preserve"> PAGEREF _Toc227942657 \h </w:instrText>
             </w:r>
             <w:r>
               <w:rPr>
@@ -4609,7 +4609,7 @@
               <w:lang w:eastAsia="es-ES"/>
             </w:rPr>
           </w:pPr>
-          <w:hyperlink w:anchor="_Toc227938740" w:history="1">
+          <w:hyperlink w:anchor="_Toc227942658" w:history="1">
             <w:r>
               <w:rPr>
                 <w:rStyle w:val="Hipervnculo"/>
@@ -4636,7 +4636,7 @@
                 <w:noProof/>
                 <w:webHidden/>
               </w:rPr>
-              <w:instrText xml:space="preserve"> PAGEREF _Toc227938740 \h </w:instrText>
+              <w:instrText xml:space="preserve"> PAGEREF _Toc227942658 \h </w:instrText>
             </w:r>
             <w:r>
               <w:rPr>
@@ -4681,7 +4681,7 @@
               <w:lang w:eastAsia="es-ES"/>
             </w:rPr>
           </w:pPr>
-          <w:hyperlink w:anchor="_Toc227938741" w:history="1">
+          <w:hyperlink w:anchor="_Toc227942659" w:history="1">
             <w:r>
               <w:rPr>
                 <w:rStyle w:val="Hipervnculo"/>
@@ -4708,7 +4708,7 @@
                 <w:noProof/>
                 <w:webHidden/>
               </w:rPr>
-              <w:instrText xml:space="preserve"> PAGEREF _Toc227938741 \h </w:instrText>
+              <w:instrText xml:space="preserve"> PAGEREF _Toc227942659 \h </w:instrText>
             </w:r>
             <w:r>
               <w:rPr>
@@ -4753,7 +4753,7 @@
               <w:lang w:eastAsia="es-ES"/>
             </w:rPr>
           </w:pPr>
-          <w:hyperlink w:anchor="_Toc227938742" w:history="1">
+          <w:hyperlink w:anchor="_Toc227942660" w:history="1">
             <w:r>
               <w:rPr>
                 <w:rStyle w:val="Hipervnculo"/>
@@ -4780,7 +4780,7 @@
                 <w:noProof/>
                 <w:webHidden/>
               </w:rPr>
-              <w:instrText xml:space="preserve"> PAGEREF _Toc227938742 \h </w:instrText>
+              <w:instrText xml:space="preserve"> PAGEREF _Toc227942660 \h </w:instrText>
             </w:r>
             <w:r>
               <w:rPr>
@@ -4825,7 +4825,7 @@
               <w:lang w:eastAsia="es-ES"/>
             </w:rPr>
           </w:pPr>
-          <w:hyperlink w:anchor="_Toc227938743" w:history="1">
+          <w:hyperlink w:anchor="_Toc227942661" w:history="1">
             <w:r>
               <w:rPr>
                 <w:rStyle w:val="Hipervnculo"/>
@@ -4852,7 +4852,7 @@
                 <w:noProof/>
                 <w:webHidden/>
               </w:rPr>
-              <w:instrText xml:space="preserve"> PAGEREF _Toc227938743 \h </w:instrText>
+              <w:instrText xml:space="preserve"> PAGEREF _Toc227942661 \h </w:instrText>
             </w:r>
             <w:r>
               <w:rPr>
@@ -4897,7 +4897,7 @@
               <w:lang w:eastAsia="es-ES"/>
             </w:rPr>
           </w:pPr>
-          <w:hyperlink w:anchor="_Toc227938744" w:history="1">
+          <w:hyperlink w:anchor="_Toc227942662" w:history="1">
             <w:r>
               <w:rPr>
                 <w:rStyle w:val="Hipervnculo"/>
@@ -4924,7 +4924,7 @@
                 <w:noProof/>
                 <w:webHidden/>
               </w:rPr>
-              <w:instrText xml:space="preserve"> PAGEREF _Toc227938744 \h </w:instrText>
+              <w:instrText xml:space="preserve"> PAGEREF _Toc227942662 \h </w:instrText>
             </w:r>
             <w:r>
               <w:rPr>
@@ -4969,7 +4969,7 @@
               <w:lang w:eastAsia="es-ES"/>
             </w:rPr>
           </w:pPr>
-          <w:hyperlink w:anchor="_Toc227938745" w:history="1">
+          <w:hyperlink w:anchor="_Toc227942663" w:history="1">
             <w:r>
               <w:rPr>
                 <w:rStyle w:val="Hipervnculo"/>
@@ -4996,7 +4996,7 @@
                 <w:noProof/>
                 <w:webHidden/>
               </w:rPr>
-              <w:instrText xml:space="preserve"> PAGEREF _Toc227938745 \h </w:instrText>
+              <w:instrText xml:space="preserve"> PAGEREF _Toc227942663 \h </w:instrText>
             </w:r>
             <w:r>
               <w:rPr>
@@ -5041,7 +5041,7 @@
               <w:lang w:eastAsia="es-ES"/>
             </w:rPr>
           </w:pPr>
-          <w:hyperlink w:anchor="_Toc227938746" w:history="1">
+          <w:hyperlink w:anchor="_Toc227942664" w:history="1">
             <w:r>
               <w:rPr>
                 <w:rStyle w:val="Hipervnculo"/>
@@ -5068,7 +5068,7 @@
                 <w:noProof/>
                 <w:webHidden/>
               </w:rPr>
-              <w:instrText xml:space="preserve"> PAGEREF _Toc227938746 \h </w:instrText>
+              <w:instrText xml:space="preserve"> PAGEREF _Toc227942664 \h </w:instrText>
             </w:r>
             <w:r>
               <w:rPr>
@@ -5113,7 +5113,7 @@
               <w:lang w:eastAsia="es-ES"/>
             </w:rPr>
           </w:pPr>
-          <w:hyperlink w:anchor="_Toc227938747" w:history="1">
+          <w:hyperlink w:anchor="_Toc227942665" w:history="1">
             <w:r>
               <w:rPr>
                 <w:rStyle w:val="Hipervnculo"/>
@@ -5140,7 +5140,7 @@
                 <w:noProof/>
                 <w:webHidden/>
               </w:rPr>
-              <w:instrText xml:space="preserve"> PAGEREF _Toc227938747 \h </w:instrText>
+              <w:instrText xml:space="preserve"> PAGEREF _Toc227942665 \h </w:instrText>
             </w:r>
             <w:r>
               <w:rPr>
@@ -5185,7 +5185,7 @@
               <w:lang w:eastAsia="es-ES"/>
             </w:rPr>
           </w:pPr>
-          <w:hyperlink w:anchor="_Toc227938748" w:history="1">
+          <w:hyperlink w:anchor="_Toc227942666" w:history="1">
             <w:r>
               <w:rPr>
                 <w:rStyle w:val="Hipervnculo"/>
@@ -5212,7 +5212,7 @@
                 <w:noProof/>
                 <w:webHidden/>
               </w:rPr>
-              <w:instrText xml:space="preserve"> PAGEREF _Toc227938748 \h </w:instrText>
+              <w:instrText xml:space="preserve"> PAGEREF _Toc227942666 \h </w:instrText>
             </w:r>
             <w:r>
               <w:rPr>
@@ -5257,7 +5257,7 @@
               <w:lang w:eastAsia="es-ES"/>
             </w:rPr>
           </w:pPr>
-          <w:hyperlink w:anchor="_Toc227938749" w:history="1">
+          <w:hyperlink w:anchor="_Toc227942667" w:history="1">
             <w:r>
               <w:rPr>
                 <w:rStyle w:val="Hipervnculo"/>
@@ -5284,7 +5284,7 @@
                 <w:noProof/>
                 <w:webHidden/>
               </w:rPr>
-              <w:instrText xml:space="preserve"> PAGEREF _Toc227938749 \h </w:instrText>
+              <w:instrText xml:space="preserve"> PAGEREF _Toc227942667 \h </w:instrText>
             </w:r>
             <w:r>
               <w:rPr>
@@ -5329,7 +5329,7 @@
               <w:lang w:eastAsia="es-ES"/>
             </w:rPr>
           </w:pPr>
-          <w:hyperlink w:anchor="_Toc227938750" w:history="1">
+          <w:hyperlink w:anchor="_Toc227942668" w:history="1">
             <w:r>
               <w:rPr>
                 <w:rStyle w:val="Hipervnculo"/>
@@ -5356,7 +5356,7 @@
                 <w:noProof/>
                 <w:webHidden/>
               </w:rPr>
-              <w:instrText xml:space="preserve"> PAGEREF _Toc227938750 \h </w:instrText>
+              <w:instrText xml:space="preserve"> PAGEREF _Toc227942668 \h </w:instrText>
             </w:r>
             <w:r>
               <w:rPr>
@@ -5401,7 +5401,7 @@
               <w:lang w:eastAsia="es-ES"/>
             </w:rPr>
           </w:pPr>
-          <w:hyperlink w:anchor="_Toc227938751" w:history="1">
+          <w:hyperlink w:anchor="_Toc227942669" w:history="1">
             <w:r>
               <w:rPr>
                 <w:rStyle w:val="Hipervnculo"/>
@@ -5428,7 +5428,7 @@
                 <w:noProof/>
                 <w:webHidden/>
               </w:rPr>
-              <w:instrText xml:space="preserve"> PAGEREF _Toc227938751 \h </w:instrText>
+              <w:instrText xml:space="preserve"> PAGEREF _Toc227942669 \h </w:instrText>
             </w:r>
             <w:r>
               <w:rPr>
@@ -5473,7 +5473,7 @@
               <w:lang w:eastAsia="es-ES"/>
             </w:rPr>
           </w:pPr>
-          <w:hyperlink w:anchor="_Toc227938752" w:history="1">
+          <w:hyperlink w:anchor="_Toc227942670" w:history="1">
             <w:r>
               <w:rPr>
                 <w:rStyle w:val="Hipervnculo"/>
@@ -5500,7 +5500,7 @@
                 <w:noProof/>
                 <w:webHidden/>
               </w:rPr>
-              <w:instrText xml:space="preserve"> PAGEREF _Toc227938752 \h </w:instrText>
+              <w:instrText xml:space="preserve"> PAGEREF _Toc227942670 \h </w:instrText>
             </w:r>
             <w:r>
               <w:rPr>
@@ -5545,7 +5545,7 @@
               <w:lang w:eastAsia="es-ES"/>
             </w:rPr>
           </w:pPr>
-          <w:hyperlink w:anchor="_Toc227938753" w:history="1">
+          <w:hyperlink w:anchor="_Toc227942671" w:history="1">
             <w:r>
               <w:rPr>
                 <w:rStyle w:val="Hipervnculo"/>
@@ -5572,7 +5572,7 @@
                 <w:noProof/>
                 <w:webHidden/>
               </w:rPr>
-              <w:instrText xml:space="preserve"> PAGEREF _Toc227938753 \h </w:instrText>
+              <w:instrText xml:space="preserve"> PAGEREF _Toc227942671 \h </w:instrText>
             </w:r>
             <w:r>
               <w:rPr>
@@ -5617,7 +5617,7 @@
               <w:lang w:eastAsia="es-ES"/>
             </w:rPr>
           </w:pPr>
-          <w:hyperlink w:anchor="_Toc227938754" w:history="1">
+          <w:hyperlink w:anchor="_Toc227942672" w:history="1">
             <w:r>
               <w:rPr>
                 <w:rStyle w:val="Hipervnculo"/>
@@ -5644,7 +5644,7 @@
                 <w:noProof/>
                 <w:webHidden/>
               </w:rPr>
-              <w:instrText xml:space="preserve"> PAGEREF _Toc227938754 \h </w:instrText>
+              <w:instrText xml:space="preserve"> PAGEREF _Toc227942672 \h </w:instrText>
             </w:r>
             <w:r>
               <w:rPr>
@@ -5689,7 +5689,7 @@
               <w:lang w:eastAsia="es-ES"/>
             </w:rPr>
           </w:pPr>
-          <w:hyperlink w:anchor="_Toc227938755" w:history="1">
+          <w:hyperlink w:anchor="_Toc227942673" w:history="1">
             <w:r>
               <w:rPr>
                 <w:rStyle w:val="Hipervnculo"/>
@@ -5716,7 +5716,7 @@
                 <w:noProof/>
                 <w:webHidden/>
               </w:rPr>
-              <w:instrText xml:space="preserve"> PAGEREF _Toc227938755 \h </w:instrText>
+              <w:instrText xml:space="preserve"> PAGEREF _Toc227942673 \h </w:instrText>
             </w:r>
             <w:r>
               <w:rPr>
@@ -5761,7 +5761,7 @@
               <w:lang w:eastAsia="es-ES"/>
             </w:rPr>
           </w:pPr>
-          <w:hyperlink w:anchor="_Toc227938756" w:history="1">
+          <w:hyperlink w:anchor="_Toc227942674" w:history="1">
             <w:r>
               <w:rPr>
                 <w:rStyle w:val="Hipervnculo"/>
@@ -5788,7 +5788,7 @@
                 <w:noProof/>
                 <w:webHidden/>
               </w:rPr>
-              <w:instrText xml:space="preserve"> PAGEREF _Toc227938756 \h </w:instrText>
+              <w:instrText xml:space="preserve"> PAGEREF _Toc227942674 \h </w:instrText>
             </w:r>
             <w:r>
               <w:rPr>
@@ -5833,7 +5833,7 @@
               <w:lang w:eastAsia="es-ES"/>
             </w:rPr>
           </w:pPr>
-          <w:hyperlink w:anchor="_Toc227938757" w:history="1">
+          <w:hyperlink w:anchor="_Toc227942675" w:history="1">
             <w:r>
               <w:rPr>
                 <w:rStyle w:val="Hipervnculo"/>
@@ -5860,7 +5860,7 @@
                 <w:noProof/>
                 <w:webHidden/>
               </w:rPr>
-              <w:instrText xml:space="preserve"> PAGEREF _Toc227938757 \h </w:instrText>
+              <w:instrText xml:space="preserve"> PAGEREF _Toc227942675 \h </w:instrText>
             </w:r>
             <w:r>
               <w:rPr>
@@ -5905,7 +5905,7 @@
               <w:lang w:eastAsia="es-ES"/>
             </w:rPr>
           </w:pPr>
-          <w:hyperlink w:anchor="_Toc227938758" w:history="1">
+          <w:hyperlink w:anchor="_Toc227942676" w:history="1">
             <w:r>
               <w:rPr>
                 <w:rStyle w:val="Hipervnculo"/>
@@ -5932,7 +5932,7 @@
                 <w:noProof/>
                 <w:webHidden/>
               </w:rPr>
-              <w:instrText xml:space="preserve"> PAGEREF _Toc227938758 \h </w:instrText>
+              <w:instrText xml:space="preserve"> PAGEREF _Toc227942676 \h </w:instrText>
             </w:r>
             <w:r>
               <w:rPr>
@@ -5977,7 +5977,7 @@
               <w:lang w:eastAsia="es-ES"/>
             </w:rPr>
           </w:pPr>
-          <w:hyperlink w:anchor="_Toc227938759" w:history="1">
+          <w:hyperlink w:anchor="_Toc227942677" w:history="1">
             <w:r>
               <w:rPr>
                 <w:rStyle w:val="Hipervnculo"/>
@@ -6004,7 +6004,7 @@
                 <w:noProof/>
                 <w:webHidden/>
               </w:rPr>
-              <w:instrText xml:space="preserve"> PAGEREF _Toc227938759 \h </w:instrText>
+              <w:instrText xml:space="preserve"> PAGEREF _Toc227942677 \h </w:instrText>
             </w:r>
             <w:r>
               <w:rPr>
@@ -6049,7 +6049,7 @@
               <w:lang w:eastAsia="es-ES"/>
             </w:rPr>
           </w:pPr>
-          <w:hyperlink w:anchor="_Toc227938760" w:history="1">
+          <w:hyperlink w:anchor="_Toc227942678" w:history="1">
             <w:r>
               <w:rPr>
                 <w:rStyle w:val="Hipervnculo"/>
@@ -6076,7 +6076,7 @@
                 <w:noProof/>
                 <w:webHidden/>
               </w:rPr>
-              <w:instrText xml:space="preserve"> PAGEREF _Toc227938760 \h </w:instrText>
+              <w:instrText xml:space="preserve"> PAGEREF _Toc227942678 \h </w:instrText>
             </w:r>
             <w:r>
               <w:rPr>
@@ -6121,7 +6121,7 @@
               <w:lang w:eastAsia="es-ES"/>
             </w:rPr>
           </w:pPr>
-          <w:hyperlink w:anchor="_Toc227938761" w:history="1">
+          <w:hyperlink w:anchor="_Toc227942679" w:history="1">
             <w:r>
               <w:rPr>
                 <w:rStyle w:val="Hipervnculo"/>
@@ -6148,7 +6148,7 @@
                 <w:noProof/>
                 <w:webHidden/>
               </w:rPr>
-              <w:instrText xml:space="preserve"> PAGEREF _Toc227938761 \h </w:instrText>
+              <w:instrText xml:space="preserve"> PAGEREF _Toc227942679 \h </w:instrText>
             </w:r>
             <w:r>
               <w:rPr>
@@ -6193,13 +6193,13 @@
               <w:lang w:eastAsia="es-ES"/>
             </w:rPr>
           </w:pPr>
-          <w:hyperlink w:anchor="_Toc227938762" w:history="1">
+          <w:hyperlink w:anchor="_Toc227942680" w:history="1">
             <w:r>
               <w:rPr>
                 <w:rStyle w:val="Hipervnculo"/>
                 <w:noProof/>
               </w:rPr>
-              <w:t>5.4 Wireframes</w:t>
+              <w:t>5.4. Iconografía</w:t>
             </w:r>
             <w:r>
               <w:rPr>
@@ -6220,7 +6220,7 @@
                 <w:noProof/>
                 <w:webHidden/>
               </w:rPr>
-              <w:instrText xml:space="preserve"> PAGEREF _Toc227938762 \h </w:instrText>
+              <w:instrText xml:space="preserve"> PAGEREF _Toc227942680 \h </w:instrText>
             </w:r>
             <w:r>
               <w:rPr>
@@ -6265,13 +6265,13 @@
               <w:lang w:eastAsia="es-ES"/>
             </w:rPr>
           </w:pPr>
-          <w:hyperlink w:anchor="_Toc227938763" w:history="1">
+          <w:hyperlink w:anchor="_Toc227942681" w:history="1">
             <w:r>
               <w:rPr>
                 <w:rStyle w:val="Hipervnculo"/>
                 <w:noProof/>
               </w:rPr>
-              <w:t>5.4.1 Dashboard</w:t>
+              <w:t>Configuración</w:t>
             </w:r>
             <w:r>
               <w:rPr>
@@ -6292,7 +6292,7 @@
                 <w:noProof/>
                 <w:webHidden/>
               </w:rPr>
-              <w:instrText xml:space="preserve"> PAGEREF _Toc227938763 \h </w:instrText>
+              <w:instrText xml:space="preserve"> PAGEREF _Toc227942681 \h </w:instrText>
             </w:r>
             <w:r>
               <w:rPr>
@@ -6337,13 +6337,13 @@
               <w:lang w:eastAsia="es-ES"/>
             </w:rPr>
           </w:pPr>
-          <w:hyperlink w:anchor="_Toc227938764" w:history="1">
+          <w:hyperlink w:anchor="_Toc227942682" w:history="1">
             <w:r>
               <w:rPr>
                 <w:rStyle w:val="Hipervnculo"/>
                 <w:noProof/>
               </w:rPr>
-              <w:t>5.4.2 Pos</w:t>
+              <w:t>Listado de iconos usados</w:t>
             </w:r>
             <w:r>
               <w:rPr>
@@ -6364,7 +6364,7 @@
                 <w:noProof/>
                 <w:webHidden/>
               </w:rPr>
-              <w:instrText xml:space="preserve"> PAGEREF _Toc227938764 \h </w:instrText>
+              <w:instrText xml:space="preserve"> PAGEREF _Toc227942682 \h </w:instrText>
             </w:r>
             <w:r>
               <w:rPr>
@@ -6384,7 +6384,295 @@
                 <w:noProof/>
                 <w:webHidden/>
               </w:rPr>
+              <w:t>17</w:t>
+            </w:r>
+            <w:r>
+              <w:rPr>
+                <w:noProof/>
+                <w:webHidden/>
+              </w:rPr>
+              <w:fldChar w:fldCharType="end"/>
+            </w:r>
+          </w:hyperlink>
+        </w:p>
+        <w:p>
+          <w:pPr>
+            <w:pStyle w:val="TDC3"/>
+            <w:tabs>
+              <w:tab w:val="right" w:leader="dot" w:pos="8494"/>
+            </w:tabs>
+            <w:rPr>
+              <w:rFonts w:eastAsiaTheme="minorEastAsia"/>
+              <w:noProof/>
+              <w:sz w:val="24"/>
+              <w:szCs w:val="24"/>
+              <w:lang w:eastAsia="es-ES"/>
+            </w:rPr>
+          </w:pPr>
+          <w:hyperlink w:anchor="_Toc227942683" w:history="1">
+            <w:r>
+              <w:rPr>
+                <w:rStyle w:val="Hipervnculo"/>
+                <w:noProof/>
+              </w:rPr>
+              <w:t>Tamaños</w:t>
+            </w:r>
+            <w:r>
+              <w:rPr>
+                <w:noProof/>
+                <w:webHidden/>
+              </w:rPr>
+              <w:tab/>
+            </w:r>
+            <w:r>
+              <w:rPr>
+                <w:noProof/>
+                <w:webHidden/>
+              </w:rPr>
+              <w:fldChar w:fldCharType="begin"/>
+            </w:r>
+            <w:r>
+              <w:rPr>
+                <w:noProof/>
+                <w:webHidden/>
+              </w:rPr>
+              <w:instrText xml:space="preserve"> PAGEREF _Toc227942683 \h </w:instrText>
+            </w:r>
+            <w:r>
+              <w:rPr>
+                <w:noProof/>
+                <w:webHidden/>
+              </w:rPr>
+            </w:r>
+            <w:r>
+              <w:rPr>
+                <w:noProof/>
+                <w:webHidden/>
+              </w:rPr>
+              <w:fldChar w:fldCharType="separate"/>
+            </w:r>
+            <w:r>
+              <w:rPr>
+                <w:noProof/>
+                <w:webHidden/>
+              </w:rPr>
+              <w:t>17</w:t>
+            </w:r>
+            <w:r>
+              <w:rPr>
+                <w:noProof/>
+                <w:webHidden/>
+              </w:rPr>
+              <w:fldChar w:fldCharType="end"/>
+            </w:r>
+          </w:hyperlink>
+        </w:p>
+        <w:p>
+          <w:pPr>
+            <w:pStyle w:val="TDC2"/>
+            <w:tabs>
+              <w:tab w:val="right" w:leader="dot" w:pos="8494"/>
+            </w:tabs>
+            <w:rPr>
+              <w:rFonts w:eastAsiaTheme="minorEastAsia"/>
+              <w:noProof/>
+              <w:sz w:val="24"/>
+              <w:szCs w:val="24"/>
+              <w:lang w:eastAsia="es-ES"/>
+            </w:rPr>
+          </w:pPr>
+          <w:hyperlink w:anchor="_Toc227942684" w:history="1">
+            <w:r>
+              <w:rPr>
+                <w:rStyle w:val="Hipervnculo"/>
+                <w:noProof/>
+              </w:rPr>
+              <w:t>5.4 Wireframes</w:t>
+            </w:r>
+            <w:r>
+              <w:rPr>
+                <w:noProof/>
+                <w:webHidden/>
+              </w:rPr>
+              <w:tab/>
+            </w:r>
+            <w:r>
+              <w:rPr>
+                <w:noProof/>
+                <w:webHidden/>
+              </w:rPr>
+              <w:fldChar w:fldCharType="begin"/>
+            </w:r>
+            <w:r>
+              <w:rPr>
+                <w:noProof/>
+                <w:webHidden/>
+              </w:rPr>
+              <w:instrText xml:space="preserve"> PAGEREF _Toc227942684 \h </w:instrText>
+            </w:r>
+            <w:r>
+              <w:rPr>
+                <w:noProof/>
+                <w:webHidden/>
+              </w:rPr>
+            </w:r>
+            <w:r>
+              <w:rPr>
+                <w:noProof/>
+                <w:webHidden/>
+              </w:rPr>
+              <w:fldChar w:fldCharType="separate"/>
+            </w:r>
+            <w:r>
+              <w:rPr>
+                <w:noProof/>
+                <w:webHidden/>
+              </w:rPr>
               <w:t>18</w:t>
+            </w:r>
+            <w:r>
+              <w:rPr>
+                <w:noProof/>
+                <w:webHidden/>
+              </w:rPr>
+              <w:fldChar w:fldCharType="end"/>
+            </w:r>
+          </w:hyperlink>
+        </w:p>
+        <w:p>
+          <w:pPr>
+            <w:pStyle w:val="TDC3"/>
+            <w:tabs>
+              <w:tab w:val="right" w:leader="dot" w:pos="8494"/>
+            </w:tabs>
+            <w:rPr>
+              <w:rFonts w:eastAsiaTheme="minorEastAsia"/>
+              <w:noProof/>
+              <w:sz w:val="24"/>
+              <w:szCs w:val="24"/>
+              <w:lang w:eastAsia="es-ES"/>
+            </w:rPr>
+          </w:pPr>
+          <w:hyperlink w:anchor="_Toc227942685" w:history="1">
+            <w:r>
+              <w:rPr>
+                <w:rStyle w:val="Hipervnculo"/>
+                <w:noProof/>
+              </w:rPr>
+              <w:t>5.4.1 Dashboard</w:t>
+            </w:r>
+            <w:r>
+              <w:rPr>
+                <w:noProof/>
+                <w:webHidden/>
+              </w:rPr>
+              <w:tab/>
+            </w:r>
+            <w:r>
+              <w:rPr>
+                <w:noProof/>
+                <w:webHidden/>
+              </w:rPr>
+              <w:fldChar w:fldCharType="begin"/>
+            </w:r>
+            <w:r>
+              <w:rPr>
+                <w:noProof/>
+                <w:webHidden/>
+              </w:rPr>
+              <w:instrText xml:space="preserve"> PAGEREF _Toc227942685 \h </w:instrText>
+            </w:r>
+            <w:r>
+              <w:rPr>
+                <w:noProof/>
+                <w:webHidden/>
+              </w:rPr>
+            </w:r>
+            <w:r>
+              <w:rPr>
+                <w:noProof/>
+                <w:webHidden/>
+              </w:rPr>
+              <w:fldChar w:fldCharType="separate"/>
+            </w:r>
+            <w:r>
+              <w:rPr>
+                <w:noProof/>
+                <w:webHidden/>
+              </w:rPr>
+              <w:t>18</w:t>
+            </w:r>
+            <w:r>
+              <w:rPr>
+                <w:noProof/>
+                <w:webHidden/>
+              </w:rPr>
+              <w:fldChar w:fldCharType="end"/>
+            </w:r>
+          </w:hyperlink>
+        </w:p>
+        <w:p>
+          <w:pPr>
+            <w:pStyle w:val="TDC3"/>
+            <w:tabs>
+              <w:tab w:val="right" w:leader="dot" w:pos="8494"/>
+            </w:tabs>
+            <w:rPr>
+              <w:rFonts w:eastAsiaTheme="minorEastAsia"/>
+              <w:noProof/>
+              <w:sz w:val="24"/>
+              <w:szCs w:val="24"/>
+              <w:lang w:eastAsia="es-ES"/>
+            </w:rPr>
+          </w:pPr>
+          <w:hyperlink w:anchor="_Toc227942686" w:history="1">
+            <w:r>
+              <w:rPr>
+                <w:rStyle w:val="Hipervnculo"/>
+                <w:noProof/>
+              </w:rPr>
+              <w:t>5.4.2 Pos</w:t>
+            </w:r>
+            <w:r>
+              <w:rPr>
+                <w:noProof/>
+                <w:webHidden/>
+              </w:rPr>
+              <w:tab/>
+            </w:r>
+            <w:r>
+              <w:rPr>
+                <w:noProof/>
+                <w:webHidden/>
+              </w:rPr>
+              <w:fldChar w:fldCharType="begin"/>
+            </w:r>
+            <w:r>
+              <w:rPr>
+                <w:noProof/>
+                <w:webHidden/>
+              </w:rPr>
+              <w:instrText xml:space="preserve"> PAGEREF _Toc227942686 \h </w:instrText>
+            </w:r>
+            <w:r>
+              <w:rPr>
+                <w:noProof/>
+                <w:webHidden/>
+              </w:rPr>
+            </w:r>
+            <w:r>
+              <w:rPr>
+                <w:noProof/>
+                <w:webHidden/>
+              </w:rPr>
+              <w:fldChar w:fldCharType="separate"/>
+            </w:r>
+            <w:r>
+              <w:rPr>
+                <w:noProof/>
+                <w:webHidden/>
+              </w:rPr>
+              <w:t>19</w:t>
             </w:r>
             <w:r>
               <w:rPr>
@@ -6409,7 +6697,7 @@
               <w:lang w:eastAsia="es-ES"/>
             </w:rPr>
           </w:pPr>
-          <w:hyperlink w:anchor="_Toc227938765" w:history="1">
+          <w:hyperlink w:anchor="_Toc227942687" w:history="1">
             <w:r>
               <w:rPr>
                 <w:rStyle w:val="Hipervnculo"/>
@@ -6436,7 +6724,7 @@
                 <w:noProof/>
                 <w:webHidden/>
               </w:rPr>
-              <w:instrText xml:space="preserve"> PAGEREF _Toc227938765 \h </w:instrText>
+              <w:instrText xml:space="preserve"> PAGEREF _Toc227942687 \h </w:instrText>
             </w:r>
             <w:r>
               <w:rPr>
@@ -6456,7 +6744,7 @@
                 <w:noProof/>
                 <w:webHidden/>
               </w:rPr>
-              <w:t>19</w:t>
+              <w:t>20</w:t>
             </w:r>
             <w:r>
               <w:rPr>
@@ -6481,27 +6769,13 @@
               <w:lang w:eastAsia="es-ES"/>
             </w:rPr>
           </w:pPr>
-          <w:hyperlink w:anchor="_Toc227938766" w:history="1">
+          <w:hyperlink w:anchor="_Toc227942688" w:history="1">
             <w:r>
               <w:rPr>
                 <w:rStyle w:val="Hipervnculo"/>
                 <w:noProof/>
               </w:rPr>
-              <w:t>7. Bibl</w:t>
-            </w:r>
-            <w:r>
-              <w:rPr>
-                <w:rStyle w:val="Hipervnculo"/>
-                <w:noProof/>
-              </w:rPr>
-              <w:t>i</w:t>
-            </w:r>
-            <w:r>
-              <w:rPr>
-                <w:rStyle w:val="Hipervnculo"/>
-                <w:noProof/>
-              </w:rPr>
-              <w:t>ografía</w:t>
+              <w:t>7. Bibliografía</w:t>
             </w:r>
             <w:r>
               <w:rPr>
@@ -6522,7 +6796,7 @@
                 <w:noProof/>
                 <w:webHidden/>
               </w:rPr>
-              <w:instrText xml:space="preserve"> PAGEREF _Toc227938766 \h </w:instrText>
+              <w:instrText xml:space="preserve"> PAGEREF _Toc227942688 \h </w:instrText>
             </w:r>
             <w:r>
               <w:rPr>
@@ -6542,7 +6816,7 @@
                 <w:noProof/>
                 <w:webHidden/>
               </w:rPr>
-              <w:t>19</w:t>
+              <w:t>20</w:t>
             </w:r>
             <w:r>
               <w:rPr>
@@ -6574,7 +6848,6 @@
         </w:rPr>
       </w:pPr>
       <w:r>
-        <w:lastRenderedPageBreak/>
         <w:br w:type="page"/>
       </w:r>
     </w:p>
@@ -6582,7 +6855,7 @@
       <w:pPr>
         <w:pStyle w:val="Ttulo1"/>
       </w:pPr>
-      <w:bookmarkStart w:id="0" w:name="_Toc227938733"/>
+      <w:bookmarkStart w:id="0" w:name="_Toc227942651"/>
       <w:r>
         <w:lastRenderedPageBreak/>
         <w:t>1. Introducción</w:t>
@@ -6785,7 +7058,7 @@
       <w:pPr>
         <w:pStyle w:val="Ttulo2"/>
       </w:pPr>
-      <w:bookmarkStart w:id="1" w:name="_Toc227938734"/>
+      <w:bookmarkStart w:id="1" w:name="_Toc227942652"/>
       <w:r>
         <w:t>1.</w:t>
       </w:r>
@@ -6979,7 +7252,7 @@
       <w:pPr>
         <w:pStyle w:val="Ttulo1"/>
       </w:pPr>
-      <w:bookmarkStart w:id="2" w:name="_Toc227938735"/>
+      <w:bookmarkStart w:id="2" w:name="_Toc227942653"/>
       <w:r>
         <w:t>2. Estructura del proyecto</w:t>
       </w:r>
@@ -8487,7 +8760,7 @@
       <w:pPr>
         <w:pStyle w:val="Ttulo1"/>
       </w:pPr>
-      <w:bookmarkStart w:id="3" w:name="_Toc227938736"/>
+      <w:bookmarkStart w:id="3" w:name="_Toc227942654"/>
       <w:r>
         <w:t>3</w:t>
       </w:r>
@@ -8935,7 +9208,7 @@
       <w:pPr>
         <w:pStyle w:val="Ttulo2"/>
       </w:pPr>
-      <w:bookmarkStart w:id="4" w:name="_Toc227938737"/>
+      <w:bookmarkStart w:id="4" w:name="_Toc227942655"/>
       <w:r>
         <w:t>3.1 Despliegue de la aplicación</w:t>
       </w:r>
@@ -9204,7 +9477,7 @@
       <w:pPr>
         <w:pStyle w:val="Ttulo2"/>
       </w:pPr>
-      <w:bookmarkStart w:id="5" w:name="_Toc227938738"/>
+      <w:bookmarkStart w:id="5" w:name="_Toc227942656"/>
       <w:r>
         <w:t>3.</w:t>
       </w:r>
@@ -10936,7 +11209,7 @@
           <w:lang w:eastAsia="es-ES"/>
         </w:rPr>
       </w:pPr>
-      <w:bookmarkStart w:id="6" w:name="_Toc227938739"/>
+      <w:bookmarkStart w:id="6" w:name="_Toc227942657"/>
       <w:r>
         <w:rPr>
           <w:rFonts w:eastAsia="Times New Roman"/>
@@ -11661,7 +11934,7 @@
       <w:pPr>
         <w:pStyle w:val="Ttulo2"/>
       </w:pPr>
-      <w:bookmarkStart w:id="7" w:name="_Toc227938740"/>
+      <w:bookmarkStart w:id="7" w:name="_Toc227942658"/>
       <w:r>
         <w:t>4.1 Descripción de las tablas</w:t>
       </w:r>
@@ -11827,7 +12100,7 @@
       <w:pPr>
         <w:pStyle w:val="Ttulo3"/>
       </w:pPr>
-      <w:bookmarkStart w:id="8" w:name="_Toc227938741"/>
+      <w:bookmarkStart w:id="8" w:name="_Toc227942659"/>
       <w:r>
         <w:t xml:space="preserve">Tabla: </w:t>
       </w:r>
@@ -13422,7 +13695,7 @@
       <w:pPr>
         <w:pStyle w:val="Ttulo3"/>
       </w:pPr>
-      <w:bookmarkStart w:id="9" w:name="_Toc227938742"/>
+      <w:bookmarkStart w:id="9" w:name="_Toc227942660"/>
       <w:r>
         <w:t xml:space="preserve">Tabla: </w:t>
       </w:r>
@@ -13931,7 +14204,7 @@
       <w:pPr>
         <w:pStyle w:val="Ttulo3"/>
       </w:pPr>
-      <w:bookmarkStart w:id="10" w:name="_Toc227938743"/>
+      <w:bookmarkStart w:id="10" w:name="_Toc227942661"/>
       <w:r>
         <w:t xml:space="preserve">Tabla: </w:t>
       </w:r>
@@ -14445,7 +14718,7 @@
       <w:pPr>
         <w:pStyle w:val="Ttulo3"/>
       </w:pPr>
-      <w:bookmarkStart w:id="11" w:name="_Toc227938744"/>
+      <w:bookmarkStart w:id="11" w:name="_Toc227942662"/>
       <w:r>
         <w:lastRenderedPageBreak/>
         <w:t xml:space="preserve">Tabla: </w:t>
@@ -15778,7 +16051,7 @@
       <w:pPr>
         <w:pStyle w:val="Ttulo3"/>
       </w:pPr>
-      <w:bookmarkStart w:id="12" w:name="_Toc227938745"/>
+      <w:bookmarkStart w:id="12" w:name="_Toc227942663"/>
       <w:r>
         <w:t xml:space="preserve">Tabla: </w:t>
       </w:r>
@@ -16530,7 +16803,7 @@
       <w:pPr>
         <w:pStyle w:val="Ttulo3"/>
       </w:pPr>
-      <w:bookmarkStart w:id="13" w:name="_Toc227938746"/>
+      <w:bookmarkStart w:id="13" w:name="_Toc227942664"/>
       <w:r>
         <w:t xml:space="preserve">Tabla: </w:t>
       </w:r>
@@ -16972,7 +17245,7 @@
       <w:pPr>
         <w:pStyle w:val="Ttulo3"/>
       </w:pPr>
-      <w:bookmarkStart w:id="14" w:name="_Toc227938747"/>
+      <w:bookmarkStart w:id="14" w:name="_Toc227942665"/>
       <w:r>
         <w:t xml:space="preserve">Tabla: </w:t>
       </w:r>
@@ -19017,7 +19290,7 @@
       <w:pPr>
         <w:pStyle w:val="Ttulo3"/>
       </w:pPr>
-      <w:bookmarkStart w:id="15" w:name="_Toc227938748"/>
+      <w:bookmarkStart w:id="15" w:name="_Toc227942666"/>
       <w:r>
         <w:t xml:space="preserve">Tabla: </w:t>
       </w:r>
@@ -20922,7 +21195,7 @@
       <w:pPr>
         <w:pStyle w:val="Ttulo3"/>
       </w:pPr>
-      <w:bookmarkStart w:id="16" w:name="_Toc227938749"/>
+      <w:bookmarkStart w:id="16" w:name="_Toc227942667"/>
       <w:r>
         <w:t xml:space="preserve">Tabla: </w:t>
       </w:r>
@@ -22341,7 +22614,7 @@
       <w:pPr>
         <w:pStyle w:val="Ttulo3"/>
       </w:pPr>
-      <w:bookmarkStart w:id="17" w:name="_Toc227938750"/>
+      <w:bookmarkStart w:id="17" w:name="_Toc227942668"/>
       <w:r>
         <w:t xml:space="preserve">Vista: </w:t>
       </w:r>
@@ -23219,7 +23492,7 @@
       <w:pPr>
         <w:pStyle w:val="Ttulo3"/>
       </w:pPr>
-      <w:bookmarkStart w:id="18" w:name="_Toc227938751"/>
+      <w:bookmarkStart w:id="18" w:name="_Toc227942669"/>
       <w:r>
         <w:t xml:space="preserve">Vista: </w:t>
       </w:r>
@@ -24301,7 +24574,7 @@
       <w:pPr>
         <w:pStyle w:val="Ttulo1"/>
       </w:pPr>
-      <w:bookmarkStart w:id="19" w:name="_Toc227938752"/>
+      <w:bookmarkStart w:id="19" w:name="_Toc227942670"/>
       <w:r>
         <w:lastRenderedPageBreak/>
         <w:t>5. Guía de estilo</w:t>
@@ -24312,7 +24585,7 @@
       <w:pPr>
         <w:pStyle w:val="Ttulo2"/>
       </w:pPr>
-      <w:bookmarkStart w:id="20" w:name="_Toc227938753"/>
+      <w:bookmarkStart w:id="20" w:name="_Toc227942671"/>
       <w:r>
         <w:t>5.1 Introducción</w:t>
       </w:r>
@@ -25086,7 +25359,7 @@
       <w:pPr>
         <w:pStyle w:val="Ttulo3"/>
       </w:pPr>
-      <w:bookmarkStart w:id="21" w:name="_Toc227938754"/>
+      <w:bookmarkStart w:id="21" w:name="_Toc227942672"/>
       <w:r>
         <w:t>Stack técnico</w:t>
       </w:r>
@@ -25352,7 +25625,7 @@
       <w:pPr>
         <w:pStyle w:val="Ttulo2"/>
       </w:pPr>
-      <w:bookmarkStart w:id="22" w:name="_Toc227938755"/>
+      <w:bookmarkStart w:id="22" w:name="_Toc227942673"/>
       <w:r>
         <w:t>5.2 Color y uso tipográfico del color</w:t>
       </w:r>
@@ -25408,7 +25681,7 @@
       <w:pPr>
         <w:pStyle w:val="Ttulo3"/>
       </w:pPr>
-      <w:bookmarkStart w:id="23" w:name="_Toc227938756"/>
+      <w:bookmarkStart w:id="23" w:name="_Toc227942674"/>
       <w:r>
         <w:lastRenderedPageBreak/>
         <w:t>5.2.1 Blue – Acciones primarias y tema claro</w:t>
@@ -25829,7 +26102,7 @@
       <w:pPr>
         <w:pStyle w:val="Ttulo3"/>
       </w:pPr>
-      <w:bookmarkStart w:id="24" w:name="_Toc227938757"/>
+      <w:bookmarkStart w:id="24" w:name="_Toc227942675"/>
       <w:r>
         <w:t xml:space="preserve">5.2.2 Stone – Colores neutros y tema </w:t>
       </w:r>
@@ -26434,7 +26707,7 @@
       <w:pPr>
         <w:pStyle w:val="Ttulo3"/>
       </w:pPr>
-      <w:bookmarkStart w:id="25" w:name="_Toc227938758"/>
+      <w:bookmarkStart w:id="25" w:name="_Toc227942676"/>
       <w:r>
         <w:lastRenderedPageBreak/>
         <w:t>5.2.3 Slate – Colores neutros y tema oscuro</w:t>
@@ -27002,7 +27275,7 @@
       <w:pPr>
         <w:pStyle w:val="Ttulo3"/>
       </w:pPr>
-      <w:bookmarkStart w:id="26" w:name="_Toc227938759"/>
+      <w:bookmarkStart w:id="26" w:name="_Toc227942677"/>
       <w:r>
         <w:t>5.2.4 Cyan – Acciones primarias y tema oscuro</w:t>
       </w:r>
@@ -27446,7 +27719,7 @@
       <w:pPr>
         <w:pStyle w:val="Ttulo3"/>
       </w:pPr>
-      <w:bookmarkStart w:id="27" w:name="_Toc227938760"/>
+      <w:bookmarkStart w:id="27" w:name="_Toc227942678"/>
       <w:r>
         <w:t>5.2.5 Colores semánticos</w:t>
       </w:r>
@@ -27777,7 +28050,7 @@
       <w:pPr>
         <w:pStyle w:val="Ttulo2"/>
       </w:pPr>
-      <w:bookmarkStart w:id="28" w:name="_Toc227938761"/>
+      <w:bookmarkStart w:id="28" w:name="_Toc227942679"/>
       <w:r>
         <w:lastRenderedPageBreak/>
         <w:t>5.3 Tipografía</w:t>
@@ -29322,15 +29595,16 @@
       <w:pPr>
         <w:pStyle w:val="Ttulo2"/>
       </w:pPr>
+      <w:bookmarkStart w:id="29" w:name="_Toc227942680"/>
       <w:r>
         <w:t>5.4. Iconografía</w:t>
       </w:r>
+      <w:bookmarkEnd w:id="29"/>
     </w:p>
     <w:p>
       <w:pPr>
         <w:jc w:val="both"/>
       </w:pPr>
-      <w:bookmarkStart w:id="29" w:name="_Toc227938762"/>
       <w:r>
         <w:t xml:space="preserve">Para nuestra Iconografía hemos usado la librería Font Awesome </w:t>
       </w:r>
@@ -29925,9 +30199,11 @@
       <w:pPr>
         <w:pStyle w:val="Ttulo3"/>
       </w:pPr>
+      <w:bookmarkStart w:id="30" w:name="_Toc227942681"/>
       <w:r>
         <w:t>Configuración</w:t>
       </w:r>
+      <w:bookmarkEnd w:id="30"/>
     </w:p>
     <w:p>
       <w:r>
@@ -30367,9 +30643,11 @@
       <w:pPr>
         <w:pStyle w:val="Ttulo3"/>
       </w:pPr>
+      <w:bookmarkStart w:id="31" w:name="_Toc227942682"/>
       <w:r>
         <w:t>Listado de iconos usados</w:t>
       </w:r>
+      <w:bookmarkEnd w:id="31"/>
     </w:p>
     <w:tbl>
       <w:tblPr>
@@ -30475,9 +30753,9 @@
             </w:pPr>
             <w:r>
               <w:drawing>
-                <wp:inline distT="0" distB="0" distL="0" distR="0" wp14:anchorId="2E8B4BA2" wp14:editId="22F3CDC7">
-                  <wp:extent cx="378121" cy="320040"/>
-                  <wp:effectExtent l="0" t="0" r="3175" b="3810"/>
+                <wp:inline distT="0" distB="0" distL="0" distR="0" wp14:anchorId="2E8B4BA2" wp14:editId="5F947556">
+                  <wp:extent cx="382800" cy="324000"/>
+                  <wp:effectExtent l="0" t="0" r="0" b="0"/>
                   <wp:docPr id="1060535831" name="Imagen 1"/>
                   <wp:cNvGraphicFramePr>
                     <a:graphicFrameLocks xmlns:a="http://schemas.openxmlformats.org/drawingml/2006/main" noChangeAspect="1"/>
@@ -30498,7 +30776,7 @@
                         <pic:spPr>
                           <a:xfrm>
                             <a:off x="0" y="0"/>
-                            <a:ext cx="387498" cy="327977"/>
+                            <a:ext cx="382800" cy="324000"/>
                           </a:xfrm>
                           <a:prstGeom prst="rect">
                             <a:avLst/>
@@ -30515,8 +30793,18 @@
         <w:tc>
           <w:tcPr>
             <w:tcW w:w="4104" w:type="dxa"/>
-          </w:tcPr>
-          <w:p/>
+            <w:vAlign w:val="center"/>
+          </w:tcPr>
+          <w:p>
+            <w:r>
+              <w:t xml:space="preserve">Usuario, </w:t>
+            </w:r>
+            <w:proofErr w:type="spellStart"/>
+            <w:r>
+              <w:t>login</w:t>
+            </w:r>
+            <w:proofErr w:type="spellEnd"/>
+          </w:p>
         </w:tc>
       </w:tr>
       <w:tr>
@@ -30547,7 +30835,7 @@
             </w:pPr>
             <w:r>
               <w:drawing>
-                <wp:inline distT="0" distB="0" distL="0" distR="0" wp14:anchorId="6B560F80" wp14:editId="7F81B740">
+                <wp:inline distT="0" distB="0" distL="0" distR="0" wp14:anchorId="6B560F80" wp14:editId="5D665F33">
                   <wp:extent cx="408305" cy="378462"/>
                   <wp:effectExtent l="0" t="0" r="0" b="2540"/>
                   <wp:docPr id="1773114196" name="Imagen 1"/>
@@ -30587,8 +30875,13 @@
         <w:tc>
           <w:tcPr>
             <w:tcW w:w="4104" w:type="dxa"/>
-          </w:tcPr>
-          <w:p/>
+            <w:vAlign w:val="center"/>
+          </w:tcPr>
+          <w:p>
+            <w:r>
+              <w:t>Contraseña, seguridad</w:t>
+            </w:r>
+          </w:p>
         </w:tc>
       </w:tr>
       <w:tr>
@@ -30619,7 +30912,7 @@
             </w:pPr>
             <w:r>
               <w:drawing>
-                <wp:inline distT="0" distB="0" distL="0" distR="0" wp14:anchorId="57B2EC0F" wp14:editId="1561C452">
+                <wp:inline distT="0" distB="0" distL="0" distR="0" wp14:anchorId="57B2EC0F" wp14:editId="3B5F0424">
                   <wp:extent cx="327660" cy="304831"/>
                   <wp:effectExtent l="0" t="0" r="0" b="0"/>
                   <wp:docPr id="116592644" name="Imagen 1"/>
@@ -30659,8 +30952,18 @@
         <w:tc>
           <w:tcPr>
             <w:tcW w:w="4104" w:type="dxa"/>
-          </w:tcPr>
-          <w:p/>
+            <w:vAlign w:val="center"/>
+          </w:tcPr>
+          <w:p>
+            <w:proofErr w:type="spellStart"/>
+            <w:r>
+              <w:t>Dashboard</w:t>
+            </w:r>
+            <w:proofErr w:type="spellEnd"/>
+            <w:r>
+              <w:t>, métricas</w:t>
+            </w:r>
+          </w:p>
         </w:tc>
       </w:tr>
       <w:tr>
@@ -30731,8 +31034,15 @@
         <w:tc>
           <w:tcPr>
             <w:tcW w:w="4104" w:type="dxa"/>
-          </w:tcPr>
-          <w:p/>
+            <w:vAlign w:val="center"/>
+          </w:tcPr>
+          <w:p>
+            <w:proofErr w:type="gramStart"/>
+            <w:r>
+              <w:t>Tickets</w:t>
+            </w:r>
+            <w:proofErr w:type="gramEnd"/>
+          </w:p>
         </w:tc>
       </w:tr>
       <w:tr>
@@ -30803,8 +31113,13 @@
         <w:tc>
           <w:tcPr>
             <w:tcW w:w="4104" w:type="dxa"/>
-          </w:tcPr>
-          <w:p/>
+            <w:vAlign w:val="center"/>
+          </w:tcPr>
+          <w:p>
+            <w:r>
+              <w:t>Monetización</w:t>
+            </w:r>
+          </w:p>
         </w:tc>
       </w:tr>
       <w:tr>
@@ -30875,8 +31190,13 @@
         <w:tc>
           <w:tcPr>
             <w:tcW w:w="4104" w:type="dxa"/>
-          </w:tcPr>
-          <w:p/>
+            <w:vAlign w:val="center"/>
+          </w:tcPr>
+          <w:p>
+            <w:r>
+              <w:t>Facturas</w:t>
+            </w:r>
+          </w:p>
         </w:tc>
       </w:tr>
       <w:tr>
@@ -30947,8 +31267,13 @@
         <w:tc>
           <w:tcPr>
             <w:tcW w:w="4104" w:type="dxa"/>
-          </w:tcPr>
-          <w:p/>
+            <w:vAlign w:val="center"/>
+          </w:tcPr>
+          <w:p>
+            <w:r>
+              <w:t>Ver / visualizar</w:t>
+            </w:r>
+          </w:p>
         </w:tc>
       </w:tr>
       <w:tr>
@@ -31019,8 +31344,13 @@
         <w:tc>
           <w:tcPr>
             <w:tcW w:w="4104" w:type="dxa"/>
-          </w:tcPr>
-          <w:p/>
+            <w:vAlign w:val="center"/>
+          </w:tcPr>
+          <w:p>
+            <w:r>
+              <w:t>Editar</w:t>
+            </w:r>
+          </w:p>
         </w:tc>
       </w:tr>
       <w:tr>
@@ -31049,13 +31379,55 @@
             <w:pPr>
               <w:jc w:val="center"/>
             </w:pPr>
+            <w:r>
+              <w:drawing>
+                <wp:inline distT="0" distB="0" distL="0" distR="0" wp14:anchorId="1A1F09CF" wp14:editId="7C0188F8">
+                  <wp:extent cx="365760" cy="356982"/>
+                  <wp:effectExtent l="0" t="0" r="0" b="5080"/>
+                  <wp:docPr id="97714814" name="Imagen 1"/>
+                  <wp:cNvGraphicFramePr>
+                    <a:graphicFrameLocks xmlns:a="http://schemas.openxmlformats.org/drawingml/2006/main" noChangeAspect="1"/>
+                  </wp:cNvGraphicFramePr>
+                  <a:graphic xmlns:a="http://schemas.openxmlformats.org/drawingml/2006/main">
+                    <a:graphicData uri="http://schemas.openxmlformats.org/drawingml/2006/picture">
+                      <pic:pic xmlns:pic="http://schemas.openxmlformats.org/drawingml/2006/picture">
+                        <pic:nvPicPr>
+                          <pic:cNvPr id="97714814" name=""/>
+                          <pic:cNvPicPr/>
+                        </pic:nvPicPr>
+                        <pic:blipFill>
+                          <a:blip r:embed="rId32"/>
+                          <a:stretch>
+                            <a:fillRect/>
+                          </a:stretch>
+                        </pic:blipFill>
+                        <pic:spPr>
+                          <a:xfrm>
+                            <a:off x="0" y="0"/>
+                            <a:ext cx="374753" cy="365759"/>
+                          </a:xfrm>
+                          <a:prstGeom prst="rect">
+                            <a:avLst/>
+                          </a:prstGeom>
+                        </pic:spPr>
+                      </pic:pic>
+                    </a:graphicData>
+                  </a:graphic>
+                </wp:inline>
+              </w:drawing>
+            </w:r>
           </w:p>
         </w:tc>
         <w:tc>
           <w:tcPr>
             <w:tcW w:w="4104" w:type="dxa"/>
-          </w:tcPr>
-          <w:p/>
+            <w:vAlign w:val="center"/>
+          </w:tcPr>
+          <w:p>
+            <w:r>
+              <w:t>Eliminar</w:t>
+            </w:r>
+          </w:p>
         </w:tc>
       </w:tr>
       <w:tr>
@@ -31084,13 +31456,55 @@
             <w:pPr>
               <w:jc w:val="center"/>
             </w:pPr>
+            <w:r>
+              <w:drawing>
+                <wp:inline distT="0" distB="0" distL="0" distR="0" wp14:anchorId="305B3E0A" wp14:editId="0C69CC12">
+                  <wp:extent cx="400360" cy="358140"/>
+                  <wp:effectExtent l="0" t="0" r="0" b="3810"/>
+                  <wp:docPr id="2115797102" name="Imagen 1"/>
+                  <wp:cNvGraphicFramePr>
+                    <a:graphicFrameLocks xmlns:a="http://schemas.openxmlformats.org/drawingml/2006/main" noChangeAspect="1"/>
+                  </wp:cNvGraphicFramePr>
+                  <a:graphic xmlns:a="http://schemas.openxmlformats.org/drawingml/2006/main">
+                    <a:graphicData uri="http://schemas.openxmlformats.org/drawingml/2006/picture">
+                      <pic:pic xmlns:pic="http://schemas.openxmlformats.org/drawingml/2006/picture">
+                        <pic:nvPicPr>
+                          <pic:cNvPr id="2115797102" name=""/>
+                          <pic:cNvPicPr/>
+                        </pic:nvPicPr>
+                        <pic:blipFill>
+                          <a:blip r:embed="rId33"/>
+                          <a:stretch>
+                            <a:fillRect/>
+                          </a:stretch>
+                        </pic:blipFill>
+                        <pic:spPr>
+                          <a:xfrm>
+                            <a:off x="0" y="0"/>
+                            <a:ext cx="403509" cy="360957"/>
+                          </a:xfrm>
+                          <a:prstGeom prst="rect">
+                            <a:avLst/>
+                          </a:prstGeom>
+                        </pic:spPr>
+                      </pic:pic>
+                    </a:graphicData>
+                  </a:graphic>
+                </wp:inline>
+              </w:drawing>
+            </w:r>
           </w:p>
         </w:tc>
         <w:tc>
           <w:tcPr>
             <w:tcW w:w="4104" w:type="dxa"/>
-          </w:tcPr>
-          <w:p/>
+            <w:vAlign w:val="center"/>
+          </w:tcPr>
+          <w:p>
+            <w:r>
+              <w:t>Elegir tema – modo claro</w:t>
+            </w:r>
+          </w:p>
         </w:tc>
       </w:tr>
       <w:tr>
@@ -31119,55 +31533,274 @@
             <w:pPr>
               <w:jc w:val="center"/>
             </w:pPr>
+            <w:r>
+              <w:drawing>
+                <wp:inline distT="0" distB="0" distL="0" distR="0" wp14:anchorId="170AD524" wp14:editId="4E093082">
+                  <wp:extent cx="297180" cy="294514"/>
+                  <wp:effectExtent l="0" t="0" r="7620" b="0"/>
+                  <wp:docPr id="536785263" name="Imagen 1"/>
+                  <wp:cNvGraphicFramePr>
+                    <a:graphicFrameLocks xmlns:a="http://schemas.openxmlformats.org/drawingml/2006/main" noChangeAspect="1"/>
+                  </wp:cNvGraphicFramePr>
+                  <a:graphic xmlns:a="http://schemas.openxmlformats.org/drawingml/2006/main">
+                    <a:graphicData uri="http://schemas.openxmlformats.org/drawingml/2006/picture">
+                      <pic:pic xmlns:pic="http://schemas.openxmlformats.org/drawingml/2006/picture">
+                        <pic:nvPicPr>
+                          <pic:cNvPr id="536785263" name=""/>
+                          <pic:cNvPicPr/>
+                        </pic:nvPicPr>
+                        <pic:blipFill>
+                          <a:blip r:embed="rId34"/>
+                          <a:stretch>
+                            <a:fillRect/>
+                          </a:stretch>
+                        </pic:blipFill>
+                        <pic:spPr>
+                          <a:xfrm>
+                            <a:off x="0" y="0"/>
+                            <a:ext cx="303857" cy="301131"/>
+                          </a:xfrm>
+                          <a:prstGeom prst="rect">
+                            <a:avLst/>
+                          </a:prstGeom>
+                        </pic:spPr>
+                      </pic:pic>
+                    </a:graphicData>
+                  </a:graphic>
+                </wp:inline>
+              </w:drawing>
+            </w:r>
           </w:p>
         </w:tc>
         <w:tc>
           <w:tcPr>
             <w:tcW w:w="4104" w:type="dxa"/>
-          </w:tcPr>
-          <w:p/>
+            <w:vAlign w:val="center"/>
+          </w:tcPr>
+          <w:p>
+            <w:r>
+              <w:t>Elegir tema – modo oscuro</w:t>
+            </w:r>
+          </w:p>
         </w:tc>
       </w:tr>
     </w:tbl>
     <w:p/>
     <w:p>
       <w:pPr>
-        <w:pStyle w:val="Ttulo2"/>
-      </w:pPr>
-      <w:r>
-        <w:t>5.</w:t>
-      </w:r>
-      <w:r>
-        <w:t>4</w:t>
-      </w:r>
-      <w:r>
-        <w:t xml:space="preserve"> </w:t>
+        <w:pStyle w:val="Ttulo3"/>
+      </w:pPr>
+      <w:bookmarkStart w:id="32" w:name="_Toc227942683"/>
+      <w:r>
+        <w:t>Tamaños</w:t>
+      </w:r>
+      <w:bookmarkEnd w:id="32"/>
+    </w:p>
+    <w:p>
+      <w:r>
+        <w:t>Los tamaños que hemos usados son “</w:t>
       </w:r>
       <w:proofErr w:type="spellStart"/>
       <w:r>
-        <w:t>Wireframes</w:t>
-      </w:r>
-      <w:bookmarkEnd w:id="29"/>
+        <w:t>sm</w:t>
+      </w:r>
+      <w:proofErr w:type="spellEnd"/>
+      <w:r>
+        <w:t>”, “</w:t>
+      </w:r>
+      <w:proofErr w:type="spellStart"/>
+      <w:r>
+        <w:t>lg</w:t>
+      </w:r>
+      <w:proofErr w:type="spellEnd"/>
+      <w:r>
+        <w:t xml:space="preserve">”, “2x” y “5x” que se asigna en el atributo </w:t>
+      </w:r>
+      <w:proofErr w:type="spellStart"/>
+      <w:r>
+        <w:t>size</w:t>
+      </w:r>
+      <w:proofErr w:type="spellEnd"/>
+      <w:r>
+        <w:t xml:space="preserve"> de </w:t>
+      </w:r>
+      <w:proofErr w:type="spellStart"/>
+      <w:r>
+        <w:t>FontAwesomeIcon</w:t>
+      </w:r>
       <w:proofErr w:type="spellEnd"/>
     </w:p>
     <w:p>
-      <w:r>
-        <w:t xml:space="preserve">En esta sección vamos a mostrar los </w:t>
+      <w:pPr>
+        <w:shd w:val="clear" w:color="auto" w:fill="F2F2F2" w:themeFill="background1" w:themeFillShade="F2"/>
+        <w:tabs>
+          <w:tab w:val="left" w:pos="916"/>
+          <w:tab w:val="left" w:pos="1832"/>
+          <w:tab w:val="left" w:pos="2748"/>
+          <w:tab w:val="left" w:pos="3664"/>
+          <w:tab w:val="left" w:pos="4580"/>
+          <w:tab w:val="left" w:pos="5496"/>
+          <w:tab w:val="left" w:pos="6412"/>
+          <w:tab w:val="left" w:pos="7328"/>
+          <w:tab w:val="left" w:pos="8244"/>
+          <w:tab w:val="left" w:pos="9160"/>
+          <w:tab w:val="left" w:pos="10076"/>
+          <w:tab w:val="left" w:pos="10992"/>
+          <w:tab w:val="left" w:pos="11908"/>
+          <w:tab w:val="left" w:pos="12824"/>
+          <w:tab w:val="left" w:pos="13740"/>
+          <w:tab w:val="left" w:pos="14656"/>
+        </w:tabs>
+        <w:spacing w:after="0" w:line="240" w:lineRule="auto"/>
+        <w:rPr>
+          <w:rFonts w:ascii="Courier New" w:eastAsia="Times New Roman" w:hAnsi="Courier New" w:cs="Courier New"/>
+          <w:kern w:val="0"/>
+          <w:sz w:val="20"/>
+          <w:szCs w:val="20"/>
+          <w:lang w:eastAsia="es-ES"/>
+          <w14:ligatures w14:val="none"/>
+        </w:rPr>
+      </w:pPr>
+      <w:r>
+        <w:rPr>
+          <w:rFonts w:ascii="Courier New" w:eastAsia="Times New Roman" w:hAnsi="Courier New" w:cs="Courier New"/>
+          <w:kern w:val="0"/>
+          <w:sz w:val="20"/>
+          <w:szCs w:val="20"/>
+          <w:lang w:eastAsia="es-ES"/>
+          <w14:ligatures w14:val="none"/>
+        </w:rPr>
+        <w:t>&lt;</w:t>
       </w:r>
       <w:proofErr w:type="spellStart"/>
       <w:r>
-        <w:t>wireframes</w:t>
+        <w:rPr>
+          <w:rFonts w:ascii="Courier New" w:eastAsia="Times New Roman" w:hAnsi="Courier New" w:cs="Courier New"/>
+          <w:kern w:val="0"/>
+          <w:sz w:val="20"/>
+          <w:szCs w:val="20"/>
+          <w:lang w:eastAsia="es-ES"/>
+          <w14:ligatures w14:val="none"/>
+        </w:rPr>
+        <w:t>FontAwesomeIcon</w:t>
       </w:r>
       <w:proofErr w:type="spellEnd"/>
       <w:r>
-        <w:t xml:space="preserve"> de las secciones más importantes.</w:t>
+        <w:rPr>
+          <w:rFonts w:ascii="Courier New" w:eastAsia="Times New Roman" w:hAnsi="Courier New" w:cs="Courier New"/>
+          <w:kern w:val="0"/>
+          <w:sz w:val="20"/>
+          <w:szCs w:val="20"/>
+          <w:lang w:eastAsia="es-ES"/>
+          <w14:ligatures w14:val="none"/>
+        </w:rPr>
+        <w:t xml:space="preserve"> </w:t>
+      </w:r>
+      <w:proofErr w:type="spellStart"/>
+      <w:r>
+        <w:rPr>
+          <w:rFonts w:ascii="Courier New" w:eastAsia="Times New Roman" w:hAnsi="Courier New" w:cs="Courier New"/>
+          <w:kern w:val="0"/>
+          <w:sz w:val="20"/>
+          <w:szCs w:val="20"/>
+          <w:lang w:eastAsia="es-ES"/>
+          <w14:ligatures w14:val="none"/>
+        </w:rPr>
+        <w:t>icon</w:t>
+      </w:r>
+      <w:proofErr w:type="spellEnd"/>
+      <w:r>
+        <w:rPr>
+          <w:rFonts w:ascii="Courier New" w:eastAsia="Times New Roman" w:hAnsi="Courier New" w:cs="Courier New"/>
+          <w:kern w:val="0"/>
+          <w:sz w:val="20"/>
+          <w:szCs w:val="20"/>
+          <w:lang w:eastAsia="es-ES"/>
+          <w14:ligatures w14:val="none"/>
+        </w:rPr>
+        <w:t>={</w:t>
+      </w:r>
+      <w:proofErr w:type="spellStart"/>
+      <w:r>
+        <w:rPr>
+          <w:rFonts w:ascii="Courier New" w:eastAsia="Times New Roman" w:hAnsi="Courier New" w:cs="Courier New"/>
+          <w:kern w:val="0"/>
+          <w:sz w:val="20"/>
+          <w:szCs w:val="20"/>
+          <w:lang w:eastAsia="es-ES"/>
+          <w14:ligatures w14:val="none"/>
+        </w:rPr>
+        <w:t>faUser</w:t>
+      </w:r>
+      <w:proofErr w:type="spellEnd"/>
+      <w:r>
+        <w:rPr>
+          <w:rFonts w:ascii="Courier New" w:eastAsia="Times New Roman" w:hAnsi="Courier New" w:cs="Courier New"/>
+          <w:kern w:val="0"/>
+          <w:sz w:val="20"/>
+          <w:szCs w:val="20"/>
+          <w:lang w:eastAsia="es-ES"/>
+          <w14:ligatures w14:val="none"/>
+        </w:rPr>
+        <w:t xml:space="preserve">} </w:t>
+      </w:r>
+      <w:proofErr w:type="spellStart"/>
+      <w:r>
+        <w:rPr>
+          <w:rFonts w:ascii="Courier New" w:eastAsia="Times New Roman" w:hAnsi="Courier New" w:cs="Courier New"/>
+          <w:kern w:val="0"/>
+          <w:sz w:val="20"/>
+          <w:szCs w:val="20"/>
+          <w:lang w:eastAsia="es-ES"/>
+          <w14:ligatures w14:val="none"/>
+        </w:rPr>
+        <w:t>size</w:t>
+      </w:r>
+      <w:proofErr w:type="spellEnd"/>
+      <w:r>
+        <w:rPr>
+          <w:rFonts w:ascii="Courier New" w:eastAsia="Times New Roman" w:hAnsi="Courier New" w:cs="Courier New"/>
+          <w:kern w:val="0"/>
+          <w:sz w:val="20"/>
+          <w:szCs w:val="20"/>
+          <w:lang w:eastAsia="es-ES"/>
+          <w14:ligatures w14:val="none"/>
+        </w:rPr>
+        <w:t>="</w:t>
+      </w:r>
+      <w:proofErr w:type="spellStart"/>
+      <w:r>
+        <w:rPr>
+          <w:rFonts w:ascii="Courier New" w:eastAsia="Times New Roman" w:hAnsi="Courier New" w:cs="Courier New"/>
+          <w:kern w:val="0"/>
+          <w:sz w:val="20"/>
+          <w:szCs w:val="20"/>
+          <w:lang w:eastAsia="es-ES"/>
+          <w14:ligatures w14:val="none"/>
+        </w:rPr>
+        <w:t>lg</w:t>
+      </w:r>
+      <w:proofErr w:type="spellEnd"/>
+      <w:r>
+        <w:rPr>
+          <w:rFonts w:ascii="Courier New" w:eastAsia="Times New Roman" w:hAnsi="Courier New" w:cs="Courier New"/>
+          <w:kern w:val="0"/>
+          <w:sz w:val="20"/>
+          <w:szCs w:val="20"/>
+          <w:lang w:eastAsia="es-ES"/>
+          <w14:ligatures w14:val="none"/>
+        </w:rPr>
+        <w:t>" /&gt;</w:t>
       </w:r>
     </w:p>
     <w:p>
       <w:pPr>
-        <w:pStyle w:val="Ttulo3"/>
-      </w:pPr>
-      <w:bookmarkStart w:id="30" w:name="_Toc227938763"/>
+        <w:pStyle w:val="Ttulo2"/>
+      </w:pPr>
+      <w:r>
+        <w:br w:type="page"/>
+      </w:r>
+      <w:bookmarkStart w:id="33" w:name="_Toc227942684"/>
       <w:r>
         <w:lastRenderedPageBreak/>
         <w:t>5.</w:t>
@@ -31176,13 +31809,47 @@
         <w:t>4</w:t>
       </w:r>
       <w:r>
+        <w:t xml:space="preserve"> </w:t>
+      </w:r>
+      <w:proofErr w:type="spellStart"/>
+      <w:r>
+        <w:t>Wireframes</w:t>
+      </w:r>
+      <w:bookmarkEnd w:id="33"/>
+      <w:proofErr w:type="spellEnd"/>
+    </w:p>
+    <w:p>
+      <w:r>
+        <w:t xml:space="preserve">En esta sección vamos a mostrar los </w:t>
+      </w:r>
+      <w:proofErr w:type="spellStart"/>
+      <w:r>
+        <w:t>wireframes</w:t>
+      </w:r>
+      <w:proofErr w:type="spellEnd"/>
+      <w:r>
+        <w:t xml:space="preserve"> de las secciones más importantes.</w:t>
+      </w:r>
+    </w:p>
+    <w:p>
+      <w:pPr>
+        <w:pStyle w:val="Ttulo3"/>
+      </w:pPr>
+      <w:bookmarkStart w:id="34" w:name="_Toc227942685"/>
+      <w:r>
+        <w:t>5.</w:t>
+      </w:r>
+      <w:r>
+        <w:t>4</w:t>
+      </w:r>
+      <w:r>
         <w:t xml:space="preserve">.1 </w:t>
       </w:r>
       <w:proofErr w:type="spellStart"/>
       <w:r>
         <w:t>Dashboard</w:t>
       </w:r>
-      <w:bookmarkEnd w:id="30"/>
+      <w:bookmarkEnd w:id="34"/>
       <w:proofErr w:type="spellEnd"/>
     </w:p>
     <w:p>
@@ -31209,7 +31876,7 @@
                     <pic:cNvPicPr/>
                   </pic:nvPicPr>
                   <pic:blipFill>
-                    <a:blip r:embed="rId32" cstate="print">
+                    <a:blip r:embed="rId35" cstate="print">
                       <a:extLst>
                         <a:ext uri="{28A0092B-C50C-407E-A947-70E740481C1C}">
                           <a14:useLocalDpi xmlns:a14="http://schemas.microsoft.com/office/drawing/2010/main" val="0"/>
@@ -31321,7 +31988,7 @@
                     <pic:cNvPicPr/>
                   </pic:nvPicPr>
                   <pic:blipFill>
-                    <a:blip r:embed="rId33"/>
+                    <a:blip r:embed="rId36"/>
                     <a:stretch>
                       <a:fillRect/>
                     </a:stretch>
@@ -31386,7 +32053,7 @@
       <w:pPr>
         <w:pStyle w:val="Ttulo3"/>
       </w:pPr>
-      <w:bookmarkStart w:id="31" w:name="_Toc227938764"/>
+      <w:bookmarkStart w:id="35" w:name="_Toc227942686"/>
       <w:r>
         <w:lastRenderedPageBreak/>
         <w:t>5.</w:t>
@@ -31401,7 +32068,7 @@
       <w:r>
         <w:t>Pos</w:t>
       </w:r>
-      <w:bookmarkEnd w:id="31"/>
+      <w:bookmarkEnd w:id="35"/>
       <w:proofErr w:type="spellEnd"/>
     </w:p>
     <w:p>
@@ -31428,7 +32095,7 @@
                     <pic:cNvPicPr/>
                   </pic:nvPicPr>
                   <pic:blipFill>
-                    <a:blip r:embed="rId34" cstate="print">
+                    <a:blip r:embed="rId37" cstate="print">
                       <a:extLst>
                         <a:ext uri="{28A0092B-C50C-407E-A947-70E740481C1C}">
                           <a14:useLocalDpi xmlns:a14="http://schemas.microsoft.com/office/drawing/2010/main" val="0"/>
@@ -31540,7 +32207,7 @@
                     <pic:cNvPicPr/>
                   </pic:nvPicPr>
                   <pic:blipFill>
-                    <a:blip r:embed="rId35"/>
+                    <a:blip r:embed="rId38"/>
                     <a:stretch>
                       <a:fillRect/>
                     </a:stretch>
@@ -31625,12 +32292,12 @@
       <w:pPr>
         <w:pStyle w:val="Ttulo1"/>
       </w:pPr>
-      <w:bookmarkStart w:id="32" w:name="_Toc227938765"/>
+      <w:bookmarkStart w:id="36" w:name="_Toc227942687"/>
       <w:r>
         <w:lastRenderedPageBreak/>
         <w:t>6. Caso de uso</w:t>
       </w:r>
-      <w:bookmarkEnd w:id="32"/>
+      <w:bookmarkEnd w:id="36"/>
     </w:p>
     <w:p>
       <w:pPr>
@@ -31727,11 +32394,11 @@
       <w:pPr>
         <w:pStyle w:val="Ttulo1"/>
       </w:pPr>
-      <w:bookmarkStart w:id="33" w:name="_Toc227938766"/>
+      <w:bookmarkStart w:id="37" w:name="_Toc227942688"/>
       <w:r>
         <w:t>7. Bibliografía</w:t>
       </w:r>
-      <w:bookmarkEnd w:id="33"/>
+      <w:bookmarkEnd w:id="37"/>
     </w:p>
     <w:p>
       <w:pPr>
@@ -31787,7 +32454,7 @@
         <w:pStyle w:val="Prrafodelista"/>
         <w:ind w:left="1416"/>
       </w:pPr>
-      <w:hyperlink r:id="rId36" w:history="1">
+      <w:hyperlink r:id="rId39" w:history="1">
         <w:r>
           <w:rPr>
             <w:rStyle w:val="Hipervnculo"/>
@@ -31837,7 +32504,7 @@
         <w:pStyle w:val="Prrafodelista"/>
         <w:ind w:firstLine="696"/>
       </w:pPr>
-      <w:hyperlink r:id="rId37" w:history="1">
+      <w:hyperlink r:id="rId40" w:history="1">
         <w:r>
           <w:rPr>
             <w:rStyle w:val="Hipervnculo"/>
@@ -31868,7 +32535,7 @@
         <w:pStyle w:val="Prrafodelista"/>
         <w:ind w:left="708" w:firstLine="708"/>
       </w:pPr>
-      <w:hyperlink r:id="rId38" w:history="1">
+      <w:hyperlink r:id="rId41" w:history="1">
         <w:r>
           <w:rPr>
             <w:rStyle w:val="Hipervnculo"/>
@@ -31902,7 +32569,7 @@
         <w:pStyle w:val="Prrafodelista"/>
         <w:ind w:firstLine="696"/>
       </w:pPr>
-      <w:hyperlink r:id="rId39" w:history="1">
+      <w:hyperlink r:id="rId42" w:history="1">
         <w:r>
           <w:rPr>
             <w:rStyle w:val="Hipervnculo"/>
@@ -31941,7 +32608,7 @@
         <w:pStyle w:val="Prrafodelista"/>
         <w:ind w:firstLine="696"/>
       </w:pPr>
-      <w:hyperlink r:id="rId40" w:history="1">
+      <w:hyperlink r:id="rId43" w:history="1">
         <w:r>
           <w:rPr>
             <w:rStyle w:val="Hipervnculo"/>
@@ -31995,7 +32662,7 @@
         <w:pStyle w:val="Prrafodelista"/>
         <w:ind w:left="1440"/>
       </w:pPr>
-      <w:hyperlink r:id="rId41" w:history="1">
+      <w:hyperlink r:id="rId44" w:history="1">
         <w:r>
           <w:rPr>
             <w:rStyle w:val="Hipervnculo"/>
@@ -32021,7 +32688,7 @@
         <w:pStyle w:val="Prrafodelista"/>
         <w:ind w:left="1440"/>
       </w:pPr>
-      <w:hyperlink r:id="rId42" w:history="1">
+      <w:hyperlink r:id="rId45" w:history="1">
         <w:r>
           <w:rPr>
             <w:rStyle w:val="Hipervnculo"/>
@@ -32058,7 +32725,7 @@
           <w:numId w:val="38"/>
         </w:numPr>
       </w:pPr>
-      <w:hyperlink r:id="rId43" w:history="1">
+      <w:hyperlink r:id="rId46" w:history="1">
         <w:r>
           <w:rPr>
             <w:rStyle w:val="Hipervnculo"/>
@@ -32075,7 +32742,7 @@
           <w:numId w:val="38"/>
         </w:numPr>
       </w:pPr>
-      <w:hyperlink r:id="rId44" w:history="1">
+      <w:hyperlink r:id="rId47" w:history="1">
         <w:r>
           <w:rPr>
             <w:rStyle w:val="Hipervnculo"/>
@@ -32128,7 +32795,7 @@
           <w:numId w:val="38"/>
         </w:numPr>
       </w:pPr>
-      <w:hyperlink r:id="rId45" w:history="1">
+      <w:hyperlink r:id="rId48" w:history="1">
         <w:r>
           <w:rPr>
             <w:rStyle w:val="Hipervnculo"/>
@@ -32190,7 +32857,7 @@
         <w:pStyle w:val="Prrafodelista"/>
         <w:ind w:left="1440"/>
       </w:pPr>
-      <w:hyperlink r:id="rId46" w:history="1">
+      <w:hyperlink r:id="rId49" w:history="1">
         <w:r>
           <w:rPr>
             <w:rStyle w:val="Hipervnculo"/>
@@ -32243,7 +32910,7 @@
           <w:numId w:val="38"/>
         </w:numPr>
       </w:pPr>
-      <w:hyperlink r:id="rId47" w:history="1">
+      <w:hyperlink r:id="rId50" w:history="1">
         <w:r>
           <w:rPr>
             <w:rStyle w:val="Hipervnculo"/>
@@ -32266,7 +32933,7 @@
       <w:r>
         <w:br/>
       </w:r>
-      <w:hyperlink r:id="rId48" w:history="1">
+      <w:hyperlink r:id="rId51" w:history="1">
         <w:r>
           <w:rPr>
             <w:rStyle w:val="Hipervnculo"/>
@@ -32297,7 +32964,7 @@
         <w:pStyle w:val="Prrafodelista"/>
         <w:ind w:left="1440"/>
       </w:pPr>
-      <w:hyperlink r:id="rId49" w:history="1">
+      <w:hyperlink r:id="rId52" w:history="1">
         <w:r>
           <w:rPr>
             <w:rStyle w:val="Hipervnculo"/>
@@ -32351,7 +33018,7 @@
           <w:numId w:val="38"/>
         </w:numPr>
       </w:pPr>
-      <w:hyperlink r:id="rId50" w:history="1">
+      <w:hyperlink r:id="rId53" w:history="1">
         <w:r>
           <w:rPr>
             <w:rStyle w:val="Hipervnculo"/>
@@ -32368,7 +33035,7 @@
           <w:numId w:val="38"/>
         </w:numPr>
       </w:pPr>
-      <w:hyperlink r:id="rId51" w:history="1">
+      <w:hyperlink r:id="rId54" w:history="1">
         <w:r>
           <w:rPr>
             <w:rStyle w:val="Hipervnculo"/>
@@ -32385,7 +33052,7 @@
           <w:numId w:val="38"/>
         </w:numPr>
       </w:pPr>
-      <w:hyperlink r:id="rId52" w:history="1">
+      <w:hyperlink r:id="rId55" w:history="1">
         <w:r>
           <w:rPr>
             <w:rStyle w:val="Hipervnculo"/>
@@ -32402,7 +33069,7 @@
           <w:numId w:val="38"/>
         </w:numPr>
       </w:pPr>
-      <w:hyperlink r:id="rId53" w:history="1">
+      <w:hyperlink r:id="rId56" w:history="1">
         <w:r>
           <w:rPr>
             <w:rStyle w:val="Hipervnculo"/>
@@ -32413,7 +33080,7 @@
     </w:p>
     <w:p/>
     <w:sectPr>
-      <w:footerReference w:type="default" r:id="rId54"/>
+      <w:footerReference w:type="default" r:id="rId57"/>
       <w:pgSz w:w="11906" w:h="16838"/>
       <w:pgMar w:top="1417" w:right="1701" w:bottom="1417" w:left="1701" w:header="708" w:footer="708" w:gutter="0"/>
       <w:pgNumType w:start="0"/>
@@ -38634,6 +39301,7 @@
     <w:rsid w:val="000A437F"/>
     <w:rsid w:val="001077DF"/>
     <w:rsid w:val="001264DC"/>
+    <w:rsid w:val="003D1216"/>
     <w:rsid w:val="00406C8A"/>
     <w:rsid w:val="0055497D"/>
     <w:rsid w:val="006D6755"/>
@@ -38643,7 +39311,6 @@
     <w:rsid w:val="007E6509"/>
     <w:rsid w:val="008C29E1"/>
     <w:rsid w:val="00AA5E59"/>
-    <w:rsid w:val="00B867A6"/>
     <w:rsid w:val="00C66654"/>
     <w:rsid w:val="00D04E45"/>
     <w:rsid w:val="00E4042E"/>

</xml_diff>

<commit_message>
docs: update style guide
</commit_message>
<xml_diff>
--- a/documentacion proyecto/Proyecto Final - Memoria proyecto Bsnessapp.docx
+++ b/documentacion proyecto/Proyecto Final - Memoria proyecto Bsnessapp.docx
@@ -4103,7 +4103,7 @@
           <w:r>
             <w:fldChar w:fldCharType="separate"/>
           </w:r>
-          <w:hyperlink w:anchor="_Toc227942651" w:history="1">
+          <w:hyperlink w:anchor="_Toc228223644" w:history="1">
             <w:r>
               <w:rPr>
                 <w:rStyle w:val="Hipervnculo"/>
@@ -4130,7 +4130,7 @@
                 <w:noProof/>
                 <w:webHidden/>
               </w:rPr>
-              <w:instrText xml:space="preserve"> PAGEREF _Toc227942651 \h </w:instrText>
+              <w:instrText xml:space="preserve"> PAGEREF _Toc228223644 \h </w:instrText>
             </w:r>
             <w:r>
               <w:rPr>
@@ -4175,7 +4175,7 @@
               <w:lang w:eastAsia="es-ES"/>
             </w:rPr>
           </w:pPr>
-          <w:hyperlink w:anchor="_Toc227942652" w:history="1">
+          <w:hyperlink w:anchor="_Toc228223645" w:history="1">
             <w:r>
               <w:rPr>
                 <w:rStyle w:val="Hipervnculo"/>
@@ -4202,7 +4202,7 @@
                 <w:noProof/>
                 <w:webHidden/>
               </w:rPr>
-              <w:instrText xml:space="preserve"> PAGEREF _Toc227942652 \h </w:instrText>
+              <w:instrText xml:space="preserve"> PAGEREF _Toc228223645 \h </w:instrText>
             </w:r>
             <w:r>
               <w:rPr>
@@ -4247,7 +4247,7 @@
               <w:lang w:eastAsia="es-ES"/>
             </w:rPr>
           </w:pPr>
-          <w:hyperlink w:anchor="_Toc227942653" w:history="1">
+          <w:hyperlink w:anchor="_Toc228223646" w:history="1">
             <w:r>
               <w:rPr>
                 <w:rStyle w:val="Hipervnculo"/>
@@ -4274,7 +4274,7 @@
                 <w:noProof/>
                 <w:webHidden/>
               </w:rPr>
-              <w:instrText xml:space="preserve"> PAGEREF _Toc227942653 \h </w:instrText>
+              <w:instrText xml:space="preserve"> PAGEREF _Toc228223646 \h </w:instrText>
             </w:r>
             <w:r>
               <w:rPr>
@@ -4319,7 +4319,7 @@
               <w:lang w:eastAsia="es-ES"/>
             </w:rPr>
           </w:pPr>
-          <w:hyperlink w:anchor="_Toc227942654" w:history="1">
+          <w:hyperlink w:anchor="_Toc228223647" w:history="1">
             <w:r>
               <w:rPr>
                 <w:rStyle w:val="Hipervnculo"/>
@@ -4346,7 +4346,7 @@
                 <w:noProof/>
                 <w:webHidden/>
               </w:rPr>
-              <w:instrText xml:space="preserve"> PAGEREF _Toc227942654 \h </w:instrText>
+              <w:instrText xml:space="preserve"> PAGEREF _Toc228223647 \h </w:instrText>
             </w:r>
             <w:r>
               <w:rPr>
@@ -4391,7 +4391,7 @@
               <w:lang w:eastAsia="es-ES"/>
             </w:rPr>
           </w:pPr>
-          <w:hyperlink w:anchor="_Toc227942655" w:history="1">
+          <w:hyperlink w:anchor="_Toc228223648" w:history="1">
             <w:r>
               <w:rPr>
                 <w:rStyle w:val="Hipervnculo"/>
@@ -4418,7 +4418,7 @@
                 <w:noProof/>
                 <w:webHidden/>
               </w:rPr>
-              <w:instrText xml:space="preserve"> PAGEREF _Toc227942655 \h </w:instrText>
+              <w:instrText xml:space="preserve"> PAGEREF _Toc228223648 \h </w:instrText>
             </w:r>
             <w:r>
               <w:rPr>
@@ -4463,7 +4463,7 @@
               <w:lang w:eastAsia="es-ES"/>
             </w:rPr>
           </w:pPr>
-          <w:hyperlink w:anchor="_Toc227942656" w:history="1">
+          <w:hyperlink w:anchor="_Toc228223649" w:history="1">
             <w:r>
               <w:rPr>
                 <w:rStyle w:val="Hipervnculo"/>
@@ -4490,7 +4490,7 @@
                 <w:noProof/>
                 <w:webHidden/>
               </w:rPr>
-              <w:instrText xml:space="preserve"> PAGEREF _Toc227942656 \h </w:instrText>
+              <w:instrText xml:space="preserve"> PAGEREF _Toc228223649 \h </w:instrText>
             </w:r>
             <w:r>
               <w:rPr>
@@ -4535,7 +4535,7 @@
               <w:lang w:eastAsia="es-ES"/>
             </w:rPr>
           </w:pPr>
-          <w:hyperlink w:anchor="_Toc227942657" w:history="1">
+          <w:hyperlink w:anchor="_Toc228223650" w:history="1">
             <w:r>
               <w:rPr>
                 <w:rStyle w:val="Hipervnculo"/>
@@ -4564,7 +4564,7 @@
                 <w:noProof/>
                 <w:webHidden/>
               </w:rPr>
-              <w:instrText xml:space="preserve"> PAGEREF _Toc227942657 \h </w:instrText>
+              <w:instrText xml:space="preserve"> PAGEREF _Toc228223650 \h </w:instrText>
             </w:r>
             <w:r>
               <w:rPr>
@@ -4609,7 +4609,7 @@
               <w:lang w:eastAsia="es-ES"/>
             </w:rPr>
           </w:pPr>
-          <w:hyperlink w:anchor="_Toc227942658" w:history="1">
+          <w:hyperlink w:anchor="_Toc228223651" w:history="1">
             <w:r>
               <w:rPr>
                 <w:rStyle w:val="Hipervnculo"/>
@@ -4636,7 +4636,7 @@
                 <w:noProof/>
                 <w:webHidden/>
               </w:rPr>
-              <w:instrText xml:space="preserve"> PAGEREF _Toc227942658 \h </w:instrText>
+              <w:instrText xml:space="preserve"> PAGEREF _Toc228223651 \h </w:instrText>
             </w:r>
             <w:r>
               <w:rPr>
@@ -4681,7 +4681,7 @@
               <w:lang w:eastAsia="es-ES"/>
             </w:rPr>
           </w:pPr>
-          <w:hyperlink w:anchor="_Toc227942659" w:history="1">
+          <w:hyperlink w:anchor="_Toc228223652" w:history="1">
             <w:r>
               <w:rPr>
                 <w:rStyle w:val="Hipervnculo"/>
@@ -4708,7 +4708,7 @@
                 <w:noProof/>
                 <w:webHidden/>
               </w:rPr>
-              <w:instrText xml:space="preserve"> PAGEREF _Toc227942659 \h </w:instrText>
+              <w:instrText xml:space="preserve"> PAGEREF _Toc228223652 \h </w:instrText>
             </w:r>
             <w:r>
               <w:rPr>
@@ -4753,7 +4753,7 @@
               <w:lang w:eastAsia="es-ES"/>
             </w:rPr>
           </w:pPr>
-          <w:hyperlink w:anchor="_Toc227942660" w:history="1">
+          <w:hyperlink w:anchor="_Toc228223653" w:history="1">
             <w:r>
               <w:rPr>
                 <w:rStyle w:val="Hipervnculo"/>
@@ -4780,7 +4780,7 @@
                 <w:noProof/>
                 <w:webHidden/>
               </w:rPr>
-              <w:instrText xml:space="preserve"> PAGEREF _Toc227942660 \h </w:instrText>
+              <w:instrText xml:space="preserve"> PAGEREF _Toc228223653 \h </w:instrText>
             </w:r>
             <w:r>
               <w:rPr>
@@ -4825,7 +4825,7 @@
               <w:lang w:eastAsia="es-ES"/>
             </w:rPr>
           </w:pPr>
-          <w:hyperlink w:anchor="_Toc227942661" w:history="1">
+          <w:hyperlink w:anchor="_Toc228223654" w:history="1">
             <w:r>
               <w:rPr>
                 <w:rStyle w:val="Hipervnculo"/>
@@ -4852,7 +4852,7 @@
                 <w:noProof/>
                 <w:webHidden/>
               </w:rPr>
-              <w:instrText xml:space="preserve"> PAGEREF _Toc227942661 \h </w:instrText>
+              <w:instrText xml:space="preserve"> PAGEREF _Toc228223654 \h </w:instrText>
             </w:r>
             <w:r>
               <w:rPr>
@@ -4897,7 +4897,7 @@
               <w:lang w:eastAsia="es-ES"/>
             </w:rPr>
           </w:pPr>
-          <w:hyperlink w:anchor="_Toc227942662" w:history="1">
+          <w:hyperlink w:anchor="_Toc228223655" w:history="1">
             <w:r>
               <w:rPr>
                 <w:rStyle w:val="Hipervnculo"/>
@@ -4924,7 +4924,7 @@
                 <w:noProof/>
                 <w:webHidden/>
               </w:rPr>
-              <w:instrText xml:space="preserve"> PAGEREF _Toc227942662 \h </w:instrText>
+              <w:instrText xml:space="preserve"> PAGEREF _Toc228223655 \h </w:instrText>
             </w:r>
             <w:r>
               <w:rPr>
@@ -4944,7 +4944,7 @@
                 <w:noProof/>
                 <w:webHidden/>
               </w:rPr>
-              <w:t>10</w:t>
+              <w:t>9</w:t>
             </w:r>
             <w:r>
               <w:rPr>
@@ -4969,7 +4969,7 @@
               <w:lang w:eastAsia="es-ES"/>
             </w:rPr>
           </w:pPr>
-          <w:hyperlink w:anchor="_Toc227942663" w:history="1">
+          <w:hyperlink w:anchor="_Toc228223656" w:history="1">
             <w:r>
               <w:rPr>
                 <w:rStyle w:val="Hipervnculo"/>
@@ -4996,7 +4996,7 @@
                 <w:noProof/>
                 <w:webHidden/>
               </w:rPr>
-              <w:instrText xml:space="preserve"> PAGEREF _Toc227942663 \h </w:instrText>
+              <w:instrText xml:space="preserve"> PAGEREF _Toc228223656 \h </w:instrText>
             </w:r>
             <w:r>
               <w:rPr>
@@ -5041,7 +5041,7 @@
               <w:lang w:eastAsia="es-ES"/>
             </w:rPr>
           </w:pPr>
-          <w:hyperlink w:anchor="_Toc227942664" w:history="1">
+          <w:hyperlink w:anchor="_Toc228223657" w:history="1">
             <w:r>
               <w:rPr>
                 <w:rStyle w:val="Hipervnculo"/>
@@ -5068,7 +5068,7 @@
                 <w:noProof/>
                 <w:webHidden/>
               </w:rPr>
-              <w:instrText xml:space="preserve"> PAGEREF _Toc227942664 \h </w:instrText>
+              <w:instrText xml:space="preserve"> PAGEREF _Toc228223657 \h </w:instrText>
             </w:r>
             <w:r>
               <w:rPr>
@@ -5113,7 +5113,7 @@
               <w:lang w:eastAsia="es-ES"/>
             </w:rPr>
           </w:pPr>
-          <w:hyperlink w:anchor="_Toc227942665" w:history="1">
+          <w:hyperlink w:anchor="_Toc228223658" w:history="1">
             <w:r>
               <w:rPr>
                 <w:rStyle w:val="Hipervnculo"/>
@@ -5140,7 +5140,7 @@
                 <w:noProof/>
                 <w:webHidden/>
               </w:rPr>
-              <w:instrText xml:space="preserve"> PAGEREF _Toc227942665 \h </w:instrText>
+              <w:instrText xml:space="preserve"> PAGEREF _Toc228223658 \h </w:instrText>
             </w:r>
             <w:r>
               <w:rPr>
@@ -5185,7 +5185,7 @@
               <w:lang w:eastAsia="es-ES"/>
             </w:rPr>
           </w:pPr>
-          <w:hyperlink w:anchor="_Toc227942666" w:history="1">
+          <w:hyperlink w:anchor="_Toc228223659" w:history="1">
             <w:r>
               <w:rPr>
                 <w:rStyle w:val="Hipervnculo"/>
@@ -5212,7 +5212,7 @@
                 <w:noProof/>
                 <w:webHidden/>
               </w:rPr>
-              <w:instrText xml:space="preserve"> PAGEREF _Toc227942666 \h </w:instrText>
+              <w:instrText xml:space="preserve"> PAGEREF _Toc228223659 \h </w:instrText>
             </w:r>
             <w:r>
               <w:rPr>
@@ -5257,7 +5257,7 @@
               <w:lang w:eastAsia="es-ES"/>
             </w:rPr>
           </w:pPr>
-          <w:hyperlink w:anchor="_Toc227942667" w:history="1">
+          <w:hyperlink w:anchor="_Toc228223660" w:history="1">
             <w:r>
               <w:rPr>
                 <w:rStyle w:val="Hipervnculo"/>
@@ -5284,7 +5284,7 @@
                 <w:noProof/>
                 <w:webHidden/>
               </w:rPr>
-              <w:instrText xml:space="preserve"> PAGEREF _Toc227942667 \h </w:instrText>
+              <w:instrText xml:space="preserve"> PAGEREF _Toc228223660 \h </w:instrText>
             </w:r>
             <w:r>
               <w:rPr>
@@ -5329,7 +5329,7 @@
               <w:lang w:eastAsia="es-ES"/>
             </w:rPr>
           </w:pPr>
-          <w:hyperlink w:anchor="_Toc227942668" w:history="1">
+          <w:hyperlink w:anchor="_Toc228223661" w:history="1">
             <w:r>
               <w:rPr>
                 <w:rStyle w:val="Hipervnculo"/>
@@ -5356,7 +5356,7 @@
                 <w:noProof/>
                 <w:webHidden/>
               </w:rPr>
-              <w:instrText xml:space="preserve"> PAGEREF _Toc227942668 \h </w:instrText>
+              <w:instrText xml:space="preserve"> PAGEREF _Toc228223661 \h </w:instrText>
             </w:r>
             <w:r>
               <w:rPr>
@@ -5401,7 +5401,7 @@
               <w:lang w:eastAsia="es-ES"/>
             </w:rPr>
           </w:pPr>
-          <w:hyperlink w:anchor="_Toc227942669" w:history="1">
+          <w:hyperlink w:anchor="_Toc228223662" w:history="1">
             <w:r>
               <w:rPr>
                 <w:rStyle w:val="Hipervnculo"/>
@@ -5428,7 +5428,7 @@
                 <w:noProof/>
                 <w:webHidden/>
               </w:rPr>
-              <w:instrText xml:space="preserve"> PAGEREF _Toc227942669 \h </w:instrText>
+              <w:instrText xml:space="preserve"> PAGEREF _Toc228223662 \h </w:instrText>
             </w:r>
             <w:r>
               <w:rPr>
@@ -5473,7 +5473,7 @@
               <w:lang w:eastAsia="es-ES"/>
             </w:rPr>
           </w:pPr>
-          <w:hyperlink w:anchor="_Toc227942670" w:history="1">
+          <w:hyperlink w:anchor="_Toc228223663" w:history="1">
             <w:r>
               <w:rPr>
                 <w:rStyle w:val="Hipervnculo"/>
@@ -5500,7 +5500,7 @@
                 <w:noProof/>
                 <w:webHidden/>
               </w:rPr>
-              <w:instrText xml:space="preserve"> PAGEREF _Toc227942670 \h </w:instrText>
+              <w:instrText xml:space="preserve"> PAGEREF _Toc228223663 \h </w:instrText>
             </w:r>
             <w:r>
               <w:rPr>
@@ -5545,7 +5545,7 @@
               <w:lang w:eastAsia="es-ES"/>
             </w:rPr>
           </w:pPr>
-          <w:hyperlink w:anchor="_Toc227942671" w:history="1">
+          <w:hyperlink w:anchor="_Toc228223664" w:history="1">
             <w:r>
               <w:rPr>
                 <w:rStyle w:val="Hipervnculo"/>
@@ -5572,7 +5572,7 @@
                 <w:noProof/>
                 <w:webHidden/>
               </w:rPr>
-              <w:instrText xml:space="preserve"> PAGEREF _Toc227942671 \h </w:instrText>
+              <w:instrText xml:space="preserve"> PAGEREF _Toc228223664 \h </w:instrText>
             </w:r>
             <w:r>
               <w:rPr>
@@ -5617,7 +5617,7 @@
               <w:lang w:eastAsia="es-ES"/>
             </w:rPr>
           </w:pPr>
-          <w:hyperlink w:anchor="_Toc227942672" w:history="1">
+          <w:hyperlink w:anchor="_Toc228223665" w:history="1">
             <w:r>
               <w:rPr>
                 <w:rStyle w:val="Hipervnculo"/>
@@ -5644,7 +5644,7 @@
                 <w:noProof/>
                 <w:webHidden/>
               </w:rPr>
-              <w:instrText xml:space="preserve"> PAGEREF _Toc227942672 \h </w:instrText>
+              <w:instrText xml:space="preserve"> PAGEREF _Toc228223665 \h </w:instrText>
             </w:r>
             <w:r>
               <w:rPr>
@@ -5689,7 +5689,7 @@
               <w:lang w:eastAsia="es-ES"/>
             </w:rPr>
           </w:pPr>
-          <w:hyperlink w:anchor="_Toc227942673" w:history="1">
+          <w:hyperlink w:anchor="_Toc228223666" w:history="1">
             <w:r>
               <w:rPr>
                 <w:rStyle w:val="Hipervnculo"/>
@@ -5716,7 +5716,7 @@
                 <w:noProof/>
                 <w:webHidden/>
               </w:rPr>
-              <w:instrText xml:space="preserve"> PAGEREF _Toc227942673 \h </w:instrText>
+              <w:instrText xml:space="preserve"> PAGEREF _Toc228223666 \h </w:instrText>
             </w:r>
             <w:r>
               <w:rPr>
@@ -5761,7 +5761,7 @@
               <w:lang w:eastAsia="es-ES"/>
             </w:rPr>
           </w:pPr>
-          <w:hyperlink w:anchor="_Toc227942674" w:history="1">
+          <w:hyperlink w:anchor="_Toc228223667" w:history="1">
             <w:r>
               <w:rPr>
                 <w:rStyle w:val="Hipervnculo"/>
@@ -5788,7 +5788,7 @@
                 <w:noProof/>
                 <w:webHidden/>
               </w:rPr>
-              <w:instrText xml:space="preserve"> PAGEREF _Toc227942674 \h </w:instrText>
+              <w:instrText xml:space="preserve"> PAGEREF _Toc228223667 \h </w:instrText>
             </w:r>
             <w:r>
               <w:rPr>
@@ -5833,7 +5833,7 @@
               <w:lang w:eastAsia="es-ES"/>
             </w:rPr>
           </w:pPr>
-          <w:hyperlink w:anchor="_Toc227942675" w:history="1">
+          <w:hyperlink w:anchor="_Toc228223668" w:history="1">
             <w:r>
               <w:rPr>
                 <w:rStyle w:val="Hipervnculo"/>
@@ -5860,7 +5860,7 @@
                 <w:noProof/>
                 <w:webHidden/>
               </w:rPr>
-              <w:instrText xml:space="preserve"> PAGEREF _Toc227942675 \h </w:instrText>
+              <w:instrText xml:space="preserve"> PAGEREF _Toc228223668 \h </w:instrText>
             </w:r>
             <w:r>
               <w:rPr>
@@ -5905,7 +5905,7 @@
               <w:lang w:eastAsia="es-ES"/>
             </w:rPr>
           </w:pPr>
-          <w:hyperlink w:anchor="_Toc227942676" w:history="1">
+          <w:hyperlink w:anchor="_Toc228223669" w:history="1">
             <w:r>
               <w:rPr>
                 <w:rStyle w:val="Hipervnculo"/>
@@ -5932,7 +5932,7 @@
                 <w:noProof/>
                 <w:webHidden/>
               </w:rPr>
-              <w:instrText xml:space="preserve"> PAGEREF _Toc227942676 \h </w:instrText>
+              <w:instrText xml:space="preserve"> PAGEREF _Toc228223669 \h </w:instrText>
             </w:r>
             <w:r>
               <w:rPr>
@@ -5977,7 +5977,7 @@
               <w:lang w:eastAsia="es-ES"/>
             </w:rPr>
           </w:pPr>
-          <w:hyperlink w:anchor="_Toc227942677" w:history="1">
+          <w:hyperlink w:anchor="_Toc228223670" w:history="1">
             <w:r>
               <w:rPr>
                 <w:rStyle w:val="Hipervnculo"/>
@@ -6004,7 +6004,7 @@
                 <w:noProof/>
                 <w:webHidden/>
               </w:rPr>
-              <w:instrText xml:space="preserve"> PAGEREF _Toc227942677 \h </w:instrText>
+              <w:instrText xml:space="preserve"> PAGEREF _Toc228223670 \h </w:instrText>
             </w:r>
             <w:r>
               <w:rPr>
@@ -6049,7 +6049,7 @@
               <w:lang w:eastAsia="es-ES"/>
             </w:rPr>
           </w:pPr>
-          <w:hyperlink w:anchor="_Toc227942678" w:history="1">
+          <w:hyperlink w:anchor="_Toc228223671" w:history="1">
             <w:r>
               <w:rPr>
                 <w:rStyle w:val="Hipervnculo"/>
@@ -6076,7 +6076,7 @@
                 <w:noProof/>
                 <w:webHidden/>
               </w:rPr>
-              <w:instrText xml:space="preserve"> PAGEREF _Toc227942678 \h </w:instrText>
+              <w:instrText xml:space="preserve"> PAGEREF _Toc228223671 \h </w:instrText>
             </w:r>
             <w:r>
               <w:rPr>
@@ -6121,7 +6121,7 @@
               <w:lang w:eastAsia="es-ES"/>
             </w:rPr>
           </w:pPr>
-          <w:hyperlink w:anchor="_Toc227942679" w:history="1">
+          <w:hyperlink w:anchor="_Toc228223672" w:history="1">
             <w:r>
               <w:rPr>
                 <w:rStyle w:val="Hipervnculo"/>
@@ -6148,7 +6148,7 @@
                 <w:noProof/>
                 <w:webHidden/>
               </w:rPr>
-              <w:instrText xml:space="preserve"> PAGEREF _Toc227942679 \h </w:instrText>
+              <w:instrText xml:space="preserve"> PAGEREF _Toc228223672 \h </w:instrText>
             </w:r>
             <w:r>
               <w:rPr>
@@ -6193,7 +6193,7 @@
               <w:lang w:eastAsia="es-ES"/>
             </w:rPr>
           </w:pPr>
-          <w:hyperlink w:anchor="_Toc227942680" w:history="1">
+          <w:hyperlink w:anchor="_Toc228223673" w:history="1">
             <w:r>
               <w:rPr>
                 <w:rStyle w:val="Hipervnculo"/>
@@ -6220,7 +6220,7 @@
                 <w:noProof/>
                 <w:webHidden/>
               </w:rPr>
-              <w:instrText xml:space="preserve"> PAGEREF _Toc227942680 \h </w:instrText>
+              <w:instrText xml:space="preserve"> PAGEREF _Toc228223673 \h </w:instrText>
             </w:r>
             <w:r>
               <w:rPr>
@@ -6265,7 +6265,7 @@
               <w:lang w:eastAsia="es-ES"/>
             </w:rPr>
           </w:pPr>
-          <w:hyperlink w:anchor="_Toc227942681" w:history="1">
+          <w:hyperlink w:anchor="_Toc228223674" w:history="1">
             <w:r>
               <w:rPr>
                 <w:rStyle w:val="Hipervnculo"/>
@@ -6292,7 +6292,7 @@
                 <w:noProof/>
                 <w:webHidden/>
               </w:rPr>
-              <w:instrText xml:space="preserve"> PAGEREF _Toc227942681 \h </w:instrText>
+              <w:instrText xml:space="preserve"> PAGEREF _Toc228223674 \h </w:instrText>
             </w:r>
             <w:r>
               <w:rPr>
@@ -6337,7 +6337,7 @@
               <w:lang w:eastAsia="es-ES"/>
             </w:rPr>
           </w:pPr>
-          <w:hyperlink w:anchor="_Toc227942682" w:history="1">
+          <w:hyperlink w:anchor="_Toc228223675" w:history="1">
             <w:r>
               <w:rPr>
                 <w:rStyle w:val="Hipervnculo"/>
@@ -6364,7 +6364,7 @@
                 <w:noProof/>
                 <w:webHidden/>
               </w:rPr>
-              <w:instrText xml:space="preserve"> PAGEREF _Toc227942682 \h </w:instrText>
+              <w:instrText xml:space="preserve"> PAGEREF _Toc228223675 \h </w:instrText>
             </w:r>
             <w:r>
               <w:rPr>
@@ -6409,7 +6409,7 @@
               <w:lang w:eastAsia="es-ES"/>
             </w:rPr>
           </w:pPr>
-          <w:hyperlink w:anchor="_Toc227942683" w:history="1">
+          <w:hyperlink w:anchor="_Toc228223676" w:history="1">
             <w:r>
               <w:rPr>
                 <w:rStyle w:val="Hipervnculo"/>
@@ -6436,7 +6436,7 @@
                 <w:noProof/>
                 <w:webHidden/>
               </w:rPr>
-              <w:instrText xml:space="preserve"> PAGEREF _Toc227942683 \h </w:instrText>
+              <w:instrText xml:space="preserve"> PAGEREF _Toc228223676 \h </w:instrText>
             </w:r>
             <w:r>
               <w:rPr>
@@ -6481,13 +6481,13 @@
               <w:lang w:eastAsia="es-ES"/>
             </w:rPr>
           </w:pPr>
-          <w:hyperlink w:anchor="_Toc227942684" w:history="1">
+          <w:hyperlink w:anchor="_Toc228223677" w:history="1">
             <w:r>
               <w:rPr>
                 <w:rStyle w:val="Hipervnculo"/>
                 <w:noProof/>
               </w:rPr>
-              <w:t>5.4 Wireframes</w:t>
+              <w:t>5.5 Wireframes</w:t>
             </w:r>
             <w:r>
               <w:rPr>
@@ -6508,7 +6508,7 @@
                 <w:noProof/>
                 <w:webHidden/>
               </w:rPr>
-              <w:instrText xml:space="preserve"> PAGEREF _Toc227942684 \h </w:instrText>
+              <w:instrText xml:space="preserve"> PAGEREF _Toc228223677 \h </w:instrText>
             </w:r>
             <w:r>
               <w:rPr>
@@ -6553,13 +6553,13 @@
               <w:lang w:eastAsia="es-ES"/>
             </w:rPr>
           </w:pPr>
-          <w:hyperlink w:anchor="_Toc227942685" w:history="1">
+          <w:hyperlink w:anchor="_Toc228223678" w:history="1">
             <w:r>
               <w:rPr>
                 <w:rStyle w:val="Hipervnculo"/>
                 <w:noProof/>
               </w:rPr>
-              <w:t>5.4.1 Dashboard</w:t>
+              <w:t>5.5.1 Dashboard</w:t>
             </w:r>
             <w:r>
               <w:rPr>
@@ -6580,7 +6580,7 @@
                 <w:noProof/>
                 <w:webHidden/>
               </w:rPr>
-              <w:instrText xml:space="preserve"> PAGEREF _Toc227942685 \h </w:instrText>
+              <w:instrText xml:space="preserve"> PAGEREF _Toc228223678 \h </w:instrText>
             </w:r>
             <w:r>
               <w:rPr>
@@ -6625,13 +6625,13 @@
               <w:lang w:eastAsia="es-ES"/>
             </w:rPr>
           </w:pPr>
-          <w:hyperlink w:anchor="_Toc227942686" w:history="1">
+          <w:hyperlink w:anchor="_Toc228223679" w:history="1">
             <w:r>
               <w:rPr>
                 <w:rStyle w:val="Hipervnculo"/>
                 <w:noProof/>
               </w:rPr>
-              <w:t>5.4.2 Pos</w:t>
+              <w:t>5.5.2 Pos</w:t>
             </w:r>
             <w:r>
               <w:rPr>
@@ -6652,7 +6652,7 @@
                 <w:noProof/>
                 <w:webHidden/>
               </w:rPr>
-              <w:instrText xml:space="preserve"> PAGEREF _Toc227942686 \h </w:instrText>
+              <w:instrText xml:space="preserve"> PAGEREF _Toc228223679 \h </w:instrText>
             </w:r>
             <w:r>
               <w:rPr>
@@ -6673,6 +6673,222 @@
                 <w:webHidden/>
               </w:rPr>
               <w:t>19</w:t>
+            </w:r>
+            <w:r>
+              <w:rPr>
+                <w:noProof/>
+                <w:webHidden/>
+              </w:rPr>
+              <w:fldChar w:fldCharType="end"/>
+            </w:r>
+          </w:hyperlink>
+        </w:p>
+        <w:p>
+          <w:pPr>
+            <w:pStyle w:val="TDC2"/>
+            <w:tabs>
+              <w:tab w:val="right" w:leader="dot" w:pos="8494"/>
+            </w:tabs>
+            <w:rPr>
+              <w:rFonts w:eastAsiaTheme="minorEastAsia"/>
+              <w:noProof/>
+              <w:sz w:val="24"/>
+              <w:szCs w:val="24"/>
+              <w:lang w:eastAsia="es-ES"/>
+            </w:rPr>
+          </w:pPr>
+          <w:hyperlink w:anchor="_Toc228223680" w:history="1">
+            <w:r>
+              <w:rPr>
+                <w:rStyle w:val="Hipervnculo"/>
+                <w:noProof/>
+              </w:rPr>
+              <w:t>5.6 Espaciados y layout</w:t>
+            </w:r>
+            <w:r>
+              <w:rPr>
+                <w:noProof/>
+                <w:webHidden/>
+              </w:rPr>
+              <w:tab/>
+            </w:r>
+            <w:r>
+              <w:rPr>
+                <w:noProof/>
+                <w:webHidden/>
+              </w:rPr>
+              <w:fldChar w:fldCharType="begin"/>
+            </w:r>
+            <w:r>
+              <w:rPr>
+                <w:noProof/>
+                <w:webHidden/>
+              </w:rPr>
+              <w:instrText xml:space="preserve"> PAGEREF _Toc228223680 \h </w:instrText>
+            </w:r>
+            <w:r>
+              <w:rPr>
+                <w:noProof/>
+                <w:webHidden/>
+              </w:rPr>
+            </w:r>
+            <w:r>
+              <w:rPr>
+                <w:noProof/>
+                <w:webHidden/>
+              </w:rPr>
+              <w:fldChar w:fldCharType="separate"/>
+            </w:r>
+            <w:r>
+              <w:rPr>
+                <w:noProof/>
+                <w:webHidden/>
+              </w:rPr>
+              <w:t>20</w:t>
+            </w:r>
+            <w:r>
+              <w:rPr>
+                <w:noProof/>
+                <w:webHidden/>
+              </w:rPr>
+              <w:fldChar w:fldCharType="end"/>
+            </w:r>
+          </w:hyperlink>
+        </w:p>
+        <w:p>
+          <w:pPr>
+            <w:pStyle w:val="TDC3"/>
+            <w:tabs>
+              <w:tab w:val="right" w:leader="dot" w:pos="8494"/>
+            </w:tabs>
+            <w:rPr>
+              <w:rFonts w:eastAsiaTheme="minorEastAsia"/>
+              <w:noProof/>
+              <w:sz w:val="24"/>
+              <w:szCs w:val="24"/>
+              <w:lang w:eastAsia="es-ES"/>
+            </w:rPr>
+          </w:pPr>
+          <w:hyperlink w:anchor="_Toc228223681" w:history="1">
+            <w:r>
+              <w:rPr>
+                <w:rStyle w:val="Hipervnculo"/>
+                <w:noProof/>
+              </w:rPr>
+              <w:t>5.6.1 Contenedores</w:t>
+            </w:r>
+            <w:r>
+              <w:rPr>
+                <w:noProof/>
+                <w:webHidden/>
+              </w:rPr>
+              <w:tab/>
+            </w:r>
+            <w:r>
+              <w:rPr>
+                <w:noProof/>
+                <w:webHidden/>
+              </w:rPr>
+              <w:fldChar w:fldCharType="begin"/>
+            </w:r>
+            <w:r>
+              <w:rPr>
+                <w:noProof/>
+                <w:webHidden/>
+              </w:rPr>
+              <w:instrText xml:space="preserve"> PAGEREF _Toc228223681 \h </w:instrText>
+            </w:r>
+            <w:r>
+              <w:rPr>
+                <w:noProof/>
+                <w:webHidden/>
+              </w:rPr>
+            </w:r>
+            <w:r>
+              <w:rPr>
+                <w:noProof/>
+                <w:webHidden/>
+              </w:rPr>
+              <w:fldChar w:fldCharType="separate"/>
+            </w:r>
+            <w:r>
+              <w:rPr>
+                <w:noProof/>
+                <w:webHidden/>
+              </w:rPr>
+              <w:t>20</w:t>
+            </w:r>
+            <w:r>
+              <w:rPr>
+                <w:noProof/>
+                <w:webHidden/>
+              </w:rPr>
+              <w:fldChar w:fldCharType="end"/>
+            </w:r>
+          </w:hyperlink>
+        </w:p>
+        <w:p>
+          <w:pPr>
+            <w:pStyle w:val="TDC3"/>
+            <w:tabs>
+              <w:tab w:val="right" w:leader="dot" w:pos="8494"/>
+            </w:tabs>
+            <w:rPr>
+              <w:rFonts w:eastAsiaTheme="minorEastAsia"/>
+              <w:noProof/>
+              <w:sz w:val="24"/>
+              <w:szCs w:val="24"/>
+              <w:lang w:eastAsia="es-ES"/>
+            </w:rPr>
+          </w:pPr>
+          <w:hyperlink w:anchor="_Toc228223682" w:history="1">
+            <w:r>
+              <w:rPr>
+                <w:rStyle w:val="Hipervnculo"/>
+                <w:noProof/>
+              </w:rPr>
+              <w:t>5.6.2 Espaciado</w:t>
+            </w:r>
+            <w:r>
+              <w:rPr>
+                <w:noProof/>
+                <w:webHidden/>
+              </w:rPr>
+              <w:tab/>
+            </w:r>
+            <w:r>
+              <w:rPr>
+                <w:noProof/>
+                <w:webHidden/>
+              </w:rPr>
+              <w:fldChar w:fldCharType="begin"/>
+            </w:r>
+            <w:r>
+              <w:rPr>
+                <w:noProof/>
+                <w:webHidden/>
+              </w:rPr>
+              <w:instrText xml:space="preserve"> PAGEREF _Toc228223682 \h </w:instrText>
+            </w:r>
+            <w:r>
+              <w:rPr>
+                <w:noProof/>
+                <w:webHidden/>
+              </w:rPr>
+            </w:r>
+            <w:r>
+              <w:rPr>
+                <w:noProof/>
+                <w:webHidden/>
+              </w:rPr>
+              <w:fldChar w:fldCharType="separate"/>
+            </w:r>
+            <w:r>
+              <w:rPr>
+                <w:noProof/>
+                <w:webHidden/>
+              </w:rPr>
+              <w:t>20</w:t>
             </w:r>
             <w:r>
               <w:rPr>
@@ -6697,7 +6913,7 @@
               <w:lang w:eastAsia="es-ES"/>
             </w:rPr>
           </w:pPr>
-          <w:hyperlink w:anchor="_Toc227942687" w:history="1">
+          <w:hyperlink w:anchor="_Toc228223683" w:history="1">
             <w:r>
               <w:rPr>
                 <w:rStyle w:val="Hipervnculo"/>
@@ -6724,7 +6940,7 @@
                 <w:noProof/>
                 <w:webHidden/>
               </w:rPr>
-              <w:instrText xml:space="preserve"> PAGEREF _Toc227942687 \h </w:instrText>
+              <w:instrText xml:space="preserve"> PAGEREF _Toc228223683 \h </w:instrText>
             </w:r>
             <w:r>
               <w:rPr>
@@ -6744,7 +6960,7 @@
                 <w:noProof/>
                 <w:webHidden/>
               </w:rPr>
-              <w:t>20</w:t>
+              <w:t>21</w:t>
             </w:r>
             <w:r>
               <w:rPr>
@@ -6769,13 +6985,13 @@
               <w:lang w:eastAsia="es-ES"/>
             </w:rPr>
           </w:pPr>
-          <w:hyperlink w:anchor="_Toc227942688" w:history="1">
+          <w:hyperlink w:anchor="_Toc228223684" w:history="1">
             <w:r>
               <w:rPr>
                 <w:rStyle w:val="Hipervnculo"/>
                 <w:noProof/>
               </w:rPr>
-              <w:t>7. Bibliografía</w:t>
+              <w:t>7. Anexos</w:t>
             </w:r>
             <w:r>
               <w:rPr>
@@ -6796,7 +7012,7 @@
                 <w:noProof/>
                 <w:webHidden/>
               </w:rPr>
-              <w:instrText xml:space="preserve"> PAGEREF _Toc227942688 \h </w:instrText>
+              <w:instrText xml:space="preserve"> PAGEREF _Toc228223684 \h </w:instrText>
             </w:r>
             <w:r>
               <w:rPr>
@@ -6816,7 +7032,223 @@
                 <w:noProof/>
                 <w:webHidden/>
               </w:rPr>
-              <w:t>20</w:t>
+              <w:t>21</w:t>
+            </w:r>
+            <w:r>
+              <w:rPr>
+                <w:noProof/>
+                <w:webHidden/>
+              </w:rPr>
+              <w:fldChar w:fldCharType="end"/>
+            </w:r>
+          </w:hyperlink>
+        </w:p>
+        <w:p>
+          <w:pPr>
+            <w:pStyle w:val="TDC2"/>
+            <w:tabs>
+              <w:tab w:val="right" w:leader="dot" w:pos="8494"/>
+            </w:tabs>
+            <w:rPr>
+              <w:rFonts w:eastAsiaTheme="minorEastAsia"/>
+              <w:noProof/>
+              <w:sz w:val="24"/>
+              <w:szCs w:val="24"/>
+              <w:lang w:eastAsia="es-ES"/>
+            </w:rPr>
+          </w:pPr>
+          <w:hyperlink w:anchor="_Toc228223685" w:history="1">
+            <w:r>
+              <w:rPr>
+                <w:rStyle w:val="Hipervnculo"/>
+                <w:noProof/>
+              </w:rPr>
+              <w:t>7.1 Anexo – Diagrama de clase</w:t>
+            </w:r>
+            <w:r>
+              <w:rPr>
+                <w:noProof/>
+                <w:webHidden/>
+              </w:rPr>
+              <w:tab/>
+            </w:r>
+            <w:r>
+              <w:rPr>
+                <w:noProof/>
+                <w:webHidden/>
+              </w:rPr>
+              <w:fldChar w:fldCharType="begin"/>
+            </w:r>
+            <w:r>
+              <w:rPr>
+                <w:noProof/>
+                <w:webHidden/>
+              </w:rPr>
+              <w:instrText xml:space="preserve"> PAGEREF _Toc228223685 \h </w:instrText>
+            </w:r>
+            <w:r>
+              <w:rPr>
+                <w:noProof/>
+                <w:webHidden/>
+              </w:rPr>
+            </w:r>
+            <w:r>
+              <w:rPr>
+                <w:noProof/>
+                <w:webHidden/>
+              </w:rPr>
+              <w:fldChar w:fldCharType="separate"/>
+            </w:r>
+            <w:r>
+              <w:rPr>
+                <w:noProof/>
+                <w:webHidden/>
+              </w:rPr>
+              <w:t>21</w:t>
+            </w:r>
+            <w:r>
+              <w:rPr>
+                <w:noProof/>
+                <w:webHidden/>
+              </w:rPr>
+              <w:fldChar w:fldCharType="end"/>
+            </w:r>
+          </w:hyperlink>
+        </w:p>
+        <w:p>
+          <w:pPr>
+            <w:pStyle w:val="TDC2"/>
+            <w:tabs>
+              <w:tab w:val="right" w:leader="dot" w:pos="8494"/>
+            </w:tabs>
+            <w:rPr>
+              <w:rFonts w:eastAsiaTheme="minorEastAsia"/>
+              <w:noProof/>
+              <w:sz w:val="24"/>
+              <w:szCs w:val="24"/>
+              <w:lang w:eastAsia="es-ES"/>
+            </w:rPr>
+          </w:pPr>
+          <w:hyperlink w:anchor="_Toc228223686" w:history="1">
+            <w:r>
+              <w:rPr>
+                <w:rStyle w:val="Hipervnculo"/>
+                <w:noProof/>
+              </w:rPr>
+              <w:t>7.2 Anexo – Diagrama entidad relación</w:t>
+            </w:r>
+            <w:r>
+              <w:rPr>
+                <w:noProof/>
+                <w:webHidden/>
+              </w:rPr>
+              <w:tab/>
+            </w:r>
+            <w:r>
+              <w:rPr>
+                <w:noProof/>
+                <w:webHidden/>
+              </w:rPr>
+              <w:fldChar w:fldCharType="begin"/>
+            </w:r>
+            <w:r>
+              <w:rPr>
+                <w:noProof/>
+                <w:webHidden/>
+              </w:rPr>
+              <w:instrText xml:space="preserve"> PAGEREF _Toc228223686 \h </w:instrText>
+            </w:r>
+            <w:r>
+              <w:rPr>
+                <w:noProof/>
+                <w:webHidden/>
+              </w:rPr>
+            </w:r>
+            <w:r>
+              <w:rPr>
+                <w:noProof/>
+                <w:webHidden/>
+              </w:rPr>
+              <w:fldChar w:fldCharType="separate"/>
+            </w:r>
+            <w:r>
+              <w:rPr>
+                <w:noProof/>
+                <w:webHidden/>
+              </w:rPr>
+              <w:t>21</w:t>
+            </w:r>
+            <w:r>
+              <w:rPr>
+                <w:noProof/>
+                <w:webHidden/>
+              </w:rPr>
+              <w:fldChar w:fldCharType="end"/>
+            </w:r>
+          </w:hyperlink>
+        </w:p>
+        <w:p>
+          <w:pPr>
+            <w:pStyle w:val="TDC1"/>
+            <w:tabs>
+              <w:tab w:val="right" w:leader="dot" w:pos="8494"/>
+            </w:tabs>
+            <w:rPr>
+              <w:rFonts w:eastAsiaTheme="minorEastAsia"/>
+              <w:noProof/>
+              <w:sz w:val="24"/>
+              <w:szCs w:val="24"/>
+              <w:lang w:eastAsia="es-ES"/>
+            </w:rPr>
+          </w:pPr>
+          <w:hyperlink w:anchor="_Toc228223687" w:history="1">
+            <w:r>
+              <w:rPr>
+                <w:rStyle w:val="Hipervnculo"/>
+                <w:noProof/>
+              </w:rPr>
+              <w:t>8. Bibliografía</w:t>
+            </w:r>
+            <w:r>
+              <w:rPr>
+                <w:noProof/>
+                <w:webHidden/>
+              </w:rPr>
+              <w:tab/>
+            </w:r>
+            <w:r>
+              <w:rPr>
+                <w:noProof/>
+                <w:webHidden/>
+              </w:rPr>
+              <w:fldChar w:fldCharType="begin"/>
+            </w:r>
+            <w:r>
+              <w:rPr>
+                <w:noProof/>
+                <w:webHidden/>
+              </w:rPr>
+              <w:instrText xml:space="preserve"> PAGEREF _Toc228223687 \h </w:instrText>
+            </w:r>
+            <w:r>
+              <w:rPr>
+                <w:noProof/>
+                <w:webHidden/>
+              </w:rPr>
+            </w:r>
+            <w:r>
+              <w:rPr>
+                <w:noProof/>
+                <w:webHidden/>
+              </w:rPr>
+              <w:fldChar w:fldCharType="separate"/>
+            </w:r>
+            <w:r>
+              <w:rPr>
+                <w:noProof/>
+                <w:webHidden/>
+              </w:rPr>
+              <w:t>21</w:t>
             </w:r>
             <w:r>
               <w:rPr>
@@ -6855,7 +7287,7 @@
       <w:pPr>
         <w:pStyle w:val="Ttulo1"/>
       </w:pPr>
-      <w:bookmarkStart w:id="0" w:name="_Toc227942651"/>
+      <w:bookmarkStart w:id="0" w:name="_Toc228223644"/>
       <w:r>
         <w:lastRenderedPageBreak/>
         <w:t>1. Introducción</w:t>
@@ -6974,17 +7406,12 @@
           <w:ilvl w:val="0"/>
           <w:numId w:val="4"/>
         </w:numPr>
+        <w:spacing w:after="120"/>
         <w:jc w:val="both"/>
       </w:pPr>
       <w:r>
         <w:t>Acceso a la aplicación según rol en la empresa.</w:t>
       </w:r>
-    </w:p>
-    <w:p>
-      <w:pPr>
-        <w:pStyle w:val="Prrafodelista"/>
-        <w:jc w:val="both"/>
-      </w:pPr>
     </w:p>
     <w:p>
       <w:pPr>
@@ -7058,7 +7485,7 @@
       <w:pPr>
         <w:pStyle w:val="Ttulo2"/>
       </w:pPr>
-      <w:bookmarkStart w:id="1" w:name="_Toc227942652"/>
+      <w:bookmarkStart w:id="1" w:name="_Toc228223645"/>
       <w:r>
         <w:t>1.</w:t>
       </w:r>
@@ -7245,14 +7672,9 @@
     </w:p>
     <w:p>
       <w:pPr>
-        <w:jc w:val="both"/>
-      </w:pPr>
-    </w:p>
-    <w:p>
-      <w:pPr>
         <w:pStyle w:val="Ttulo1"/>
       </w:pPr>
-      <w:bookmarkStart w:id="2" w:name="_Toc227942653"/>
+      <w:bookmarkStart w:id="2" w:name="_Toc228223646"/>
       <w:r>
         <w:t>2. Estructura del proyecto</w:t>
       </w:r>
@@ -8657,7 +9079,6 @@
           <w:lang w:eastAsia="es-ES"/>
           <w14:ligatures w14:val="none"/>
         </w:rPr>
-        <w:lastRenderedPageBreak/>
         <w:t xml:space="preserve"> </w:t>
       </w:r>
       <w:r>
@@ -8760,7 +9181,7 @@
       <w:pPr>
         <w:pStyle w:val="Ttulo1"/>
       </w:pPr>
-      <w:bookmarkStart w:id="3" w:name="_Toc227942654"/>
+      <w:bookmarkStart w:id="3" w:name="_Toc228223647"/>
       <w:r>
         <w:t>3</w:t>
       </w:r>
@@ -9201,21 +9622,18 @@
     </w:p>
     <w:p>
       <w:pPr>
-        <w:jc w:val="both"/>
-      </w:pPr>
-    </w:p>
-    <w:p>
-      <w:pPr>
         <w:pStyle w:val="Ttulo2"/>
       </w:pPr>
-      <w:bookmarkStart w:id="4" w:name="_Toc227942655"/>
-      <w:r>
+      <w:bookmarkStart w:id="4" w:name="_Toc228223648"/>
+      <w:r>
+        <w:lastRenderedPageBreak/>
         <w:t>3.1 Despliegue de la aplicación</w:t>
       </w:r>
       <w:bookmarkEnd w:id="4"/>
     </w:p>
     <w:p>
       <w:pPr>
+        <w:spacing w:after="120"/>
         <w:jc w:val="both"/>
       </w:pPr>
       <w:r>
@@ -9311,7 +9729,7 @@
           <w:ilvl w:val="0"/>
           <w:numId w:val="36"/>
         </w:numPr>
-        <w:spacing w:after="0"/>
+        <w:spacing w:after="120"/>
         <w:jc w:val="both"/>
       </w:pPr>
       <w:r>
@@ -9320,7 +9738,7 @@
     </w:p>
     <w:p>
       <w:pPr>
-        <w:spacing w:after="0"/>
+        <w:spacing w:after="120"/>
         <w:jc w:val="both"/>
       </w:pPr>
       <w:r>
@@ -9333,9 +9751,6 @@
       <w:proofErr w:type="spellEnd"/>
       <w:r>
         <w:t>, es que tiene aplicaciones integradas como es el sistema de bases de datos Neon DB que es el que usamos en nuestra aplicación. En nuestro caso lo hemos seleccionado como sistema de base de datos por los siguientes motivos:</w:t>
-      </w:r>
-      <w:r>
-        <w:br/>
       </w:r>
     </w:p>
     <w:p>
@@ -9394,7 +9809,7 @@
           <w:ilvl w:val="0"/>
           <w:numId w:val="37"/>
         </w:numPr>
-        <w:spacing w:after="0"/>
+        <w:spacing w:after="120"/>
         <w:jc w:val="both"/>
       </w:pPr>
       <w:r>
@@ -9411,73 +9826,66 @@
     </w:p>
     <w:p>
       <w:pPr>
-        <w:pStyle w:val="Prrafodelista"/>
-        <w:spacing w:after="0"/>
         <w:jc w:val="both"/>
       </w:pPr>
+      <w:r>
+        <w:t xml:space="preserve">Por otro lado, tenemos comprado el dominio </w:t>
+      </w:r>
+      <w:r>
+        <w:rPr>
+          <w:i/>
+          <w:iCs/>
+        </w:rPr>
+        <w:t>bsnessapp.es</w:t>
+      </w:r>
+      <w:r>
+        <w:t xml:space="preserve"> a </w:t>
+      </w:r>
+      <w:r>
+        <w:rPr>
+          <w:b/>
+          <w:bCs/>
+        </w:rPr>
+        <w:t>Ionos Cloud</w:t>
+      </w:r>
+      <w:r>
+        <w:t xml:space="preserve"> donde hemos redireccionado este dominio a nuestra aplicación en </w:t>
+      </w:r>
+      <w:proofErr w:type="spellStart"/>
+      <w:r>
+        <w:t>Vercel</w:t>
+      </w:r>
+      <w:proofErr w:type="spellEnd"/>
+      <w:r>
+        <w:t xml:space="preserve">. Además, hemos añadido en nuestro servicio de </w:t>
+      </w:r>
+      <w:proofErr w:type="spellStart"/>
+      <w:r>
+        <w:t>Vercel</w:t>
+      </w:r>
+      <w:proofErr w:type="spellEnd"/>
+      <w:r>
+        <w:t xml:space="preserve"> todas las variables de DNS de Ionos para poder usar nuestro email corporativo para enviar los </w:t>
+      </w:r>
+      <w:proofErr w:type="gramStart"/>
+      <w:r>
+        <w:t>tickets</w:t>
+      </w:r>
+      <w:proofErr w:type="gramEnd"/>
+      <w:r>
+        <w:t xml:space="preserve"> en pdf a nuestros clientes desde la aplicación.</w:t>
+      </w:r>
     </w:p>
     <w:p>
       <w:pPr>
         <w:jc w:val="both"/>
       </w:pPr>
-      <w:r>
-        <w:t xml:space="preserve">Por otro lado, tenemos comprado el dominio </w:t>
-      </w:r>
-      <w:r>
-        <w:rPr>
-          <w:i/>
-          <w:iCs/>
-        </w:rPr>
-        <w:t>bsnessapp.es</w:t>
-      </w:r>
-      <w:r>
-        <w:t xml:space="preserve"> a </w:t>
-      </w:r>
-      <w:r>
-        <w:rPr>
-          <w:b/>
-          <w:bCs/>
-        </w:rPr>
-        <w:t>Ionos Cloud</w:t>
-      </w:r>
-      <w:r>
-        <w:t xml:space="preserve"> donde hemos redireccionado este dominio a nuestra aplicación en </w:t>
-      </w:r>
-      <w:proofErr w:type="spellStart"/>
-      <w:r>
-        <w:t>Vercel</w:t>
-      </w:r>
-      <w:proofErr w:type="spellEnd"/>
-      <w:r>
-        <w:t xml:space="preserve">. Además, hemos añadido en nuestro servicio de </w:t>
-      </w:r>
-      <w:proofErr w:type="spellStart"/>
-      <w:r>
-        <w:t>Vercel</w:t>
-      </w:r>
-      <w:proofErr w:type="spellEnd"/>
-      <w:r>
-        <w:t xml:space="preserve"> todas las variables de DNS de Ionos para poder usar nuestro email corporativo para enviar los </w:t>
-      </w:r>
-      <w:proofErr w:type="gramStart"/>
-      <w:r>
-        <w:t>tickets</w:t>
-      </w:r>
-      <w:proofErr w:type="gramEnd"/>
-      <w:r>
-        <w:t xml:space="preserve"> en pdf a nuestros clientes desde la aplicación.</w:t>
-      </w:r>
     </w:p>
     <w:p>
       <w:pPr>
-        <w:jc w:val="both"/>
-      </w:pPr>
-    </w:p>
-    <w:p>
-      <w:pPr>
         <w:pStyle w:val="Ttulo2"/>
       </w:pPr>
-      <w:bookmarkStart w:id="5" w:name="_Toc227942656"/>
+      <w:bookmarkStart w:id="5" w:name="_Toc228223649"/>
       <w:r>
         <w:t>3.</w:t>
       </w:r>
@@ -9629,7 +10037,6 @@
           <w:lang w:eastAsia="es-ES"/>
           <w14:ligatures w14:val="none"/>
         </w:rPr>
-        <w:lastRenderedPageBreak/>
         <w:t>Dependencias:</w:t>
       </w:r>
     </w:p>
@@ -11027,7 +11434,6 @@
           <w:lang w:eastAsia="es-ES"/>
           <w14:ligatures w14:val="none"/>
         </w:rPr>
-        <w:lastRenderedPageBreak/>
         <w:t>Dependencias:</w:t>
       </w:r>
     </w:p>
@@ -11209,7 +11615,7 @@
           <w:lang w:eastAsia="es-ES"/>
         </w:rPr>
       </w:pPr>
-      <w:bookmarkStart w:id="6" w:name="_Toc227942657"/>
+      <w:bookmarkStart w:id="6" w:name="_Toc228223650"/>
       <w:r>
         <w:rPr>
           <w:rFonts w:eastAsia="Times New Roman"/>
@@ -11934,7 +12340,7 @@
       <w:pPr>
         <w:pStyle w:val="Ttulo2"/>
       </w:pPr>
-      <w:bookmarkStart w:id="7" w:name="_Toc227942658"/>
+      <w:bookmarkStart w:id="7" w:name="_Toc228223651"/>
       <w:r>
         <w:t>4.1 Descripción de las tablas</w:t>
       </w:r>
@@ -12100,7 +12506,7 @@
       <w:pPr>
         <w:pStyle w:val="Ttulo3"/>
       </w:pPr>
-      <w:bookmarkStart w:id="8" w:name="_Toc227942659"/>
+      <w:bookmarkStart w:id="8" w:name="_Toc228223652"/>
       <w:r>
         <w:t xml:space="preserve">Tabla: </w:t>
       </w:r>
@@ -12175,7 +12581,6 @@
                 <w:sz w:val="20"/>
                 <w:szCs w:val="20"/>
               </w:rPr>
-              <w:lastRenderedPageBreak/>
               <w:t>Campo</w:t>
             </w:r>
           </w:p>
@@ -12605,6 +13010,7 @@
                 <w:sz w:val="20"/>
                 <w:szCs w:val="20"/>
               </w:rPr>
+              <w:lastRenderedPageBreak/>
               <w:t>password</w:t>
             </w:r>
             <w:proofErr w:type="spellEnd"/>
@@ -13695,7 +14101,7 @@
       <w:pPr>
         <w:pStyle w:val="Ttulo3"/>
       </w:pPr>
-      <w:bookmarkStart w:id="9" w:name="_Toc227942660"/>
+      <w:bookmarkStart w:id="9" w:name="_Toc228223653"/>
       <w:r>
         <w:t xml:space="preserve">Tabla: </w:t>
       </w:r>
@@ -14204,7 +14610,7 @@
       <w:pPr>
         <w:pStyle w:val="Ttulo3"/>
       </w:pPr>
-      <w:bookmarkStart w:id="10" w:name="_Toc227942661"/>
+      <w:bookmarkStart w:id="10" w:name="_Toc228223654"/>
       <w:r>
         <w:t xml:space="preserve">Tabla: </w:t>
       </w:r>
@@ -14718,9 +15124,8 @@
       <w:pPr>
         <w:pStyle w:val="Ttulo3"/>
       </w:pPr>
-      <w:bookmarkStart w:id="11" w:name="_Toc227942662"/>
-      <w:r>
-        <w:lastRenderedPageBreak/>
+      <w:bookmarkStart w:id="11" w:name="_Toc228223655"/>
+      <w:r>
         <w:t xml:space="preserve">Tabla: </w:t>
       </w:r>
       <w:proofErr w:type="spellStart"/>
@@ -14793,6 +15198,7 @@
                 <w:sz w:val="20"/>
                 <w:szCs w:val="20"/>
               </w:rPr>
+              <w:lastRenderedPageBreak/>
               <w:t>Campo</w:t>
             </w:r>
           </w:p>
@@ -16051,7 +16457,7 @@
       <w:pPr>
         <w:pStyle w:val="Ttulo3"/>
       </w:pPr>
-      <w:bookmarkStart w:id="12" w:name="_Toc227942663"/>
+      <w:bookmarkStart w:id="12" w:name="_Toc228223656"/>
       <w:r>
         <w:t xml:space="preserve">Tabla: </w:t>
       </w:r>
@@ -16803,7 +17209,7 @@
       <w:pPr>
         <w:pStyle w:val="Ttulo3"/>
       </w:pPr>
-      <w:bookmarkStart w:id="13" w:name="_Toc227942664"/>
+      <w:bookmarkStart w:id="13" w:name="_Toc228223657"/>
       <w:r>
         <w:t xml:space="preserve">Tabla: </w:t>
       </w:r>
@@ -17245,7 +17651,7 @@
       <w:pPr>
         <w:pStyle w:val="Ttulo3"/>
       </w:pPr>
-      <w:bookmarkStart w:id="14" w:name="_Toc227942665"/>
+      <w:bookmarkStart w:id="14" w:name="_Toc228223658"/>
       <w:r>
         <w:t xml:space="preserve">Tabla: </w:t>
       </w:r>
@@ -17773,7 +18179,6 @@
                 <w:sz w:val="20"/>
                 <w:szCs w:val="20"/>
               </w:rPr>
-              <w:lastRenderedPageBreak/>
               <w:t>serie</w:t>
             </w:r>
           </w:p>
@@ -18279,6 +18684,7 @@
                 <w:sz w:val="20"/>
                 <w:szCs w:val="20"/>
               </w:rPr>
+              <w:lastRenderedPageBreak/>
               <w:t>tax_total</w:t>
             </w:r>
             <w:proofErr w:type="spellEnd"/>
@@ -19290,7 +19696,7 @@
       <w:pPr>
         <w:pStyle w:val="Ttulo3"/>
       </w:pPr>
-      <w:bookmarkStart w:id="15" w:name="_Toc227942666"/>
+      <w:bookmarkStart w:id="15" w:name="_Toc228223659"/>
       <w:r>
         <w:t xml:space="preserve">Tabla: </w:t>
       </w:r>
@@ -21195,7 +21601,7 @@
       <w:pPr>
         <w:pStyle w:val="Ttulo3"/>
       </w:pPr>
-      <w:bookmarkStart w:id="16" w:name="_Toc227942667"/>
+      <w:bookmarkStart w:id="16" w:name="_Toc228223660"/>
       <w:r>
         <w:t xml:space="preserve">Tabla: </w:t>
       </w:r>
@@ -21924,7 +22330,6 @@
                 <w:sz w:val="20"/>
                 <w:szCs w:val="20"/>
               </w:rPr>
-              <w:lastRenderedPageBreak/>
               <w:t>total</w:t>
             </w:r>
           </w:p>
@@ -22203,6 +22608,7 @@
                 <w:sz w:val="20"/>
                 <w:szCs w:val="20"/>
               </w:rPr>
+              <w:lastRenderedPageBreak/>
               <w:t>last_receipt_id</w:t>
             </w:r>
             <w:proofErr w:type="spellEnd"/>
@@ -22614,7 +23020,7 @@
       <w:pPr>
         <w:pStyle w:val="Ttulo3"/>
       </w:pPr>
-      <w:bookmarkStart w:id="17" w:name="_Toc227942668"/>
+      <w:bookmarkStart w:id="17" w:name="_Toc228223661"/>
       <w:r>
         <w:t xml:space="preserve">Vista: </w:t>
       </w:r>
@@ -23492,7 +23898,7 @@
       <w:pPr>
         <w:pStyle w:val="Ttulo3"/>
       </w:pPr>
-      <w:bookmarkStart w:id="18" w:name="_Toc227942669"/>
+      <w:bookmarkStart w:id="18" w:name="_Toc228223662"/>
       <w:r>
         <w:t xml:space="preserve">Vista: </w:t>
       </w:r>
@@ -24574,7 +24980,7 @@
       <w:pPr>
         <w:pStyle w:val="Ttulo1"/>
       </w:pPr>
-      <w:bookmarkStart w:id="19" w:name="_Toc227942670"/>
+      <w:bookmarkStart w:id="19" w:name="_Toc228223663"/>
       <w:r>
         <w:lastRenderedPageBreak/>
         <w:t>5. Guía de estilo</w:t>
@@ -24585,7 +24991,7 @@
       <w:pPr>
         <w:pStyle w:val="Ttulo2"/>
       </w:pPr>
-      <w:bookmarkStart w:id="20" w:name="_Toc227942671"/>
+      <w:bookmarkStart w:id="20" w:name="_Toc228223664"/>
       <w:r>
         <w:t>5.1 Introducción</w:t>
       </w:r>
@@ -25359,7 +25765,7 @@
       <w:pPr>
         <w:pStyle w:val="Ttulo3"/>
       </w:pPr>
-      <w:bookmarkStart w:id="21" w:name="_Toc227942672"/>
+      <w:bookmarkStart w:id="21" w:name="_Toc228223665"/>
       <w:r>
         <w:t>Stack técnico</w:t>
       </w:r>
@@ -25625,7 +26031,7 @@
       <w:pPr>
         <w:pStyle w:val="Ttulo2"/>
       </w:pPr>
-      <w:bookmarkStart w:id="22" w:name="_Toc227942673"/>
+      <w:bookmarkStart w:id="22" w:name="_Toc228223666"/>
       <w:r>
         <w:t>5.2 Color y uso tipográfico del color</w:t>
       </w:r>
@@ -25681,7 +26087,7 @@
       <w:pPr>
         <w:pStyle w:val="Ttulo3"/>
       </w:pPr>
-      <w:bookmarkStart w:id="23" w:name="_Toc227942674"/>
+      <w:bookmarkStart w:id="23" w:name="_Toc228223667"/>
       <w:r>
         <w:lastRenderedPageBreak/>
         <w:t>5.2.1 Blue – Acciones primarias y tema claro</w:t>
@@ -26102,7 +26508,7 @@
       <w:pPr>
         <w:pStyle w:val="Ttulo3"/>
       </w:pPr>
-      <w:bookmarkStart w:id="24" w:name="_Toc227942675"/>
+      <w:bookmarkStart w:id="24" w:name="_Toc228223668"/>
       <w:r>
         <w:t xml:space="preserve">5.2.2 Stone – Colores neutros y tema </w:t>
       </w:r>
@@ -26707,7 +27113,7 @@
       <w:pPr>
         <w:pStyle w:val="Ttulo3"/>
       </w:pPr>
-      <w:bookmarkStart w:id="25" w:name="_Toc227942676"/>
+      <w:bookmarkStart w:id="25" w:name="_Toc228223669"/>
       <w:r>
         <w:lastRenderedPageBreak/>
         <w:t>5.2.3 Slate – Colores neutros y tema oscuro</w:t>
@@ -27275,7 +27681,7 @@
       <w:pPr>
         <w:pStyle w:val="Ttulo3"/>
       </w:pPr>
-      <w:bookmarkStart w:id="26" w:name="_Toc227942677"/>
+      <w:bookmarkStart w:id="26" w:name="_Toc228223670"/>
       <w:r>
         <w:t>5.2.4 Cyan – Acciones primarias y tema oscuro</w:t>
       </w:r>
@@ -27719,7 +28125,7 @@
       <w:pPr>
         <w:pStyle w:val="Ttulo3"/>
       </w:pPr>
-      <w:bookmarkStart w:id="27" w:name="_Toc227942678"/>
+      <w:bookmarkStart w:id="27" w:name="_Toc228223671"/>
       <w:r>
         <w:t>5.2.5 Colores semánticos</w:t>
       </w:r>
@@ -28050,7 +28456,7 @@
       <w:pPr>
         <w:pStyle w:val="Ttulo2"/>
       </w:pPr>
-      <w:bookmarkStart w:id="28" w:name="_Toc227942679"/>
+      <w:bookmarkStart w:id="28" w:name="_Toc228223672"/>
       <w:r>
         <w:lastRenderedPageBreak/>
         <w:t>5.3 Tipografía</w:t>
@@ -29595,7 +30001,7 @@
       <w:pPr>
         <w:pStyle w:val="Ttulo2"/>
       </w:pPr>
-      <w:bookmarkStart w:id="29" w:name="_Toc227942680"/>
+      <w:bookmarkStart w:id="29" w:name="_Toc228223673"/>
       <w:r>
         <w:t>5.4. Iconografía</w:t>
       </w:r>
@@ -30199,7 +30605,7 @@
       <w:pPr>
         <w:pStyle w:val="Ttulo3"/>
       </w:pPr>
-      <w:bookmarkStart w:id="30" w:name="_Toc227942681"/>
+      <w:bookmarkStart w:id="30" w:name="_Toc228223674"/>
       <w:r>
         <w:t>Configuración</w:t>
       </w:r>
@@ -30643,7 +31049,7 @@
       <w:pPr>
         <w:pStyle w:val="Ttulo3"/>
       </w:pPr>
-      <w:bookmarkStart w:id="31" w:name="_Toc227942682"/>
+      <w:bookmarkStart w:id="31" w:name="_Toc228223675"/>
       <w:r>
         <w:t>Listado de iconos usados</w:t>
       </w:r>
@@ -30752,6 +31158,9 @@
               <w:jc w:val="center"/>
             </w:pPr>
             <w:r>
+              <w:rPr>
+                <w:noProof/>
+              </w:rPr>
               <w:drawing>
                 <wp:inline distT="0" distB="0" distL="0" distR="0" wp14:anchorId="2E8B4BA2" wp14:editId="5F947556">
                   <wp:extent cx="382800" cy="324000"/>
@@ -30834,6 +31243,9 @@
               <w:jc w:val="center"/>
             </w:pPr>
             <w:r>
+              <w:rPr>
+                <w:noProof/>
+              </w:rPr>
               <w:drawing>
                 <wp:inline distT="0" distB="0" distL="0" distR="0" wp14:anchorId="6B560F80" wp14:editId="5D665F33">
                   <wp:extent cx="408305" cy="378462"/>
@@ -30911,6 +31323,9 @@
               <w:jc w:val="center"/>
             </w:pPr>
             <w:r>
+              <w:rPr>
+                <w:noProof/>
+              </w:rPr>
               <w:drawing>
                 <wp:inline distT="0" distB="0" distL="0" distR="0" wp14:anchorId="57B2EC0F" wp14:editId="3B5F0424">
                   <wp:extent cx="327660" cy="304831"/>
@@ -30993,6 +31408,9 @@
               <w:jc w:val="center"/>
             </w:pPr>
             <w:r>
+              <w:rPr>
+                <w:noProof/>
+              </w:rPr>
               <w:drawing>
                 <wp:inline distT="0" distB="0" distL="0" distR="0" wp14:anchorId="76C75960" wp14:editId="4AF59EB4">
                   <wp:extent cx="434340" cy="303890"/>
@@ -31072,6 +31490,9 @@
               <w:jc w:val="center"/>
             </w:pPr>
             <w:r>
+              <w:rPr>
+                <w:noProof/>
+              </w:rPr>
               <w:drawing>
                 <wp:inline distT="0" distB="0" distL="0" distR="0" wp14:anchorId="44E0C378" wp14:editId="44DB5B07">
                   <wp:extent cx="441960" cy="368752"/>
@@ -31149,6 +31570,9 @@
               <w:jc w:val="center"/>
             </w:pPr>
             <w:r>
+              <w:rPr>
+                <w:noProof/>
+              </w:rPr>
               <w:drawing>
                 <wp:inline distT="0" distB="0" distL="0" distR="0" wp14:anchorId="405AEBEA" wp14:editId="71E43413">
                   <wp:extent cx="339725" cy="363564"/>
@@ -31226,6 +31650,9 @@
               <w:jc w:val="center"/>
             </w:pPr>
             <w:r>
+              <w:rPr>
+                <w:noProof/>
+              </w:rPr>
               <w:drawing>
                 <wp:inline distT="0" distB="0" distL="0" distR="0" wp14:anchorId="56094F42" wp14:editId="4A0EC8D7">
                   <wp:extent cx="448885" cy="346075"/>
@@ -31303,6 +31730,9 @@
               <w:jc w:val="center"/>
             </w:pPr>
             <w:r>
+              <w:rPr>
+                <w:noProof/>
+              </w:rPr>
               <w:drawing>
                 <wp:inline distT="0" distB="0" distL="0" distR="0" wp14:anchorId="576CE32F" wp14:editId="2A786C5C">
                   <wp:extent cx="396240" cy="354741"/>
@@ -31380,6 +31810,9 @@
               <w:jc w:val="center"/>
             </w:pPr>
             <w:r>
+              <w:rPr>
+                <w:noProof/>
+              </w:rPr>
               <w:drawing>
                 <wp:inline distT="0" distB="0" distL="0" distR="0" wp14:anchorId="1A1F09CF" wp14:editId="7C0188F8">
                   <wp:extent cx="365760" cy="356982"/>
@@ -31457,6 +31890,9 @@
               <w:jc w:val="center"/>
             </w:pPr>
             <w:r>
+              <w:rPr>
+                <w:noProof/>
+              </w:rPr>
               <w:drawing>
                 <wp:inline distT="0" distB="0" distL="0" distR="0" wp14:anchorId="305B3E0A" wp14:editId="0C69CC12">
                   <wp:extent cx="400360" cy="358140"/>
@@ -31534,6 +31970,9 @@
               <w:jc w:val="center"/>
             </w:pPr>
             <w:r>
+              <w:rPr>
+                <w:noProof/>
+              </w:rPr>
               <w:drawing>
                 <wp:inline distT="0" distB="0" distL="0" distR="0" wp14:anchorId="170AD524" wp14:editId="4E093082">
                   <wp:extent cx="297180" cy="294514"/>
@@ -31590,7 +32029,7 @@
       <w:pPr>
         <w:pStyle w:val="Ttulo3"/>
       </w:pPr>
-      <w:bookmarkStart w:id="32" w:name="_Toc227942683"/>
+      <w:bookmarkStart w:id="32" w:name="_Toc228223676"/>
       <w:r>
         <w:t>Tamaños</w:t>
       </w:r>
@@ -31800,13 +32239,13 @@
       <w:r>
         <w:br w:type="page"/>
       </w:r>
-      <w:bookmarkStart w:id="33" w:name="_Toc227942684"/>
+      <w:bookmarkStart w:id="33" w:name="_Toc228223677"/>
       <w:r>
         <w:lastRenderedPageBreak/>
         <w:t>5.</w:t>
       </w:r>
       <w:r>
-        <w:t>4</w:t>
+        <w:t>5</w:t>
       </w:r>
       <w:r>
         <w:t xml:space="preserve"> </w:t>
@@ -31835,12 +32274,12 @@
       <w:pPr>
         <w:pStyle w:val="Ttulo3"/>
       </w:pPr>
-      <w:bookmarkStart w:id="34" w:name="_Toc227942685"/>
+      <w:bookmarkStart w:id="34" w:name="_Toc228223678"/>
       <w:r>
         <w:t>5.</w:t>
       </w:r>
       <w:r>
-        <w:t>4</w:t>
+        <w:t>5</w:t>
       </w:r>
       <w:r>
         <w:t xml:space="preserve">.1 </w:t>
@@ -32053,13 +32492,13 @@
       <w:pPr>
         <w:pStyle w:val="Ttulo3"/>
       </w:pPr>
-      <w:bookmarkStart w:id="35" w:name="_Toc227942686"/>
+      <w:bookmarkStart w:id="35" w:name="_Toc228223679"/>
       <w:r>
         <w:lastRenderedPageBreak/>
         <w:t>5.</w:t>
       </w:r>
       <w:r>
-        <w:t>4</w:t>
+        <w:t>5</w:t>
       </w:r>
       <w:r>
         <w:t xml:space="preserve">.2 </w:t>
@@ -32280,6 +32719,923 @@
         <w:rPr>
           <w:rFonts w:asciiTheme="majorHAnsi" w:eastAsiaTheme="majorEastAsia" w:hAnsiTheme="majorHAnsi" w:cstheme="majorBidi"/>
           <w:color w:val="0F4761" w:themeColor="accent1" w:themeShade="BF"/>
+          <w:sz w:val="32"/>
+          <w:szCs w:val="32"/>
+        </w:rPr>
+      </w:pPr>
+      <w:r>
+        <w:br w:type="page"/>
+      </w:r>
+    </w:p>
+    <w:p>
+      <w:pPr>
+        <w:pStyle w:val="Ttulo2"/>
+      </w:pPr>
+      <w:bookmarkStart w:id="36" w:name="_Toc228223680"/>
+      <w:r>
+        <w:lastRenderedPageBreak/>
+        <w:t xml:space="preserve">5.6 Espaciados y </w:t>
+      </w:r>
+      <w:proofErr w:type="spellStart"/>
+      <w:r>
+        <w:t>layout</w:t>
+      </w:r>
+      <w:bookmarkEnd w:id="36"/>
+      <w:proofErr w:type="spellEnd"/>
+    </w:p>
+    <w:p>
+      <w:pPr>
+        <w:jc w:val="both"/>
+      </w:pPr>
+      <w:r>
+        <w:t xml:space="preserve">En esta sección definiremos </w:t>
+      </w:r>
+      <w:r>
+        <w:t>cómo estructur</w:t>
+      </w:r>
+      <w:r>
+        <w:t>amos</w:t>
+      </w:r>
+      <w:r>
+        <w:t xml:space="preserve"> el contenido en la página: ancho y centrado con contenedores (container, </w:t>
+      </w:r>
+      <w:proofErr w:type="spellStart"/>
+      <w:r>
+        <w:t>max</w:t>
+      </w:r>
+      <w:proofErr w:type="spellEnd"/>
+      <w:r>
+        <w:t>-w-*) y criterios de uso según el tipo de bloque.</w:t>
+      </w:r>
+      <w:r>
+        <w:t xml:space="preserve"> </w:t>
+      </w:r>
+      <w:r>
+        <w:t xml:space="preserve"> </w:t>
+      </w:r>
+      <w:r>
+        <w:t>Mostraremos la metodología</w:t>
+      </w:r>
+      <w:r>
+        <w:t xml:space="preserve"> de </w:t>
+      </w:r>
+      <w:r>
+        <w:rPr>
+          <w:b/>
+          <w:bCs/>
+        </w:rPr>
+        <w:t>espaciado</w:t>
+      </w:r>
+      <w:r>
+        <w:rPr>
+          <w:b/>
+          <w:bCs/>
+        </w:rPr>
+        <w:t xml:space="preserve"> </w:t>
+      </w:r>
+      <w:r>
+        <w:t>usado</w:t>
+      </w:r>
+      <w:r>
+        <w:t xml:space="preserve"> con utilidades de </w:t>
+      </w:r>
+      <w:proofErr w:type="spellStart"/>
+      <w:r>
+        <w:rPr>
+          <w:i/>
+          <w:iCs/>
+        </w:rPr>
+        <w:t>Tailwind</w:t>
+      </w:r>
+      <w:proofErr w:type="spellEnd"/>
+      <w:r>
+        <w:t>: </w:t>
+      </w:r>
+    </w:p>
+    <w:p>
+      <w:pPr>
+        <w:pStyle w:val="Prrafodelista"/>
+        <w:numPr>
+          <w:ilvl w:val="0"/>
+          <w:numId w:val="39"/>
+        </w:numPr>
+        <w:jc w:val="both"/>
+      </w:pPr>
+      <w:r>
+        <w:t>gap entre elementos</w:t>
+      </w:r>
+    </w:p>
+    <w:p>
+      <w:pPr>
+        <w:pStyle w:val="Prrafodelista"/>
+        <w:numPr>
+          <w:ilvl w:val="0"/>
+          <w:numId w:val="39"/>
+        </w:numPr>
+        <w:jc w:val="both"/>
+      </w:pPr>
+      <w:r>
+        <w:t>p</w:t>
+      </w:r>
+      <w:r>
+        <w:t xml:space="preserve"> (</w:t>
+      </w:r>
+      <w:proofErr w:type="spellStart"/>
+      <w:r>
+        <w:t>padding</w:t>
+      </w:r>
+      <w:proofErr w:type="spellEnd"/>
+      <w:r>
+        <w:t>)</w:t>
+      </w:r>
+      <w:r>
+        <w:t> y </w:t>
+      </w:r>
+      <w:proofErr w:type="spellStart"/>
+      <w:r>
+        <w:t>px</w:t>
+      </w:r>
+      <w:proofErr w:type="spellEnd"/>
+      <w:r>
+        <w:t xml:space="preserve"> para relleno y variaciones en </w:t>
+      </w:r>
+      <w:proofErr w:type="spellStart"/>
+      <w:r>
+        <w:t>breakpoints</w:t>
+      </w:r>
+      <w:proofErr w:type="spellEnd"/>
+    </w:p>
+    <w:p>
+      <w:pPr>
+        <w:jc w:val="both"/>
+      </w:pPr>
+      <w:r>
+        <w:t>Incluye la </w:t>
+      </w:r>
+      <w:r>
+        <w:rPr>
+          <w:b/>
+          <w:bCs/>
+        </w:rPr>
+        <w:t xml:space="preserve">tabla de </w:t>
+      </w:r>
+      <w:proofErr w:type="spellStart"/>
+      <w:r>
+        <w:rPr>
+          <w:b/>
+          <w:bCs/>
+        </w:rPr>
+        <w:t>breakpoints</w:t>
+      </w:r>
+      <w:proofErr w:type="spellEnd"/>
+      <w:r>
+        <w:t> (</w:t>
+      </w:r>
+      <w:proofErr w:type="spellStart"/>
+      <w:r>
+        <w:t>sm</w:t>
+      </w:r>
+      <w:proofErr w:type="spellEnd"/>
+      <w:r>
+        <w:t xml:space="preserve">, </w:t>
+      </w:r>
+      <w:proofErr w:type="spellStart"/>
+      <w:r>
+        <w:t>md</w:t>
+      </w:r>
+      <w:proofErr w:type="spellEnd"/>
+      <w:r>
+        <w:t xml:space="preserve">, </w:t>
+      </w:r>
+      <w:proofErr w:type="spellStart"/>
+      <w:r>
+        <w:t>lg</w:t>
+      </w:r>
+      <w:proofErr w:type="spellEnd"/>
+      <w:r>
+        <w:t xml:space="preserve">, </w:t>
+      </w:r>
+      <w:proofErr w:type="spellStart"/>
+      <w:r>
+        <w:t>xl</w:t>
+      </w:r>
+      <w:proofErr w:type="spellEnd"/>
+      <w:r>
+        <w:t>, 2xl) y </w:t>
+      </w:r>
+      <w:r>
+        <w:rPr>
+          <w:b/>
+          <w:bCs/>
+        </w:rPr>
+        <w:t xml:space="preserve">patrones de </w:t>
+      </w:r>
+      <w:proofErr w:type="spellStart"/>
+      <w:r>
+        <w:rPr>
+          <w:b/>
+          <w:bCs/>
+        </w:rPr>
+        <w:t>grid</w:t>
+      </w:r>
+      <w:proofErr w:type="spellEnd"/>
+      <w:r>
+        <w:t xml:space="preserve"> frecuentes (columnas, </w:t>
+      </w:r>
+      <w:proofErr w:type="spellStart"/>
+      <w:r>
+        <w:t>sidebar</w:t>
+      </w:r>
+      <w:proofErr w:type="spellEnd"/>
+      <w:r>
+        <w:t>, etc.) para diseños responsivos coherentes.</w:t>
+      </w:r>
+    </w:p>
+    <w:p>
+      <w:pPr>
+        <w:jc w:val="both"/>
+      </w:pPr>
+    </w:p>
+    <w:p>
+      <w:pPr>
+        <w:pStyle w:val="Ttulo3"/>
+      </w:pPr>
+      <w:bookmarkStart w:id="37" w:name="_Toc228223681"/>
+      <w:r>
+        <w:t>5.6.1 Contenedores</w:t>
+      </w:r>
+      <w:bookmarkEnd w:id="37"/>
+    </w:p>
+    <w:p>
+      <w:pPr>
+        <w:jc w:val="both"/>
+      </w:pPr>
+      <w:r>
+        <w:t>Los contenedores s</w:t>
+      </w:r>
+      <w:r>
+        <w:t>on cajas de diseño que limitan el ancho del contenido y añaden márgenes internos, para que el texto y los bloques no se peguen a los bordes de la pantalla.</w:t>
+      </w:r>
+      <w:r>
+        <w:br/>
+      </w:r>
+      <w:r>
+        <w:rPr>
+          <w:i/>
+          <w:iCs/>
+          <w:shd w:val="clear" w:color="auto" w:fill="F2F2F2" w:themeFill="background1" w:themeFillShade="F2"/>
+        </w:rPr>
+        <w:t xml:space="preserve">container </w:t>
+      </w:r>
+      <w:proofErr w:type="spellStart"/>
+      <w:r>
+        <w:rPr>
+          <w:i/>
+          <w:iCs/>
+          <w:shd w:val="clear" w:color="auto" w:fill="F2F2F2" w:themeFill="background1" w:themeFillShade="F2"/>
+        </w:rPr>
+        <w:t>mx</w:t>
+      </w:r>
+      <w:proofErr w:type="spellEnd"/>
+      <w:r>
+        <w:rPr>
+          <w:i/>
+          <w:iCs/>
+          <w:shd w:val="clear" w:color="auto" w:fill="F2F2F2" w:themeFill="background1" w:themeFillShade="F2"/>
+        </w:rPr>
+        <w:t>-auto px-4</w:t>
+      </w:r>
+      <w:r>
+        <w:t> centra el bloque; </w:t>
+      </w:r>
+      <w:proofErr w:type="spellStart"/>
+      <w:r>
+        <w:rPr>
+          <w:i/>
+          <w:iCs/>
+          <w:shd w:val="clear" w:color="auto" w:fill="F2F2F2" w:themeFill="background1" w:themeFillShade="F2"/>
+        </w:rPr>
+        <w:t>max</w:t>
+      </w:r>
+      <w:proofErr w:type="spellEnd"/>
+      <w:r>
+        <w:rPr>
+          <w:i/>
+          <w:iCs/>
+          <w:shd w:val="clear" w:color="auto" w:fill="F2F2F2" w:themeFill="background1" w:themeFillShade="F2"/>
+        </w:rPr>
+        <w:t>-w-*</w:t>
+      </w:r>
+      <w:r>
+        <w:t> fija un ancho máximo distinto según el caso (páginas anchas, formularios, modales, etc.).</w:t>
+      </w:r>
+      <w:r>
+        <w:t xml:space="preserve"> </w:t>
+      </w:r>
+      <w:r>
+        <w:t xml:space="preserve">Así el </w:t>
+      </w:r>
+      <w:proofErr w:type="spellStart"/>
+      <w:r>
+        <w:rPr>
+          <w:i/>
+          <w:iCs/>
+        </w:rPr>
+        <w:t>layout</w:t>
+      </w:r>
+      <w:proofErr w:type="spellEnd"/>
+      <w:r>
+        <w:t xml:space="preserve"> se mantiene legible y coherente en monitores grandes y pequeños.</w:t>
+      </w:r>
+      <w:r>
+        <w:t xml:space="preserve"> Dentro de los estilos de </w:t>
+      </w:r>
+      <w:proofErr w:type="spellStart"/>
+      <w:r>
+        <w:t>Tailwind</w:t>
+      </w:r>
+      <w:proofErr w:type="spellEnd"/>
+      <w:r>
+        <w:t>, aquí un listado de los que hemos usado</w:t>
+      </w:r>
+      <w:r>
+        <w:t>:</w:t>
+      </w:r>
+      <w:r>
+        <w:br/>
+      </w:r>
+    </w:p>
+    <w:tbl>
+      <w:tblPr>
+        <w:tblStyle w:val="Tablaconcuadrcula"/>
+        <w:tblW w:w="0" w:type="auto"/>
+        <w:tblLook w:val="04A0" w:firstRow="1" w:lastRow="0" w:firstColumn="1" w:lastColumn="0" w:noHBand="0" w:noVBand="1"/>
+      </w:tblPr>
+      <w:tblGrid>
+        <w:gridCol w:w="2547"/>
+        <w:gridCol w:w="5947"/>
+      </w:tblGrid>
+      <w:tr>
+        <w:tc>
+          <w:tcPr>
+            <w:tcW w:w="2547" w:type="dxa"/>
+            <w:shd w:val="clear" w:color="auto" w:fill="156082" w:themeFill="accent1"/>
+            <w:vAlign w:val="center"/>
+          </w:tcPr>
+          <w:p>
+            <w:pPr>
+              <w:jc w:val="center"/>
+              <w:rPr>
+                <w:color w:val="FFFFFF" w:themeColor="background1"/>
+              </w:rPr>
+            </w:pPr>
+            <w:r>
+              <w:rPr>
+                <w:color w:val="FFFFFF" w:themeColor="background1"/>
+              </w:rPr>
+              <w:t>Clase</w:t>
+            </w:r>
+          </w:p>
+        </w:tc>
+        <w:tc>
+          <w:tcPr>
+            <w:tcW w:w="5947" w:type="dxa"/>
+            <w:shd w:val="clear" w:color="auto" w:fill="156082" w:themeFill="accent1"/>
+            <w:vAlign w:val="center"/>
+          </w:tcPr>
+          <w:p>
+            <w:pPr>
+              <w:jc w:val="center"/>
+              <w:rPr>
+                <w:color w:val="FFFFFF" w:themeColor="background1"/>
+              </w:rPr>
+            </w:pPr>
+            <w:r>
+              <w:rPr>
+                <w:color w:val="FFFFFF" w:themeColor="background1"/>
+              </w:rPr>
+              <w:t>Uso</w:t>
+            </w:r>
+          </w:p>
+        </w:tc>
+      </w:tr>
+      <w:tr>
+        <w:tc>
+          <w:tcPr>
+            <w:tcW w:w="2547" w:type="dxa"/>
+          </w:tcPr>
+          <w:p>
+            <w:pPr>
+              <w:jc w:val="both"/>
+            </w:pPr>
+            <w:r>
+              <w:t xml:space="preserve">container </w:t>
+            </w:r>
+            <w:proofErr w:type="spellStart"/>
+            <w:r>
+              <w:t>mx</w:t>
+            </w:r>
+            <w:proofErr w:type="spellEnd"/>
+            <w:r>
+              <w:t>-auto px-4</w:t>
+            </w:r>
+          </w:p>
+        </w:tc>
+        <w:tc>
+          <w:tcPr>
+            <w:tcW w:w="5947" w:type="dxa"/>
+          </w:tcPr>
+          <w:p>
+            <w:pPr>
+              <w:jc w:val="both"/>
+            </w:pPr>
+            <w:r>
+              <w:t xml:space="preserve">Contenedor centrado con </w:t>
+            </w:r>
+            <w:proofErr w:type="spellStart"/>
+            <w:r>
+              <w:t>padding</w:t>
+            </w:r>
+            <w:proofErr w:type="spellEnd"/>
+            <w:r>
+              <w:t xml:space="preserve"> lateral</w:t>
+            </w:r>
+          </w:p>
+        </w:tc>
+      </w:tr>
+      <w:tr>
+        <w:tc>
+          <w:tcPr>
+            <w:tcW w:w="2547" w:type="dxa"/>
+          </w:tcPr>
+          <w:p>
+            <w:pPr>
+              <w:jc w:val="both"/>
+            </w:pPr>
+            <w:r>
+              <w:t>max-w-7xl</w:t>
+            </w:r>
+          </w:p>
+        </w:tc>
+        <w:tc>
+          <w:tcPr>
+            <w:tcW w:w="5947" w:type="dxa"/>
+          </w:tcPr>
+          <w:p>
+            <w:pPr>
+              <w:jc w:val="both"/>
+            </w:pPr>
+            <w:r>
+              <w:t>Ancho máximo ~80rem</w:t>
+            </w:r>
+            <w:r>
+              <w:t xml:space="preserve"> (1280px)</w:t>
+            </w:r>
+          </w:p>
+        </w:tc>
+      </w:tr>
+      <w:tr>
+        <w:tc>
+          <w:tcPr>
+            <w:tcW w:w="2547" w:type="dxa"/>
+          </w:tcPr>
+          <w:p>
+            <w:pPr>
+              <w:jc w:val="both"/>
+            </w:pPr>
+            <w:r>
+              <w:t>max-w-3xl</w:t>
+            </w:r>
+          </w:p>
+        </w:tc>
+        <w:tc>
+          <w:tcPr>
+            <w:tcW w:w="5947" w:type="dxa"/>
+          </w:tcPr>
+          <w:p>
+            <w:pPr>
+              <w:jc w:val="both"/>
+            </w:pPr>
+            <w:r>
+              <w:t xml:space="preserve">Ancho máximo 48rem (768px) - </w:t>
+            </w:r>
+            <w:r>
+              <w:t>Formularios, textos largos</w:t>
+            </w:r>
+          </w:p>
+        </w:tc>
+      </w:tr>
+      <w:tr>
+        <w:tc>
+          <w:tcPr>
+            <w:tcW w:w="2547" w:type="dxa"/>
+          </w:tcPr>
+          <w:p>
+            <w:pPr>
+              <w:jc w:val="both"/>
+            </w:pPr>
+            <w:r>
+              <w:t>max-w-2xl</w:t>
+            </w:r>
+          </w:p>
+        </w:tc>
+        <w:tc>
+          <w:tcPr>
+            <w:tcW w:w="5947" w:type="dxa"/>
+          </w:tcPr>
+          <w:p>
+            <w:pPr>
+              <w:jc w:val="both"/>
+            </w:pPr>
+            <w:r>
+              <w:t>Ancho máximo 42rem (672px) – Modales, secciones estrechas</w:t>
+            </w:r>
+          </w:p>
+        </w:tc>
+      </w:tr>
+      <w:tr>
+        <w:tc>
+          <w:tcPr>
+            <w:tcW w:w="2547" w:type="dxa"/>
+          </w:tcPr>
+          <w:p>
+            <w:pPr>
+              <w:jc w:val="both"/>
+            </w:pPr>
+            <w:proofErr w:type="spellStart"/>
+            <w:r>
+              <w:t>max</w:t>
+            </w:r>
+            <w:proofErr w:type="spellEnd"/>
+            <w:r>
+              <w:t>-w-</w:t>
+            </w:r>
+            <w:proofErr w:type="spellStart"/>
+            <w:r>
+              <w:t>lg</w:t>
+            </w:r>
+            <w:proofErr w:type="spellEnd"/>
+          </w:p>
+        </w:tc>
+        <w:tc>
+          <w:tcPr>
+            <w:tcW w:w="5947" w:type="dxa"/>
+          </w:tcPr>
+          <w:p>
+            <w:pPr>
+              <w:jc w:val="both"/>
+            </w:pPr>
+            <w:r>
+              <w:t>Ancho máximo 32rem (512px) – Formularios compactos</w:t>
+            </w:r>
+          </w:p>
+        </w:tc>
+      </w:tr>
+      <w:tr>
+        <w:tc>
+          <w:tcPr>
+            <w:tcW w:w="2547" w:type="dxa"/>
+          </w:tcPr>
+          <w:p>
+            <w:pPr>
+              <w:jc w:val="both"/>
+            </w:pPr>
+            <w:proofErr w:type="spellStart"/>
+            <w:r>
+              <w:t>max</w:t>
+            </w:r>
+            <w:proofErr w:type="spellEnd"/>
+            <w:r>
+              <w:t>-w-</w:t>
+            </w:r>
+            <w:proofErr w:type="spellStart"/>
+            <w:r>
+              <w:t>sm</w:t>
+            </w:r>
+            <w:proofErr w:type="spellEnd"/>
+          </w:p>
+        </w:tc>
+        <w:tc>
+          <w:tcPr>
+            <w:tcW w:w="5947" w:type="dxa"/>
+          </w:tcPr>
+          <w:p>
+            <w:pPr>
+              <w:jc w:val="both"/>
+            </w:pPr>
+            <w:r>
+              <w:t>Ancho máximo 24rem (384px) – Inputs, tarjetas pequeñas</w:t>
+            </w:r>
+          </w:p>
+        </w:tc>
+      </w:tr>
+    </w:tbl>
+    <w:p>
+      <w:pPr>
+        <w:jc w:val="both"/>
+      </w:pPr>
+    </w:p>
+    <w:p>
+      <w:pPr>
+        <w:pStyle w:val="Ttulo3"/>
+      </w:pPr>
+      <w:bookmarkStart w:id="38" w:name="_Toc228223682"/>
+      <w:r>
+        <w:t>5.6.2 Espaciado</w:t>
+      </w:r>
+      <w:bookmarkEnd w:id="38"/>
+    </w:p>
+    <w:p>
+      <w:pPr>
+        <w:jc w:val="both"/>
+      </w:pPr>
+      <w:r>
+        <w:t xml:space="preserve">El espaciado hace a las </w:t>
+      </w:r>
+      <w:r>
+        <w:t xml:space="preserve">clases de </w:t>
+      </w:r>
+      <w:proofErr w:type="spellStart"/>
+      <w:r>
+        <w:t>Tailwind</w:t>
+      </w:r>
+      <w:proofErr w:type="spellEnd"/>
+      <w:r>
+        <w:t xml:space="preserve"> que usamos </w:t>
+      </w:r>
+      <w:r>
+        <w:t>para </w:t>
+      </w:r>
+      <w:r>
+        <w:rPr>
+          <w:b/>
+          <w:bCs/>
+        </w:rPr>
+        <w:t>separar</w:t>
+      </w:r>
+      <w:r>
+        <w:t> y </w:t>
+      </w:r>
+      <w:r>
+        <w:rPr>
+          <w:b/>
+          <w:bCs/>
+        </w:rPr>
+        <w:t>re</w:t>
+      </w:r>
+      <w:r>
+        <w:rPr>
+          <w:b/>
+          <w:bCs/>
+        </w:rPr>
+        <w:t>l</w:t>
+      </w:r>
+      <w:r>
+        <w:rPr>
+          <w:b/>
+          <w:bCs/>
+        </w:rPr>
+        <w:t>lenar</w:t>
+      </w:r>
+      <w:r>
+        <w:t xml:space="preserve"> contenido: gap entre </w:t>
+      </w:r>
+      <w:proofErr w:type="spellStart"/>
+      <w:r>
+        <w:t>flex</w:t>
+      </w:r>
+      <w:proofErr w:type="spellEnd"/>
+      <w:r>
+        <w:t>/</w:t>
+      </w:r>
+      <w:proofErr w:type="spellStart"/>
+      <w:r>
+        <w:t>grid</w:t>
+      </w:r>
+      <w:proofErr w:type="spellEnd"/>
+      <w:r>
+        <w:t>, p-* y </w:t>
+      </w:r>
+      <w:proofErr w:type="spellStart"/>
+      <w:r>
+        <w:t>px</w:t>
+      </w:r>
+      <w:proofErr w:type="spellEnd"/>
+      <w:r>
+        <w:t>-* para márgenes internos.</w:t>
+      </w:r>
+      <w:r>
+        <w:t xml:space="preserve"> </w:t>
+      </w:r>
+      <w:r>
+        <w:t xml:space="preserve">Sirve de referencia rápida para no inventar escala en cada componente y mantener espaciado coherente en toda la </w:t>
+      </w:r>
+      <w:proofErr w:type="gramStart"/>
+      <w:r>
+        <w:t>app</w:t>
+      </w:r>
+      <w:proofErr w:type="gramEnd"/>
+      <w:r>
+        <w:t>.</w:t>
+      </w:r>
+      <w:r>
+        <w:t xml:space="preserve"> A continuación, un listado con las clases típicas usadas en el proyecto:</w:t>
+      </w:r>
+    </w:p>
+    <w:tbl>
+      <w:tblPr>
+        <w:tblStyle w:val="Tablaconcuadrcula"/>
+        <w:tblW w:w="0" w:type="auto"/>
+        <w:tblLook w:val="04A0" w:firstRow="1" w:lastRow="0" w:firstColumn="1" w:lastColumn="0" w:noHBand="0" w:noVBand="1"/>
+      </w:tblPr>
+      <w:tblGrid>
+        <w:gridCol w:w="3256"/>
+        <w:gridCol w:w="5238"/>
+      </w:tblGrid>
+      <w:tr>
+        <w:tc>
+          <w:tcPr>
+            <w:tcW w:w="3256" w:type="dxa"/>
+            <w:shd w:val="clear" w:color="auto" w:fill="156082" w:themeFill="accent1"/>
+          </w:tcPr>
+          <w:p>
+            <w:pPr>
+              <w:jc w:val="center"/>
+              <w:rPr>
+                <w:color w:val="FFFFFF" w:themeColor="background1"/>
+              </w:rPr>
+            </w:pPr>
+            <w:r>
+              <w:rPr>
+                <w:color w:val="FFFFFF" w:themeColor="background1"/>
+              </w:rPr>
+              <w:t>Tipo</w:t>
+            </w:r>
+          </w:p>
+        </w:tc>
+        <w:tc>
+          <w:tcPr>
+            <w:tcW w:w="5238" w:type="dxa"/>
+            <w:shd w:val="clear" w:color="auto" w:fill="156082" w:themeFill="accent1"/>
+          </w:tcPr>
+          <w:p>
+            <w:pPr>
+              <w:jc w:val="center"/>
+              <w:rPr>
+                <w:color w:val="FFFFFF" w:themeColor="background1"/>
+              </w:rPr>
+            </w:pPr>
+            <w:r>
+              <w:rPr>
+                <w:color w:val="FFFFFF" w:themeColor="background1"/>
+              </w:rPr>
+              <w:t>Clases típicas</w:t>
+            </w:r>
+          </w:p>
+        </w:tc>
+      </w:tr>
+      <w:tr>
+        <w:tc>
+          <w:tcPr>
+            <w:tcW w:w="3256" w:type="dxa"/>
+          </w:tcPr>
+          <w:p>
+            <w:pPr>
+              <w:jc w:val="both"/>
+            </w:pPr>
+            <w:r>
+              <w:t>Gaps</w:t>
+            </w:r>
+          </w:p>
+        </w:tc>
+        <w:tc>
+          <w:tcPr>
+            <w:tcW w:w="5238" w:type="dxa"/>
+          </w:tcPr>
+          <w:p>
+            <w:pPr>
+              <w:jc w:val="both"/>
+              <w:rPr>
+                <w:lang w:val="en-US"/>
+              </w:rPr>
+            </w:pPr>
+            <w:r>
+              <w:rPr>
+                <w:lang w:val="en-US"/>
+              </w:rPr>
+              <w:t>gap-1, gap-</w:t>
+            </w:r>
+            <w:r>
+              <w:rPr>
+                <w:lang w:val="en-US"/>
+              </w:rPr>
+              <w:t>2</w:t>
+            </w:r>
+            <w:r>
+              <w:rPr>
+                <w:lang w:val="en-US"/>
+              </w:rPr>
+              <w:t>, gap-4, gap-6, gap-</w:t>
+            </w:r>
+            <w:r>
+              <w:rPr>
+                <w:lang w:val="en-US"/>
+              </w:rPr>
+              <w:t>8</w:t>
+            </w:r>
+          </w:p>
+        </w:tc>
+      </w:tr>
+      <w:tr>
+        <w:tc>
+          <w:tcPr>
+            <w:tcW w:w="3256" w:type="dxa"/>
+          </w:tcPr>
+          <w:p>
+            <w:pPr>
+              <w:jc w:val="both"/>
+              <w:rPr>
+                <w:lang w:val="en-US"/>
+              </w:rPr>
+            </w:pPr>
+            <w:r>
+              <w:rPr>
+                <w:lang w:val="en-US"/>
+              </w:rPr>
+              <w:t>Padding</w:t>
+            </w:r>
+          </w:p>
+        </w:tc>
+        <w:tc>
+          <w:tcPr>
+            <w:tcW w:w="5238" w:type="dxa"/>
+          </w:tcPr>
+          <w:p>
+            <w:pPr>
+              <w:jc w:val="both"/>
+            </w:pPr>
+            <w:r>
+              <w:t>p-2, p-3, p-4, p-6, p-8</w:t>
+            </w:r>
+          </w:p>
+        </w:tc>
+      </w:tr>
+      <w:tr>
+        <w:tc>
+          <w:tcPr>
+            <w:tcW w:w="3256" w:type="dxa"/>
+          </w:tcPr>
+          <w:p>
+            <w:pPr>
+              <w:jc w:val="both"/>
+              <w:rPr>
+                <w:lang w:val="en-US"/>
+              </w:rPr>
+            </w:pPr>
+            <w:r>
+              <w:rPr>
+                <w:lang w:val="en-US"/>
+              </w:rPr>
+              <w:t>Padding lateral</w:t>
+            </w:r>
+          </w:p>
+        </w:tc>
+        <w:tc>
+          <w:tcPr>
+            <w:tcW w:w="5238" w:type="dxa"/>
+          </w:tcPr>
+          <w:p>
+            <w:pPr>
+              <w:jc w:val="both"/>
+            </w:pPr>
+            <w:r>
+              <w:t xml:space="preserve">px-4, px-5, </w:t>
+            </w:r>
+            <w:proofErr w:type="gramStart"/>
+            <w:r>
+              <w:t>md:px</w:t>
+            </w:r>
+            <w:proofErr w:type="gramEnd"/>
+            <w:r>
+              <w:t>-3</w:t>
+            </w:r>
+          </w:p>
+        </w:tc>
+      </w:tr>
+    </w:tbl>
+    <w:p>
+      <w:pPr>
+        <w:jc w:val="both"/>
+        <w:rPr>
+          <w:lang w:val="en-US"/>
+        </w:rPr>
+      </w:pPr>
+    </w:p>
+    <w:p>
+      <w:pPr>
+        <w:rPr>
+          <w:rFonts w:asciiTheme="majorHAnsi" w:eastAsiaTheme="majorEastAsia" w:hAnsiTheme="majorHAnsi" w:cstheme="majorBidi"/>
+          <w:color w:val="0F4761" w:themeColor="accent1" w:themeShade="BF"/>
           <w:sz w:val="40"/>
           <w:szCs w:val="40"/>
         </w:rPr>
@@ -32292,12 +33648,12 @@
       <w:pPr>
         <w:pStyle w:val="Ttulo1"/>
       </w:pPr>
-      <w:bookmarkStart w:id="36" w:name="_Toc227942687"/>
+      <w:bookmarkStart w:id="39" w:name="_Toc228223683"/>
       <w:r>
         <w:lastRenderedPageBreak/>
         <w:t>6. Caso de uso</w:t>
       </w:r>
-      <w:bookmarkEnd w:id="36"/>
+      <w:bookmarkEnd w:id="39"/>
     </w:p>
     <w:p>
       <w:pPr>
@@ -32394,11 +33750,74 @@
       <w:pPr>
         <w:pStyle w:val="Ttulo1"/>
       </w:pPr>
-      <w:bookmarkStart w:id="37" w:name="_Toc227942688"/>
-      <w:r>
-        <w:t>7. Bibliografía</w:t>
-      </w:r>
-      <w:bookmarkEnd w:id="37"/>
+      <w:bookmarkStart w:id="40" w:name="_Toc228223684"/>
+      <w:r>
+        <w:t>7. Anexos</w:t>
+      </w:r>
+      <w:bookmarkEnd w:id="40"/>
+    </w:p>
+    <w:p>
+      <w:pPr>
+        <w:pStyle w:val="Ttulo2"/>
+      </w:pPr>
+      <w:bookmarkStart w:id="41" w:name="_Toc228223685"/>
+      <w:r>
+        <w:t>7.1 Anexo – Diagrama de clase</w:t>
+      </w:r>
+      <w:bookmarkEnd w:id="41"/>
+    </w:p>
+    <w:p>
+      <w:r>
+        <w:t>Ver archivo</w:t>
+      </w:r>
+      <w:r>
+        <w:t xml:space="preserve"> Anexo Z -</w:t>
+      </w:r>
+      <w:r>
+        <w:t xml:space="preserve"> Diagrama de clase.</w:t>
+      </w:r>
+    </w:p>
+    <w:p/>
+    <w:p/>
+    <w:p>
+      <w:pPr>
+        <w:pStyle w:val="Ttulo2"/>
+      </w:pPr>
+      <w:bookmarkStart w:id="42" w:name="_Toc228223686"/>
+      <w:r>
+        <w:t>7.2 Anexo – Diagrama entidad relación</w:t>
+      </w:r>
+      <w:bookmarkEnd w:id="42"/>
+    </w:p>
+    <w:p>
+      <w:r>
+        <w:t>Ver archivo</w:t>
+      </w:r>
+      <w:r>
+        <w:t xml:space="preserve"> Anexo X -</w:t>
+      </w:r>
+      <w:r>
+        <w:t xml:space="preserve"> Diagrama </w:t>
+      </w:r>
+      <w:r>
+        <w:t>entidad relación.</w:t>
+      </w:r>
+    </w:p>
+    <w:p/>
+    <w:p/>
+    <w:p/>
+    <w:p>
+      <w:pPr>
+        <w:pStyle w:val="Ttulo1"/>
+      </w:pPr>
+      <w:bookmarkStart w:id="43" w:name="_Toc228223687"/>
+      <w:r>
+        <w:t>8</w:t>
+      </w:r>
+      <w:r>
+        <w:t>. Bibliografía</w:t>
+      </w:r>
+      <w:bookmarkEnd w:id="43"/>
     </w:p>
     <w:p>
       <w:pPr>
@@ -32990,7 +34409,6 @@
           <w:b/>
           <w:bCs/>
         </w:rPr>
-        <w:lastRenderedPageBreak/>
         <w:t xml:space="preserve">Configuración DNS en </w:t>
       </w:r>
       <w:proofErr w:type="spellStart"/>
@@ -33379,7 +34797,7 @@
   <w:abstractNum w:abstractNumId="1" w15:restartNumberingAfterBreak="0">
     <w:nsid w:val="04DA3C96"/>
     <w:multiLevelType w:val="multilevel"/>
-    <w:tmpl w:val="A8D0E5C4"/>
+    <w:tmpl w:val="5DA035A6"/>
     <w:lvl w:ilvl="0">
       <w:start w:val="1"/>
       <w:numFmt w:val="bullet"/>
@@ -33396,20 +34814,15 @@
         <w:sz w:val="20"/>
       </w:rPr>
     </w:lvl>
-    <w:lvl w:ilvl="1" w:tentative="1">
-      <w:start w:val="1"/>
+    <w:lvl w:ilvl="1">
       <w:numFmt w:val="bullet"/>
-      <w:lvlText w:val="o"/>
+      <w:lvlText w:val="-"/>
       <w:lvlJc w:val="left"/>
       <w:pPr>
-        <w:tabs>
-          <w:tab w:val="num" w:pos="1440"/>
-        </w:tabs>
         <w:ind w:left="1440" w:hanging="360"/>
       </w:pPr>
       <w:rPr>
-        <w:rFonts w:ascii="Courier New" w:hAnsi="Courier New" w:hint="default"/>
-        <w:sz w:val="20"/>
+        <w:rFonts w:ascii="Aptos" w:eastAsiaTheme="minorHAnsi" w:hAnsi="Aptos" w:cstheme="minorBidi" w:hint="default"/>
       </w:rPr>
     </w:lvl>
     <w:lvl w:ilvl="2" w:tentative="1">
@@ -35459,6 +36872,119 @@
     </w:lvl>
   </w:abstractNum>
   <w:abstractNum w:abstractNumId="18" w15:restartNumberingAfterBreak="0">
+    <w:nsid w:val="25FC624C"/>
+    <w:multiLevelType w:val="hybridMultilevel"/>
+    <w:tmpl w:val="82FC7B76"/>
+    <w:lvl w:ilvl="0" w:tplc="0C0A000B">
+      <w:start w:val="1"/>
+      <w:numFmt w:val="bullet"/>
+      <w:lvlText w:val=""/>
+      <w:lvlJc w:val="left"/>
+      <w:pPr>
+        <w:ind w:left="720" w:hanging="360"/>
+      </w:pPr>
+      <w:rPr>
+        <w:rFonts w:ascii="Wingdings" w:hAnsi="Wingdings" w:hint="default"/>
+      </w:rPr>
+    </w:lvl>
+    <w:lvl w:ilvl="1" w:tplc="0C0A0003">
+      <w:start w:val="1"/>
+      <w:numFmt w:val="bullet"/>
+      <w:lvlText w:val="o"/>
+      <w:lvlJc w:val="left"/>
+      <w:pPr>
+        <w:ind w:left="1440" w:hanging="360"/>
+      </w:pPr>
+      <w:rPr>
+        <w:rFonts w:ascii="Courier New" w:hAnsi="Courier New" w:cs="Courier New" w:hint="default"/>
+      </w:rPr>
+    </w:lvl>
+    <w:lvl w:ilvl="2" w:tplc="0C0A0005" w:tentative="1">
+      <w:start w:val="1"/>
+      <w:numFmt w:val="bullet"/>
+      <w:lvlText w:val=""/>
+      <w:lvlJc w:val="left"/>
+      <w:pPr>
+        <w:ind w:left="2160" w:hanging="360"/>
+      </w:pPr>
+      <w:rPr>
+        <w:rFonts w:ascii="Wingdings" w:hAnsi="Wingdings" w:hint="default"/>
+      </w:rPr>
+    </w:lvl>
+    <w:lvl w:ilvl="3" w:tplc="0C0A0001" w:tentative="1">
+      <w:start w:val="1"/>
+      <w:numFmt w:val="bullet"/>
+      <w:lvlText w:val=""/>
+      <w:lvlJc w:val="left"/>
+      <w:pPr>
+        <w:ind w:left="2880" w:hanging="360"/>
+      </w:pPr>
+      <w:rPr>
+        <w:rFonts w:ascii="Symbol" w:hAnsi="Symbol" w:hint="default"/>
+      </w:rPr>
+    </w:lvl>
+    <w:lvl w:ilvl="4" w:tplc="0C0A0003" w:tentative="1">
+      <w:start w:val="1"/>
+      <w:numFmt w:val="bullet"/>
+      <w:lvlText w:val="o"/>
+      <w:lvlJc w:val="left"/>
+      <w:pPr>
+        <w:ind w:left="3600" w:hanging="360"/>
+      </w:pPr>
+      <w:rPr>
+        <w:rFonts w:ascii="Courier New" w:hAnsi="Courier New" w:cs="Courier New" w:hint="default"/>
+      </w:rPr>
+    </w:lvl>
+    <w:lvl w:ilvl="5" w:tplc="0C0A0005" w:tentative="1">
+      <w:start w:val="1"/>
+      <w:numFmt w:val="bullet"/>
+      <w:lvlText w:val=""/>
+      <w:lvlJc w:val="left"/>
+      <w:pPr>
+        <w:ind w:left="4320" w:hanging="360"/>
+      </w:pPr>
+      <w:rPr>
+        <w:rFonts w:ascii="Wingdings" w:hAnsi="Wingdings" w:hint="default"/>
+      </w:rPr>
+    </w:lvl>
+    <w:lvl w:ilvl="6" w:tplc="0C0A0001" w:tentative="1">
+      <w:start w:val="1"/>
+      <w:numFmt w:val="bullet"/>
+      <w:lvlText w:val=""/>
+      <w:lvlJc w:val="left"/>
+      <w:pPr>
+        <w:ind w:left="5040" w:hanging="360"/>
+      </w:pPr>
+      <w:rPr>
+        <w:rFonts w:ascii="Symbol" w:hAnsi="Symbol" w:hint="default"/>
+      </w:rPr>
+    </w:lvl>
+    <w:lvl w:ilvl="7" w:tplc="0C0A0003" w:tentative="1">
+      <w:start w:val="1"/>
+      <w:numFmt w:val="bullet"/>
+      <w:lvlText w:val="o"/>
+      <w:lvlJc w:val="left"/>
+      <w:pPr>
+        <w:ind w:left="5760" w:hanging="360"/>
+      </w:pPr>
+      <w:rPr>
+        <w:rFonts w:ascii="Courier New" w:hAnsi="Courier New" w:cs="Courier New" w:hint="default"/>
+      </w:rPr>
+    </w:lvl>
+    <w:lvl w:ilvl="8" w:tplc="0C0A0005" w:tentative="1">
+      <w:start w:val="1"/>
+      <w:numFmt w:val="bullet"/>
+      <w:lvlText w:val=""/>
+      <w:lvlJc w:val="left"/>
+      <w:pPr>
+        <w:ind w:left="6480" w:hanging="360"/>
+      </w:pPr>
+      <w:rPr>
+        <w:rFonts w:ascii="Wingdings" w:hAnsi="Wingdings" w:hint="default"/>
+      </w:rPr>
+    </w:lvl>
+  </w:abstractNum>
+  <w:abstractNum w:abstractNumId="19" w15:restartNumberingAfterBreak="0">
     <w:nsid w:val="289A67AE"/>
     <w:multiLevelType w:val="hybridMultilevel"/>
     <w:tmpl w:val="A3B02262"/>
@@ -35571,7 +37097,7 @@
       </w:rPr>
     </w:lvl>
   </w:abstractNum>
-  <w:abstractNum w:abstractNumId="19" w15:restartNumberingAfterBreak="0">
+  <w:abstractNum w:abstractNumId="20" w15:restartNumberingAfterBreak="0">
     <w:nsid w:val="2A4F5106"/>
     <w:multiLevelType w:val="hybridMultilevel"/>
     <w:tmpl w:val="431A8B18"/>
@@ -35684,7 +37210,7 @@
       </w:rPr>
     </w:lvl>
   </w:abstractNum>
-  <w:abstractNum w:abstractNumId="20" w15:restartNumberingAfterBreak="0">
+  <w:abstractNum w:abstractNumId="21" w15:restartNumberingAfterBreak="0">
     <w:nsid w:val="2B16332B"/>
     <w:multiLevelType w:val="hybridMultilevel"/>
     <w:tmpl w:val="4E60481C"/>
@@ -35797,7 +37323,7 @@
       </w:rPr>
     </w:lvl>
   </w:abstractNum>
-  <w:abstractNum w:abstractNumId="21" w15:restartNumberingAfterBreak="0">
+  <w:abstractNum w:abstractNumId="22" w15:restartNumberingAfterBreak="0">
     <w:nsid w:val="3072483A"/>
     <w:multiLevelType w:val="multilevel"/>
     <w:tmpl w:val="E61EB670"/>
@@ -35946,7 +37472,7 @@
       </w:rPr>
     </w:lvl>
   </w:abstractNum>
-  <w:abstractNum w:abstractNumId="22" w15:restartNumberingAfterBreak="0">
+  <w:abstractNum w:abstractNumId="23" w15:restartNumberingAfterBreak="0">
     <w:nsid w:val="36923754"/>
     <w:multiLevelType w:val="hybridMultilevel"/>
     <w:tmpl w:val="ED8A77F2"/>
@@ -36059,7 +37585,7 @@
       </w:rPr>
     </w:lvl>
   </w:abstractNum>
-  <w:abstractNum w:abstractNumId="23" w15:restartNumberingAfterBreak="0">
+  <w:abstractNum w:abstractNumId="24" w15:restartNumberingAfterBreak="0">
     <w:nsid w:val="3CD5037A"/>
     <w:multiLevelType w:val="hybridMultilevel"/>
     <w:tmpl w:val="A57639A2"/>
@@ -36173,7 +37699,7 @@
       </w:rPr>
     </w:lvl>
   </w:abstractNum>
-  <w:abstractNum w:abstractNumId="24" w15:restartNumberingAfterBreak="0">
+  <w:abstractNum w:abstractNumId="25" w15:restartNumberingAfterBreak="0">
     <w:nsid w:val="3E016E2B"/>
     <w:multiLevelType w:val="hybridMultilevel"/>
     <w:tmpl w:val="2110A552"/>
@@ -36285,7 +37811,7 @@
       </w:rPr>
     </w:lvl>
   </w:abstractNum>
-  <w:abstractNum w:abstractNumId="25" w15:restartNumberingAfterBreak="0">
+  <w:abstractNum w:abstractNumId="26" w15:restartNumberingAfterBreak="0">
     <w:nsid w:val="40844D9C"/>
     <w:multiLevelType w:val="hybridMultilevel"/>
     <w:tmpl w:val="2D72BEC6"/>
@@ -36399,7 +37925,7 @@
       </w:rPr>
     </w:lvl>
   </w:abstractNum>
-  <w:abstractNum w:abstractNumId="26" w15:restartNumberingAfterBreak="0">
+  <w:abstractNum w:abstractNumId="27" w15:restartNumberingAfterBreak="0">
     <w:nsid w:val="581D2BA1"/>
     <w:multiLevelType w:val="multilevel"/>
     <w:tmpl w:val="D374947E"/>
@@ -36548,7 +38074,7 @@
       </w:rPr>
     </w:lvl>
   </w:abstractNum>
-  <w:abstractNum w:abstractNumId="27" w15:restartNumberingAfterBreak="0">
+  <w:abstractNum w:abstractNumId="28" w15:restartNumberingAfterBreak="0">
     <w:nsid w:val="5C5040C7"/>
     <w:multiLevelType w:val="hybridMultilevel"/>
     <w:tmpl w:val="FAA8A178"/>
@@ -36660,7 +38186,7 @@
       </w:rPr>
     </w:lvl>
   </w:abstractNum>
-  <w:abstractNum w:abstractNumId="28" w15:restartNumberingAfterBreak="0">
+  <w:abstractNum w:abstractNumId="29" w15:restartNumberingAfterBreak="0">
     <w:nsid w:val="60304F91"/>
     <w:multiLevelType w:val="multilevel"/>
     <w:tmpl w:val="6AF83A1A"/>
@@ -36809,7 +38335,7 @@
       </w:rPr>
     </w:lvl>
   </w:abstractNum>
-  <w:abstractNum w:abstractNumId="29" w15:restartNumberingAfterBreak="0">
+  <w:abstractNum w:abstractNumId="30" w15:restartNumberingAfterBreak="0">
     <w:nsid w:val="6550758B"/>
     <w:multiLevelType w:val="hybridMultilevel"/>
     <w:tmpl w:val="9B188336"/>
@@ -36922,7 +38448,7 @@
       </w:rPr>
     </w:lvl>
   </w:abstractNum>
-  <w:abstractNum w:abstractNumId="30" w15:restartNumberingAfterBreak="0">
+  <w:abstractNum w:abstractNumId="31" w15:restartNumberingAfterBreak="0">
     <w:nsid w:val="65B346CC"/>
     <w:multiLevelType w:val="hybridMultilevel"/>
     <w:tmpl w:val="8EFA7E64"/>
@@ -37037,7 +38563,7 @@
       </w:rPr>
     </w:lvl>
   </w:abstractNum>
-  <w:abstractNum w:abstractNumId="31" w15:restartNumberingAfterBreak="0">
+  <w:abstractNum w:abstractNumId="32" w15:restartNumberingAfterBreak="0">
     <w:nsid w:val="6D411FA9"/>
     <w:multiLevelType w:val="multilevel"/>
     <w:tmpl w:val="445C09AE"/>
@@ -37186,7 +38712,7 @@
       </w:rPr>
     </w:lvl>
   </w:abstractNum>
-  <w:abstractNum w:abstractNumId="32" w15:restartNumberingAfterBreak="0">
+  <w:abstractNum w:abstractNumId="33" w15:restartNumberingAfterBreak="0">
     <w:nsid w:val="6F6376CD"/>
     <w:multiLevelType w:val="hybridMultilevel"/>
     <w:tmpl w:val="079AE5E4"/>
@@ -37298,7 +38824,7 @@
       </w:rPr>
     </w:lvl>
   </w:abstractNum>
-  <w:abstractNum w:abstractNumId="33" w15:restartNumberingAfterBreak="0">
+  <w:abstractNum w:abstractNumId="34" w15:restartNumberingAfterBreak="0">
     <w:nsid w:val="71983572"/>
     <w:multiLevelType w:val="hybridMultilevel"/>
     <w:tmpl w:val="EF1EE654"/>
@@ -37410,7 +38936,7 @@
       </w:rPr>
     </w:lvl>
   </w:abstractNum>
-  <w:abstractNum w:abstractNumId="34" w15:restartNumberingAfterBreak="0">
+  <w:abstractNum w:abstractNumId="35" w15:restartNumberingAfterBreak="0">
     <w:nsid w:val="72700329"/>
     <w:multiLevelType w:val="hybridMultilevel"/>
     <w:tmpl w:val="B36A6E62"/>
@@ -37523,7 +39049,7 @@
       </w:rPr>
     </w:lvl>
   </w:abstractNum>
-  <w:abstractNum w:abstractNumId="35" w15:restartNumberingAfterBreak="0">
+  <w:abstractNum w:abstractNumId="36" w15:restartNumberingAfterBreak="0">
     <w:nsid w:val="72F5791D"/>
     <w:multiLevelType w:val="hybridMultilevel"/>
     <w:tmpl w:val="316EC540"/>
@@ -37636,7 +39162,7 @@
       </w:rPr>
     </w:lvl>
   </w:abstractNum>
-  <w:abstractNum w:abstractNumId="36" w15:restartNumberingAfterBreak="0">
+  <w:abstractNum w:abstractNumId="37" w15:restartNumberingAfterBreak="0">
     <w:nsid w:val="74744F4C"/>
     <w:multiLevelType w:val="hybridMultilevel"/>
     <w:tmpl w:val="974A85E2"/>
@@ -37750,7 +39276,7 @@
       </w:rPr>
     </w:lvl>
   </w:abstractNum>
-  <w:abstractNum w:abstractNumId="37" w15:restartNumberingAfterBreak="0">
+  <w:abstractNum w:abstractNumId="38" w15:restartNumberingAfterBreak="0">
     <w:nsid w:val="752902AD"/>
     <w:multiLevelType w:val="multilevel"/>
     <w:tmpl w:val="99FE1808"/>
@@ -37906,85 +39432,85 @@
     <w:abstractNumId w:val="9"/>
   </w:num>
   <w:num w:numId="3" w16cid:durableId="865944275">
-    <w:abstractNumId w:val="33"/>
+    <w:abstractNumId w:val="34"/>
   </w:num>
   <w:num w:numId="4" w16cid:durableId="1424303095">
-    <w:abstractNumId w:val="22"/>
+    <w:abstractNumId w:val="23"/>
   </w:num>
   <w:num w:numId="5" w16cid:durableId="1883053895">
     <w:abstractNumId w:val="10"/>
   </w:num>
   <w:num w:numId="6" w16cid:durableId="766386230">
-    <w:abstractNumId w:val="32"/>
+    <w:abstractNumId w:val="33"/>
   </w:num>
   <w:num w:numId="7" w16cid:durableId="799492589">
-    <w:abstractNumId w:val="29"/>
+    <w:abstractNumId w:val="30"/>
   </w:num>
   <w:num w:numId="8" w16cid:durableId="1943877626">
-    <w:abstractNumId w:val="20"/>
+    <w:abstractNumId w:val="21"/>
   </w:num>
   <w:num w:numId="9" w16cid:durableId="1604994413">
-    <w:abstractNumId w:val="27"/>
+    <w:abstractNumId w:val="28"/>
   </w:num>
   <w:num w:numId="10" w16cid:durableId="1611087005">
     <w:abstractNumId w:val="17"/>
   </w:num>
   <w:num w:numId="11" w16cid:durableId="356809826">
-    <w:abstractNumId w:val="26"/>
+    <w:abstractNumId w:val="27"/>
   </w:num>
   <w:num w:numId="12" w16cid:durableId="1485273352">
     <w:abstractNumId w:val="3"/>
   </w:num>
   <w:num w:numId="13" w16cid:durableId="402800859">
-    <w:abstractNumId w:val="37"/>
+    <w:abstractNumId w:val="38"/>
   </w:num>
   <w:num w:numId="14" w16cid:durableId="292295946">
     <w:abstractNumId w:val="14"/>
   </w:num>
   <w:num w:numId="15" w16cid:durableId="1088768482">
-    <w:abstractNumId w:val="28"/>
+    <w:abstractNumId w:val="29"/>
   </w:num>
   <w:num w:numId="16" w16cid:durableId="239947597">
-    <w:abstractNumId w:val="21"/>
+    <w:abstractNumId w:val="22"/>
   </w:num>
   <w:num w:numId="17" w16cid:durableId="1555461702">
-    <w:abstractNumId w:val="31"/>
+    <w:abstractNumId w:val="32"/>
   </w:num>
   <w:num w:numId="18" w16cid:durableId="524904319">
-    <w:abstractNumId w:val="24"/>
+    <w:abstractNumId w:val="25"/>
   </w:num>
   <w:num w:numId="19" w16cid:durableId="865756380">
-    <w:abstractNumId w:val="18"/>
+    <w:abstractNumId w:val="19"/>
   </w:num>
   <w:num w:numId="20" w16cid:durableId="876504802">
-    <w:abstractNumId w:val="19"/>
+    <w:abstractNumId w:val="20"/>
   </w:num>
   <w:num w:numId="21" w16cid:durableId="1340500787">
-    <w:abstractNumId w:val="25"/>
+    <w:abstractNumId w:val="26"/>
   </w:num>
   <w:num w:numId="22" w16cid:durableId="920019110">
     <w:abstractNumId w:val="12"/>
   </w:num>
   <w:num w:numId="23" w16cid:durableId="2087878300">
-    <w:abstractNumId w:val="34"/>
+    <w:abstractNumId w:val="35"/>
   </w:num>
   <w:num w:numId="24" w16cid:durableId="52387369">
     <w:abstractNumId w:val="13"/>
   </w:num>
   <w:num w:numId="25" w16cid:durableId="1141770455">
-    <w:abstractNumId w:val="30"/>
+    <w:abstractNumId w:val="31"/>
   </w:num>
   <w:num w:numId="26" w16cid:durableId="494763806">
-    <w:abstractNumId w:val="35"/>
+    <w:abstractNumId w:val="36"/>
   </w:num>
   <w:num w:numId="27" w16cid:durableId="994529986">
-    <w:abstractNumId w:val="36"/>
+    <w:abstractNumId w:val="37"/>
   </w:num>
   <w:num w:numId="28" w16cid:durableId="1355500932">
     <w:abstractNumId w:val="0"/>
   </w:num>
   <w:num w:numId="29" w16cid:durableId="1598101669">
-    <w:abstractNumId w:val="23"/>
+    <w:abstractNumId w:val="24"/>
   </w:num>
   <w:num w:numId="30" w16cid:durableId="1268973584">
     <w:abstractNumId w:val="5"/>
@@ -38012,6 +39538,9 @@
   </w:num>
   <w:num w:numId="38" w16cid:durableId="509567588">
     <w:abstractNumId w:val="8"/>
+  </w:num>
+  <w:num w:numId="39" w16cid:durableId="1108156868">
+    <w:abstractNumId w:val="18"/>
   </w:num>
 </w:numbering>
 </file>
@@ -39298,12 +40827,14 @@
   </w:compat>
   <w:rsids>
     <w:rsidRoot w:val="00D04E45"/>
+    <w:rsid w:val="000833F5"/>
     <w:rsid w:val="000A437F"/>
     <w:rsid w:val="001077DF"/>
     <w:rsid w:val="001264DC"/>
     <w:rsid w:val="003D1216"/>
     <w:rsid w:val="00406C8A"/>
     <w:rsid w:val="0055497D"/>
+    <w:rsid w:val="00596FD9"/>
     <w:rsid w:val="006D6755"/>
     <w:rsid w:val="0073319B"/>
     <w:rsid w:val="00742029"/>

</xml_diff>

<commit_message>
docs: add app url in documentation
</commit_message>
<xml_diff>
--- a/documentacion proyecto/Proyecto Final - Memoria proyecto Bsnessapp.docx
+++ b/documentacion proyecto/Proyecto Final - Memoria proyecto Bsnessapp.docx
@@ -3924,15 +3924,7 @@
                                         <w:sz w:val="36"/>
                                         <w:szCs w:val="36"/>
                                       </w:rPr>
-                                      <w:t xml:space="preserve">Memoria proyecto </w:t>
-                                    </w:r>
-                                    <w:r>
-                                      <w:rPr>
-                                        <w:color w:val="404040" w:themeColor="text1" w:themeTint="BF"/>
-                                        <w:sz w:val="36"/>
-                                        <w:szCs w:val="36"/>
-                                      </w:rPr>
-                                      <w:t>BsnessApp</w:t>
+                                      <w:t>Memoria proyecto BsnessApp</w:t>
                                     </w:r>
                                   </w:sdtContent>
                                 </w:sdt>
@@ -4027,15 +4019,7 @@
                                   <w:sz w:val="36"/>
                                   <w:szCs w:val="36"/>
                                 </w:rPr>
-                                <w:t xml:space="preserve">Memoria proyecto </w:t>
-                              </w:r>
-                              <w:r>
-                                <w:rPr>
-                                  <w:color w:val="404040" w:themeColor="text1" w:themeTint="BF"/>
-                                  <w:sz w:val="36"/>
-                                  <w:szCs w:val="36"/>
-                                </w:rPr>
-                                <w:t>BsnessApp</w:t>
+                                <w:t>Memoria proyecto BsnessApp</w:t>
                               </w:r>
                             </w:sdtContent>
                           </w:sdt>
@@ -7575,6 +7559,12 @@
     </w:p>
     <w:p>
       <w:pPr>
+        <w:spacing w:after="120"/>
+        <w:jc w:val="both"/>
+      </w:pPr>
+    </w:p>
+    <w:p>
+      <w:pPr>
         <w:pBdr>
           <w:left w:val="single" w:sz="24" w:space="4" w:color="E97132" w:themeColor="accent2"/>
         </w:pBdr>
@@ -7639,6 +7629,119 @@
         <w:ind w:left="397" w:right="397"/>
         <w:jc w:val="both"/>
       </w:pPr>
+    </w:p>
+    <w:p/>
+    <w:p>
+      <w:pPr>
+        <w:pBdr>
+          <w:left w:val="single" w:sz="24" w:space="4" w:color="156082" w:themeColor="accent1"/>
+        </w:pBdr>
+        <w:shd w:val="clear" w:color="auto" w:fill="F2F2F2" w:themeFill="background1" w:themeFillShade="F2"/>
+        <w:spacing w:after="0"/>
+        <w:ind w:left="397" w:right="397"/>
+        <w:jc w:val="both"/>
+      </w:pPr>
+      <w:r>
+        <w:t xml:space="preserve">El proyecto se encuentra </w:t>
+      </w:r>
+      <w:r>
+        <w:t>desplegado</w:t>
+      </w:r>
+      <w:r>
+        <w:t xml:space="preserve"> en </w:t>
+      </w:r>
+      <w:proofErr w:type="spellStart"/>
+      <w:r>
+        <w:rPr>
+          <w:b/>
+          <w:bCs/>
+        </w:rPr>
+        <w:t>Vercel</w:t>
+      </w:r>
+      <w:proofErr w:type="spellEnd"/>
+      <w:r>
+        <w:t xml:space="preserve"> en el siguiente enlace:</w:t>
+      </w:r>
+    </w:p>
+    <w:p>
+      <w:pPr>
+        <w:pBdr>
+          <w:left w:val="single" w:sz="24" w:space="4" w:color="156082" w:themeColor="accent1"/>
+        </w:pBdr>
+        <w:shd w:val="clear" w:color="auto" w:fill="F2F2F2" w:themeFill="background1" w:themeFillShade="F2"/>
+        <w:spacing w:after="0"/>
+        <w:ind w:left="397" w:right="397"/>
+        <w:jc w:val="both"/>
+      </w:pPr>
+    </w:p>
+    <w:p>
+      <w:pPr>
+        <w:pBdr>
+          <w:left w:val="single" w:sz="24" w:space="4" w:color="156082" w:themeColor="accent1"/>
+        </w:pBdr>
+        <w:shd w:val="clear" w:color="auto" w:fill="F2F2F2" w:themeFill="background1" w:themeFillShade="F2"/>
+        <w:spacing w:after="0"/>
+        <w:ind w:left="397" w:right="397" w:firstLine="311"/>
+        <w:jc w:val="both"/>
+      </w:pPr>
+      <w:r>
+        <w:fldChar w:fldCharType="begin"/>
+      </w:r>
+      <w:r>
+        <w:instrText>HYPERLINK "</w:instrText>
+      </w:r>
+      <w:r>
+        <w:instrText>https://</w:instrText>
+      </w:r>
+      <w:r>
+        <w:instrText>bsnessapp.es</w:instrText>
+      </w:r>
+    </w:p>
+    <w:p>
+      <w:pPr>
+        <w:pBdr>
+          <w:left w:val="single" w:sz="24" w:space="4" w:color="156082" w:themeColor="accent1"/>
+        </w:pBdr>
+        <w:shd w:val="clear" w:color="auto" w:fill="F2F2F2" w:themeFill="background1" w:themeFillShade="F2"/>
+        <w:spacing w:after="0"/>
+        <w:ind w:left="397" w:right="397" w:firstLine="311"/>
+        <w:jc w:val="both"/>
+        <w:rPr>
+          <w:rStyle w:val="Hipervnculo"/>
+        </w:rPr>
+      </w:pPr>
+      <w:r>
+        <w:instrText>"</w:instrText>
+      </w:r>
+      <w:r>
+        <w:fldChar w:fldCharType="separate"/>
+      </w:r>
+      <w:r>
+        <w:rPr>
+          <w:rStyle w:val="Hipervnculo"/>
+        </w:rPr>
+        <w:t>https://</w:t>
+      </w:r>
+      <w:r>
+        <w:rPr>
+          <w:rStyle w:val="Hipervnculo"/>
+        </w:rPr>
+        <w:t>bsnessapp.es</w:t>
+      </w:r>
+    </w:p>
+    <w:p>
+      <w:pPr>
+        <w:pBdr>
+          <w:left w:val="single" w:sz="24" w:space="4" w:color="156082" w:themeColor="accent1"/>
+        </w:pBdr>
+        <w:shd w:val="clear" w:color="auto" w:fill="F2F2F2" w:themeFill="background1" w:themeFillShade="F2"/>
+        <w:spacing w:after="0"/>
+        <w:ind w:left="397" w:right="397"/>
+        <w:jc w:val="both"/>
+      </w:pPr>
+      <w:r>
+        <w:fldChar w:fldCharType="end"/>
+      </w:r>
     </w:p>
     <w:p/>
     <w:p>
@@ -40756,6 +40859,7 @@
   <w:style w:type="paragraph" w:default="1" w:styleId="Normal">
     <w:name w:val="Normal"/>
     <w:qFormat/>
+    <w:rsid w:val="0045269E"/>
   </w:style>
   <w:style w:type="paragraph" w:styleId="Ttulo1">
     <w:name w:val="heading 1"/>
@@ -41659,6 +41763,8 @@
     <w:rsid w:val="008C29E1"/>
     <w:rsid w:val="00976924"/>
     <w:rsid w:val="00AA5E59"/>
+    <w:rsid w:val="00AE36D9"/>
+    <w:rsid w:val="00BD6953"/>
     <w:rsid w:val="00C66654"/>
     <w:rsid w:val="00D04E45"/>
     <w:rsid w:val="00D36DF2"/>

</xml_diff>